<commit_message>
Finalize elite V17 resume intelligence
</commit_message>
<xml_diff>
--- a/site-v15/downloads/Casey_Barton_Resume.docx
+++ b/site-v15/downloads/Casey_Barton_Resume.docx
@@ -6,140 +6,271 @@
       <w:tblPr>
         <w:tblW w:type="auto" w:w="0"/>
         <w:jc w:val="center"/>
+        <w:tblLayout w:type="fixed"/>
         <w:tblLook w:firstColumn="1" w:firstRow="1" w:lastColumn="0" w:lastRow="0" w:noHBand="0" w:noVBand="1" w:val="04A0"/>
+        <w:tblCellSpacing w:w="0" w:type="dxa"/>
       </w:tblPr>
       <w:tblGrid>
-        <w:gridCol w:w="7344"/>
-        <w:gridCol w:w="3024"/>
+        <w:gridCol w:w="7992"/>
+        <w:gridCol w:w="2880"/>
       </w:tblGrid>
       <w:tr>
         <w:tc>
           <w:tcPr>
             <w:tcW w:type="dxa" w:w="5429"/>
-            <w:shd w:fill="071B21"/>
+            <w:shd w:fill="0B2028"/>
             <w:tcMar>
-              <w:top w:w="180" w:type="dxa"/>
-              <w:start w:w="180" w:type="dxa"/>
-              <w:bottom w:w="160" w:type="dxa"/>
-              <w:end w:w="180" w:type="dxa"/>
+              <w:top w:w="125" w:type="dxa"/>
+              <w:start w:w="115" w:type="dxa"/>
+              <w:bottom w:w="115" w:type="dxa"/>
+              <w:end w:w="115" w:type="dxa"/>
             </w:tcMar>
-            <w:vAlign w:val="bottom"/>
+            <w:tcBorders>
+              <w:top w:val="nil"/>
+              <w:left w:val="nil"/>
+              <w:bottom w:val="nil"/>
+              <w:right w:val="nil"/>
+            </w:tcBorders>
+            <w:vAlign w:val="center"/>
           </w:tcPr>
           <w:p>
+            <w:pPr>
+              <w:spacing w:before="0" w:after="40" w:line="240" w:lineRule="auto"/>
+            </w:pPr>
             <w:r>
               <w:rPr>
                 <w:rFonts w:ascii="Aptos" w:hAnsi="Aptos" w:eastAsia="Aptos"/>
                 <w:b/>
+                <w:i w:val="0"/>
                 <w:color w:val="FFFFFF"/>
-                <w:sz w:val="48"/>
+                <w:sz w:val="41"/>
               </w:rPr>
               <w:t>CASEY DEL CARPIO BARTON</w:t>
             </w:r>
           </w:p>
           <w:p>
+            <w:pPr>
+              <w:spacing w:before="0" w:after="40" w:line="240" w:lineRule="auto"/>
+            </w:pPr>
             <w:r>
               <w:rPr>
                 <w:rFonts w:ascii="Aptos" w:hAnsi="Aptos" w:eastAsia="Aptos"/>
                 <w:b/>
-                <w:color w:val="B8F5DF"/>
-                <w:sz w:val="18"/>
+                <w:i w:val="0"/>
+                <w:color w:val="7DEAD4"/>
+                <w:sz w:val="21"/>
               </w:rPr>
-              <w:t>APPLIED AI SYSTEMS ARCHITECT | AGENT INFRASTRUCTURE ENGINEER</w:t>
+              <w:t>APPLIED AI SYSTEMS ARCHITECT</w:t>
             </w:r>
-          </w:p>
-          <w:p>
             <w:r>
               <w:rPr>
                 <w:rFonts w:ascii="Aptos" w:hAnsi="Aptos" w:eastAsia="Aptos"/>
                 <w:b w:val="0"/>
-                <w:color w:val="D4E6E2"/>
+                <w:i w:val="0"/>
+                <w:color w:val="D7E4E7"/>
+                <w:sz w:val="18"/>
+              </w:rPr>
+              <w:t xml:space="preserve">  |  Agent Infrastructure Engineer</w:t>
+            </w:r>
+          </w:p>
+          <w:p>
+            <w:pPr>
+              <w:spacing w:before="0" w:after="0" w:line="240" w:lineRule="auto"/>
+            </w:pPr>
+            <w:r>
+              <w:rPr>
+                <w:rFonts w:ascii="Aptos" w:hAnsi="Aptos" w:eastAsia="Aptos"/>
+                <w:b w:val="0"/>
+                <w:i w:val="0"/>
+                <w:color w:val="C1D1D5"/>
                 <w:sz w:val="16"/>
               </w:rPr>
-              <w:t>Builds the operating layer that makes powerful AI dependable enough to use.</w:t>
+              <w:t>Forward-Deployed AI  |  Evidence-bound execution for ambitious systems and high-consequence decisions.</w:t>
             </w:r>
           </w:p>
         </w:tc>
         <w:tc>
           <w:tcPr>
             <w:tcW w:type="dxa" w:w="5429"/>
-            <w:shd w:fill="071B21"/>
+            <w:shd w:fill="0B2028"/>
             <w:tcMar>
-              <w:top w:w="180" w:type="dxa"/>
-              <w:start w:w="180" w:type="dxa"/>
-              <w:bottom w:w="160" w:type="dxa"/>
-              <w:end w:w="180" w:type="dxa"/>
+              <w:top w:w="125" w:type="dxa"/>
+              <w:start w:w="115" w:type="dxa"/>
+              <w:bottom w:w="115" w:type="dxa"/>
+              <w:end w:w="115" w:type="dxa"/>
             </w:tcMar>
-            <w:vAlign w:val="bottom"/>
+            <w:tcBorders>
+              <w:top w:val="nil"/>
+              <w:left w:val="nil"/>
+              <w:bottom w:val="nil"/>
+              <w:right w:val="nil"/>
+            </w:tcBorders>
+            <w:vAlign w:val="center"/>
           </w:tcPr>
           <w:p>
             <w:pPr>
+              <w:spacing w:before="0" w:after="20" w:line="240" w:lineRule="auto"/>
               <w:jc w:val="right"/>
             </w:pPr>
             <w:r>
               <w:rPr>
                 <w:rFonts w:ascii="Aptos" w:hAnsi="Aptos" w:eastAsia="Aptos"/>
-                <w:b w:val="0"/>
-                <w:color w:val="D4E6E2"/>
-                <w:sz w:val="15"/>
+                <w:b/>
+                <w:i w:val="0"/>
+                <w:color w:val="FFFFFF"/>
+                <w:sz w:val="18"/>
               </w:rPr>
               <w:t>Honolulu, Hawaii</w:t>
             </w:r>
           </w:p>
           <w:p>
             <w:pPr>
+              <w:spacing w:before="0" w:after="0" w:line="240" w:lineRule="auto"/>
               <w:jc w:val="right"/>
+            </w:pPr>
+            <w:hyperlink r:id="rId9">
+              <w:r>
+                <w:rPr>
+                  <w:color w:val="D7E4E7"/>
+                  <w:u w:val="none"/>
+                  <w:sz w:val="16"/>
+                  <w:szCs w:val="16"/>
+                </w:rPr>
+                <w:t>808-936-5654</w:t>
+              </w:r>
+            </w:hyperlink>
+            <w:r>
+              <w:rPr>
+                <w:rFonts w:ascii="Aptos" w:hAnsi="Aptos" w:eastAsia="Aptos"/>
+                <w:b w:val="0"/>
+                <w:i w:val="0"/>
+                <w:sz w:val="2"/>
+              </w:rPr>
+              <w:br/>
+            </w:r>
+            <w:hyperlink r:id="rId10">
+              <w:r>
+                <w:rPr>
+                  <w:color w:val="D7E4E7"/>
+                  <w:u w:val="none"/>
+                  <w:sz w:val="16"/>
+                  <w:szCs w:val="16"/>
+                </w:rPr>
+                <w:t>glacier.equilibrium@gmail.com</w:t>
+              </w:r>
+            </w:hyperlink>
+            <w:r>
+              <w:rPr>
+                <w:rFonts w:ascii="Aptos" w:hAnsi="Aptos" w:eastAsia="Aptos"/>
+                <w:b w:val="0"/>
+                <w:i w:val="0"/>
+                <w:sz w:val="2"/>
+              </w:rPr>
+              <w:br/>
+            </w:r>
+            <w:hyperlink r:id="rId11">
+              <w:r>
+                <w:rPr>
+                  <w:color w:val="D7E4E7"/>
+                  <w:u w:val="none"/>
+                  <w:sz w:val="16"/>
+                  <w:szCs w:val="16"/>
+                </w:rPr>
+                <w:t>casey-barton-glaciereq.vercel.app</w:t>
+              </w:r>
+            </w:hyperlink>
+            <w:r>
+              <w:rPr>
+                <w:rFonts w:ascii="Aptos" w:hAnsi="Aptos" w:eastAsia="Aptos"/>
+                <w:b w:val="0"/>
+                <w:i w:val="0"/>
+                <w:sz w:val="2"/>
+              </w:rPr>
+              <w:br/>
+            </w:r>
+            <w:hyperlink r:id="rId12">
+              <w:r>
+                <w:rPr>
+                  <w:color w:val="D7E4E7"/>
+                  <w:u w:val="none"/>
+                  <w:sz w:val="16"/>
+                  <w:szCs w:val="16"/>
+                </w:rPr>
+                <w:t>github.com/GlacierEQ</w:t>
+              </w:r>
+            </w:hyperlink>
+          </w:p>
+        </w:tc>
+      </w:tr>
+    </w:tbl>
+    <w:tbl>
+      <w:tblPr>
+        <w:tblW w:type="auto" w:w="0"/>
+        <w:jc w:val="center"/>
+        <w:tblLook w:firstColumn="1" w:firstRow="1" w:lastColumn="0" w:lastRow="0" w:noHBand="0" w:noVBand="1" w:val="04A0"/>
+        <w:tblCellSpacing w:w="0" w:type="dxa"/>
+      </w:tblPr>
+      <w:tblGrid>
+        <w:gridCol w:w="10858"/>
+      </w:tblGrid>
+      <w:tr>
+        <w:tc>
+          <w:tcPr>
+            <w:tcW w:type="dxa" w:w="10858"/>
+            <w:shd w:fill="EEF6F4"/>
+            <w:tcMar>
+              <w:top w:w="75" w:type="dxa"/>
+              <w:start w:w="90" w:type="dxa"/>
+              <w:bottom w:w="75" w:type="dxa"/>
+              <w:end w:w="90" w:type="dxa"/>
+            </w:tcMar>
+            <w:tcBorders>
+              <w:top w:sz="8" w:val="single" w:color="087A73"/>
+              <w:left w:sz="2" w:val="single" w:color="D4E4E1"/>
+              <w:bottom w:sz="8" w:val="single" w:color="087A73"/>
+              <w:right w:sz="2" w:val="single" w:color="D4E4E1"/>
+            </w:tcBorders>
+          </w:tcPr>
+          <w:p>
+            <w:pPr>
+              <w:spacing w:before="0" w:after="40" w:line="240" w:lineRule="auto"/>
+            </w:pPr>
+            <w:r>
+              <w:rPr>
+                <w:rFonts w:ascii="Aptos" w:hAnsi="Aptos" w:eastAsia="Aptos"/>
+                <w:b/>
+                <w:i w:val="0"/>
+                <w:color w:val="087A73"/>
+                <w:sz w:val="16"/>
+              </w:rPr>
+              <w:t>EXECUTIVE SIGNAL</w:t>
+            </w:r>
+          </w:p>
+          <w:p>
+            <w:pPr>
+              <w:spacing w:before="0" w:after="0" w:line="254" w:lineRule="auto"/>
             </w:pPr>
             <w:r>
               <w:rPr>
                 <w:rFonts w:ascii="Aptos" w:hAnsi="Aptos" w:eastAsia="Aptos"/>
                 <w:b w:val="0"/>
-                <w:color w:val="D4E6E2"/>
-                <w:sz w:val="15"/>
+                <w:i w:val="0"/>
+                <w:color w:val="14232A"/>
+                <w:sz w:val="19"/>
               </w:rPr>
-              <w:t>glacier.equilibrium@gmail.com</w:t>
-            </w:r>
-          </w:p>
-          <w:p>
-            <w:pPr>
-              <w:jc w:val="right"/>
-            </w:pPr>
-            <w:r>
-              <w:rPr>
-                <w:rFonts w:ascii="Aptos" w:hAnsi="Aptos" w:eastAsia="Aptos"/>
-                <w:b w:val="0"/>
-                <w:color w:val="D4E6E2"/>
-                <w:sz w:val="15"/>
-              </w:rPr>
-              <w:t>casey-barton-glaciereq.vercel.app</w:t>
-            </w:r>
-          </w:p>
-          <w:p>
-            <w:pPr>
-              <w:jc w:val="right"/>
-            </w:pPr>
-            <w:r>
-              <w:rPr>
-                <w:rFonts w:ascii="Aptos" w:hAnsi="Aptos" w:eastAsia="Aptos"/>
-                <w:b w:val="0"/>
-                <w:color w:val="D4E6E2"/>
-                <w:sz w:val="15"/>
-              </w:rPr>
-              <w:t>github.com/GlacierEQ</w:t>
+              <w:t>Builds the operating layer between model capability and dependable outcomes: explicit authority, bounded tool use, deterministic evidence, controlled failure, continuity, and completion receipts. Combines software architecture with scientific measurement, compressed-gas safety, building-system inspection, and owner-operated field execution.</w:t>
             </w:r>
           </w:p>
         </w:tc>
       </w:tr>
     </w:tbl>
-    <w:p>
-      <w:pPr>
-        <w:spacing w:after="20"/>
-      </w:pPr>
-    </w:p>
     <w:tbl>
       <w:tblPr>
         <w:tblW w:type="auto" w:w="0"/>
         <w:jc w:val="center"/>
+        <w:tblLayout w:type="fixed"/>
         <w:tblLook w:firstColumn="1" w:firstRow="1" w:lastColumn="0" w:lastRow="0" w:noHBand="0" w:noVBand="1" w:val="04A0"/>
+        <w:tblCellSpacing w:w="0" w:type="dxa"/>
       </w:tblPr>
       <w:tblGrid>
         <w:gridCol w:w="2714"/>
@@ -151,32 +282,48 @@
         <w:tc>
           <w:tcPr>
             <w:tcW w:type="dxa" w:w="2714"/>
-            <w:shd w:fill="0D3A3C"/>
+            <w:shd w:fill="F7FAF9"/>
             <w:tcMar>
-              <w:top w:w="90" w:type="dxa"/>
-              <w:start w:w="110" w:type="dxa"/>
-              <w:bottom w:w="90" w:type="dxa"/>
-              <w:end w:w="110" w:type="dxa"/>
+              <w:top w:w="65" w:type="dxa"/>
+              <w:start w:w="40" w:type="dxa"/>
+              <w:bottom w:w="65" w:type="dxa"/>
+              <w:end w:w="40" w:type="dxa"/>
             </w:tcMar>
+            <w:tcBorders>
+              <w:top w:sz="2" w:val="single" w:color="D4E4E1"/>
+              <w:left w:sz="2" w:val="single" w:color="D4E4E1"/>
+              <w:bottom w:sz="2" w:val="single" w:color="D4E4E1"/>
+              <w:right w:sz="2" w:val="single" w:color="D4E4E1"/>
+            </w:tcBorders>
           </w:tcPr>
           <w:p>
+            <w:pPr>
+              <w:spacing w:before="0" w:after="20" w:line="240" w:lineRule="auto"/>
+              <w:jc w:val="center"/>
+            </w:pPr>
             <w:r>
               <w:rPr>
                 <w:rFonts w:ascii="Aptos" w:hAnsi="Aptos" w:eastAsia="Aptos"/>
                 <w:b/>
-                <w:color w:val="B8F5DF"/>
+                <w:i w:val="0"/>
+                <w:color w:val="087A73"/>
                 <w:sz w:val="31"/>
               </w:rPr>
               <w:t>69/69</w:t>
             </w:r>
           </w:p>
           <w:p>
+            <w:pPr>
+              <w:spacing w:before="0" w:after="0" w:line="228" w:lineRule="auto"/>
+              <w:jc w:val="center"/>
+            </w:pPr>
             <w:r>
               <w:rPr>
                 <w:rFonts w:ascii="Aptos" w:hAnsi="Aptos" w:eastAsia="Aptos"/>
                 <w:b w:val="0"/>
-                <w:color w:val="D8E8E5"/>
-                <w:sz w:val="13"/>
+                <w:i w:val="0"/>
+                <w:color w:val="5B6D75"/>
+                <w:sz w:val="15"/>
               </w:rPr>
               <w:t>Receipt Router tests</w:t>
             </w:r>
@@ -185,102 +332,150 @@
         <w:tc>
           <w:tcPr>
             <w:tcW w:type="dxa" w:w="2714"/>
-            <w:shd w:fill="0D3A3C"/>
+            <w:shd w:fill="EEF6F4"/>
             <w:tcMar>
-              <w:top w:w="90" w:type="dxa"/>
-              <w:start w:w="110" w:type="dxa"/>
-              <w:bottom w:w="90" w:type="dxa"/>
-              <w:end w:w="110" w:type="dxa"/>
+              <w:top w:w="65" w:type="dxa"/>
+              <w:start w:w="40" w:type="dxa"/>
+              <w:bottom w:w="65" w:type="dxa"/>
+              <w:end w:w="40" w:type="dxa"/>
             </w:tcMar>
+            <w:tcBorders>
+              <w:top w:sz="2" w:val="single" w:color="D4E4E1"/>
+              <w:left w:sz="2" w:val="single" w:color="D4E4E1"/>
+              <w:bottom w:sz="2" w:val="single" w:color="D4E4E1"/>
+              <w:right w:sz="2" w:val="single" w:color="D4E4E1"/>
+            </w:tcBorders>
           </w:tcPr>
           <w:p>
+            <w:pPr>
+              <w:spacing w:before="0" w:after="20" w:line="240" w:lineRule="auto"/>
+              <w:jc w:val="center"/>
+            </w:pPr>
             <w:r>
               <w:rPr>
                 <w:rFonts w:ascii="Aptos" w:hAnsi="Aptos" w:eastAsia="Aptos"/>
                 <w:b/>
-                <w:color w:val="B8F5DF"/>
+                <w:i w:val="0"/>
+                <w:color w:val="087A73"/>
                 <w:sz w:val="31"/>
               </w:rPr>
               <w:t>166 + 19</w:t>
             </w:r>
           </w:p>
           <w:p>
+            <w:pPr>
+              <w:spacing w:before="0" w:after="0" w:line="228" w:lineRule="auto"/>
+              <w:jc w:val="center"/>
+            </w:pPr>
             <w:r>
               <w:rPr>
                 <w:rFonts w:ascii="Aptos" w:hAnsi="Aptos" w:eastAsia="Aptos"/>
                 <w:b w:val="0"/>
-                <w:color w:val="D8E8E5"/>
-                <w:sz w:val="13"/>
+                <w:i w:val="0"/>
+                <w:color w:val="5B6D75"/>
+                <w:sz w:val="15"/>
               </w:rPr>
-              <w:t>source + memory tests</w:t>
+              <w:t>Bounded source + memory tests</w:t>
             </w:r>
           </w:p>
         </w:tc>
         <w:tc>
           <w:tcPr>
             <w:tcW w:type="dxa" w:w="2714"/>
-            <w:shd w:fill="0D3A3C"/>
+            <w:shd w:fill="F7FAF9"/>
             <w:tcMar>
-              <w:top w:w="90" w:type="dxa"/>
-              <w:start w:w="110" w:type="dxa"/>
-              <w:bottom w:w="90" w:type="dxa"/>
-              <w:end w:w="110" w:type="dxa"/>
+              <w:top w:w="65" w:type="dxa"/>
+              <w:start w:w="40" w:type="dxa"/>
+              <w:bottom w:w="65" w:type="dxa"/>
+              <w:end w:w="40" w:type="dxa"/>
             </w:tcMar>
+            <w:tcBorders>
+              <w:top w:sz="2" w:val="single" w:color="D4E4E1"/>
+              <w:left w:sz="2" w:val="single" w:color="D4E4E1"/>
+              <w:bottom w:sz="2" w:val="single" w:color="D4E4E1"/>
+              <w:right w:sz="2" w:val="single" w:color="D4E4E1"/>
+            </w:tcBorders>
           </w:tcPr>
           <w:p>
+            <w:pPr>
+              <w:spacing w:before="0" w:after="20" w:line="240" w:lineRule="auto"/>
+              <w:jc w:val="center"/>
+            </w:pPr>
             <w:r>
               <w:rPr>
                 <w:rFonts w:ascii="Aptos" w:hAnsi="Aptos" w:eastAsia="Aptos"/>
                 <w:b/>
-                <w:color w:val="B8F5DF"/>
+                <w:i w:val="0"/>
+                <w:color w:val="087A73"/>
                 <w:sz w:val="31"/>
               </w:rPr>
               <w:t>148/148</w:t>
             </w:r>
           </w:p>
           <w:p>
+            <w:pPr>
+              <w:spacing w:before="0" w:after="0" w:line="228" w:lineRule="auto"/>
+              <w:jc w:val="center"/>
+            </w:pPr>
             <w:r>
               <w:rPr>
                 <w:rFonts w:ascii="Aptos" w:hAnsi="Aptos" w:eastAsia="Aptos"/>
                 <w:b w:val="0"/>
-                <w:color w:val="D8E8E5"/>
-                <w:sz w:val="13"/>
+                <w:i w:val="0"/>
+                <w:color w:val="5B6D75"/>
+                <w:sz w:val="15"/>
               </w:rPr>
-              <w:t>Helix tests recorded</w:t>
+              <w:t>Job Application Helix tests</w:t>
             </w:r>
           </w:p>
         </w:tc>
         <w:tc>
           <w:tcPr>
             <w:tcW w:type="dxa" w:w="2714"/>
-            <w:shd w:fill="0D3A3C"/>
+            <w:shd w:fill="EEF6F4"/>
             <w:tcMar>
-              <w:top w:w="90" w:type="dxa"/>
-              <w:start w:w="110" w:type="dxa"/>
-              <w:bottom w:w="90" w:type="dxa"/>
-              <w:end w:w="110" w:type="dxa"/>
+              <w:top w:w="65" w:type="dxa"/>
+              <w:start w:w="40" w:type="dxa"/>
+              <w:bottom w:w="65" w:type="dxa"/>
+              <w:end w:w="40" w:type="dxa"/>
             </w:tcMar>
+            <w:tcBorders>
+              <w:top w:sz="2" w:val="single" w:color="D4E4E1"/>
+              <w:left w:sz="2" w:val="single" w:color="D4E4E1"/>
+              <w:bottom w:sz="2" w:val="single" w:color="D4E4E1"/>
+              <w:right w:sz="2" w:val="single" w:color="D4E4E1"/>
+            </w:tcBorders>
           </w:tcPr>
           <w:p>
+            <w:pPr>
+              <w:spacing w:before="0" w:after="20" w:line="240" w:lineRule="auto"/>
+              <w:jc w:val="center"/>
+            </w:pPr>
             <w:r>
               <w:rPr>
                 <w:rFonts w:ascii="Aptos" w:hAnsi="Aptos" w:eastAsia="Aptos"/>
                 <w:b/>
-                <w:color w:val="B8F5DF"/>
+                <w:i w:val="0"/>
+                <w:color w:val="087A73"/>
                 <w:sz w:val="31"/>
               </w:rPr>
               <w:t>0</w:t>
             </w:r>
           </w:p>
           <w:p>
+            <w:pPr>
+              <w:spacing w:before="0" w:after="0" w:line="228" w:lineRule="auto"/>
+              <w:jc w:val="center"/>
+            </w:pPr>
             <w:r>
               <w:rPr>
                 <w:rFonts w:ascii="Aptos" w:hAnsi="Aptos" w:eastAsia="Aptos"/>
                 <w:b w:val="0"/>
-                <w:color w:val="D8E8E5"/>
-                <w:sz w:val="13"/>
+                <w:i w:val="0"/>
+                <w:color w:val="5B6D75"/>
+                <w:sz w:val="15"/>
               </w:rPr>
-              <w:t>external flagship actions</w:t>
+              <w:t>External actions in flagship verification</w:t>
             </w:r>
           </w:p>
         </w:tc>
@@ -288,79 +483,506 @@
     </w:tbl>
     <w:p>
       <w:pPr>
-        <w:spacing w:before="160" w:after="40"/>
+        <w:spacing w:before="120" w:after="60" w:line="240" w:lineRule="auto"/>
+        <w:keepNext/>
+        <w:keepLines/>
+        <w:pBdr>
+          <w:bottom w:val="single" w:sz="10" w:space="2" w:color="087A73"/>
+        </w:pBdr>
       </w:pPr>
       <w:r>
         <w:rPr>
           <w:rFonts w:ascii="Aptos" w:hAnsi="Aptos" w:eastAsia="Aptos"/>
           <w:b/>
-          <w:color w:val="0D766C"/>
-          <w:sz w:val="14"/>
+          <w:i w:val="0"/>
+          <w:color w:val="087A73"/>
+          <w:sz w:val="24"/>
         </w:rPr>
-        <w:t>SYSTEMS POSITIONING</w:t>
-      </w:r>
-    </w:p>
-    <w:p>
-      <w:pPr>
-        <w:spacing w:after="100"/>
-      </w:pPr>
-      <w:r>
-        <w:rPr>
-          <w:rFonts w:ascii="Aptos" w:hAnsi="Aptos" w:eastAsia="Aptos"/>
-          <w:b/>
-          <w:color w:val="12272D"/>
-          <w:sz w:val="30"/>
-        </w:rPr>
-        <w:t>Inspection discipline for AI systems.</w:t>
-      </w:r>
-    </w:p>
-    <w:p>
-      <w:pPr>
-        <w:spacing w:after="100"/>
-      </w:pPr>
-      <w:r>
-        <w:rPr>
-          <w:rFonts w:ascii="Aptos" w:hAnsi="Aptos" w:eastAsia="Aptos"/>
-          <w:b w:val="0"/>
-          <w:color w:val="263C41"/>
-          <w:sz w:val="17"/>
-        </w:rPr>
-        <w:t>Applied AI systems architect who builds the operating layer around model capability: task ownership, tool contracts, authority, evidence states, controlled failure, persistence, and completion receipts. Brings cross-domain discipline from software engineering, residential systems inspection, scientific measurement, field operations, and compressed-gas safety.</w:t>
-      </w:r>
-    </w:p>
-    <w:p>
-      <w:pPr>
-        <w:spacing w:before="160" w:after="40"/>
-      </w:pPr>
-      <w:r>
-        <w:rPr>
-          <w:rFonts w:ascii="Aptos" w:hAnsi="Aptos" w:eastAsia="Aptos"/>
-          <w:b/>
-          <w:color w:val="0D766C"/>
-          <w:sz w:val="14"/>
-        </w:rPr>
-        <w:t>SELECTED EXECUTION</w:t>
-      </w:r>
-    </w:p>
-    <w:p>
-      <w:pPr>
-        <w:spacing w:after="100"/>
-      </w:pPr>
-      <w:r>
-        <w:rPr>
-          <w:rFonts w:ascii="Aptos" w:hAnsi="Aptos" w:eastAsia="Aptos"/>
-          <w:b/>
-          <w:color w:val="12272D"/>
-          <w:sz w:val="30"/>
-        </w:rPr>
-        <w:t>Proof that reveals engineering judgment.</w:t>
+        <w:t>PROFESSIONAL EXPERIENCE</w:t>
       </w:r>
     </w:p>
     <w:tbl>
       <w:tblPr>
         <w:tblW w:type="auto" w:w="0"/>
         <w:jc w:val="center"/>
+        <w:tblLayout w:type="fixed"/>
         <w:tblLook w:firstColumn="1" w:firstRow="1" w:lastColumn="0" w:lastRow="0" w:noHBand="0" w:noVBand="1" w:val="04A0"/>
+        <w:tblCellSpacing w:w="0" w:type="dxa"/>
+      </w:tblPr>
+      <w:tblGrid>
+        <w:gridCol w:w="8496"/>
+        <w:gridCol w:w="2376"/>
+      </w:tblGrid>
+      <w:tr>
+        <w:tc>
+          <w:tcPr>
+            <w:tcW w:type="dxa" w:w="5429"/>
+            <w:tcMar>
+              <w:top w:w="30" w:type="dxa"/>
+              <w:start w:w="0" w:type="dxa"/>
+              <w:bottom w:w="15" w:type="dxa"/>
+              <w:end w:w="0" w:type="dxa"/>
+            </w:tcMar>
+            <w:tcBorders>
+              <w:bottom w:val="nil"/>
+            </w:tcBorders>
+          </w:tcPr>
+          <w:p>
+            <w:pPr>
+              <w:spacing w:before="0" w:after="0" w:line="240" w:lineRule="auto"/>
+            </w:pPr>
+            <w:r>
+              <w:rPr>
+                <w:rFonts w:ascii="Aptos" w:hAnsi="Aptos" w:eastAsia="Aptos"/>
+                <w:b/>
+                <w:i w:val="0"/>
+                <w:color w:val="14232A"/>
+                <w:sz w:val="21"/>
+              </w:rPr>
+              <w:t>GlacierEQ</w:t>
+            </w:r>
+            <w:r>
+              <w:rPr>
+                <w:rFonts w:ascii="Aptos" w:hAnsi="Aptos" w:eastAsia="Aptos"/>
+                <w:b w:val="0"/>
+                <w:i w:val="0"/>
+                <w:color w:val="5B6D75"/>
+                <w:sz w:val="21"/>
+              </w:rPr>
+              <w:t xml:space="preserve"> | </w:t>
+            </w:r>
+            <w:r>
+              <w:rPr>
+                <w:rFonts w:ascii="Aptos" w:hAnsi="Aptos" w:eastAsia="Aptos"/>
+                <w:b/>
+                <w:i w:val="0"/>
+                <w:color w:val="087A73"/>
+                <w:sz w:val="20"/>
+              </w:rPr>
+              <w:t>Founder / Applied AI Systems Builder</w:t>
+            </w:r>
+          </w:p>
+        </w:tc>
+        <w:tc>
+          <w:tcPr>
+            <w:tcW w:type="dxa" w:w="5429"/>
+            <w:tcMar>
+              <w:top w:w="30" w:type="dxa"/>
+              <w:start w:w="0" w:type="dxa"/>
+              <w:bottom w:w="15" w:type="dxa"/>
+              <w:end w:w="0" w:type="dxa"/>
+            </w:tcMar>
+            <w:tcBorders>
+              <w:bottom w:val="nil"/>
+            </w:tcBorders>
+          </w:tcPr>
+          <w:p>
+            <w:pPr>
+              <w:spacing w:before="0" w:after="0" w:line="240" w:lineRule="auto"/>
+              <w:jc w:val="right"/>
+            </w:pPr>
+            <w:r>
+              <w:rPr>
+                <w:rFonts w:ascii="Aptos" w:hAnsi="Aptos" w:eastAsia="Aptos"/>
+                <w:b/>
+                <w:i w:val="0"/>
+                <w:color w:val="5B6D75"/>
+                <w:sz w:val="17"/>
+              </w:rPr>
+              <w:t>Jan 2025-Present</w:t>
+            </w:r>
+          </w:p>
+        </w:tc>
+      </w:tr>
+    </w:tbl>
+    <w:p>
+      <w:pPr>
+        <w:spacing w:before="0" w:after="20" w:line="240" w:lineRule="auto"/>
+      </w:pPr>
+      <w:r>
+        <w:rPr>
+          <w:rFonts w:ascii="Aptos" w:hAnsi="Aptos" w:eastAsia="Aptos"/>
+          <w:b w:val="0"/>
+          <w:i/>
+          <w:color w:val="5B6D75"/>
+          <w:sz w:val="17"/>
+        </w:rPr>
+        <w:t>Honolulu, Hawaii</w:t>
+      </w:r>
+    </w:p>
+    <w:p>
+      <w:pPr>
+        <w:pStyle w:val="ListBullet"/>
+        <w:spacing w:after="8" w:line="240" w:lineRule="auto"/>
+        <w:ind w:left="245" w:hanging="202"/>
+        <w:keepLines/>
+      </w:pPr>
+      <w:r>
+        <w:rPr>
+          <w:rFonts w:ascii="Aptos" w:hAnsi="Aptos" w:eastAsia="Aptos"/>
+          <w:color w:val="14232A"/>
+          <w:sz w:val="18"/>
+        </w:rPr>
+        <w:t>Design and implement evidence-bound systems spanning agent orchestration, application intelligence, document and evidence pipelines, memory and continuity, infrastructure governance, and human-machine interfaces.</w:t>
+      </w:r>
+    </w:p>
+    <w:p>
+      <w:pPr>
+        <w:pStyle w:val="ListBullet"/>
+        <w:spacing w:after="8" w:line="240" w:lineRule="auto"/>
+        <w:ind w:left="245" w:hanging="202"/>
+        <w:keepLines/>
+      </w:pPr>
+      <w:r>
+        <w:rPr>
+          <w:rFonts w:ascii="Aptos" w:hAnsi="Aptos" w:eastAsia="Aptos"/>
+          <w:color w:val="14232A"/>
+          <w:sz w:val="18"/>
+        </w:rPr>
+        <w:t>Convert ambiguous architecture into typed contracts, runnable slices, deterministic tests, explicit refusal behavior, machine-readable facts, and reviewable completion receipts.</w:t>
+      </w:r>
+    </w:p>
+    <w:p>
+      <w:pPr>
+        <w:pStyle w:val="ListBullet"/>
+        <w:spacing w:after="8" w:line="240" w:lineRule="auto"/>
+        <w:ind w:left="245" w:hanging="202"/>
+        <w:keepLines/>
+      </w:pPr>
+      <w:r>
+        <w:rPr>
+          <w:rFonts w:ascii="Aptos" w:hAnsi="Aptos" w:eastAsia="Aptos"/>
+          <w:color w:val="14232A"/>
+          <w:sz w:val="18"/>
+        </w:rPr>
+        <w:t>Built a public Portfolio Receipt Router that replaced unsupported autonomous-control semantics with a local fail-closed evidence system; 69 of 69 tests passed through direct and reusable CI with zero external actions.</w:t>
+      </w:r>
+    </w:p>
+    <w:p>
+      <w:pPr>
+        <w:pStyle w:val="ListBullet"/>
+        <w:spacing w:after="8" w:line="240" w:lineRule="auto"/>
+        <w:ind w:left="245" w:hanging="202"/>
+        <w:keepLines/>
+      </w:pPr>
+      <w:r>
+        <w:rPr>
+          <w:rFonts w:ascii="Aptos" w:hAnsi="Aptos" w:eastAsia="Aptos"/>
+          <w:color w:val="14232A"/>
+          <w:sz w:val="18"/>
+        </w:rPr>
+        <w:t>Govern a multi-repository portfolio by separating source presence, review, execution, deployment, authority, and verified completion so recruiter, technical, and machine views cannot drift.</w:t>
+      </w:r>
+    </w:p>
+    <w:tbl>
+      <w:tblPr>
+        <w:tblW w:type="auto" w:w="0"/>
+        <w:jc w:val="center"/>
+        <w:tblLayout w:type="fixed"/>
+        <w:tblLook w:firstColumn="1" w:firstRow="1" w:lastColumn="0" w:lastRow="0" w:noHBand="0" w:noVBand="1" w:val="04A0"/>
+        <w:tblCellSpacing w:w="0" w:type="dxa"/>
+      </w:tblPr>
+      <w:tblGrid>
+        <w:gridCol w:w="8496"/>
+        <w:gridCol w:w="2376"/>
+      </w:tblGrid>
+      <w:tr>
+        <w:tc>
+          <w:tcPr>
+            <w:tcW w:type="dxa" w:w="5429"/>
+            <w:tcMar>
+              <w:top w:w="30" w:type="dxa"/>
+              <w:start w:w="0" w:type="dxa"/>
+              <w:bottom w:w="15" w:type="dxa"/>
+              <w:end w:w="0" w:type="dxa"/>
+            </w:tcMar>
+            <w:tcBorders>
+              <w:bottom w:val="nil"/>
+            </w:tcBorders>
+          </w:tcPr>
+          <w:p>
+            <w:pPr>
+              <w:spacing w:before="0" w:after="0" w:line="240" w:lineRule="auto"/>
+            </w:pPr>
+            <w:r>
+              <w:rPr>
+                <w:rFonts w:ascii="Aptos" w:hAnsi="Aptos" w:eastAsia="Aptos"/>
+                <w:b/>
+                <w:i w:val="0"/>
+                <w:color w:val="14232A"/>
+                <w:sz w:val="21"/>
+              </w:rPr>
+              <w:t>Diamond Head Home Inspections</w:t>
+            </w:r>
+            <w:r>
+              <w:rPr>
+                <w:rFonts w:ascii="Aptos" w:hAnsi="Aptos" w:eastAsia="Aptos"/>
+                <w:b w:val="0"/>
+                <w:i w:val="0"/>
+                <w:color w:val="5B6D75"/>
+                <w:sz w:val="21"/>
+              </w:rPr>
+              <w:t xml:space="preserve"> | </w:t>
+            </w:r>
+            <w:r>
+              <w:rPr>
+                <w:rFonts w:ascii="Aptos" w:hAnsi="Aptos" w:eastAsia="Aptos"/>
+                <w:b/>
+                <w:i w:val="0"/>
+                <w:color w:val="087A73"/>
+                <w:sz w:val="20"/>
+              </w:rPr>
+              <w:t>Certified Home Inspector</w:t>
+            </w:r>
+          </w:p>
+        </w:tc>
+        <w:tc>
+          <w:tcPr>
+            <w:tcW w:type="dxa" w:w="5429"/>
+            <w:tcMar>
+              <w:top w:w="30" w:type="dxa"/>
+              <w:start w:w="0" w:type="dxa"/>
+              <w:bottom w:w="15" w:type="dxa"/>
+              <w:end w:w="0" w:type="dxa"/>
+            </w:tcMar>
+            <w:tcBorders>
+              <w:bottom w:val="nil"/>
+            </w:tcBorders>
+          </w:tcPr>
+          <w:p>
+            <w:pPr>
+              <w:spacing w:before="0" w:after="0" w:line="240" w:lineRule="auto"/>
+              <w:jc w:val="right"/>
+            </w:pPr>
+            <w:r>
+              <w:rPr>
+                <w:rFonts w:ascii="Aptos" w:hAnsi="Aptos" w:eastAsia="Aptos"/>
+                <w:b/>
+                <w:i w:val="0"/>
+                <w:color w:val="5B6D75"/>
+                <w:sz w:val="17"/>
+              </w:rPr>
+              <w:t>2020-2024</w:t>
+            </w:r>
+          </w:p>
+        </w:tc>
+      </w:tr>
+    </w:tbl>
+    <w:p>
+      <w:pPr>
+        <w:spacing w:before="0" w:after="20" w:line="240" w:lineRule="auto"/>
+      </w:pPr>
+      <w:r>
+        <w:rPr>
+          <w:rFonts w:ascii="Aptos" w:hAnsi="Aptos" w:eastAsia="Aptos"/>
+          <w:b w:val="0"/>
+          <w:i/>
+          <w:color w:val="5B6D75"/>
+          <w:sz w:val="17"/>
+        </w:rPr>
+        <w:t>Honolulu, Hawaii</w:t>
+      </w:r>
+    </w:p>
+    <w:p>
+      <w:pPr>
+        <w:pStyle w:val="ListBullet"/>
+        <w:spacing w:after="8" w:line="240" w:lineRule="auto"/>
+        <w:ind w:left="245" w:hanging="202"/>
+        <w:keepLines/>
+      </w:pPr>
+      <w:r>
+        <w:rPr>
+          <w:rFonts w:ascii="Aptos" w:hAnsi="Aptos" w:eastAsia="Aptos"/>
+          <w:color w:val="14232A"/>
+          <w:sz w:val="18"/>
+        </w:rPr>
+        <w:t>Inspected residential structural, roofing, electrical, plumbing, HVAC, moisture, and safety conditions; translated field evidence into clear, decision-ready reports under time constraints.</w:t>
+      </w:r>
+    </w:p>
+    <w:p>
+      <w:pPr>
+        <w:pStyle w:val="ListBullet"/>
+        <w:spacing w:after="8" w:line="240" w:lineRule="auto"/>
+        <w:ind w:left="245" w:hanging="202"/>
+        <w:keepLines/>
+      </w:pPr>
+      <w:r>
+        <w:rPr>
+          <w:rFonts w:ascii="Aptos" w:hAnsi="Aptos" w:eastAsia="Aptos"/>
+          <w:color w:val="14232A"/>
+          <w:sz w:val="18"/>
+        </w:rPr>
+        <w:t>Developed disciplined habits around uncertainty labeling, defect prioritization, interacting-system analysis, client communication, and avoiding unsupported conclusions.</w:t>
+      </w:r>
+    </w:p>
+    <w:tbl>
+      <w:tblPr>
+        <w:tblW w:type="auto" w:w="0"/>
+        <w:jc w:val="center"/>
+        <w:tblLayout w:type="fixed"/>
+        <w:tblLook w:firstColumn="1" w:firstRow="1" w:lastColumn="0" w:lastRow="0" w:noHBand="0" w:noVBand="1" w:val="04A0"/>
+        <w:tblCellSpacing w:w="0" w:type="dxa"/>
+      </w:tblPr>
+      <w:tblGrid>
+        <w:gridCol w:w="8496"/>
+        <w:gridCol w:w="2376"/>
+      </w:tblGrid>
+      <w:tr>
+        <w:tc>
+          <w:tcPr>
+            <w:tcW w:type="dxa" w:w="5429"/>
+            <w:tcMar>
+              <w:top w:w="30" w:type="dxa"/>
+              <w:start w:w="0" w:type="dxa"/>
+              <w:bottom w:w="15" w:type="dxa"/>
+              <w:end w:w="0" w:type="dxa"/>
+            </w:tcMar>
+            <w:tcBorders>
+              <w:bottom w:val="nil"/>
+            </w:tcBorders>
+          </w:tcPr>
+          <w:p>
+            <w:pPr>
+              <w:spacing w:before="0" w:after="0" w:line="240" w:lineRule="auto"/>
+            </w:pPr>
+            <w:r>
+              <w:rPr>
+                <w:rFonts w:ascii="Aptos" w:hAnsi="Aptos" w:eastAsia="Aptos"/>
+                <w:b/>
+                <w:i w:val="0"/>
+                <w:color w:val="14232A"/>
+                <w:sz w:val="21"/>
+              </w:rPr>
+              <w:t>Hi-Class Home Services / Hi Class Maintenance Oahu LLC</w:t>
+            </w:r>
+            <w:r>
+              <w:rPr>
+                <w:rFonts w:ascii="Aptos" w:hAnsi="Aptos" w:eastAsia="Aptos"/>
+                <w:b w:val="0"/>
+                <w:i w:val="0"/>
+                <w:color w:val="5B6D75"/>
+                <w:sz w:val="21"/>
+              </w:rPr>
+              <w:t xml:space="preserve"> | </w:t>
+            </w:r>
+            <w:r>
+              <w:rPr>
+                <w:rFonts w:ascii="Aptos" w:hAnsi="Aptos" w:eastAsia="Aptos"/>
+                <w:b/>
+                <w:i w:val="0"/>
+                <w:color w:val="087A73"/>
+                <w:sz w:val="20"/>
+              </w:rPr>
+              <w:t>Owner-Operator, Building Systems &amp; Field Services</w:t>
+            </w:r>
+          </w:p>
+        </w:tc>
+        <w:tc>
+          <w:tcPr>
+            <w:tcW w:type="dxa" w:w="5429"/>
+            <w:tcMar>
+              <w:top w:w="30" w:type="dxa"/>
+              <w:start w:w="0" w:type="dxa"/>
+              <w:bottom w:w="15" w:type="dxa"/>
+              <w:end w:w="0" w:type="dxa"/>
+            </w:tcMar>
+            <w:tcBorders>
+              <w:bottom w:val="nil"/>
+            </w:tcBorders>
+          </w:tcPr>
+          <w:p>
+            <w:pPr>
+              <w:spacing w:before="0" w:after="0" w:line="240" w:lineRule="auto"/>
+              <w:jc w:val="right"/>
+            </w:pPr>
+            <w:r>
+              <w:rPr>
+                <w:rFonts w:ascii="Aptos" w:hAnsi="Aptos" w:eastAsia="Aptos"/>
+                <w:b/>
+                <w:i w:val="0"/>
+                <w:color w:val="5B6D75"/>
+                <w:sz w:val="17"/>
+              </w:rPr>
+              <w:t>2017-Present</w:t>
+            </w:r>
+          </w:p>
+        </w:tc>
+      </w:tr>
+    </w:tbl>
+    <w:p>
+      <w:pPr>
+        <w:spacing w:before="0" w:after="20" w:line="240" w:lineRule="auto"/>
+      </w:pPr>
+      <w:r>
+        <w:rPr>
+          <w:rFonts w:ascii="Aptos" w:hAnsi="Aptos" w:eastAsia="Aptos"/>
+          <w:b w:val="0"/>
+          <w:i/>
+          <w:color w:val="5B6D75"/>
+          <w:sz w:val="17"/>
+        </w:rPr>
+        <w:t>Honolulu, Hawaii</w:t>
+      </w:r>
+    </w:p>
+    <w:p>
+      <w:pPr>
+        <w:pStyle w:val="ListBullet"/>
+        <w:spacing w:after="8" w:line="240" w:lineRule="auto"/>
+        <w:ind w:left="245" w:hanging="202"/>
+        <w:keepLines/>
+      </w:pPr>
+      <w:r>
+        <w:rPr>
+          <w:rFonts w:ascii="Aptos" w:hAnsi="Aptos" w:eastAsia="Aptos"/>
+          <w:color w:val="14232A"/>
+          <w:sz w:val="18"/>
+        </w:rPr>
+        <w:t>Scope residential repair and service work, prepare estimates, coordinate execution, and communicate assumptions, constraints, and completion status with clients.</w:t>
+      </w:r>
+    </w:p>
+    <w:p>
+      <w:pPr>
+        <w:pStyle w:val="ListBullet"/>
+        <w:spacing w:after="8" w:line="240" w:lineRule="auto"/>
+        <w:ind w:left="245" w:hanging="202"/>
+        <w:keepLines/>
+      </w:pPr>
+      <w:r>
+        <w:rPr>
+          <w:rFonts w:ascii="Aptos" w:hAnsi="Aptos" w:eastAsia="Aptos"/>
+          <w:color w:val="14232A"/>
+          <w:sz w:val="18"/>
+        </w:rPr>
+        <w:t>Work across practical building-system problems including minor carpentry, plumbing, electrical fixture replacement, drywall, painting, flooring, and maintenance planning.</w:t>
+      </w:r>
+    </w:p>
+    <w:p>
+      <w:pPr>
+        <w:spacing w:before="120" w:after="60" w:line="240" w:lineRule="auto"/>
+        <w:keepNext/>
+        <w:keepLines/>
+        <w:pBdr>
+          <w:bottom w:val="single" w:sz="10" w:space="2" w:color="087A73"/>
+        </w:pBdr>
+      </w:pPr>
+      <w:r>
+        <w:rPr>
+          <w:rFonts w:ascii="Aptos" w:hAnsi="Aptos" w:eastAsia="Aptos"/>
+          <w:b/>
+          <w:i w:val="0"/>
+          <w:color w:val="087A73"/>
+          <w:sz w:val="24"/>
+        </w:rPr>
+        <w:t>CORE CAPABILITY MATRIX</w:t>
+      </w:r>
+    </w:p>
+    <w:tbl>
+      <w:tblPr>
+        <w:tblW w:type="auto" w:w="0"/>
+        <w:jc w:val="center"/>
+        <w:tblLayout w:type="fixed"/>
+        <w:tblLook w:firstColumn="1" w:firstRow="1" w:lastColumn="0" w:lastRow="0" w:noHBand="0" w:noVBand="1" w:val="04A0"/>
+        <w:tblCellSpacing w:w="0" w:type="dxa"/>
       </w:tblPr>
       <w:tblGrid>
         <w:gridCol w:w="5429"/>
@@ -370,112 +992,96 @@
         <w:tc>
           <w:tcPr>
             <w:tcW w:type="dxa" w:w="5429"/>
-            <w:shd w:fill="FFFFFF"/>
+            <w:shd w:fill="EEF6F4"/>
             <w:tcMar>
-              <w:top w:w="100" w:type="dxa"/>
-              <w:start w:w="120" w:type="dxa"/>
-              <w:bottom w:w="100" w:type="dxa"/>
-              <w:end w:w="120" w:type="dxa"/>
+              <w:top w:w="65" w:type="dxa"/>
+              <w:start w:w="80" w:type="dxa"/>
+              <w:bottom w:w="65" w:type="dxa"/>
+              <w:end w:w="80" w:type="dxa"/>
             </w:tcMar>
+            <w:tcBorders>
+              <w:top w:sz="2" w:val="single" w:color="D4E4E1"/>
+              <w:left w:sz="2" w:val="single" w:color="D4E4E1"/>
+              <w:bottom w:sz="2" w:val="single" w:color="D4E4E1"/>
+              <w:right w:sz="2" w:val="single" w:color="D4E4E1"/>
+            </w:tcBorders>
           </w:tcPr>
           <w:p>
+            <w:pPr>
+              <w:spacing w:before="0" w:after="40" w:line="240" w:lineRule="auto"/>
+            </w:pPr>
             <w:r>
               <w:rPr>
                 <w:rFonts w:ascii="Aptos" w:hAnsi="Aptos" w:eastAsia="Aptos"/>
                 <w:b/>
-                <w:color w:val="0D766C"/>
-                <w:sz w:val="12"/>
+                <w:i w:val="0"/>
+                <w:color w:val="087A73"/>
+                <w:sz w:val="16"/>
               </w:rPr>
-              <w:t>TEST VERIFIED</w:t>
+              <w:t>Agent infrastructure &amp; governance</w:t>
             </w:r>
           </w:p>
           <w:p>
-            <w:r>
-              <w:rPr>
-                <w:rFonts w:ascii="Aptos" w:hAnsi="Aptos" w:eastAsia="Aptos"/>
-                <w:b/>
-                <w:color w:val="14262C"/>
-                <w:sz w:val="18"/>
-              </w:rPr>
-              <w:t>Portfolio Receipt Router</w:t>
-            </w:r>
-          </w:p>
-          <w:p>
+            <w:pPr>
+              <w:spacing w:before="0" w:after="0" w:line="240" w:lineRule="auto"/>
+            </w:pPr>
             <w:r>
               <w:rPr>
                 <w:rFonts w:ascii="Aptos" w:hAnsi="Aptos" w:eastAsia="Aptos"/>
                 <w:b w:val="0"/>
-                <w:color w:val="536A6D"/>
+                <w:i w:val="0"/>
+                <w:color w:val="14232A"/>
                 <w:sz w:val="15"/>
               </w:rPr>
-              <w:t>Replaced unsupported autonomous-control semantics with a local, fail-closed evidence router while preserving compatibility.</w:t>
-            </w:r>
-          </w:p>
-          <w:p>
-            <w:r>
-              <w:rPr>
-                <w:rFonts w:ascii="Aptos" w:hAnsi="Aptos" w:eastAsia="Aptos"/>
-                <w:b w:val="0"/>
-                <w:color w:val="536A6D"/>
-                <w:sz w:val="14"/>
-              </w:rPr>
-              <w:t>69/69 tests; two CI paths; artifact 8910423397; zero external actions.</w:t>
+              <w:t>Multi-agent coordination; MCP and tool contracts; capability/authority separation; approval models; state machines; bounded retries; recovery and closure.</w:t>
             </w:r>
           </w:p>
         </w:tc>
         <w:tc>
           <w:tcPr>
             <w:tcW w:type="dxa" w:w="5429"/>
-            <w:shd w:fill="FFFFFF"/>
+            <w:shd w:fill="F7FAF9"/>
             <w:tcMar>
-              <w:top w:w="100" w:type="dxa"/>
-              <w:start w:w="120" w:type="dxa"/>
-              <w:bottom w:w="100" w:type="dxa"/>
-              <w:end w:w="120" w:type="dxa"/>
+              <w:top w:w="65" w:type="dxa"/>
+              <w:start w:w="80" w:type="dxa"/>
+              <w:bottom w:w="65" w:type="dxa"/>
+              <w:end w:w="80" w:type="dxa"/>
             </w:tcMar>
+            <w:tcBorders>
+              <w:top w:sz="2" w:val="single" w:color="D4E4E1"/>
+              <w:left w:sz="2" w:val="single" w:color="D4E4E1"/>
+              <w:bottom w:sz="2" w:val="single" w:color="D4E4E1"/>
+              <w:right w:sz="2" w:val="single" w:color="D4E4E1"/>
+            </w:tcBorders>
           </w:tcPr>
           <w:p>
+            <w:pPr>
+              <w:spacing w:before="0" w:after="40" w:line="240" w:lineRule="auto"/>
+            </w:pPr>
             <w:r>
               <w:rPr>
                 <w:rFonts w:ascii="Aptos" w:hAnsi="Aptos" w:eastAsia="Aptos"/>
                 <w:b/>
-                <w:color w:val="0D766C"/>
-                <w:sz w:val="12"/>
+                <w:i w:val="0"/>
+                <w:color w:val="087A73"/>
+                <w:sz w:val="16"/>
               </w:rPr>
-              <w:t>148/148 RECORDED</w:t>
+              <w:t>Evidence &amp; release engineering</w:t>
             </w:r>
           </w:p>
           <w:p>
-            <w:r>
-              <w:rPr>
-                <w:rFonts w:ascii="Aptos" w:hAnsi="Aptos" w:eastAsia="Aptos"/>
-                <w:b/>
-                <w:color w:val="14262C"/>
-                <w:sz w:val="18"/>
-              </w:rPr>
-              <w:t>Job Application Helix</w:t>
-            </w:r>
-          </w:p>
-          <w:p>
+            <w:pPr>
+              <w:spacing w:before="0" w:after="0" w:line="240" w:lineRule="auto"/>
+            </w:pPr>
             <w:r>
               <w:rPr>
                 <w:rFonts w:ascii="Aptos" w:hAnsi="Aptos" w:eastAsia="Aptos"/>
                 <w:b w:val="0"/>
-                <w:color w:val="536A6D"/>
+                <w:i w:val="0"/>
+                <w:color w:val="14232A"/>
                 <w:sz w:val="15"/>
               </w:rPr>
-              <w:t>Evidence-governed hiring and portfolio orchestration across role research, source quality, claim calibration, package state, and follow-up.</w:t>
-            </w:r>
-          </w:p>
-          <w:p>
-            <w:r>
-              <w:rPr>
-                <w:rFonts w:ascii="Aptos" w:hAnsi="Aptos" w:eastAsia="Aptos"/>
-                <w:b w:val="0"/>
-                <w:color w:val="536A6D"/>
-                <w:sz w:val="14"/>
-              </w:rPr>
-              <w:t>Recorded repository tests; current release and deployment gates remain distinct.</w:t>
+              <w:t>Provenance; claim-to-source mapping; deterministic testing; JSON Schema; CI/CD; static analysis; integrity hashing; machine-readable receipts.</w:t>
             </w:r>
           </w:p>
         </w:tc>
@@ -484,112 +1090,864 @@
         <w:tc>
           <w:tcPr>
             <w:tcW w:type="dxa" w:w="5429"/>
-            <w:shd w:fill="FFFFFF"/>
+            <w:shd w:fill="F7FAF9"/>
             <w:tcMar>
-              <w:top w:w="100" w:type="dxa"/>
-              <w:start w:w="120" w:type="dxa"/>
-              <w:bottom w:w="100" w:type="dxa"/>
-              <w:end w:w="120" w:type="dxa"/>
+              <w:top w:w="65" w:type="dxa"/>
+              <w:start w:w="80" w:type="dxa"/>
+              <w:bottom w:w="65" w:type="dxa"/>
+              <w:end w:w="80" w:type="dxa"/>
             </w:tcMar>
+            <w:tcBorders>
+              <w:top w:sz="2" w:val="single" w:color="D4E4E1"/>
+              <w:left w:sz="2" w:val="single" w:color="D4E4E1"/>
+              <w:bottom w:sz="2" w:val="single" w:color="D4E4E1"/>
+              <w:right w:sz="2" w:val="single" w:color="D4E4E1"/>
+            </w:tcBorders>
           </w:tcPr>
           <w:p>
+            <w:pPr>
+              <w:spacing w:before="0" w:after="40" w:line="240" w:lineRule="auto"/>
+            </w:pPr>
             <w:r>
               <w:rPr>
                 <w:rFonts w:ascii="Aptos" w:hAnsi="Aptos" w:eastAsia="Aptos"/>
                 <w:b/>
-                <w:color w:val="0D766C"/>
-                <w:sz w:val="12"/>
+                <w:i w:val="0"/>
+                <w:color w:val="087A73"/>
+                <w:sz w:val="16"/>
               </w:rPr>
-              <w:t>62/62 RECORDED</w:t>
+              <w:t>Application &amp; document intelligence</w:t>
             </w:r>
           </w:p>
           <w:p>
-            <w:r>
-              <w:rPr>
-                <w:rFonts w:ascii="Aptos" w:hAnsi="Aptos" w:eastAsia="Aptos"/>
-                <w:b/>
-                <w:color w:val="14262C"/>
-                <w:sz w:val="18"/>
-              </w:rPr>
-              <w:t>Agent Coordinator</w:t>
-            </w:r>
-          </w:p>
-          <w:p>
+            <w:pPr>
+              <w:spacing w:before="0" w:after="0" w:line="240" w:lineRule="auto"/>
+            </w:pPr>
             <w:r>
               <w:rPr>
                 <w:rFonts w:ascii="Aptos" w:hAnsi="Aptos" w:eastAsia="Aptos"/>
                 <w:b w:val="0"/>
-                <w:color w:val="536A6D"/>
+                <w:i w:val="0"/>
+                <w:color w:val="14232A"/>
                 <w:sz w:val="15"/>
               </w:rPr>
-              <w:t>Deterministic task ownership, dependency order, capacity, stable priority, shared budgets, and explicit refusal.</w:t>
-            </w:r>
-          </w:p>
-          <w:p>
-            <w:r>
-              <w:rPr>
-                <w:rFonts w:ascii="Aptos" w:hAnsi="Aptos" w:eastAsia="Aptos"/>
-                <w:b w:val="0"/>
-                <w:color w:val="536A6D"/>
-                <w:sz w:val="14"/>
-              </w:rPr>
-              <w:t>Recorded Python tests; hosted promotion remains a separate state.</w:t>
+              <w:t>Role research; evidence-qualified resume generation; document extraction; structured artifacts; human and machine presentation layers.</w:t>
             </w:r>
           </w:p>
         </w:tc>
         <w:tc>
           <w:tcPr>
             <w:tcW w:type="dxa" w:w="5429"/>
-            <w:shd w:fill="FFF6E3"/>
+            <w:shd w:fill="EEF6F4"/>
             <w:tcMar>
-              <w:top w:w="100" w:type="dxa"/>
-              <w:start w:w="120" w:type="dxa"/>
-              <w:bottom w:w="100" w:type="dxa"/>
-              <w:end w:w="120" w:type="dxa"/>
+              <w:top w:w="65" w:type="dxa"/>
+              <w:start w:w="80" w:type="dxa"/>
+              <w:bottom w:w="65" w:type="dxa"/>
+              <w:end w:w="80" w:type="dxa"/>
             </w:tcMar>
+            <w:tcBorders>
+              <w:top w:sz="2" w:val="single" w:color="D4E4E1"/>
+              <w:left w:sz="2" w:val="single" w:color="D4E4E1"/>
+              <w:bottom w:sz="2" w:val="single" w:color="D4E4E1"/>
+              <w:right w:sz="2" w:val="single" w:color="D4E4E1"/>
+            </w:tcBorders>
           </w:tcPr>
           <w:p>
+            <w:pPr>
+              <w:spacing w:before="0" w:after="40" w:line="240" w:lineRule="auto"/>
+            </w:pPr>
             <w:r>
               <w:rPr>
                 <w:rFonts w:ascii="Aptos" w:hAnsi="Aptos" w:eastAsia="Aptos"/>
                 <w:b/>
-                <w:color w:val="9A6500"/>
-                <w:sz w:val="12"/>
+                <w:i w:val="0"/>
+                <w:color w:val="087A73"/>
+                <w:sz w:val="16"/>
               </w:rPr>
-              <w:t>EXECUTION BLOCKED</w:t>
+              <w:t>Primary technology</w:t>
             </w:r>
           </w:p>
           <w:p>
+            <w:pPr>
+              <w:spacing w:before="0" w:after="0" w:line="240" w:lineRule="auto"/>
+            </w:pPr>
+            <w:r>
+              <w:rPr>
+                <w:rFonts w:ascii="Aptos" w:hAnsi="Aptos" w:eastAsia="Aptos"/>
+                <w:b w:val="0"/>
+                <w:i w:val="0"/>
+                <w:color w:val="14232A"/>
+                <w:sz w:val="15"/>
+              </w:rPr>
+              <w:t>Python; TypeScript; JavaScript; SQL; Bash; Node.js; React; Next.js; FastAPI; REST; JSON-RPC 2.0; MCP; GitHub Actions; Docker; Vercel.</w:t>
+            </w:r>
+          </w:p>
+        </w:tc>
+      </w:tr>
+    </w:tbl>
+    <w:p>
+      <w:r>
+        <w:br w:type="page"/>
+      </w:r>
+    </w:p>
+    <w:p>
+      <w:pPr>
+        <w:spacing w:before="120" w:after="60" w:line="240" w:lineRule="auto"/>
+        <w:keepNext/>
+        <w:keepLines/>
+        <w:pBdr>
+          <w:bottom w:val="single" w:sz="10" w:space="2" w:color="087A73"/>
+        </w:pBdr>
+      </w:pPr>
+      <w:r>
+        <w:rPr>
+          <w:rFonts w:ascii="Aptos" w:hAnsi="Aptos" w:eastAsia="Aptos"/>
+          <w:b/>
+          <w:i w:val="0"/>
+          <w:color w:val="087A73"/>
+          <w:sz w:val="24"/>
+        </w:rPr>
+        <w:t>SELECTED SYSTEMS AND EVIDENCE STATES</w:t>
+      </w:r>
+    </w:p>
+    <w:tbl>
+      <w:tblPr>
+        <w:tblW w:type="auto" w:w="0"/>
+        <w:jc w:val="center"/>
+        <w:tblLayout w:type="fixed"/>
+        <w:tblLook w:firstColumn="1" w:firstRow="1" w:lastColumn="0" w:lastRow="0" w:noHBand="0" w:noVBand="1" w:val="04A0"/>
+        <w:tblCellSpacing w:w="0" w:type="dxa"/>
+      </w:tblPr>
+      <w:tblGrid>
+        <w:gridCol w:w="5616"/>
+        <w:gridCol w:w="5256"/>
+      </w:tblGrid>
+      <w:tr>
+        <w:tc>
+          <w:tcPr>
+            <w:tcW w:type="dxa" w:w="5429"/>
+            <w:shd w:fill="EEF6F4"/>
+            <w:tcMar>
+              <w:top w:w="65" w:type="dxa"/>
+              <w:start w:w="65" w:type="dxa"/>
+              <w:bottom w:w="65" w:type="dxa"/>
+              <w:end w:w="65" w:type="dxa"/>
+            </w:tcMar>
+            <w:tcBorders>
+              <w:top w:sz="2" w:val="single" w:color="D4E4E1"/>
+              <w:left w:sz="2" w:val="single" w:color="D4E4E1"/>
+              <w:bottom w:sz="2" w:val="single" w:color="D4E4E1"/>
+              <w:right w:sz="2" w:val="single" w:color="D4E4E1"/>
+            </w:tcBorders>
+            <w:vAlign w:val="top"/>
+          </w:tcPr>
+          <w:p>
+            <w:pPr>
+              <w:spacing w:before="0" w:after="20" w:line="240" w:lineRule="auto"/>
+            </w:pPr>
             <w:r>
               <w:rPr>
                 <w:rFonts w:ascii="Aptos" w:hAnsi="Aptos" w:eastAsia="Aptos"/>
                 <w:b/>
-                <w:color w:val="14262C"/>
-                <w:sz w:val="18"/>
+                <w:i w:val="0"/>
+                <w:color w:val="14232A"/>
+                <w:sz w:val="20"/>
+              </w:rPr>
+              <w:t>Portfolio Receipt Router</w:t>
+            </w:r>
+          </w:p>
+          <w:p>
+            <w:pPr>
+              <w:spacing w:before="0" w:after="40" w:line="240" w:lineRule="auto"/>
+            </w:pPr>
+            <w:r>
+              <w:rPr>
+                <w:rFonts w:ascii="Aptos" w:hAnsi="Aptos" w:eastAsia="Aptos"/>
+                <w:b/>
+                <w:i w:val="0"/>
+                <w:color w:val="087A73"/>
+                <w:sz w:val="14"/>
+              </w:rPr>
+              <w:t>TEST VERIFIED</w:t>
+            </w:r>
+          </w:p>
+          <w:p>
+            <w:pPr>
+              <w:spacing w:before="0" w:after="0" w:line="240" w:lineRule="auto"/>
+            </w:pPr>
+            <w:r>
+              <w:rPr>
+                <w:rFonts w:ascii="Aptos" w:hAnsi="Aptos" w:eastAsia="Aptos"/>
+                <w:b w:val="0"/>
+                <w:i w:val="0"/>
+                <w:color w:val="14232A"/>
+                <w:sz w:val="16"/>
+              </w:rPr>
+              <w:t>Compatibility-safe architecture repair and evidence routing.</w:t>
+            </w:r>
+          </w:p>
+        </w:tc>
+        <w:tc>
+          <w:tcPr>
+            <w:tcW w:type="dxa" w:w="5429"/>
+            <w:shd w:fill="EEF6F4"/>
+            <w:tcMar>
+              <w:top w:w="65" w:type="dxa"/>
+              <w:start w:w="65" w:type="dxa"/>
+              <w:bottom w:w="65" w:type="dxa"/>
+              <w:end w:w="65" w:type="dxa"/>
+            </w:tcMar>
+            <w:tcBorders>
+              <w:top w:sz="2" w:val="single" w:color="D4E4E1"/>
+              <w:left w:sz="2" w:val="single" w:color="D4E4E1"/>
+              <w:bottom w:sz="2" w:val="single" w:color="D4E4E1"/>
+              <w:right w:sz="2" w:val="single" w:color="D4E4E1"/>
+            </w:tcBorders>
+            <w:vAlign w:val="top"/>
+          </w:tcPr>
+          <w:p/>
+          <w:p>
+            <w:pPr>
+              <w:spacing w:before="0" w:after="20" w:line="240" w:lineRule="auto"/>
+            </w:pPr>
+            <w:r>
+              <w:rPr>
+                <w:rFonts w:ascii="Aptos" w:hAnsi="Aptos" w:eastAsia="Aptos"/>
+                <w:b/>
+                <w:i w:val="0"/>
+                <w:color w:val="087A73"/>
+                <w:sz w:val="14"/>
+              </w:rPr>
+              <w:t>EVIDENCE</w:t>
+            </w:r>
+          </w:p>
+          <w:p>
+            <w:pPr>
+              <w:spacing w:before="0" w:after="40" w:line="245" w:lineRule="auto"/>
+            </w:pPr>
+            <w:r>
+              <w:rPr>
+                <w:rFonts w:ascii="Aptos" w:hAnsi="Aptos" w:eastAsia="Aptos"/>
+                <w:b w:val="0"/>
+                <w:i w:val="0"/>
+                <w:color w:val="14232A"/>
+                <w:sz w:val="16"/>
+              </w:rPr>
+              <w:t>69/69 tests; direct and reusable CI; artifact 8910423397; zero external actions.</w:t>
+            </w:r>
+          </w:p>
+          <w:p>
+            <w:pPr>
+              <w:spacing w:before="0" w:after="20" w:line="240" w:lineRule="auto"/>
+            </w:pPr>
+            <w:r>
+              <w:rPr>
+                <w:rFonts w:ascii="Aptos" w:hAnsi="Aptos" w:eastAsia="Aptos"/>
+                <w:b/>
+                <w:i w:val="0"/>
+                <w:color w:val="A56600"/>
+                <w:sz w:val="14"/>
+              </w:rPr>
+              <w:t>BOUNDARY</w:t>
+            </w:r>
+          </w:p>
+          <w:p>
+            <w:pPr>
+              <w:spacing w:before="0" w:after="40" w:line="245" w:lineRule="auto"/>
+            </w:pPr>
+            <w:r>
+              <w:rPr>
+                <w:rFonts w:ascii="Aptos" w:hAnsi="Aptos" w:eastAsia="Aptos"/>
+                <w:b w:val="0"/>
+                <w:i w:val="0"/>
+                <w:color w:val="5B6D75"/>
+                <w:sz w:val="15"/>
+              </w:rPr>
+              <w:t>Independent technical exhibit; no datacenter control, company affiliation, or production-operation claim.</w:t>
+            </w:r>
+          </w:p>
+        </w:tc>
+      </w:tr>
+      <w:tr>
+        <w:tc>
+          <w:tcPr>
+            <w:tcW w:type="dxa" w:w="5429"/>
+            <w:shd w:fill="F7FAF9"/>
+            <w:tcMar>
+              <w:top w:w="65" w:type="dxa"/>
+              <w:start w:w="65" w:type="dxa"/>
+              <w:bottom w:w="65" w:type="dxa"/>
+              <w:end w:w="65" w:type="dxa"/>
+            </w:tcMar>
+            <w:tcBorders>
+              <w:top w:sz="2" w:val="single" w:color="D4E4E1"/>
+              <w:left w:sz="2" w:val="single" w:color="D4E4E1"/>
+              <w:bottom w:sz="2" w:val="single" w:color="D4E4E1"/>
+              <w:right w:sz="2" w:val="single" w:color="D4E4E1"/>
+            </w:tcBorders>
+            <w:vAlign w:val="top"/>
+          </w:tcPr>
+          <w:p>
+            <w:pPr>
+              <w:spacing w:before="0" w:after="20" w:line="240" w:lineRule="auto"/>
+            </w:pPr>
+            <w:r>
+              <w:rPr>
+                <w:rFonts w:ascii="Aptos" w:hAnsi="Aptos" w:eastAsia="Aptos"/>
+                <w:b/>
+                <w:i w:val="0"/>
+                <w:color w:val="14232A"/>
+                <w:sz w:val="20"/>
+              </w:rPr>
+              <w:t>Job Application Helix</w:t>
+            </w:r>
+          </w:p>
+          <w:p>
+            <w:pPr>
+              <w:spacing w:before="0" w:after="40" w:line="240" w:lineRule="auto"/>
+            </w:pPr>
+            <w:r>
+              <w:rPr>
+                <w:rFonts w:ascii="Aptos" w:hAnsi="Aptos" w:eastAsia="Aptos"/>
+                <w:b/>
+                <w:i w:val="0"/>
+                <w:color w:val="087A73"/>
+                <w:sz w:val="14"/>
+              </w:rPr>
+              <w:t>RECORDED 148/148</w:t>
+            </w:r>
+          </w:p>
+          <w:p>
+            <w:pPr>
+              <w:spacing w:before="0" w:after="0" w:line="240" w:lineRule="auto"/>
+            </w:pPr>
+            <w:r>
+              <w:rPr>
+                <w:rFonts w:ascii="Aptos" w:hAnsi="Aptos" w:eastAsia="Aptos"/>
+                <w:b w:val="0"/>
+                <w:i w:val="0"/>
+                <w:color w:val="14232A"/>
+                <w:sz w:val="16"/>
+              </w:rPr>
+              <w:t>Evidence-governed hiring and portfolio orchestration.</w:t>
+            </w:r>
+          </w:p>
+        </w:tc>
+        <w:tc>
+          <w:tcPr>
+            <w:tcW w:type="dxa" w:w="5429"/>
+            <w:shd w:fill="F7FAF9"/>
+            <w:tcMar>
+              <w:top w:w="65" w:type="dxa"/>
+              <w:start w:w="65" w:type="dxa"/>
+              <w:bottom w:w="65" w:type="dxa"/>
+              <w:end w:w="65" w:type="dxa"/>
+            </w:tcMar>
+            <w:tcBorders>
+              <w:top w:sz="2" w:val="single" w:color="D4E4E1"/>
+              <w:left w:sz="2" w:val="single" w:color="D4E4E1"/>
+              <w:bottom w:sz="2" w:val="single" w:color="D4E4E1"/>
+              <w:right w:sz="2" w:val="single" w:color="D4E4E1"/>
+            </w:tcBorders>
+            <w:vAlign w:val="top"/>
+          </w:tcPr>
+          <w:p/>
+          <w:p>
+            <w:pPr>
+              <w:spacing w:before="0" w:after="20" w:line="240" w:lineRule="auto"/>
+            </w:pPr>
+            <w:r>
+              <w:rPr>
+                <w:rFonts w:ascii="Aptos" w:hAnsi="Aptos" w:eastAsia="Aptos"/>
+                <w:b/>
+                <w:i w:val="0"/>
+                <w:color w:val="087A73"/>
+                <w:sz w:val="14"/>
+              </w:rPr>
+              <w:t>EVIDENCE</w:t>
+            </w:r>
+          </w:p>
+          <w:p>
+            <w:pPr>
+              <w:spacing w:before="0" w:after="40" w:line="245" w:lineRule="auto"/>
+            </w:pPr>
+            <w:r>
+              <w:rPr>
+                <w:rFonts w:ascii="Aptos" w:hAnsi="Aptos" w:eastAsia="Aptos"/>
+                <w:b w:val="0"/>
+                <w:i w:val="0"/>
+                <w:color w:val="14232A"/>
+                <w:sz w:val="16"/>
+              </w:rPr>
+              <w:t>148/148 recorded repository tests.</w:t>
+            </w:r>
+          </w:p>
+          <w:p>
+            <w:pPr>
+              <w:spacing w:before="0" w:after="20" w:line="240" w:lineRule="auto"/>
+            </w:pPr>
+            <w:r>
+              <w:rPr>
+                <w:rFonts w:ascii="Aptos" w:hAnsi="Aptos" w:eastAsia="Aptos"/>
+                <w:b/>
+                <w:i w:val="0"/>
+                <w:color w:val="A56600"/>
+                <w:sz w:val="14"/>
+              </w:rPr>
+              <w:t>BOUNDARY</w:t>
+            </w:r>
+          </w:p>
+          <w:p>
+            <w:pPr>
+              <w:spacing w:before="0" w:after="40" w:line="245" w:lineRule="auto"/>
+            </w:pPr>
+            <w:r>
+              <w:rPr>
+                <w:rFonts w:ascii="Aptos" w:hAnsi="Aptos" w:eastAsia="Aptos"/>
+                <w:b w:val="0"/>
+                <w:i w:val="0"/>
+                <w:color w:val="5B6D75"/>
+                <w:sz w:val="15"/>
+              </w:rPr>
+              <w:t>Release-specific current-SHA and deployment gates remain separate.</w:t>
+            </w:r>
+          </w:p>
+        </w:tc>
+      </w:tr>
+      <w:tr>
+        <w:tc>
+          <w:tcPr>
+            <w:tcW w:type="dxa" w:w="5429"/>
+            <w:shd w:fill="EEF6F4"/>
+            <w:tcMar>
+              <w:top w:w="65" w:type="dxa"/>
+              <w:start w:w="65" w:type="dxa"/>
+              <w:bottom w:w="65" w:type="dxa"/>
+              <w:end w:w="65" w:type="dxa"/>
+            </w:tcMar>
+            <w:tcBorders>
+              <w:top w:sz="2" w:val="single" w:color="D4E4E1"/>
+              <w:left w:sz="2" w:val="single" w:color="D4E4E1"/>
+              <w:bottom w:sz="2" w:val="single" w:color="D4E4E1"/>
+              <w:right w:sz="2" w:val="single" w:color="D4E4E1"/>
+            </w:tcBorders>
+            <w:vAlign w:val="top"/>
+          </w:tcPr>
+          <w:p>
+            <w:pPr>
+              <w:spacing w:before="0" w:after="20" w:line="240" w:lineRule="auto"/>
+            </w:pPr>
+            <w:r>
+              <w:rPr>
+                <w:rFonts w:ascii="Aptos" w:hAnsi="Aptos" w:eastAsia="Aptos"/>
+                <w:b/>
+                <w:i w:val="0"/>
+                <w:color w:val="14232A"/>
+                <w:sz w:val="20"/>
+              </w:rPr>
+              <w:t>Agent Coordinator</w:t>
+            </w:r>
+          </w:p>
+          <w:p>
+            <w:pPr>
+              <w:spacing w:before="0" w:after="40" w:line="240" w:lineRule="auto"/>
+            </w:pPr>
+            <w:r>
+              <w:rPr>
+                <w:rFonts w:ascii="Aptos" w:hAnsi="Aptos" w:eastAsia="Aptos"/>
+                <w:b/>
+                <w:i w:val="0"/>
+                <w:color w:val="087A73"/>
+                <w:sz w:val="14"/>
+              </w:rPr>
+              <w:t>RECORDED 62/62</w:t>
+            </w:r>
+          </w:p>
+          <w:p>
+            <w:pPr>
+              <w:spacing w:before="0" w:after="0" w:line="240" w:lineRule="auto"/>
+            </w:pPr>
+            <w:r>
+              <w:rPr>
+                <w:rFonts w:ascii="Aptos" w:hAnsi="Aptos" w:eastAsia="Aptos"/>
+                <w:b w:val="0"/>
+                <w:i w:val="0"/>
+                <w:color w:val="14232A"/>
+                <w:sz w:val="16"/>
+              </w:rPr>
+              <w:t>Deterministic task ownership, dependencies, capacity, priority, and shared budgets.</w:t>
+            </w:r>
+          </w:p>
+        </w:tc>
+        <w:tc>
+          <w:tcPr>
+            <w:tcW w:type="dxa" w:w="5429"/>
+            <w:shd w:fill="EEF6F4"/>
+            <w:tcMar>
+              <w:top w:w="65" w:type="dxa"/>
+              <w:start w:w="65" w:type="dxa"/>
+              <w:bottom w:w="65" w:type="dxa"/>
+              <w:end w:w="65" w:type="dxa"/>
+            </w:tcMar>
+            <w:tcBorders>
+              <w:top w:sz="2" w:val="single" w:color="D4E4E1"/>
+              <w:left w:sz="2" w:val="single" w:color="D4E4E1"/>
+              <w:bottom w:sz="2" w:val="single" w:color="D4E4E1"/>
+              <w:right w:sz="2" w:val="single" w:color="D4E4E1"/>
+            </w:tcBorders>
+            <w:vAlign w:val="top"/>
+          </w:tcPr>
+          <w:p/>
+          <w:p>
+            <w:pPr>
+              <w:spacing w:before="0" w:after="20" w:line="240" w:lineRule="auto"/>
+            </w:pPr>
+            <w:r>
+              <w:rPr>
+                <w:rFonts w:ascii="Aptos" w:hAnsi="Aptos" w:eastAsia="Aptos"/>
+                <w:b/>
+                <w:i w:val="0"/>
+                <w:color w:val="087A73"/>
+                <w:sz w:val="14"/>
+              </w:rPr>
+              <w:t>EVIDENCE</w:t>
+            </w:r>
+          </w:p>
+          <w:p>
+            <w:pPr>
+              <w:spacing w:before="0" w:after="40" w:line="245" w:lineRule="auto"/>
+            </w:pPr>
+            <w:r>
+              <w:rPr>
+                <w:rFonts w:ascii="Aptos" w:hAnsi="Aptos" w:eastAsia="Aptos"/>
+                <w:b w:val="0"/>
+                <w:i w:val="0"/>
+                <w:color w:val="14232A"/>
+                <w:sz w:val="16"/>
+              </w:rPr>
+              <w:t>62/62 recorded Python tests.</w:t>
+            </w:r>
+          </w:p>
+          <w:p>
+            <w:pPr>
+              <w:spacing w:before="0" w:after="20" w:line="240" w:lineRule="auto"/>
+            </w:pPr>
+            <w:r>
+              <w:rPr>
+                <w:rFonts w:ascii="Aptos" w:hAnsi="Aptos" w:eastAsia="Aptos"/>
+                <w:b/>
+                <w:i w:val="0"/>
+                <w:color w:val="A56600"/>
+                <w:sz w:val="14"/>
+              </w:rPr>
+              <w:t>BOUNDARY</w:t>
+            </w:r>
+          </w:p>
+          <w:p>
+            <w:pPr>
+              <w:spacing w:before="0" w:after="40" w:line="245" w:lineRule="auto"/>
+            </w:pPr>
+            <w:r>
+              <w:rPr>
+                <w:rFonts w:ascii="Aptos" w:hAnsi="Aptos" w:eastAsia="Aptos"/>
+                <w:b w:val="0"/>
+                <w:i w:val="0"/>
+                <w:color w:val="5B6D75"/>
+                <w:sz w:val="15"/>
+              </w:rPr>
+              <w:t>Hosted matrix and build-wheel promotion remain open.</w:t>
+            </w:r>
+          </w:p>
+        </w:tc>
+      </w:tr>
+      <w:tr>
+        <w:tc>
+          <w:tcPr>
+            <w:tcW w:type="dxa" w:w="5429"/>
+            <w:shd w:fill="F7FAF9"/>
+            <w:tcMar>
+              <w:top w:w="65" w:type="dxa"/>
+              <w:start w:w="65" w:type="dxa"/>
+              <w:bottom w:w="65" w:type="dxa"/>
+              <w:end w:w="65" w:type="dxa"/>
+            </w:tcMar>
+            <w:tcBorders>
+              <w:top w:sz="2" w:val="single" w:color="D4E4E1"/>
+              <w:left w:sz="2" w:val="single" w:color="D4E4E1"/>
+              <w:bottom w:sz="2" w:val="single" w:color="D4E4E1"/>
+              <w:right w:sz="2" w:val="single" w:color="D4E4E1"/>
+            </w:tcBorders>
+            <w:vAlign w:val="top"/>
+          </w:tcPr>
+          <w:p>
+            <w:pPr>
+              <w:spacing w:before="0" w:after="20" w:line="240" w:lineRule="auto"/>
+            </w:pPr>
+            <w:r>
+              <w:rPr>
+                <w:rFonts w:ascii="Aptos" w:hAnsi="Aptos" w:eastAsia="Aptos"/>
+                <w:b/>
+                <w:i w:val="0"/>
+                <w:color w:val="14232A"/>
+                <w:sz w:val="20"/>
               </w:rPr>
               <w:t>Microcode Governance</w:t>
             </w:r>
           </w:p>
           <w:p>
+            <w:pPr>
+              <w:spacing w:before="0" w:after="40" w:line="240" w:lineRule="auto"/>
+            </w:pPr>
+            <w:r>
+              <w:rPr>
+                <w:rFonts w:ascii="Aptos" w:hAnsi="Aptos" w:eastAsia="Aptos"/>
+                <w:b/>
+                <w:i w:val="0"/>
+                <w:color w:val="A56600"/>
+                <w:sz w:val="14"/>
+              </w:rPr>
+              <w:t>REVIEWED - EXECUTION BLOCKED</w:t>
+            </w:r>
+          </w:p>
+          <w:p>
+            <w:pPr>
+              <w:spacing w:before="0" w:after="0" w:line="240" w:lineRule="auto"/>
+            </w:pPr>
             <w:r>
               <w:rPr>
                 <w:rFonts w:ascii="Aptos" w:hAnsi="Aptos" w:eastAsia="Aptos"/>
                 <w:b w:val="0"/>
-                <w:color w:val="536A6D"/>
-                <w:sz w:val="15"/>
+                <w:i w:val="0"/>
+                <w:color w:val="14232A"/>
+                <w:sz w:val="16"/>
               </w:rPr>
               <w:t>Firmware manifests, drift, SBOMs, provenance, compatibility policy, and approval-gated rollout planning.</w:t>
             </w:r>
           </w:p>
+        </w:tc>
+        <w:tc>
+          <w:tcPr>
+            <w:tcW w:type="dxa" w:w="5429"/>
+            <w:shd w:fill="F7FAF9"/>
+            <w:tcMar>
+              <w:top w:w="65" w:type="dxa"/>
+              <w:start w:w="65" w:type="dxa"/>
+              <w:bottom w:w="65" w:type="dxa"/>
+              <w:end w:w="65" w:type="dxa"/>
+            </w:tcMar>
+            <w:tcBorders>
+              <w:top w:sz="2" w:val="single" w:color="D4E4E1"/>
+              <w:left w:sz="2" w:val="single" w:color="D4E4E1"/>
+              <w:bottom w:sz="2" w:val="single" w:color="D4E4E1"/>
+              <w:right w:sz="2" w:val="single" w:color="D4E4E1"/>
+            </w:tcBorders>
+            <w:vAlign w:val="top"/>
+          </w:tcPr>
+          <w:p/>
           <w:p>
+            <w:pPr>
+              <w:spacing w:before="0" w:after="20" w:line="240" w:lineRule="auto"/>
+            </w:pPr>
+            <w:r>
+              <w:rPr>
+                <w:rFonts w:ascii="Aptos" w:hAnsi="Aptos" w:eastAsia="Aptos"/>
+                <w:b/>
+                <w:i w:val="0"/>
+                <w:color w:val="087A73"/>
+                <w:sz w:val="14"/>
+              </w:rPr>
+              <w:t>EVIDENCE</w:t>
+            </w:r>
+          </w:p>
+          <w:p>
+            <w:pPr>
+              <w:spacing w:before="0" w:after="40" w:line="245" w:lineRule="auto"/>
+            </w:pPr>
             <w:r>
               <w:rPr>
                 <w:rFonts w:ascii="Aptos" w:hAnsi="Aptos" w:eastAsia="Aptos"/>
                 <w:b w:val="0"/>
-                <w:color w:val="536A6D"/>
+                <w:i w:val="0"/>
+                <w:color w:val="14232A"/>
+                <w:sz w:val="16"/>
+              </w:rPr>
+              <w:t>132-check generated contract; static review found no critical defect.</w:t>
+            </w:r>
+          </w:p>
+          <w:p>
+            <w:pPr>
+              <w:spacing w:before="0" w:after="20" w:line="240" w:lineRule="auto"/>
+            </w:pPr>
+            <w:r>
+              <w:rPr>
+                <w:rFonts w:ascii="Aptos" w:hAnsi="Aptos" w:eastAsia="Aptos"/>
+                <w:b/>
+                <w:i w:val="0"/>
+                <w:color w:val="A56600"/>
                 <w:sz w:val="14"/>
               </w:rPr>
-              <w:t>Reviewed; private CI failed before runner execution; not represented as test verified.</w:t>
+              <w:t>BOUNDARY</w:t>
+            </w:r>
+          </w:p>
+          <w:p>
+            <w:pPr>
+              <w:spacing w:before="0" w:after="40" w:line="245" w:lineRule="auto"/>
+            </w:pPr>
+            <w:r>
+              <w:rPr>
+                <w:rFonts w:ascii="Aptos" w:hAnsi="Aptos" w:eastAsia="Aptos"/>
+                <w:b w:val="0"/>
+                <w:i w:val="0"/>
+                <w:color w:val="5B6D75"/>
+                <w:sz w:val="15"/>
+              </w:rPr>
+              <w:t>Private CI did not execute; not test verified and performs no firmware mutation.</w:t>
+            </w:r>
+          </w:p>
+        </w:tc>
+      </w:tr>
+      <w:tr>
+        <w:tc>
+          <w:tcPr>
+            <w:tcW w:type="dxa" w:w="5429"/>
+            <w:shd w:fill="EEF6F4"/>
+            <w:tcMar>
+              <w:top w:w="65" w:type="dxa"/>
+              <w:start w:w="65" w:type="dxa"/>
+              <w:bottom w:w="65" w:type="dxa"/>
+              <w:end w:w="65" w:type="dxa"/>
+            </w:tcMar>
+            <w:tcBorders>
+              <w:top w:sz="2" w:val="single" w:color="D4E4E1"/>
+              <w:left w:sz="2" w:val="single" w:color="D4E4E1"/>
+              <w:bottom w:sz="2" w:val="single" w:color="D4E4E1"/>
+              <w:right w:sz="2" w:val="single" w:color="D4E4E1"/>
+            </w:tcBorders>
+            <w:vAlign w:val="top"/>
+          </w:tcPr>
+          <w:p>
+            <w:pPr>
+              <w:spacing w:before="0" w:after="20" w:line="240" w:lineRule="auto"/>
+            </w:pPr>
+            <w:r>
+              <w:rPr>
+                <w:rFonts w:ascii="Aptos" w:hAnsi="Aptos" w:eastAsia="Aptos"/>
+                <w:b/>
+                <w:i w:val="0"/>
+                <w:color w:val="14232A"/>
+                <w:sz w:val="20"/>
+              </w:rPr>
+              <w:t>PSYSOC-X</w:t>
+            </w:r>
+          </w:p>
+          <w:p>
+            <w:pPr>
+              <w:spacing w:before="0" w:after="40" w:line="240" w:lineRule="auto"/>
+            </w:pPr>
+            <w:r>
+              <w:rPr>
+                <w:rFonts w:ascii="Aptos" w:hAnsi="Aptos" w:eastAsia="Aptos"/>
+                <w:b/>
+                <w:i w:val="0"/>
+                <w:color w:val="087A73"/>
+                <w:sz w:val="14"/>
+              </w:rPr>
+              <w:t>BOUNDED TEST SCOPE</w:t>
+            </w:r>
+          </w:p>
+          <w:p>
+            <w:pPr>
+              <w:spacing w:before="0" w:after="0" w:line="240" w:lineRule="auto"/>
+            </w:pPr>
+            <w:r>
+              <w:rPr>
+                <w:rFonts w:ascii="Aptos" w:hAnsi="Aptos" w:eastAsia="Aptos"/>
+                <w:b w:val="0"/>
+                <w:i w:val="0"/>
+                <w:color w:val="14232A"/>
+                <w:sz w:val="16"/>
+              </w:rPr>
+              <w:t>Audience calibration across recruiter, master, machine, and relationship views.</w:t>
+            </w:r>
+          </w:p>
+        </w:tc>
+        <w:tc>
+          <w:tcPr>
+            <w:tcW w:type="dxa" w:w="5429"/>
+            <w:shd w:fill="EEF6F4"/>
+            <w:tcMar>
+              <w:top w:w="65" w:type="dxa"/>
+              <w:start w:w="65" w:type="dxa"/>
+              <w:bottom w:w="65" w:type="dxa"/>
+              <w:end w:w="65" w:type="dxa"/>
+            </w:tcMar>
+            <w:tcBorders>
+              <w:top w:sz="2" w:val="single" w:color="D4E4E1"/>
+              <w:left w:sz="2" w:val="single" w:color="D4E4E1"/>
+              <w:bottom w:sz="2" w:val="single" w:color="D4E4E1"/>
+              <w:right w:sz="2" w:val="single" w:color="D4E4E1"/>
+            </w:tcBorders>
+            <w:vAlign w:val="top"/>
+          </w:tcPr>
+          <w:p/>
+          <w:p>
+            <w:pPr>
+              <w:spacing w:before="0" w:after="20" w:line="240" w:lineRule="auto"/>
+            </w:pPr>
+            <w:r>
+              <w:rPr>
+                <w:rFonts w:ascii="Aptos" w:hAnsi="Aptos" w:eastAsia="Aptos"/>
+                <w:b/>
+                <w:i w:val="0"/>
+                <w:color w:val="087A73"/>
+                <w:sz w:val="14"/>
+              </w:rPr>
+              <w:t>EVIDENCE</w:t>
+            </w:r>
+          </w:p>
+          <w:p>
+            <w:pPr>
+              <w:spacing w:before="0" w:after="40" w:line="245" w:lineRule="auto"/>
+            </w:pPr>
+            <w:r>
+              <w:rPr>
+                <w:rFonts w:ascii="Aptos" w:hAnsi="Aptos" w:eastAsia="Aptos"/>
+                <w:b w:val="0"/>
+                <w:i w:val="0"/>
+                <w:color w:val="14232A"/>
+                <w:sz w:val="16"/>
+              </w:rPr>
+              <w:t>Deterministic profile and invariant cases.</w:t>
+            </w:r>
+          </w:p>
+          <w:p>
+            <w:pPr>
+              <w:spacing w:before="0" w:after="20" w:line="240" w:lineRule="auto"/>
+            </w:pPr>
+            <w:r>
+              <w:rPr>
+                <w:rFonts w:ascii="Aptos" w:hAnsi="Aptos" w:eastAsia="Aptos"/>
+                <w:b/>
+                <w:i w:val="0"/>
+                <w:color w:val="A56600"/>
+                <w:sz w:val="14"/>
+              </w:rPr>
+              <w:t>BOUNDARY</w:t>
+            </w:r>
+          </w:p>
+          <w:p>
+            <w:pPr>
+              <w:spacing w:before="0" w:after="40" w:line="245" w:lineRule="auto"/>
+            </w:pPr>
+            <w:r>
+              <w:rPr>
+                <w:rFonts w:ascii="Aptos" w:hAnsi="Aptos" w:eastAsia="Aptos"/>
+                <w:b w:val="0"/>
+                <w:i w:val="0"/>
+                <w:color w:val="5B6D75"/>
+                <w:sz w:val="15"/>
+              </w:rPr>
+              <w:t>No diagnosis, covert persuasion, or manipulation capability is claimed.</w:t>
             </w:r>
           </w:p>
         </w:tc>
@@ -597,74 +1955,304 @@
     </w:tbl>
     <w:p>
       <w:pPr>
-        <w:spacing w:before="160" w:after="40"/>
+        <w:spacing w:before="120" w:after="60" w:line="240" w:lineRule="auto"/>
+        <w:keepNext/>
+        <w:keepLines/>
+        <w:pBdr>
+          <w:bottom w:val="single" w:sz="10" w:space="2" w:color="087A73"/>
+        </w:pBdr>
       </w:pPr>
       <w:r>
         <w:rPr>
           <w:rFonts w:ascii="Aptos" w:hAnsi="Aptos" w:eastAsia="Aptos"/>
           <w:b/>
-          <w:color w:val="0D766C"/>
-          <w:sz w:val="14"/>
+          <w:i w:val="0"/>
+          <w:color w:val="087A73"/>
+          <w:sz w:val="24"/>
         </w:rPr>
-        <w:t>EXPERIENCE</w:t>
-      </w:r>
-    </w:p>
-    <w:p>
-      <w:pPr>
-        <w:spacing w:after="100"/>
-      </w:pPr>
-      <w:r>
-        <w:rPr>
-          <w:rFonts w:ascii="Aptos" w:hAnsi="Aptos" w:eastAsia="Aptos"/>
-          <w:b/>
-          <w:color w:val="12272D"/>
-          <w:sz w:val="30"/>
-        </w:rPr>
-        <w:t>Software architecture grounded in real systems.</w:t>
+        <w:t>CROSS-DOMAIN SYSTEMS FOUNDATION</w:t>
       </w:r>
     </w:p>
     <w:tbl>
       <w:tblPr>
         <w:tblW w:type="auto" w:w="0"/>
+        <w:jc w:val="center"/>
+        <w:tblLayout w:type="fixed"/>
         <w:tblLook w:firstColumn="1" w:firstRow="1" w:lastColumn="0" w:lastRow="0" w:noHBand="0" w:noVBand="1" w:val="04A0"/>
+        <w:tblCellSpacing w:w="0" w:type="dxa"/>
       </w:tblPr>
       <w:tblGrid>
-        <w:gridCol w:w="8352"/>
-        <w:gridCol w:w="1872"/>
+        <w:gridCol w:w="3024"/>
+        <w:gridCol w:w="7848"/>
       </w:tblGrid>
       <w:tr>
         <w:tc>
           <w:tcPr>
             <w:tcW w:type="dxa" w:w="5429"/>
+            <w:shd w:fill="EEF6F4"/>
+            <w:tcMar>
+              <w:top w:w="55" w:type="dxa"/>
+              <w:start w:w="65" w:type="dxa"/>
+              <w:bottom w:w="55" w:type="dxa"/>
+              <w:end w:w="65" w:type="dxa"/>
+            </w:tcMar>
+            <w:tcBorders>
+              <w:top w:sz="2" w:val="single" w:color="D4E4E1"/>
+              <w:left w:sz="2" w:val="single" w:color="D4E4E1"/>
+              <w:bottom w:sz="2" w:val="single" w:color="D4E4E1"/>
+              <w:right w:sz="2" w:val="single" w:color="D4E4E1"/>
+            </w:tcBorders>
           </w:tcPr>
           <w:p>
+            <w:pPr>
+              <w:spacing w:before="0" w:after="0" w:line="240" w:lineRule="auto"/>
+            </w:pPr>
             <w:r>
               <w:rPr>
                 <w:rFonts w:ascii="Aptos" w:hAnsi="Aptos" w:eastAsia="Aptos"/>
                 <w:b/>
-                <w:color w:val="14262C"/>
-                <w:sz w:val="18"/>
+                <w:i w:val="0"/>
+                <w:color w:val="087A73"/>
+                <w:sz w:val="16"/>
               </w:rPr>
-              <w:t>GlacierEQ - Founder / Applied AI Systems Builder</w:t>
+              <w:t>Scientific measurement</w:t>
             </w:r>
           </w:p>
         </w:tc>
         <w:tc>
           <w:tcPr>
             <w:tcW w:type="dxa" w:w="5429"/>
+            <w:shd w:fill="EEF6F4"/>
+            <w:tcMar>
+              <w:top w:w="55" w:type="dxa"/>
+              <w:start w:w="65" w:type="dxa"/>
+              <w:bottom w:w="55" w:type="dxa"/>
+              <w:end w:w="65" w:type="dxa"/>
+            </w:tcMar>
+            <w:tcBorders>
+              <w:top w:sz="2" w:val="single" w:color="D4E4E1"/>
+              <w:left w:sz="2" w:val="single" w:color="D4E4E1"/>
+              <w:bottom w:sz="2" w:val="single" w:color="D4E4E1"/>
+              <w:right w:sz="2" w:val="single" w:color="D4E4E1"/>
+            </w:tcBorders>
           </w:tcPr>
           <w:p>
             <w:pPr>
-              <w:jc w:val="right"/>
+              <w:spacing w:before="0" w:after="0" w:line="240" w:lineRule="auto"/>
+            </w:pPr>
+            <w:r>
+              <w:rPr>
+                <w:rFonts w:ascii="Aptos" w:hAnsi="Aptos" w:eastAsia="Aptos"/>
+                <w:b w:val="0"/>
+                <w:i w:val="0"/>
+                <w:color w:val="14232A"/>
+                <w:sz w:val="16"/>
+              </w:rPr>
+              <w:t>University of Hawaii sea-urchin morphometric research, 2016-2017: processed physical measurements of gill structures to support visual species identification.</w:t>
+            </w:r>
+          </w:p>
+        </w:tc>
+      </w:tr>
+      <w:tr>
+        <w:tc>
+          <w:tcPr>
+            <w:tcW w:type="dxa" w:w="5429"/>
+            <w:shd w:fill="F7FAF9"/>
+            <w:tcMar>
+              <w:top w:w="55" w:type="dxa"/>
+              <w:start w:w="65" w:type="dxa"/>
+              <w:bottom w:w="55" w:type="dxa"/>
+              <w:end w:w="65" w:type="dxa"/>
+            </w:tcMar>
+            <w:tcBorders>
+              <w:top w:sz="2" w:val="single" w:color="D4E4E1"/>
+              <w:left w:sz="2" w:val="single" w:color="D4E4E1"/>
+              <w:bottom w:sz="2" w:val="single" w:color="D4E4E1"/>
+              <w:right w:sz="2" w:val="single" w:color="D4E4E1"/>
+            </w:tcBorders>
+          </w:tcPr>
+          <w:p>
+            <w:pPr>
+              <w:spacing w:before="0" w:after="0" w:line="240" w:lineRule="auto"/>
             </w:pPr>
             <w:r>
               <w:rPr>
                 <w:rFonts w:ascii="Aptos" w:hAnsi="Aptos" w:eastAsia="Aptos"/>
                 <w:b/>
-                <w:color w:val="0D766C"/>
-                <w:sz w:val="15"/>
+                <w:i w:val="0"/>
+                <w:color w:val="087A73"/>
+                <w:sz w:val="16"/>
               </w:rPr>
-              <w:t>Jan 2025-Present</w:t>
+              <w:t>Compressed-gas systems</w:t>
+            </w:r>
+          </w:p>
+        </w:tc>
+        <w:tc>
+          <w:tcPr>
+            <w:tcW w:type="dxa" w:w="5429"/>
+            <w:shd w:fill="F7FAF9"/>
+            <w:tcMar>
+              <w:top w:w="55" w:type="dxa"/>
+              <w:start w:w="65" w:type="dxa"/>
+              <w:bottom w:w="55" w:type="dxa"/>
+              <w:end w:w="65" w:type="dxa"/>
+            </w:tcMar>
+            <w:tcBorders>
+              <w:top w:sz="2" w:val="single" w:color="D4E4E1"/>
+              <w:left w:sz="2" w:val="single" w:color="D4E4E1"/>
+              <w:bottom w:sz="2" w:val="single" w:color="D4E4E1"/>
+              <w:right w:sz="2" w:val="single" w:color="D4E4E1"/>
+            </w:tcBorders>
+          </w:tcPr>
+          <w:p>
+            <w:pPr>
+              <w:spacing w:before="0" w:after="0" w:line="240" w:lineRule="auto"/>
+            </w:pPr>
+            <w:r>
+              <w:rPr>
+                <w:rFonts w:ascii="Aptos" w:hAnsi="Aptos" w:eastAsia="Aptos"/>
+                <w:b w:val="0"/>
+                <w:i w:val="0"/>
+                <w:color w:val="14232A"/>
+                <w:sz w:val="16"/>
+              </w:rPr>
+              <w:t>Scuba Tank Technician, Hawaiian Diving Adventures and UH Dive Office, 2016-2017: tank filling, transport, inspection and repair support, and gas mixing under safety-critical procedures.</w:t>
+            </w:r>
+          </w:p>
+        </w:tc>
+      </w:tr>
+      <w:tr>
+        <w:tc>
+          <w:tcPr>
+            <w:tcW w:type="dxa" w:w="5429"/>
+            <w:shd w:fill="EEF6F4"/>
+            <w:tcMar>
+              <w:top w:w="55" w:type="dxa"/>
+              <w:start w:w="65" w:type="dxa"/>
+              <w:bottom w:w="55" w:type="dxa"/>
+              <w:end w:w="65" w:type="dxa"/>
+            </w:tcMar>
+            <w:tcBorders>
+              <w:top w:sz="2" w:val="single" w:color="D4E4E1"/>
+              <w:left w:sz="2" w:val="single" w:color="D4E4E1"/>
+              <w:bottom w:sz="2" w:val="single" w:color="D4E4E1"/>
+              <w:right w:sz="2" w:val="single" w:color="D4E4E1"/>
+            </w:tcBorders>
+          </w:tcPr>
+          <w:p>
+            <w:pPr>
+              <w:spacing w:before="0" w:after="0" w:line="240" w:lineRule="auto"/>
+            </w:pPr>
+            <w:r>
+              <w:rPr>
+                <w:rFonts w:ascii="Aptos" w:hAnsi="Aptos" w:eastAsia="Aptos"/>
+                <w:b/>
+                <w:i w:val="0"/>
+                <w:color w:val="087A73"/>
+                <w:sz w:val="16"/>
+              </w:rPr>
+              <w:t>Field systems operations</w:t>
+            </w:r>
+          </w:p>
+        </w:tc>
+        <w:tc>
+          <w:tcPr>
+            <w:tcW w:type="dxa" w:w="5429"/>
+            <w:shd w:fill="EEF6F4"/>
+            <w:tcMar>
+              <w:top w:w="55" w:type="dxa"/>
+              <w:start w:w="65" w:type="dxa"/>
+              <w:bottom w:w="55" w:type="dxa"/>
+              <w:end w:w="65" w:type="dxa"/>
+            </w:tcMar>
+            <w:tcBorders>
+              <w:top w:sz="2" w:val="single" w:color="D4E4E1"/>
+              <w:left w:sz="2" w:val="single" w:color="D4E4E1"/>
+              <w:bottom w:sz="2" w:val="single" w:color="D4E4E1"/>
+              <w:right w:sz="2" w:val="single" w:color="D4E4E1"/>
+            </w:tcBorders>
+          </w:tcPr>
+          <w:p>
+            <w:pPr>
+              <w:spacing w:before="0" w:after="0" w:line="240" w:lineRule="auto"/>
+            </w:pPr>
+            <w:r>
+              <w:rPr>
+                <w:rFonts w:ascii="Aptos" w:hAnsi="Aptos" w:eastAsia="Aptos"/>
+                <w:b w:val="0"/>
+                <w:i w:val="0"/>
+                <w:color w:val="14232A"/>
+                <w:sz w:val="16"/>
+              </w:rPr>
+              <w:t>Residential inspection and repair work developed practical judgment around interacting systems, failure consequences, uncertainty, and clear client communication.</w:t>
+            </w:r>
+          </w:p>
+        </w:tc>
+      </w:tr>
+      <w:tr>
+        <w:tc>
+          <w:tcPr>
+            <w:tcW w:type="dxa" w:w="5429"/>
+            <w:shd w:fill="F7FAF9"/>
+            <w:tcMar>
+              <w:top w:w="55" w:type="dxa"/>
+              <w:start w:w="65" w:type="dxa"/>
+              <w:bottom w:w="55" w:type="dxa"/>
+              <w:end w:w="65" w:type="dxa"/>
+            </w:tcMar>
+            <w:tcBorders>
+              <w:top w:sz="2" w:val="single" w:color="D4E4E1"/>
+              <w:left w:sz="2" w:val="single" w:color="D4E4E1"/>
+              <w:bottom w:sz="2" w:val="single" w:color="D4E4E1"/>
+              <w:right w:sz="2" w:val="single" w:color="D4E4E1"/>
+            </w:tcBorders>
+          </w:tcPr>
+          <w:p>
+            <w:pPr>
+              <w:spacing w:before="0" w:after="0" w:line="240" w:lineRule="auto"/>
+            </w:pPr>
+            <w:r>
+              <w:rPr>
+                <w:rFonts w:ascii="Aptos" w:hAnsi="Aptos" w:eastAsia="Aptos"/>
+                <w:b/>
+                <w:i w:val="0"/>
+                <w:color w:val="087A73"/>
+                <w:sz w:val="16"/>
+              </w:rPr>
+              <w:t>Earlier leadership</w:t>
+            </w:r>
+          </w:p>
+        </w:tc>
+        <w:tc>
+          <w:tcPr>
+            <w:tcW w:type="dxa" w:w="5429"/>
+            <w:shd w:fill="F7FAF9"/>
+            <w:tcMar>
+              <w:top w:w="55" w:type="dxa"/>
+              <w:start w:w="65" w:type="dxa"/>
+              <w:bottom w:w="55" w:type="dxa"/>
+              <w:end w:w="65" w:type="dxa"/>
+            </w:tcMar>
+            <w:tcBorders>
+              <w:top w:sz="2" w:val="single" w:color="D4E4E1"/>
+              <w:left w:sz="2" w:val="single" w:color="D4E4E1"/>
+              <w:bottom w:sz="2" w:val="single" w:color="D4E4E1"/>
+              <w:right w:sz="2" w:val="single" w:color="D4E4E1"/>
+            </w:tcBorders>
+          </w:tcPr>
+          <w:p>
+            <w:pPr>
+              <w:spacing w:before="0" w:after="0" w:line="240" w:lineRule="auto"/>
+            </w:pPr>
+            <w:r>
+              <w:rPr>
+                <w:rFonts w:ascii="Aptos" w:hAnsi="Aptos" w:eastAsia="Aptos"/>
+                <w:b w:val="0"/>
+                <w:i w:val="0"/>
+                <w:color w:val="14232A"/>
+                <w:sz w:val="16"/>
+              </w:rPr>
+              <w:t>Civil Air Patrol Cadet Commander and Search-and-Rescue Ground Team Leader, 2007-2011; included as historical leadership context, not as formal professional management experience.</w:t>
             </w:r>
           </w:p>
         </w:tc>
@@ -672,708 +2260,152 @@
     </w:tbl>
     <w:p>
       <w:pPr>
-        <w:pStyle w:val="ListBullet"/>
-        <w:spacing w:after="30"/>
-        <w:ind w:left="259" w:hanging="173"/>
-      </w:pPr>
-      <w:r>
-        <w:rPr>
-          <w:rFonts w:ascii="Aptos" w:hAnsi="Aptos" w:eastAsia="Aptos"/>
-          <w:b w:val="0"/>
-          <w:color w:val="263C41"/>
-          <w:sz w:val="16"/>
-        </w:rPr>
-        <w:t>Design and implement evidence-bound systems spanning agent orchestration, application intelligence, document and evidence pipelines, memory and continuity, infrastructure governance, and human-machine interfaces.</w:t>
-      </w:r>
-    </w:p>
-    <w:p>
-      <w:pPr>
-        <w:pStyle w:val="ListBullet"/>
-        <w:spacing w:after="30"/>
-        <w:ind w:left="259" w:hanging="173"/>
-      </w:pPr>
-      <w:r>
-        <w:rPr>
-          <w:rFonts w:ascii="Aptos" w:hAnsi="Aptos" w:eastAsia="Aptos"/>
-          <w:b w:val="0"/>
-          <w:color w:val="263C41"/>
-          <w:sz w:val="16"/>
-        </w:rPr>
-        <w:t>Convert ambiguous architectures into typed contracts, runnable slices, deterministic tests, explicit refusal behavior, machine-readable facts, and reviewable completion receipts.</w:t>
-      </w:r>
-    </w:p>
-    <w:p>
-      <w:pPr>
-        <w:pStyle w:val="ListBullet"/>
-        <w:spacing w:after="30"/>
-        <w:ind w:left="259" w:hanging="173"/>
-      </w:pPr>
-      <w:r>
-        <w:rPr>
-          <w:rFonts w:ascii="Aptos" w:hAnsi="Aptos" w:eastAsia="Aptos"/>
-          <w:b w:val="0"/>
-          <w:color w:val="263C41"/>
-          <w:sz w:val="16"/>
-        </w:rPr>
-        <w:t>Govern a multi-repository portfolio by separating source presence, review, execution, deployment, authority, and verified completion so recruiter, technical, and machine views cannot drift.</w:t>
-      </w:r>
-    </w:p>
-    <w:p>
-      <w:pPr>
-        <w:pStyle w:val="ListBullet"/>
-        <w:spacing w:after="30"/>
-        <w:ind w:left="259" w:hanging="173"/>
-      </w:pPr>
-      <w:r>
-        <w:rPr>
-          <w:rFonts w:ascii="Aptos" w:hAnsi="Aptos" w:eastAsia="Aptos"/>
-          <w:b w:val="0"/>
-          <w:color w:val="263C41"/>
-          <w:sz w:val="16"/>
-        </w:rPr>
-        <w:t>Use AI-assisted development as an inspectable engineering process combining source review, bounded generation, adversarial checking, deterministic validation, and human judgment.</w:t>
-      </w:r>
-    </w:p>
-    <w:p>
-      <w:r>
-        <w:br w:type="page"/>
-      </w:r>
-    </w:p>
-    <w:p>
-      <w:pPr>
-        <w:spacing w:before="160" w:after="40"/>
+        <w:spacing w:before="120" w:after="60" w:line="240" w:lineRule="auto"/>
+        <w:keepNext/>
+        <w:keepLines/>
+        <w:pBdr>
+          <w:bottom w:val="single" w:sz="10" w:space="2" w:color="087A73"/>
+        </w:pBdr>
       </w:pPr>
       <w:r>
         <w:rPr>
           <w:rFonts w:ascii="Aptos" w:hAnsi="Aptos" w:eastAsia="Aptos"/>
           <w:b/>
-          <w:color w:val="0D766C"/>
-          <w:sz w:val="14"/>
+          <w:i w:val="0"/>
+          <w:color w:val="087A73"/>
+          <w:sz w:val="24"/>
         </w:rPr>
-        <w:t>EXPERIENCE CONTINUED</w:t>
-      </w:r>
-    </w:p>
-    <w:p>
-      <w:pPr>
-        <w:spacing w:after="100"/>
-      </w:pPr>
-      <w:r>
-        <w:rPr>
-          <w:rFonts w:ascii="Aptos" w:hAnsi="Aptos" w:eastAsia="Aptos"/>
-          <w:b/>
-          <w:color w:val="12272D"/>
-          <w:sz w:val="30"/>
-        </w:rPr>
-        <w:t>Field systems, operations, and evidence discipline.</w:t>
+        <w:t>EDUCATION AND EARLIER TECHNICAL CREDENTIALS</w:t>
       </w:r>
     </w:p>
     <w:tbl>
       <w:tblPr>
         <w:tblW w:type="auto" w:w="0"/>
+        <w:jc w:val="center"/>
+        <w:tblLayout w:type="fixed"/>
         <w:tblLook w:firstColumn="1" w:firstRow="1" w:lastColumn="0" w:lastRow="0" w:noHBand="0" w:noVBand="1" w:val="04A0"/>
+        <w:tblCellSpacing w:w="0" w:type="dxa"/>
       </w:tblPr>
       <w:tblGrid>
-        <w:gridCol w:w="8352"/>
-        <w:gridCol w:w="1872"/>
+        <w:gridCol w:w="6912"/>
+        <w:gridCol w:w="3960"/>
       </w:tblGrid>
       <w:tr>
         <w:tc>
           <w:tcPr>
             <w:tcW w:type="dxa" w:w="5429"/>
+            <w:tcMar>
+              <w:top w:w="35" w:type="dxa"/>
+              <w:start w:w="20" w:type="dxa"/>
+              <w:bottom w:w="35" w:type="dxa"/>
+              <w:end w:w="20" w:type="dxa"/>
+            </w:tcMar>
+            <w:tcBorders>
+              <w:bottom w:val="nil"/>
+            </w:tcBorders>
           </w:tcPr>
           <w:p>
+            <w:pPr>
+              <w:spacing w:before="0" w:after="0" w:line="240" w:lineRule="auto"/>
+            </w:pPr>
             <w:r>
               <w:rPr>
                 <w:rFonts w:ascii="Aptos" w:hAnsi="Aptos" w:eastAsia="Aptos"/>
                 <w:b/>
-                <w:color w:val="14262C"/>
+                <w:i w:val="0"/>
+                <w:color w:val="14232A"/>
                 <w:sz w:val="18"/>
               </w:rPr>
-              <w:t>Diamond Head Home Inspections - Certified Home Inspector</w:t>
+              <w:t>University of Hawaii at Manoa</w:t>
             </w:r>
           </w:p>
         </w:tc>
         <w:tc>
           <w:tcPr>
             <w:tcW w:type="dxa" w:w="5429"/>
+            <w:tcMar>
+              <w:top w:w="35" w:type="dxa"/>
+              <w:start w:w="20" w:type="dxa"/>
+              <w:bottom w:w="35" w:type="dxa"/>
+              <w:end w:w="20" w:type="dxa"/>
+            </w:tcMar>
+            <w:tcBorders>
+              <w:bottom w:val="nil"/>
+            </w:tcBorders>
           </w:tcPr>
           <w:p>
             <w:pPr>
+              <w:spacing w:before="0" w:after="0" w:line="240" w:lineRule="auto"/>
               <w:jc w:val="right"/>
             </w:pPr>
             <w:r>
               <w:rPr>
                 <w:rFonts w:ascii="Aptos" w:hAnsi="Aptos" w:eastAsia="Aptos"/>
-                <w:b/>
-                <w:color w:val="0D766C"/>
-                <w:sz w:val="15"/>
+                <w:b w:val="0"/>
+                <w:i w:val="0"/>
+                <w:color w:val="5B6D75"/>
+                <w:sz w:val="17"/>
               </w:rPr>
-              <w:t>2020-2024</w:t>
+              <w:t>B.S., Marine Biology - 2016</w:t>
             </w:r>
           </w:p>
         </w:tc>
       </w:tr>
-    </w:tbl>
-    <w:p>
-      <w:pPr>
-        <w:pStyle w:val="ListBullet"/>
-        <w:spacing w:after="30"/>
-        <w:ind w:left="259" w:hanging="173"/>
-      </w:pPr>
-      <w:r>
-        <w:rPr>
-          <w:rFonts w:ascii="Aptos" w:hAnsi="Aptos" w:eastAsia="Aptos"/>
-          <w:b w:val="0"/>
-          <w:color w:val="263C41"/>
-          <w:sz w:val="16"/>
-        </w:rPr>
-        <w:t>Inspected residential systems and translated field observations into clear, decision-ready reports under time constraints.</w:t>
-      </w:r>
-    </w:p>
-    <w:p>
-      <w:pPr>
-        <w:pStyle w:val="ListBullet"/>
-        <w:spacing w:after="30"/>
-        <w:ind w:left="259" w:hanging="173"/>
-      </w:pPr>
-      <w:r>
-        <w:rPr>
-          <w:rFonts w:ascii="Aptos" w:hAnsi="Aptos" w:eastAsia="Aptos"/>
-          <w:b w:val="0"/>
-          <w:color w:val="263C41"/>
-          <w:sz w:val="16"/>
-        </w:rPr>
-        <w:t>Applied disciplined evidence capture, uncertainty labeling, defect prioritization, interacting-system analysis, and plain-language communication.</w:t>
-      </w:r>
-    </w:p>
-    <w:p>
-      <w:pPr>
-        <w:pStyle w:val="ListBullet"/>
-        <w:spacing w:after="30"/>
-        <w:ind w:left="259" w:hanging="173"/>
-      </w:pPr>
-      <w:r>
-        <w:rPr>
-          <w:rFonts w:ascii="Aptos" w:hAnsi="Aptos" w:eastAsia="Aptos"/>
-          <w:b w:val="0"/>
-          <w:color w:val="263C41"/>
-          <w:sz w:val="16"/>
-        </w:rPr>
-        <w:t>Developed the operating habit now used in software architecture: observe first, distinguish symptom from cause, test the boundary, and avoid unsupported conclusions.</w:t>
-      </w:r>
-    </w:p>
-    <w:tbl>
-      <w:tblPr>
-        <w:tblW w:type="auto" w:w="0"/>
-        <w:tblLook w:firstColumn="1" w:firstRow="1" w:lastColumn="0" w:lastRow="0" w:noHBand="0" w:noVBand="1" w:val="04A0"/>
-      </w:tblPr>
-      <w:tblGrid>
-        <w:gridCol w:w="8352"/>
-        <w:gridCol w:w="1872"/>
-      </w:tblGrid>
       <w:tr>
         <w:tc>
           <w:tcPr>
             <w:tcW w:type="dxa" w:w="5429"/>
+            <w:tcMar>
+              <w:top w:w="35" w:type="dxa"/>
+              <w:start w:w="20" w:type="dxa"/>
+              <w:bottom w:w="35" w:type="dxa"/>
+              <w:end w:w="20" w:type="dxa"/>
+            </w:tcMar>
+            <w:tcBorders>
+              <w:bottom w:val="nil"/>
+            </w:tcBorders>
           </w:tcPr>
           <w:p>
+            <w:pPr>
+              <w:spacing w:before="0" w:after="0" w:line="240" w:lineRule="auto"/>
+            </w:pPr>
             <w:r>
               <w:rPr>
                 <w:rFonts w:ascii="Aptos" w:hAnsi="Aptos" w:eastAsia="Aptos"/>
                 <w:b/>
-                <w:color w:val="14262C"/>
+                <w:i w:val="0"/>
+                <w:color w:val="14232A"/>
                 <w:sz w:val="18"/>
               </w:rPr>
-              <w:t>Hi-Class Home Services / Hi Class Maintenance Oahu LLC - Owner-Operator, Building Systems and Field Services</w:t>
+              <w:t>AWS Cloud Institute</w:t>
             </w:r>
           </w:p>
         </w:tc>
         <w:tc>
           <w:tcPr>
             <w:tcW w:type="dxa" w:w="5429"/>
+            <w:tcMar>
+              <w:top w:w="35" w:type="dxa"/>
+              <w:start w:w="20" w:type="dxa"/>
+              <w:bottom w:w="35" w:type="dxa"/>
+              <w:end w:w="20" w:type="dxa"/>
+            </w:tcMar>
+            <w:tcBorders>
+              <w:bottom w:val="nil"/>
+            </w:tcBorders>
           </w:tcPr>
           <w:p>
             <w:pPr>
+              <w:spacing w:before="0" w:after="0" w:line="240" w:lineRule="auto"/>
               <w:jc w:val="right"/>
             </w:pPr>
             <w:r>
               <w:rPr>
                 <w:rFonts w:ascii="Aptos" w:hAnsi="Aptos" w:eastAsia="Aptos"/>
-                <w:b/>
-                <w:color w:val="0D766C"/>
-                <w:sz w:val="15"/>
-              </w:rPr>
-              <w:t>2017-Present</w:t>
-            </w:r>
-          </w:p>
-        </w:tc>
-      </w:tr>
-    </w:tbl>
-    <w:p>
-      <w:pPr>
-        <w:pStyle w:val="ListBullet"/>
-        <w:spacing w:after="30"/>
-        <w:ind w:left="259" w:hanging="173"/>
-      </w:pPr>
-      <w:r>
-        <w:rPr>
-          <w:rFonts w:ascii="Aptos" w:hAnsi="Aptos" w:eastAsia="Aptos"/>
-          <w:b w:val="0"/>
-          <w:color w:val="263C41"/>
-          <w:sz w:val="16"/>
-        </w:rPr>
-        <w:t>Scope residential repair and service work, prepare estimates, coordinate field execution, and communicate constraints and completion status with clients.</w:t>
-      </w:r>
-    </w:p>
-    <w:p>
-      <w:pPr>
-        <w:pStyle w:val="ListBullet"/>
-        <w:spacing w:after="30"/>
-        <w:ind w:left="259" w:hanging="173"/>
-      </w:pPr>
-      <w:r>
-        <w:rPr>
-          <w:rFonts w:ascii="Aptos" w:hAnsi="Aptos" w:eastAsia="Aptos"/>
-          <w:b w:val="0"/>
-          <w:color w:val="263C41"/>
-          <w:sz w:val="16"/>
-        </w:rPr>
-        <w:t>Work across practical building-system problems including minor carpentry, plumbing, electrical fixture replacement, drywall, painting, flooring, and maintenance planning.</w:t>
-      </w:r>
-    </w:p>
-    <w:p>
-      <w:pPr>
-        <w:pStyle w:val="ListBullet"/>
-        <w:spacing w:after="30"/>
-        <w:ind w:left="259" w:hanging="173"/>
-      </w:pPr>
-      <w:r>
-        <w:rPr>
-          <w:rFonts w:ascii="Aptos" w:hAnsi="Aptos" w:eastAsia="Aptos"/>
-          <w:b w:val="0"/>
-          <w:color w:val="263C41"/>
-          <w:sz w:val="16"/>
-        </w:rPr>
-        <w:t>Translate incomplete real-world requirements into bounded work packages, explicit assumptions, and usable closeout artifacts.</w:t>
-      </w:r>
-    </w:p>
-    <w:p>
-      <w:pPr>
-        <w:spacing w:before="160" w:after="40"/>
-      </w:pPr>
-      <w:r>
-        <w:rPr>
-          <w:rFonts w:ascii="Aptos" w:hAnsi="Aptos" w:eastAsia="Aptos"/>
-          <w:b/>
-          <w:color w:val="0D766C"/>
-          <w:sz w:val="14"/>
-        </w:rPr>
-        <w:t>CROSS-DOMAIN FOUNDATION</w:t>
-      </w:r>
-    </w:p>
-    <w:p>
-      <w:pPr>
-        <w:spacing w:after="100"/>
-      </w:pPr>
-      <w:r>
-        <w:rPr>
-          <w:rFonts w:ascii="Aptos" w:hAnsi="Aptos" w:eastAsia="Aptos"/>
-          <w:b/>
-          <w:color w:val="12272D"/>
-          <w:sz w:val="30"/>
-        </w:rPr>
-        <w:t>A rare operating perspective.</w:t>
-      </w:r>
-    </w:p>
-    <w:tbl>
-      <w:tblPr>
-        <w:tblW w:type="auto" w:w="0"/>
-        <w:tblLook w:firstColumn="1" w:firstRow="1" w:lastColumn="0" w:lastRow="0" w:noHBand="0" w:noVBand="1" w:val="04A0"/>
-      </w:tblPr>
-      <w:tblGrid>
-        <w:gridCol w:w="3619"/>
-        <w:gridCol w:w="3619"/>
-        <w:gridCol w:w="3619"/>
-      </w:tblGrid>
-      <w:tr>
-        <w:tc>
-          <w:tcPr>
-            <w:tcW w:type="dxa" w:w="3619"/>
-            <w:shd w:fill="EDF6F3"/>
-            <w:tcMar>
-              <w:top w:w="90" w:type="dxa"/>
-              <w:start w:w="100" w:type="dxa"/>
-              <w:bottom w:w="90" w:type="dxa"/>
-              <w:end w:w="100" w:type="dxa"/>
-            </w:tcMar>
-          </w:tcPr>
-          <w:p>
-            <w:r>
-              <w:rPr>
-                <w:rFonts w:ascii="Aptos" w:hAnsi="Aptos" w:eastAsia="Aptos"/>
-                <w:b/>
-                <w:color w:val="0D766C"/>
-                <w:sz w:val="12"/>
-              </w:rPr>
-              <w:t>SCIENTIFIC MEASUREMENT</w:t>
-            </w:r>
-          </w:p>
-          <w:p>
-            <w:r>
-              <w:rPr>
-                <w:rFonts w:ascii="Aptos" w:hAnsi="Aptos" w:eastAsia="Aptos"/>
-                <w:b/>
-                <w:color w:val="14262C"/>
+                <w:b w:val="0"/>
+                <w:i w:val="0"/>
+                <w:color w:val="5B6D75"/>
                 <w:sz w:val="17"/>
-              </w:rPr>
-              <w:t>Sea-urchin morphometric research</w:t>
-            </w:r>
-          </w:p>
-          <w:p>
-            <w:r>
-              <w:rPr>
-                <w:rFonts w:ascii="Aptos" w:hAnsi="Aptos" w:eastAsia="Aptos"/>
-                <w:b w:val="0"/>
-                <w:color w:val="536A6D"/>
-                <w:sz w:val="14"/>
-              </w:rPr>
-              <w:t>University of Hawaii, 2016-2017. Processed physical measurements of gill structures to support visual species identification.</w:t>
-            </w:r>
-          </w:p>
-        </w:tc>
-        <w:tc>
-          <w:tcPr>
-            <w:tcW w:type="dxa" w:w="3619"/>
-            <w:shd w:fill="EDF6F3"/>
-            <w:tcMar>
-              <w:top w:w="90" w:type="dxa"/>
-              <w:start w:w="100" w:type="dxa"/>
-              <w:bottom w:w="90" w:type="dxa"/>
-              <w:end w:w="100" w:type="dxa"/>
-            </w:tcMar>
-          </w:tcPr>
-          <w:p>
-            <w:r>
-              <w:rPr>
-                <w:rFonts w:ascii="Aptos" w:hAnsi="Aptos" w:eastAsia="Aptos"/>
-                <w:b/>
-                <w:color w:val="0D766C"/>
-                <w:sz w:val="12"/>
-              </w:rPr>
-              <w:t>COMPRESSED-GAS SYSTEMS</w:t>
-            </w:r>
-          </w:p>
-          <w:p>
-            <w:r>
-              <w:rPr>
-                <w:rFonts w:ascii="Aptos" w:hAnsi="Aptos" w:eastAsia="Aptos"/>
-                <w:b/>
-                <w:color w:val="14262C"/>
-                <w:sz w:val="17"/>
-              </w:rPr>
-              <w:t>Scuba Tank Technician</w:t>
-            </w:r>
-          </w:p>
-          <w:p>
-            <w:r>
-              <w:rPr>
-                <w:rFonts w:ascii="Aptos" w:hAnsi="Aptos" w:eastAsia="Aptos"/>
-                <w:b w:val="0"/>
-                <w:color w:val="536A6D"/>
-                <w:sz w:val="14"/>
-              </w:rPr>
-              <w:t>Hawaiian Diving Adventures and UH Dive Office, 2016-2017. Tank filling, transport, inspection and repair support, and gas mixing under safety-critical procedures.</w:t>
-            </w:r>
-          </w:p>
-        </w:tc>
-        <w:tc>
-          <w:tcPr>
-            <w:tcW w:type="dxa" w:w="3619"/>
-            <w:shd w:fill="EDF6F3"/>
-            <w:tcMar>
-              <w:top w:w="90" w:type="dxa"/>
-              <w:start w:w="100" w:type="dxa"/>
-              <w:bottom w:w="90" w:type="dxa"/>
-              <w:end w:w="100" w:type="dxa"/>
-            </w:tcMar>
-          </w:tcPr>
-          <w:p>
-            <w:r>
-              <w:rPr>
-                <w:rFonts w:ascii="Aptos" w:hAnsi="Aptos" w:eastAsia="Aptos"/>
-                <w:b/>
-                <w:color w:val="0D766C"/>
-                <w:sz w:val="12"/>
-              </w:rPr>
-              <w:t>FIELD SYSTEMS</w:t>
-            </w:r>
-          </w:p>
-          <w:p>
-            <w:r>
-              <w:rPr>
-                <w:rFonts w:ascii="Aptos" w:hAnsi="Aptos" w:eastAsia="Aptos"/>
-                <w:b/>
-                <w:color w:val="14262C"/>
-                <w:sz w:val="17"/>
-              </w:rPr>
-              <w:t>Inspection and repair operations</w:t>
-            </w:r>
-          </w:p>
-          <w:p>
-            <w:r>
-              <w:rPr>
-                <w:rFonts w:ascii="Aptos" w:hAnsi="Aptos" w:eastAsia="Aptos"/>
-                <w:b w:val="0"/>
-                <w:color w:val="536A6D"/>
-                <w:sz w:val="14"/>
-              </w:rPr>
-              <w:t>Practical judgment around interacting systems, uncertainty, failure consequences, client communication, and closeout quality.</w:t>
-            </w:r>
-          </w:p>
-        </w:tc>
-      </w:tr>
-    </w:tbl>
-    <w:p>
-      <w:pPr>
-        <w:spacing w:before="160" w:after="40"/>
-      </w:pPr>
-      <w:r>
-        <w:rPr>
-          <w:rFonts w:ascii="Aptos" w:hAnsi="Aptos" w:eastAsia="Aptos"/>
-          <w:b/>
-          <w:color w:val="0D766C"/>
-          <w:sz w:val="14"/>
-        </w:rPr>
-        <w:t>CAPABILITIES</w:t>
-      </w:r>
-    </w:p>
-    <w:p>
-      <w:pPr>
-        <w:spacing w:after="100"/>
-      </w:pPr>
-      <w:r>
-        <w:rPr>
-          <w:rFonts w:ascii="Aptos" w:hAnsi="Aptos" w:eastAsia="Aptos"/>
-          <w:b/>
-          <w:color w:val="12272D"/>
-          <w:sz w:val="30"/>
-        </w:rPr>
-        <w:t>Built for applied AI roles where the model is only one component.</w:t>
-      </w:r>
-    </w:p>
-    <w:tbl>
-      <w:tblPr>
-        <w:tblW w:type="auto" w:w="0"/>
-        <w:tblLook w:firstColumn="1" w:firstRow="1" w:lastColumn="0" w:lastRow="0" w:noHBand="0" w:noVBand="1" w:val="04A0"/>
-      </w:tblPr>
-      <w:tblGrid>
-        <w:gridCol w:w="3619"/>
-        <w:gridCol w:w="3619"/>
-        <w:gridCol w:w="3619"/>
-      </w:tblGrid>
-      <w:tr>
-        <w:tc>
-          <w:tcPr>
-            <w:tcW w:type="dxa" w:w="3619"/>
-            <w:tcMar>
-              <w:top w:w="90" w:type="dxa"/>
-              <w:start w:w="100" w:type="dxa"/>
-              <w:bottom w:w="90" w:type="dxa"/>
-              <w:end w:w="100" w:type="dxa"/>
-            </w:tcMar>
-          </w:tcPr>
-          <w:p>
-            <w:r>
-              <w:rPr>
-                <w:rFonts w:ascii="Aptos" w:hAnsi="Aptos" w:eastAsia="Aptos"/>
-                <w:b/>
-                <w:color w:val="14262C"/>
-                <w:sz w:val="17"/>
-              </w:rPr>
-              <w:t>Architecture</w:t>
-            </w:r>
-          </w:p>
-          <w:p>
-            <w:r>
-              <w:rPr>
-                <w:rFonts w:ascii="Aptos" w:hAnsi="Aptos" w:eastAsia="Aptos"/>
-                <w:b w:val="0"/>
-                <w:color w:val="536A6D"/>
-                <w:sz w:val="14"/>
-              </w:rPr>
-              <w:t>Agent infrastructure, multi-agent coordination, application intelligence, authority and approval models, state machines, event design, idempotency, failure and recovery, human-in-the-loop systems.</w:t>
-            </w:r>
-          </w:p>
-        </w:tc>
-        <w:tc>
-          <w:tcPr>
-            <w:tcW w:type="dxa" w:w="3619"/>
-            <w:tcMar>
-              <w:top w:w="90" w:type="dxa"/>
-              <w:start w:w="100" w:type="dxa"/>
-              <w:bottom w:w="90" w:type="dxa"/>
-              <w:end w:w="100" w:type="dxa"/>
-            </w:tcMar>
-          </w:tcPr>
-          <w:p>
-            <w:r>
-              <w:rPr>
-                <w:rFonts w:ascii="Aptos" w:hAnsi="Aptos" w:eastAsia="Aptos"/>
-                <w:b/>
-                <w:color w:val="14262C"/>
-                <w:sz w:val="17"/>
-              </w:rPr>
-              <w:t>Evidence and delivery</w:t>
-            </w:r>
-          </w:p>
-          <w:p>
-            <w:r>
-              <w:rPr>
-                <w:rFonts w:ascii="Aptos" w:hAnsi="Aptos" w:eastAsia="Aptos"/>
-                <w:b w:val="0"/>
-                <w:color w:val="536A6D"/>
-                <w:sz w:val="14"/>
-              </w:rPr>
-              <w:t>Provenance, claim-to-source mapping, deterministic testing, JSON Schema, CI/CD, static analysis, dependency auditing, integrity hashing, release receipts, and machine-readable interfaces.</w:t>
-            </w:r>
-          </w:p>
-        </w:tc>
-        <w:tc>
-          <w:tcPr>
-            <w:tcW w:type="dxa" w:w="3619"/>
-            <w:tcMar>
-              <w:top w:w="90" w:type="dxa"/>
-              <w:start w:w="100" w:type="dxa"/>
-              <w:bottom w:w="90" w:type="dxa"/>
-              <w:end w:w="100" w:type="dxa"/>
-            </w:tcMar>
-          </w:tcPr>
-          <w:p>
-            <w:r>
-              <w:rPr>
-                <w:rFonts w:ascii="Aptos" w:hAnsi="Aptos" w:eastAsia="Aptos"/>
-                <w:b/>
-                <w:color w:val="14262C"/>
-                <w:sz w:val="17"/>
-              </w:rPr>
-              <w:t>Primary technology</w:t>
-            </w:r>
-          </w:p>
-          <w:p>
-            <w:r>
-              <w:rPr>
-                <w:rFonts w:ascii="Aptos" w:hAnsi="Aptos" w:eastAsia="Aptos"/>
-                <w:b w:val="0"/>
-                <w:color w:val="536A6D"/>
-                <w:sz w:val="14"/>
-              </w:rPr>
-              <w:t>Python, TypeScript, JavaScript, SQL, Bash, Node.js, React, Next.js, FastAPI, REST, JSON-RPC 2.0, MCP, GitHub Actions, Docker, and Vercel. Prior scientific computing: R and MATLAB.</w:t>
-            </w:r>
-          </w:p>
-        </w:tc>
-      </w:tr>
-    </w:tbl>
-    <w:p>
-      <w:pPr>
-        <w:spacing w:before="160" w:after="40"/>
-      </w:pPr>
-      <w:r>
-        <w:rPr>
-          <w:rFonts w:ascii="Aptos" w:hAnsi="Aptos" w:eastAsia="Aptos"/>
-          <w:b/>
-          <w:color w:val="0D766C"/>
-          <w:sz w:val="14"/>
-        </w:rPr>
-        <w:t>EDUCATION</w:t>
-      </w:r>
-    </w:p>
-    <w:p>
-      <w:pPr>
-        <w:spacing w:after="100"/>
-      </w:pPr>
-      <w:r>
-        <w:rPr>
-          <w:rFonts w:ascii="Aptos" w:hAnsi="Aptos" w:eastAsia="Aptos"/>
-          <w:b/>
-          <w:color w:val="12272D"/>
-          <w:sz w:val="30"/>
-        </w:rPr>
-        <w:t>Scientific foundation and current cloud training.</w:t>
-      </w:r>
-    </w:p>
-    <w:tbl>
-      <w:tblPr>
-        <w:tblW w:type="auto" w:w="0"/>
-        <w:tblLook w:firstColumn="1" w:firstRow="1" w:lastColumn="0" w:lastRow="0" w:noHBand="0" w:noVBand="1" w:val="04A0"/>
-      </w:tblPr>
-      <w:tblGrid>
-        <w:gridCol w:w="5429"/>
-        <w:gridCol w:w="5429"/>
-      </w:tblGrid>
-      <w:tr>
-        <w:tc>
-          <w:tcPr>
-            <w:tcW w:type="dxa" w:w="5429"/>
-            <w:shd w:fill="EDF6F3"/>
-            <w:tcMar>
-              <w:top w:w="90" w:type="dxa"/>
-              <w:start w:w="110" w:type="dxa"/>
-              <w:bottom w:w="90" w:type="dxa"/>
-              <w:end w:w="110" w:type="dxa"/>
-            </w:tcMar>
-          </w:tcPr>
-          <w:p>
-            <w:r>
-              <w:rPr>
-                <w:rFonts w:ascii="Aptos" w:hAnsi="Aptos" w:eastAsia="Aptos"/>
-                <w:b/>
-                <w:color w:val="14262C"/>
-                <w:sz w:val="17"/>
-              </w:rPr>
-              <w:t>University of Hawaii at Manoa</w:t>
-            </w:r>
-          </w:p>
-          <w:p>
-            <w:r>
-              <w:rPr>
-                <w:rFonts w:ascii="Aptos" w:hAnsi="Aptos" w:eastAsia="Aptos"/>
-                <w:b w:val="0"/>
-                <w:color w:val="536A6D"/>
-                <w:sz w:val="15"/>
-              </w:rPr>
-              <w:t>B.S., Marine Biology - 2016</w:t>
-            </w:r>
-          </w:p>
-        </w:tc>
-        <w:tc>
-          <w:tcPr>
-            <w:tcW w:type="dxa" w:w="5429"/>
-            <w:shd w:fill="EDF6F3"/>
-            <w:tcMar>
-              <w:top w:w="90" w:type="dxa"/>
-              <w:start w:w="110" w:type="dxa"/>
-              <w:bottom w:w="90" w:type="dxa"/>
-              <w:end w:w="110" w:type="dxa"/>
-            </w:tcMar>
-          </w:tcPr>
-          <w:p>
-            <w:r>
-              <w:rPr>
-                <w:rFonts w:ascii="Aptos" w:hAnsi="Aptos" w:eastAsia="Aptos"/>
-                <w:b/>
-                <w:color w:val="14262C"/>
-                <w:sz w:val="17"/>
-              </w:rPr>
-              <w:t>AWS Cloud Institute</w:t>
-            </w:r>
-          </w:p>
-          <w:p>
-            <w:r>
-              <w:rPr>
-                <w:rFonts w:ascii="Aptos" w:hAnsi="Aptos" w:eastAsia="Aptos"/>
-                <w:b w:val="0"/>
-                <w:color w:val="536A6D"/>
-                <w:sz w:val="15"/>
               </w:rPr>
               <w:t>Cloud Application Developer program - 2025-2026, in progress</w:t>
             </w:r>
@@ -1383,22 +2415,35 @@
     </w:tbl>
     <w:p>
       <w:pPr>
-        <w:spacing w:before="80" w:after="100"/>
+        <w:spacing w:before="80" w:after="80" w:line="240" w:lineRule="auto"/>
       </w:pPr>
       <w:r>
         <w:rPr>
           <w:rFonts w:ascii="Aptos" w:hAnsi="Aptos" w:eastAsia="Aptos"/>
+          <w:b/>
+          <w:i w:val="0"/>
+          <w:color w:val="087A73"/>
+          <w:sz w:val="15"/>
+        </w:rPr>
+        <w:t xml:space="preserve">Earlier technical certifications recorded in prior resumes: </w:t>
+      </w:r>
+      <w:r>
+        <w:rPr>
+          <w:rFonts w:ascii="Aptos" w:hAnsi="Aptos" w:eastAsia="Aptos"/>
           <w:b w:val="0"/>
-          <w:color w:val="536A6D"/>
-          <w:sz w:val="14"/>
+          <w:i w:val="0"/>
+          <w:color w:val="5B6D75"/>
+          <w:sz w:val="15"/>
         </w:rPr>
-        <w:t>Earlier technical certifications recorded in prior resumes: PSI Visual Cylinder Inspector, Eddy Current Technician, Valve Repair Technician, Oxygen Cleaning Cylinder Technician; NAUI Rescue and Master Diver; PADI Enriched Air Diver. Current status should be confirmed before role-specific use.</w:t>
+        <w:t>PSI Visual Cylinder Inspector, Eddy Current Technician, Valve Repair Technician, Oxygen Cleaning Cylinder Technician; NAUI Rescue and Master Diver; PADI Enriched Air Diver. Current status is not represented as active without updated documentation.</w:t>
       </w:r>
     </w:p>
     <w:tbl>
       <w:tblPr>
         <w:tblW w:type="auto" w:w="0"/>
+        <w:jc w:val="center"/>
         <w:tblLook w:firstColumn="1" w:firstRow="1" w:lastColumn="0" w:lastRow="0" w:noHBand="0" w:noVBand="1" w:val="04A0"/>
+        <w:tblCellSpacing w:w="0" w:type="dxa"/>
       </w:tblPr>
       <w:tblGrid>
         <w:gridCol w:w="10858"/>
@@ -1407,30 +2452,41 @@
         <w:tc>
           <w:tcPr>
             <w:tcW w:type="dxa" w:w="10858"/>
-            <w:shd w:fill="FFF6E3"/>
+            <w:shd w:fill="FFF5DE"/>
             <w:tcMar>
-              <w:top w:w="110" w:type="dxa"/>
-              <w:start w:w="130" w:type="dxa"/>
-              <w:bottom w:w="110" w:type="dxa"/>
-              <w:end w:w="130" w:type="dxa"/>
+              <w:top w:w="65" w:type="dxa"/>
+              <w:start w:w="75" w:type="dxa"/>
+              <w:bottom w:w="65" w:type="dxa"/>
+              <w:end w:w="75" w:type="dxa"/>
             </w:tcMar>
+            <w:tcBorders>
+              <w:top w:sz="4" w:val="single" w:color="E5B34B"/>
+              <w:left w:sz="2" w:val="single" w:color="F2D99A"/>
+              <w:bottom w:sz="4" w:val="single" w:color="E5B34B"/>
+              <w:right w:sz="2" w:val="single" w:color="F2D99A"/>
+            </w:tcBorders>
           </w:tcPr>
           <w:p>
+            <w:pPr>
+              <w:spacing w:before="0" w:after="0" w:line="240" w:lineRule="auto"/>
+            </w:pPr>
             <w:r>
               <w:rPr>
                 <w:rFonts w:ascii="Aptos" w:hAnsi="Aptos" w:eastAsia="Aptos"/>
                 <w:b/>
-                <w:color w:val="9A6500"/>
-                <w:sz w:val="14"/>
+                <w:i w:val="0"/>
+                <w:color w:val="A56600"/>
+                <w:sz w:val="16"/>
               </w:rPr>
-              <w:t xml:space="preserve">Evidence boundary. </w:t>
+              <w:t xml:space="preserve">EVIDENCE BOUNDARY  </w:t>
             </w:r>
             <w:r>
               <w:rPr>
                 <w:rFonts w:ascii="Aptos" w:hAnsi="Aptos" w:eastAsia="Aptos"/>
                 <w:b w:val="0"/>
-                <w:color w:val="5F5032"/>
-                <w:sz w:val="14"/>
+                <w:i w:val="0"/>
+                <w:color w:val="14232A"/>
+                <w:sz w:val="15"/>
               </w:rPr>
               <w:t>Independent GlacierEQ work and bounded technical exhibits. Test counts refer only to their stated repository and scope. No company affiliation, proprietary access, production use, customer impact, formal people-management experience, current certification status, or hardware validation is claimed without direct evidence.</w:t>
             </w:r>
@@ -1439,9 +2495,9 @@
       </w:tr>
     </w:tbl>
     <w:sectPr>
-      <w:footerReference w:type="default" r:id="rId9"/>
+      <w:footerReference w:type="default" r:id="rId13"/>
       <w:pgSz w:w="12240" w:h="15840"/>
-      <w:pgMar w:top="605" w:right="691" w:bottom="547" w:left="691" w:header="720" w:footer="720" w:gutter="0"/>
+      <w:pgMar w:top="605" w:right="691" w:bottom="648" w:left="691" w:header="216" w:footer="360" w:gutter="0"/>
       <w:cols w:space="720"/>
       <w:docGrid w:linePitch="360"/>
     </w:sectPr>
@@ -1454,16 +2510,18 @@
   <w:p>
     <w:pPr>
       <w:pStyle w:val="Footer"/>
+      <w:spacing w:before="0" w:after="0" w:line="240" w:lineRule="auto"/>
       <w:jc w:val="center"/>
     </w:pPr>
     <w:r>
       <w:rPr>
         <w:rFonts w:ascii="Aptos" w:hAnsi="Aptos" w:eastAsia="Aptos"/>
-        <w:b w:val="0"/>
-        <w:color w:val="6A7C7E"/>
+        <w:b/>
+        <w:i w:val="0"/>
+        <w:color w:val="5B6D75"/>
         <w:sz w:val="13"/>
       </w:rPr>
-      <w:t>Casey Del Carpio Barton | Resume Intelligence V17 | Evidence-bound presentation</w:t>
+      <w:t>CASEY BARTON  |  PSYSOC-X V17 RESUME INTELLIGENCE  |  HUMAN SIGNAL + MACHINE-VERIFIABLE FACTS</w:t>
     </w:r>
   </w:p>
 </w:ftr>
@@ -1832,9 +2890,13 @@
     <w:name w:val="Normal"/>
     <w:qFormat/>
     <w:rsid w:val="00FC693F"/>
+    <w:pPr>
+      <w:spacing w:after="0"/>
+    </w:pPr>
     <w:rPr>
       <w:rFonts w:ascii="Aptos" w:hAnsi="Aptos" w:eastAsia="Aptos"/>
-      <w:sz w:val="17"/>
+      <w:color w:val="14232A"/>
+      <w:sz w:val="18"/>
     </w:rPr>
   </w:style>
   <w:style w:type="paragraph" w:styleId="Header">
@@ -2365,6 +3427,9 @@
       </w:numPr>
       <w:contextualSpacing/>
     </w:pPr>
+    <w:rPr>
+      <w:rFonts w:ascii="Aptos" w:hAnsi="Aptos" w:eastAsia="Aptos"/>
+    </w:rPr>
   </w:style>
   <w:style w:type="paragraph" w:styleId="ListBullet2">
     <w:name w:val="List Bullet 2"/>

</xml_diff>

<commit_message>
Regenerate deterministic final resume artifacts
</commit_message>
<xml_diff>
--- a/site-v15/downloads/Casey_Barton_Resume.docx
+++ b/site-v15/downloads/Casey_Barton_Resume.docx
@@ -11,26 +11,20 @@
         <w:tblCellSpacing w:w="0" w:type="dxa"/>
       </w:tblPr>
       <w:tblGrid>
-        <w:gridCol w:w="7992"/>
-        <w:gridCol w:w="2880"/>
+        <w:gridCol w:w="7128"/>
+        <w:gridCol w:w="3096"/>
       </w:tblGrid>
       <w:tr>
         <w:tc>
           <w:tcPr>
-            <w:tcW w:type="dxa" w:w="5429"/>
+            <w:tcW w:type="dxa" w:w="5112"/>
             <w:shd w:fill="0B2028"/>
             <w:tcMar>
-              <w:top w:w="125" w:type="dxa"/>
-              <w:start w:w="115" w:type="dxa"/>
-              <w:bottom w:w="115" w:type="dxa"/>
-              <w:end w:w="115" w:type="dxa"/>
+              <w:top w:w="115" w:type="dxa"/>
+              <w:start w:w="125" w:type="dxa"/>
+              <w:bottom w:w="105" w:type="dxa"/>
+              <w:end w:w="125" w:type="dxa"/>
             </w:tcMar>
-            <w:tcBorders>
-              <w:top w:val="nil"/>
-              <w:left w:val="nil"/>
-              <w:bottom w:val="nil"/>
-              <w:right w:val="nil"/>
-            </w:tcBorders>
             <w:vAlign w:val="center"/>
           </w:tcPr>
           <w:p>
@@ -39,11 +33,11 @@
             </w:pPr>
             <w:r>
               <w:rPr>
-                <w:rFonts w:ascii="Aptos" w:hAnsi="Aptos" w:eastAsia="Aptos"/>
+                <w:rFonts w:ascii="Carlito" w:hAnsi="Carlito" w:eastAsia="Carlito"/>
                 <w:b/>
                 <w:i w:val="0"/>
                 <w:color w:val="FFFFFF"/>
-                <w:sz w:val="41"/>
+                <w:sz w:val="38"/>
               </w:rPr>
               <w:t>CASEY DEL CARPIO BARTON</w:t>
             </w:r>
@@ -54,21 +48,21 @@
             </w:pPr>
             <w:r>
               <w:rPr>
-                <w:rFonts w:ascii="Aptos" w:hAnsi="Aptos" w:eastAsia="Aptos"/>
+                <w:rFonts w:ascii="Carlito" w:hAnsi="Carlito" w:eastAsia="Carlito"/>
                 <w:b/>
                 <w:i w:val="0"/>
                 <w:color w:val="7DEAD4"/>
-                <w:sz w:val="21"/>
+                <w:sz w:val="20"/>
               </w:rPr>
               <w:t>APPLIED AI SYSTEMS ARCHITECT</w:t>
             </w:r>
             <w:r>
               <w:rPr>
-                <w:rFonts w:ascii="Aptos" w:hAnsi="Aptos" w:eastAsia="Aptos"/>
+                <w:rFonts w:ascii="Carlito" w:hAnsi="Carlito" w:eastAsia="Carlito"/>
                 <w:b w:val="0"/>
                 <w:i w:val="0"/>
                 <w:color w:val="D7E4E7"/>
-                <w:sz w:val="18"/>
+                <w:sz w:val="17"/>
               </w:rPr>
               <w:t xml:space="preserve">  |  Agent Infrastructure Engineer</w:t>
             </w:r>
@@ -79,42 +73,36 @@
             </w:pPr>
             <w:r>
               <w:rPr>
-                <w:rFonts w:ascii="Aptos" w:hAnsi="Aptos" w:eastAsia="Aptos"/>
+                <w:rFonts w:ascii="Carlito" w:hAnsi="Carlito" w:eastAsia="Carlito"/>
                 <w:b w:val="0"/>
                 <w:i w:val="0"/>
                 <w:color w:val="C1D1D5"/>
                 <w:sz w:val="16"/>
               </w:rPr>
-              <w:t>Forward-Deployed AI  |  Evidence-bound execution for ambitious systems and high-consequence decisions.</w:t>
+              <w:t>Forward-Deployed AI  |  Builds the operating layer that makes powerful AI dependable enough to use.</w:t>
             </w:r>
           </w:p>
         </w:tc>
         <w:tc>
           <w:tcPr>
-            <w:tcW w:type="dxa" w:w="5429"/>
+            <w:tcW w:type="dxa" w:w="5112"/>
             <w:shd w:fill="0B2028"/>
             <w:tcMar>
-              <w:top w:w="125" w:type="dxa"/>
-              <w:start w:w="115" w:type="dxa"/>
-              <w:bottom w:w="115" w:type="dxa"/>
-              <w:end w:w="115" w:type="dxa"/>
+              <w:top w:w="115" w:type="dxa"/>
+              <w:start w:w="125" w:type="dxa"/>
+              <w:bottom w:w="105" w:type="dxa"/>
+              <w:end w:w="125" w:type="dxa"/>
             </w:tcMar>
-            <w:tcBorders>
-              <w:top w:val="nil"/>
-              <w:left w:val="nil"/>
-              <w:bottom w:val="nil"/>
-              <w:right w:val="nil"/>
-            </w:tcBorders>
             <w:vAlign w:val="center"/>
           </w:tcPr>
           <w:p>
             <w:pPr>
-              <w:spacing w:before="0" w:after="20" w:line="240" w:lineRule="auto"/>
+              <w:spacing w:before="0" w:after="40" w:line="240" w:lineRule="auto"/>
               <w:jc w:val="right"/>
             </w:pPr>
             <w:r>
               <w:rPr>
-                <w:rFonts w:ascii="Aptos" w:hAnsi="Aptos" w:eastAsia="Aptos"/>
+                <w:rFonts w:ascii="Carlito" w:hAnsi="Carlito" w:eastAsia="Carlito"/>
                 <w:b/>
                 <w:i w:val="0"/>
                 <w:color w:val="FFFFFF"/>
@@ -135,19 +123,17 @@
                   <w:u w:val="none"/>
                   <w:sz w:val="16"/>
                   <w:szCs w:val="16"/>
+                  <w:rFonts w:ascii="Carlito" w:hAnsi="Carlito"/>
                 </w:rPr>
                 <w:t>808-936-5654</w:t>
               </w:r>
             </w:hyperlink>
-            <w:r>
-              <w:rPr>
-                <w:rFonts w:ascii="Aptos" w:hAnsi="Aptos" w:eastAsia="Aptos"/>
-                <w:b w:val="0"/>
-                <w:i w:val="0"/>
-                <w:sz w:val="2"/>
-              </w:rPr>
-              <w:br/>
-            </w:r>
+          </w:p>
+          <w:p>
+            <w:pPr>
+              <w:spacing w:before="0" w:after="0" w:line="240" w:lineRule="auto"/>
+              <w:jc w:val="right"/>
+            </w:pPr>
             <w:hyperlink r:id="rId10">
               <w:r>
                 <w:rPr>
@@ -155,19 +141,17 @@
                   <w:u w:val="none"/>
                   <w:sz w:val="16"/>
                   <w:szCs w:val="16"/>
+                  <w:rFonts w:ascii="Carlito" w:hAnsi="Carlito"/>
                 </w:rPr>
                 <w:t>glacier.equilibrium@gmail.com</w:t>
               </w:r>
             </w:hyperlink>
-            <w:r>
-              <w:rPr>
-                <w:rFonts w:ascii="Aptos" w:hAnsi="Aptos" w:eastAsia="Aptos"/>
-                <w:b w:val="0"/>
-                <w:i w:val="0"/>
-                <w:sz w:val="2"/>
-              </w:rPr>
-              <w:br/>
-            </w:r>
+          </w:p>
+          <w:p>
+            <w:pPr>
+              <w:spacing w:before="0" w:after="0" w:line="240" w:lineRule="auto"/>
+              <w:jc w:val="right"/>
+            </w:pPr>
             <w:hyperlink r:id="rId11">
               <w:r>
                 <w:rPr>
@@ -175,19 +159,17 @@
                   <w:u w:val="none"/>
                   <w:sz w:val="16"/>
                   <w:szCs w:val="16"/>
+                  <w:rFonts w:ascii="Carlito" w:hAnsi="Carlito"/>
                 </w:rPr>
                 <w:t>casey-barton-glaciereq.vercel.app</w:t>
               </w:r>
             </w:hyperlink>
-            <w:r>
-              <w:rPr>
-                <w:rFonts w:ascii="Aptos" w:hAnsi="Aptos" w:eastAsia="Aptos"/>
-                <w:b w:val="0"/>
-                <w:i w:val="0"/>
-                <w:sz w:val="2"/>
-              </w:rPr>
-              <w:br/>
-            </w:r>
+          </w:p>
+          <w:p>
+            <w:pPr>
+              <w:spacing w:before="0" w:after="0" w:line="240" w:lineRule="auto"/>
+              <w:jc w:val="right"/>
+            </w:pPr>
             <w:hyperlink r:id="rId12">
               <w:r>
                 <w:rPr>
@@ -195,6 +177,7 @@
                   <w:u w:val="none"/>
                   <w:sz w:val="16"/>
                   <w:szCs w:val="16"/>
+                  <w:rFonts w:ascii="Carlito" w:hAnsi="Carlito"/>
                 </w:rPr>
                 <w:t>github.com/GlacierEQ</w:t>
               </w:r>
@@ -211,24 +194,24 @@
         <w:tblCellSpacing w:w="0" w:type="dxa"/>
       </w:tblPr>
       <w:tblGrid>
-        <w:gridCol w:w="10858"/>
+        <w:gridCol w:w="10224"/>
       </w:tblGrid>
       <w:tr>
         <w:tc>
           <w:tcPr>
-            <w:tcW w:type="dxa" w:w="10858"/>
+            <w:tcW w:type="dxa" w:w="10224"/>
             <w:shd w:fill="EEF6F4"/>
             <w:tcMar>
-              <w:top w:w="75" w:type="dxa"/>
-              <w:start w:w="90" w:type="dxa"/>
-              <w:bottom w:w="75" w:type="dxa"/>
-              <w:end w:w="90" w:type="dxa"/>
+              <w:top w:w="80" w:type="dxa"/>
+              <w:start w:w="105" w:type="dxa"/>
+              <w:bottom w:w="80" w:type="dxa"/>
+              <w:end w:w="105" w:type="dxa"/>
             </w:tcMar>
             <w:tcBorders>
-              <w:top w:sz="8" w:val="single" w:color="087A73"/>
-              <w:left w:sz="2" w:val="single" w:color="D4E4E1"/>
-              <w:bottom w:sz="8" w:val="single" w:color="087A73"/>
-              <w:right w:sz="2" w:val="single" w:color="D4E4E1"/>
+              <w:top w:val="single" w:sz="5" w:color="087A73"/>
+              <w:left w:val="single" w:sz="5" w:color="087A73"/>
+              <w:bottom w:val="single" w:sz="5" w:color="087A73"/>
+              <w:right w:val="single" w:sz="5" w:color="087A73"/>
             </w:tcBorders>
           </w:tcPr>
           <w:p>
@@ -237,28 +220,28 @@
             </w:pPr>
             <w:r>
               <w:rPr>
-                <w:rFonts w:ascii="Aptos" w:hAnsi="Aptos" w:eastAsia="Aptos"/>
+                <w:rFonts w:ascii="Carlito" w:hAnsi="Carlito" w:eastAsia="Carlito"/>
                 <w:b/>
                 <w:i w:val="0"/>
                 <w:color w:val="087A73"/>
-                <w:sz w:val="16"/>
+                <w:sz w:val="14"/>
               </w:rPr>
-              <w:t>EXECUTIVE SIGNAL</w:t>
+              <w:t>SYSTEMS SIGNAL</w:t>
             </w:r>
           </w:p>
           <w:p>
             <w:pPr>
-              <w:spacing w:before="0" w:after="0" w:line="254" w:lineRule="auto"/>
+              <w:spacing w:before="0" w:after="0" w:line="252" w:lineRule="auto"/>
             </w:pPr>
             <w:r>
               <w:rPr>
-                <w:rFonts w:ascii="Aptos" w:hAnsi="Aptos" w:eastAsia="Aptos"/>
+                <w:rFonts w:ascii="Carlito" w:hAnsi="Carlito" w:eastAsia="Carlito"/>
                 <w:b w:val="0"/>
                 <w:i w:val="0"/>
                 <w:color w:val="14232A"/>
-                <w:sz w:val="19"/>
+                <w:sz w:val="18"/>
               </w:rPr>
-              <w:t>Builds the operating layer between model capability and dependable outcomes: explicit authority, bounded tool use, deterministic evidence, controlled failure, continuity, and completion receipts. Combines software architecture with scientific measurement, compressed-gas safety, building-system inspection, and owner-operated field execution.</w:t>
+              <w:t>Applied AI systems architect who turns ambitious, ambiguous ideas into bounded operating systems with explicit authority, deterministic evidence, controlled failure behavior, and inspectable completion receipts. The method is simple: observe the actual system, separate evidence from inference, isolate the governing failure, build the narrowest useful mechanism, test the stated behavior, expose the limit, and leave a usable artifact.</w:t>
             </w:r>
           </w:p>
         </w:tc>
@@ -273,27 +256,27 @@
         <w:tblCellSpacing w:w="0" w:type="dxa"/>
       </w:tblPr>
       <w:tblGrid>
-        <w:gridCol w:w="2714"/>
-        <w:gridCol w:w="2714"/>
-        <w:gridCol w:w="2714"/>
-        <w:gridCol w:w="2714"/>
+        <w:gridCol w:w="2556"/>
+        <w:gridCol w:w="2556"/>
+        <w:gridCol w:w="2556"/>
+        <w:gridCol w:w="2556"/>
       </w:tblGrid>
       <w:tr>
         <w:tc>
           <w:tcPr>
-            <w:tcW w:type="dxa" w:w="2714"/>
+            <w:tcW w:type="dxa" w:w="2556"/>
             <w:shd w:fill="F7FAF9"/>
             <w:tcMar>
-              <w:top w:w="65" w:type="dxa"/>
-              <w:start w:w="40" w:type="dxa"/>
-              <w:bottom w:w="65" w:type="dxa"/>
-              <w:end w:w="40" w:type="dxa"/>
+              <w:top w:w="55" w:type="dxa"/>
+              <w:start w:w="35" w:type="dxa"/>
+              <w:bottom w:w="55" w:type="dxa"/>
+              <w:end w:w="35" w:type="dxa"/>
             </w:tcMar>
             <w:tcBorders>
-              <w:top w:sz="2" w:val="single" w:color="D4E4E1"/>
-              <w:left w:sz="2" w:val="single" w:color="D4E4E1"/>
-              <w:bottom w:sz="2" w:val="single" w:color="D4E4E1"/>
-              <w:right w:sz="2" w:val="single" w:color="D4E4E1"/>
+              <w:top w:val="single" w:sz="2" w:color="D4E4E1"/>
+              <w:left w:val="single" w:sz="2" w:color="D4E4E1"/>
+              <w:bottom w:val="single" w:sz="2" w:color="D4E4E1"/>
+              <w:right w:val="single" w:sz="2" w:color="D4E4E1"/>
             </w:tcBorders>
           </w:tcPr>
           <w:p>
@@ -303,11 +286,11 @@
             </w:pPr>
             <w:r>
               <w:rPr>
-                <w:rFonts w:ascii="Aptos" w:hAnsi="Aptos" w:eastAsia="Aptos"/>
+                <w:rFonts w:ascii="Carlito" w:hAnsi="Carlito" w:eastAsia="Carlito"/>
                 <w:b/>
                 <w:i w:val="0"/>
                 <w:color w:val="087A73"/>
-                <w:sz w:val="31"/>
+                <w:sz w:val="28"/>
               </w:rPr>
               <w:t>69/69</w:t>
             </w:r>
@@ -319,11 +302,11 @@
             </w:pPr>
             <w:r>
               <w:rPr>
-                <w:rFonts w:ascii="Aptos" w:hAnsi="Aptos" w:eastAsia="Aptos"/>
+                <w:rFonts w:ascii="Carlito" w:hAnsi="Carlito" w:eastAsia="Carlito"/>
                 <w:b w:val="0"/>
                 <w:i w:val="0"/>
                 <w:color w:val="5B6D75"/>
-                <w:sz w:val="15"/>
+                <w:sz w:val="14"/>
               </w:rPr>
               <w:t>Receipt Router tests</w:t>
             </w:r>
@@ -331,19 +314,19 @@
         </w:tc>
         <w:tc>
           <w:tcPr>
-            <w:tcW w:type="dxa" w:w="2714"/>
+            <w:tcW w:type="dxa" w:w="2556"/>
             <w:shd w:fill="EEF6F4"/>
             <w:tcMar>
-              <w:top w:w="65" w:type="dxa"/>
-              <w:start w:w="40" w:type="dxa"/>
-              <w:bottom w:w="65" w:type="dxa"/>
-              <w:end w:w="40" w:type="dxa"/>
+              <w:top w:w="55" w:type="dxa"/>
+              <w:start w:w="35" w:type="dxa"/>
+              <w:bottom w:w="55" w:type="dxa"/>
+              <w:end w:w="35" w:type="dxa"/>
             </w:tcMar>
             <w:tcBorders>
-              <w:top w:sz="2" w:val="single" w:color="D4E4E1"/>
-              <w:left w:sz="2" w:val="single" w:color="D4E4E1"/>
-              <w:bottom w:sz="2" w:val="single" w:color="D4E4E1"/>
-              <w:right w:sz="2" w:val="single" w:color="D4E4E1"/>
+              <w:top w:val="single" w:sz="2" w:color="D4E4E1"/>
+              <w:left w:val="single" w:sz="2" w:color="D4E4E1"/>
+              <w:bottom w:val="single" w:sz="2" w:color="D4E4E1"/>
+              <w:right w:val="single" w:sz="2" w:color="D4E4E1"/>
             </w:tcBorders>
           </w:tcPr>
           <w:p>
@@ -353,11 +336,11 @@
             </w:pPr>
             <w:r>
               <w:rPr>
-                <w:rFonts w:ascii="Aptos" w:hAnsi="Aptos" w:eastAsia="Aptos"/>
+                <w:rFonts w:ascii="Carlito" w:hAnsi="Carlito" w:eastAsia="Carlito"/>
                 <w:b/>
                 <w:i w:val="0"/>
                 <w:color w:val="087A73"/>
-                <w:sz w:val="31"/>
+                <w:sz w:val="28"/>
               </w:rPr>
               <w:t>166 + 19</w:t>
             </w:r>
@@ -369,31 +352,31 @@
             </w:pPr>
             <w:r>
               <w:rPr>
-                <w:rFonts w:ascii="Aptos" w:hAnsi="Aptos" w:eastAsia="Aptos"/>
+                <w:rFonts w:ascii="Carlito" w:hAnsi="Carlito" w:eastAsia="Carlito"/>
                 <w:b w:val="0"/>
                 <w:i w:val="0"/>
                 <w:color w:val="5B6D75"/>
-                <w:sz w:val="15"/>
+                <w:sz w:val="14"/>
               </w:rPr>
-              <w:t>Bounded source + memory tests</w:t>
+              <w:t>source + memory tests</w:t>
             </w:r>
           </w:p>
         </w:tc>
         <w:tc>
           <w:tcPr>
-            <w:tcW w:type="dxa" w:w="2714"/>
+            <w:tcW w:type="dxa" w:w="2556"/>
             <w:shd w:fill="F7FAF9"/>
             <w:tcMar>
-              <w:top w:w="65" w:type="dxa"/>
-              <w:start w:w="40" w:type="dxa"/>
-              <w:bottom w:w="65" w:type="dxa"/>
-              <w:end w:w="40" w:type="dxa"/>
+              <w:top w:w="55" w:type="dxa"/>
+              <w:start w:w="35" w:type="dxa"/>
+              <w:bottom w:w="55" w:type="dxa"/>
+              <w:end w:w="35" w:type="dxa"/>
             </w:tcMar>
             <w:tcBorders>
-              <w:top w:sz="2" w:val="single" w:color="D4E4E1"/>
-              <w:left w:sz="2" w:val="single" w:color="D4E4E1"/>
-              <w:bottom w:sz="2" w:val="single" w:color="D4E4E1"/>
-              <w:right w:sz="2" w:val="single" w:color="D4E4E1"/>
+              <w:top w:val="single" w:sz="2" w:color="D4E4E1"/>
+              <w:left w:val="single" w:sz="2" w:color="D4E4E1"/>
+              <w:bottom w:val="single" w:sz="2" w:color="D4E4E1"/>
+              <w:right w:val="single" w:sz="2" w:color="D4E4E1"/>
             </w:tcBorders>
           </w:tcPr>
           <w:p>
@@ -403,13 +386,13 @@
             </w:pPr>
             <w:r>
               <w:rPr>
-                <w:rFonts w:ascii="Aptos" w:hAnsi="Aptos" w:eastAsia="Aptos"/>
+                <w:rFonts w:ascii="Carlito" w:hAnsi="Carlito" w:eastAsia="Carlito"/>
                 <w:b/>
                 <w:i w:val="0"/>
                 <w:color w:val="087A73"/>
-                <w:sz w:val="31"/>
+                <w:sz w:val="28"/>
               </w:rPr>
-              <w:t>148/148</w:t>
+              <w:t>67</w:t>
             </w:r>
           </w:p>
           <w:p>
@@ -419,31 +402,31 @@
             </w:pPr>
             <w:r>
               <w:rPr>
-                <w:rFonts w:ascii="Aptos" w:hAnsi="Aptos" w:eastAsia="Aptos"/>
+                <w:rFonts w:ascii="Carlito" w:hAnsi="Carlito" w:eastAsia="Carlito"/>
                 <w:b w:val="0"/>
                 <w:i w:val="0"/>
                 <w:color w:val="5B6D75"/>
-                <w:sz w:val="15"/>
+                <w:sz w:val="14"/>
               </w:rPr>
-              <w:t>Job Application Helix tests</w:t>
+              <w:t>Helix admitted public set</w:t>
             </w:r>
           </w:p>
         </w:tc>
         <w:tc>
           <w:tcPr>
-            <w:tcW w:type="dxa" w:w="2714"/>
+            <w:tcW w:type="dxa" w:w="2556"/>
             <w:shd w:fill="EEF6F4"/>
             <w:tcMar>
-              <w:top w:w="65" w:type="dxa"/>
-              <w:start w:w="40" w:type="dxa"/>
-              <w:bottom w:w="65" w:type="dxa"/>
-              <w:end w:w="40" w:type="dxa"/>
+              <w:top w:w="55" w:type="dxa"/>
+              <w:start w:w="35" w:type="dxa"/>
+              <w:bottom w:w="55" w:type="dxa"/>
+              <w:end w:w="35" w:type="dxa"/>
             </w:tcMar>
             <w:tcBorders>
-              <w:top w:sz="2" w:val="single" w:color="D4E4E1"/>
-              <w:left w:sz="2" w:val="single" w:color="D4E4E1"/>
-              <w:bottom w:sz="2" w:val="single" w:color="D4E4E1"/>
-              <w:right w:sz="2" w:val="single" w:color="D4E4E1"/>
+              <w:top w:val="single" w:sz="2" w:color="D4E4E1"/>
+              <w:left w:val="single" w:sz="2" w:color="D4E4E1"/>
+              <w:bottom w:val="single" w:sz="2" w:color="D4E4E1"/>
+              <w:right w:val="single" w:sz="2" w:color="D4E4E1"/>
             </w:tcBorders>
           </w:tcPr>
           <w:p>
@@ -453,13 +436,13 @@
             </w:pPr>
             <w:r>
               <w:rPr>
-                <w:rFonts w:ascii="Aptos" w:hAnsi="Aptos" w:eastAsia="Aptos"/>
+                <w:rFonts w:ascii="Carlito" w:hAnsi="Carlito" w:eastAsia="Carlito"/>
                 <w:b/>
                 <w:i w:val="0"/>
                 <w:color w:val="087A73"/>
-                <w:sz w:val="31"/>
+                <w:sz w:val="28"/>
               </w:rPr>
-              <w:t>0</w:t>
+              <w:t>62/62</w:t>
             </w:r>
           </w:p>
           <w:p>
@@ -469,13 +452,13 @@
             </w:pPr>
             <w:r>
               <w:rPr>
-                <w:rFonts w:ascii="Aptos" w:hAnsi="Aptos" w:eastAsia="Aptos"/>
+                <w:rFonts w:ascii="Carlito" w:hAnsi="Carlito" w:eastAsia="Carlito"/>
                 <w:b w:val="0"/>
                 <w:i w:val="0"/>
                 <w:color w:val="5B6D75"/>
-                <w:sz w:val="15"/>
+                <w:sz w:val="14"/>
               </w:rPr>
-              <w:t>External actions in flagship verification</w:t>
+              <w:t>Agent Coordinator tests</w:t>
             </w:r>
           </w:p>
         </w:tc>
@@ -483,22 +466,35 @@
     </w:tbl>
     <w:p>
       <w:pPr>
-        <w:spacing w:before="120" w:after="60" w:line="240" w:lineRule="auto"/>
-        <w:keepNext/>
-        <w:keepLines/>
+        <w:spacing w:before="140" w:after="20" w:line="240" w:lineRule="auto"/>
+      </w:pPr>
+      <w:r>
+        <w:rPr>
+          <w:rFonts w:ascii="Carlito" w:hAnsi="Carlito" w:eastAsia="Carlito"/>
+          <w:b/>
+          <w:i w:val="0"/>
+          <w:color w:val="087A73"/>
+          <w:sz w:val="14"/>
+        </w:rPr>
+        <w:t>PROOF AT WORK</w:t>
+      </w:r>
+    </w:p>
+    <w:p>
+      <w:pPr>
+        <w:spacing w:before="0" w:after="80" w:line="240" w:lineRule="auto"/>
         <w:pBdr>
-          <w:bottom w:val="single" w:sz="10" w:space="2" w:color="087A73"/>
+          <w:bottom w:val="single" w:sz="8" w:space="2" w:color="087A73"/>
         </w:pBdr>
       </w:pPr>
       <w:r>
         <w:rPr>
-          <w:rFonts w:ascii="Aptos" w:hAnsi="Aptos" w:eastAsia="Aptos"/>
+          <w:rFonts w:ascii="Carlito" w:hAnsi="Carlito" w:eastAsia="Carlito"/>
           <w:b/>
           <w:i w:val="0"/>
-          <w:color w:val="087A73"/>
-          <w:sz w:val="24"/>
+          <w:color w:val="14232A"/>
+          <w:sz w:val="26"/>
         </w:rPr>
-        <w:t>PROFESSIONAL EXPERIENCE</w:t>
+        <w:t>Professional Experience</w:t>
       </w:r>
     </w:p>
     <w:tbl>
@@ -510,22 +506,19 @@
         <w:tblCellSpacing w:w="0" w:type="dxa"/>
       </w:tblPr>
       <w:tblGrid>
-        <w:gridCol w:w="8496"/>
-        <w:gridCol w:w="2376"/>
+        <w:gridCol w:w="8064"/>
+        <w:gridCol w:w="2160"/>
       </w:tblGrid>
       <w:tr>
         <w:tc>
           <w:tcPr>
-            <w:tcW w:type="dxa" w:w="5429"/>
+            <w:tcW w:type="dxa" w:w="5112"/>
             <w:tcMar>
-              <w:top w:w="30" w:type="dxa"/>
+              <w:top w:w="25" w:type="dxa"/>
               <w:start w:w="0" w:type="dxa"/>
-              <w:bottom w:w="15" w:type="dxa"/>
+              <w:bottom w:w="10" w:type="dxa"/>
               <w:end w:w="0" w:type="dxa"/>
             </w:tcMar>
-            <w:tcBorders>
-              <w:bottom w:val="nil"/>
-            </w:tcBorders>
           </w:tcPr>
           <w:p>
             <w:pPr>
@@ -533,31 +526,31 @@
             </w:pPr>
             <w:r>
               <w:rPr>
-                <w:rFonts w:ascii="Aptos" w:hAnsi="Aptos" w:eastAsia="Aptos"/>
+                <w:rFonts w:ascii="Carlito" w:hAnsi="Carlito" w:eastAsia="Carlito"/>
                 <w:b/>
                 <w:i w:val="0"/>
                 <w:color w:val="14232A"/>
-                <w:sz w:val="21"/>
+                <w:sz w:val="20"/>
               </w:rPr>
               <w:t>GlacierEQ</w:t>
             </w:r>
             <w:r>
               <w:rPr>
-                <w:rFonts w:ascii="Aptos" w:hAnsi="Aptos" w:eastAsia="Aptos"/>
+                <w:rFonts w:ascii="Carlito" w:hAnsi="Carlito" w:eastAsia="Carlito"/>
                 <w:b w:val="0"/>
                 <w:i w:val="0"/>
                 <w:color w:val="5B6D75"/>
-                <w:sz w:val="21"/>
+                <w:sz w:val="18"/>
               </w:rPr>
-              <w:t xml:space="preserve"> | </w:t>
+              <w:t xml:space="preserve">  |  </w:t>
             </w:r>
             <w:r>
               <w:rPr>
-                <w:rFonts w:ascii="Aptos" w:hAnsi="Aptos" w:eastAsia="Aptos"/>
+                <w:rFonts w:ascii="Carlito" w:hAnsi="Carlito" w:eastAsia="Carlito"/>
                 <w:b/>
                 <w:i w:val="0"/>
                 <w:color w:val="087A73"/>
-                <w:sz w:val="20"/>
+                <w:sz w:val="18"/>
               </w:rPr>
               <w:t>Founder / Applied AI Systems Builder</w:t>
             </w:r>
@@ -565,16 +558,13 @@
         </w:tc>
         <w:tc>
           <w:tcPr>
-            <w:tcW w:type="dxa" w:w="5429"/>
+            <w:tcW w:type="dxa" w:w="5112"/>
             <w:tcMar>
-              <w:top w:w="30" w:type="dxa"/>
+              <w:top w:w="25" w:type="dxa"/>
               <w:start w:w="0" w:type="dxa"/>
-              <w:bottom w:w="15" w:type="dxa"/>
+              <w:bottom w:w="10" w:type="dxa"/>
               <w:end w:w="0" w:type="dxa"/>
             </w:tcMar>
-            <w:tcBorders>
-              <w:bottom w:val="nil"/>
-            </w:tcBorders>
           </w:tcPr>
           <w:p>
             <w:pPr>
@@ -583,11 +573,11 @@
             </w:pPr>
             <w:r>
               <w:rPr>
-                <w:rFonts w:ascii="Aptos" w:hAnsi="Aptos" w:eastAsia="Aptos"/>
+                <w:rFonts w:ascii="Carlito" w:hAnsi="Carlito" w:eastAsia="Carlito"/>
                 <w:b/>
                 <w:i w:val="0"/>
                 <w:color w:val="5B6D75"/>
-                <w:sz w:val="17"/>
+                <w:sz w:val="16"/>
               </w:rPr>
               <w:t>Jan 2025-Present</w:t>
             </w:r>
@@ -597,31 +587,17 @@
     </w:tbl>
     <w:p>
       <w:pPr>
-        <w:spacing w:before="0" w:after="20" w:line="240" w:lineRule="auto"/>
+        <w:pStyle w:val="ListBullet"/>
+        <w:spacing w:before="0" w:after="14" w:line="247" w:lineRule="auto"/>
+        <w:ind w:left="259" w:hanging="202"/>
       </w:pPr>
       <w:r>
         <w:rPr>
-          <w:rFonts w:ascii="Aptos" w:hAnsi="Aptos" w:eastAsia="Aptos"/>
+          <w:rFonts w:ascii="Carlito" w:hAnsi="Carlito" w:eastAsia="Carlito"/>
           <w:b w:val="0"/>
-          <w:i/>
-          <w:color w:val="5B6D75"/>
+          <w:i w:val="0"/>
+          <w:color w:val="14232A"/>
           <w:sz w:val="17"/>
-        </w:rPr>
-        <w:t>Honolulu, Hawaii</w:t>
-      </w:r>
-    </w:p>
-    <w:p>
-      <w:pPr>
-        <w:pStyle w:val="ListBullet"/>
-        <w:spacing w:after="8" w:line="240" w:lineRule="auto"/>
-        <w:ind w:left="245" w:hanging="202"/>
-        <w:keepLines/>
-      </w:pPr>
-      <w:r>
-        <w:rPr>
-          <w:rFonts w:ascii="Aptos" w:hAnsi="Aptos" w:eastAsia="Aptos"/>
-          <w:color w:val="14232A"/>
-          <w:sz w:val="18"/>
         </w:rPr>
         <w:t>Design and implement evidence-bound systems spanning agent orchestration, application intelligence, document and evidence pipelines, memory and continuity, infrastructure governance, and human-machine interfaces.</w:t>
       </w:r>
@@ -629,49 +605,52 @@
     <w:p>
       <w:pPr>
         <w:pStyle w:val="ListBullet"/>
-        <w:spacing w:after="8" w:line="240" w:lineRule="auto"/>
-        <w:ind w:left="245" w:hanging="202"/>
-        <w:keepLines/>
+        <w:spacing w:before="0" w:after="14" w:line="247" w:lineRule="auto"/>
+        <w:ind w:left="259" w:hanging="202"/>
       </w:pPr>
       <w:r>
         <w:rPr>
-          <w:rFonts w:ascii="Aptos" w:hAnsi="Aptos" w:eastAsia="Aptos"/>
+          <w:rFonts w:ascii="Carlito" w:hAnsi="Carlito" w:eastAsia="Carlito"/>
+          <w:b w:val="0"/>
+          <w:i w:val="0"/>
           <w:color w:val="14232A"/>
-          <w:sz w:val="18"/>
+          <w:sz w:val="17"/>
         </w:rPr>
-        <w:t>Convert ambiguous architecture into typed contracts, runnable slices, deterministic tests, explicit refusal behavior, machine-readable facts, and reviewable completion receipts.</w:t>
+        <w:t>Convert broad architecture into typed contracts, runnable slices, deterministic tests, explicit refusal behavior, machine-readable facts, and reviewable completion receipts.</w:t>
       </w:r>
     </w:p>
     <w:p>
       <w:pPr>
         <w:pStyle w:val="ListBullet"/>
-        <w:spacing w:after="8" w:line="240" w:lineRule="auto"/>
-        <w:ind w:left="245" w:hanging="202"/>
-        <w:keepLines/>
+        <w:spacing w:before="0" w:after="14" w:line="247" w:lineRule="auto"/>
+        <w:ind w:left="259" w:hanging="202"/>
       </w:pPr>
       <w:r>
         <w:rPr>
-          <w:rFonts w:ascii="Aptos" w:hAnsi="Aptos" w:eastAsia="Aptos"/>
+          <w:rFonts w:ascii="Carlito" w:hAnsi="Carlito" w:eastAsia="Carlito"/>
+          <w:b w:val="0"/>
+          <w:i w:val="0"/>
           <w:color w:val="14232A"/>
-          <w:sz w:val="18"/>
+          <w:sz w:val="17"/>
         </w:rPr>
-        <w:t>Built a public Portfolio Receipt Router that replaced unsupported autonomous-control semantics with a local fail-closed evidence system; 69 of 69 tests passed through direct and reusable CI with zero external actions.</w:t>
+        <w:t>Built a public Portfolio Receipt Router that replaced unsupported autonomous-control semantics with a local fail-closed evidence system; 69/69 tests passed through direct and reusable CI with zero external actions.</w:t>
       </w:r>
     </w:p>
     <w:p>
       <w:pPr>
         <w:pStyle w:val="ListBullet"/>
-        <w:spacing w:after="8" w:line="240" w:lineRule="auto"/>
-        <w:ind w:left="245" w:hanging="202"/>
-        <w:keepLines/>
+        <w:spacing w:before="0" w:after="14" w:line="247" w:lineRule="auto"/>
+        <w:ind w:left="259" w:hanging="202"/>
       </w:pPr>
       <w:r>
         <w:rPr>
-          <w:rFonts w:ascii="Aptos" w:hAnsi="Aptos" w:eastAsia="Aptos"/>
+          <w:rFonts w:ascii="Carlito" w:hAnsi="Carlito" w:eastAsia="Carlito"/>
+          <w:b w:val="0"/>
+          <w:i w:val="0"/>
           <w:color w:val="14232A"/>
-          <w:sz w:val="18"/>
+          <w:sz w:val="17"/>
         </w:rPr>
-        <w:t>Govern a multi-repository portfolio by separating source presence, review, execution, deployment, authority, and verified completion so recruiter, technical, and machine views cannot drift.</w:t>
+        <w:t>Govern a multi-repository engineering estate by separating source presence, review, execution, deployment, authority, and verified completion so public claims cannot outrun proof.</w:t>
       </w:r>
     </w:p>
     <w:tbl>
@@ -683,22 +662,19 @@
         <w:tblCellSpacing w:w="0" w:type="dxa"/>
       </w:tblPr>
       <w:tblGrid>
-        <w:gridCol w:w="8496"/>
-        <w:gridCol w:w="2376"/>
+        <w:gridCol w:w="8064"/>
+        <w:gridCol w:w="2160"/>
       </w:tblGrid>
       <w:tr>
         <w:tc>
           <w:tcPr>
-            <w:tcW w:type="dxa" w:w="5429"/>
+            <w:tcW w:type="dxa" w:w="5112"/>
             <w:tcMar>
-              <w:top w:w="30" w:type="dxa"/>
+              <w:top w:w="25" w:type="dxa"/>
               <w:start w:w="0" w:type="dxa"/>
-              <w:bottom w:w="15" w:type="dxa"/>
+              <w:bottom w:w="10" w:type="dxa"/>
               <w:end w:w="0" w:type="dxa"/>
             </w:tcMar>
-            <w:tcBorders>
-              <w:bottom w:val="nil"/>
-            </w:tcBorders>
           </w:tcPr>
           <w:p>
             <w:pPr>
@@ -706,31 +682,31 @@
             </w:pPr>
             <w:r>
               <w:rPr>
-                <w:rFonts w:ascii="Aptos" w:hAnsi="Aptos" w:eastAsia="Aptos"/>
+                <w:rFonts w:ascii="Carlito" w:hAnsi="Carlito" w:eastAsia="Carlito"/>
                 <w:b/>
                 <w:i w:val="0"/>
                 <w:color w:val="14232A"/>
-                <w:sz w:val="21"/>
+                <w:sz w:val="20"/>
               </w:rPr>
               <w:t>Diamond Head Home Inspections</w:t>
             </w:r>
             <w:r>
               <w:rPr>
-                <w:rFonts w:ascii="Aptos" w:hAnsi="Aptos" w:eastAsia="Aptos"/>
+                <w:rFonts w:ascii="Carlito" w:hAnsi="Carlito" w:eastAsia="Carlito"/>
                 <w:b w:val="0"/>
                 <w:i w:val="0"/>
                 <w:color w:val="5B6D75"/>
-                <w:sz w:val="21"/>
+                <w:sz w:val="18"/>
               </w:rPr>
-              <w:t xml:space="preserve"> | </w:t>
+              <w:t xml:space="preserve">  |  </w:t>
             </w:r>
             <w:r>
               <w:rPr>
-                <w:rFonts w:ascii="Aptos" w:hAnsi="Aptos" w:eastAsia="Aptos"/>
+                <w:rFonts w:ascii="Carlito" w:hAnsi="Carlito" w:eastAsia="Carlito"/>
                 <w:b/>
                 <w:i w:val="0"/>
                 <w:color w:val="087A73"/>
-                <w:sz w:val="20"/>
+                <w:sz w:val="18"/>
               </w:rPr>
               <w:t>Certified Home Inspector</w:t>
             </w:r>
@@ -738,16 +714,13 @@
         </w:tc>
         <w:tc>
           <w:tcPr>
-            <w:tcW w:type="dxa" w:w="5429"/>
+            <w:tcW w:type="dxa" w:w="5112"/>
             <w:tcMar>
-              <w:top w:w="30" w:type="dxa"/>
+              <w:top w:w="25" w:type="dxa"/>
               <w:start w:w="0" w:type="dxa"/>
-              <w:bottom w:w="15" w:type="dxa"/>
+              <w:bottom w:w="10" w:type="dxa"/>
               <w:end w:w="0" w:type="dxa"/>
             </w:tcMar>
-            <w:tcBorders>
-              <w:bottom w:val="nil"/>
-            </w:tcBorders>
           </w:tcPr>
           <w:p>
             <w:pPr>
@@ -756,11 +729,11 @@
             </w:pPr>
             <w:r>
               <w:rPr>
-                <w:rFonts w:ascii="Aptos" w:hAnsi="Aptos" w:eastAsia="Aptos"/>
+                <w:rFonts w:ascii="Carlito" w:hAnsi="Carlito" w:eastAsia="Carlito"/>
                 <w:b/>
                 <w:i w:val="0"/>
                 <w:color w:val="5B6D75"/>
-                <w:sz w:val="17"/>
+                <w:sz w:val="16"/>
               </w:rPr>
               <w:t>2020-2024</w:t>
             </w:r>
@@ -770,31 +743,17 @@
     </w:tbl>
     <w:p>
       <w:pPr>
-        <w:spacing w:before="0" w:after="20" w:line="240" w:lineRule="auto"/>
+        <w:pStyle w:val="ListBullet"/>
+        <w:spacing w:before="0" w:after="14" w:line="247" w:lineRule="auto"/>
+        <w:ind w:left="259" w:hanging="202"/>
       </w:pPr>
       <w:r>
         <w:rPr>
-          <w:rFonts w:ascii="Aptos" w:hAnsi="Aptos" w:eastAsia="Aptos"/>
+          <w:rFonts w:ascii="Carlito" w:hAnsi="Carlito" w:eastAsia="Carlito"/>
           <w:b w:val="0"/>
-          <w:i/>
-          <w:color w:val="5B6D75"/>
+          <w:i w:val="0"/>
+          <w:color w:val="14232A"/>
           <w:sz w:val="17"/>
-        </w:rPr>
-        <w:t>Honolulu, Hawaii</w:t>
-      </w:r>
-    </w:p>
-    <w:p>
-      <w:pPr>
-        <w:pStyle w:val="ListBullet"/>
-        <w:spacing w:after="8" w:line="240" w:lineRule="auto"/>
-        <w:ind w:left="245" w:hanging="202"/>
-        <w:keepLines/>
-      </w:pPr>
-      <w:r>
-        <w:rPr>
-          <w:rFonts w:ascii="Aptos" w:hAnsi="Aptos" w:eastAsia="Aptos"/>
-          <w:color w:val="14232A"/>
-          <w:sz w:val="18"/>
         </w:rPr>
         <w:t>Inspected residential structural, roofing, electrical, plumbing, HVAC, moisture, and safety conditions; translated field evidence into clear, decision-ready reports under time constraints.</w:t>
       </w:r>
@@ -802,17 +761,18 @@
     <w:p>
       <w:pPr>
         <w:pStyle w:val="ListBullet"/>
-        <w:spacing w:after="8" w:line="240" w:lineRule="auto"/>
-        <w:ind w:left="245" w:hanging="202"/>
-        <w:keepLines/>
+        <w:spacing w:before="0" w:after="14" w:line="247" w:lineRule="auto"/>
+        <w:ind w:left="259" w:hanging="202"/>
       </w:pPr>
       <w:r>
         <w:rPr>
-          <w:rFonts w:ascii="Aptos" w:hAnsi="Aptos" w:eastAsia="Aptos"/>
+          <w:rFonts w:ascii="Carlito" w:hAnsi="Carlito" w:eastAsia="Carlito"/>
+          <w:b w:val="0"/>
+          <w:i w:val="0"/>
           <w:color w:val="14232A"/>
-          <w:sz w:val="18"/>
+          <w:sz w:val="17"/>
         </w:rPr>
-        <w:t>Developed disciplined habits around uncertainty labeling, defect prioritization, interacting-system analysis, client communication, and avoiding unsupported conclusions.</w:t>
+        <w:t>Built disciplined habits around uncertainty labeling, defect prioritization, interacting-system analysis, client communication, and avoiding unsupported conclusions.</w:t>
       </w:r>
     </w:p>
     <w:tbl>
@@ -824,22 +784,19 @@
         <w:tblCellSpacing w:w="0" w:type="dxa"/>
       </w:tblPr>
       <w:tblGrid>
-        <w:gridCol w:w="8496"/>
-        <w:gridCol w:w="2376"/>
+        <w:gridCol w:w="8064"/>
+        <w:gridCol w:w="2160"/>
       </w:tblGrid>
       <w:tr>
         <w:tc>
           <w:tcPr>
-            <w:tcW w:type="dxa" w:w="5429"/>
+            <w:tcW w:type="dxa" w:w="5112"/>
             <w:tcMar>
-              <w:top w:w="30" w:type="dxa"/>
+              <w:top w:w="25" w:type="dxa"/>
               <w:start w:w="0" w:type="dxa"/>
-              <w:bottom w:w="15" w:type="dxa"/>
+              <w:bottom w:w="10" w:type="dxa"/>
               <w:end w:w="0" w:type="dxa"/>
             </w:tcMar>
-            <w:tcBorders>
-              <w:bottom w:val="nil"/>
-            </w:tcBorders>
           </w:tcPr>
           <w:p>
             <w:pPr>
@@ -847,31 +804,31 @@
             </w:pPr>
             <w:r>
               <w:rPr>
-                <w:rFonts w:ascii="Aptos" w:hAnsi="Aptos" w:eastAsia="Aptos"/>
+                <w:rFonts w:ascii="Carlito" w:hAnsi="Carlito" w:eastAsia="Carlito"/>
                 <w:b/>
                 <w:i w:val="0"/>
                 <w:color w:val="14232A"/>
-                <w:sz w:val="21"/>
+                <w:sz w:val="20"/>
               </w:rPr>
               <w:t>Hi-Class Home Services / Hi Class Maintenance Oahu LLC</w:t>
             </w:r>
             <w:r>
               <w:rPr>
-                <w:rFonts w:ascii="Aptos" w:hAnsi="Aptos" w:eastAsia="Aptos"/>
+                <w:rFonts w:ascii="Carlito" w:hAnsi="Carlito" w:eastAsia="Carlito"/>
                 <w:b w:val="0"/>
                 <w:i w:val="0"/>
                 <w:color w:val="5B6D75"/>
-                <w:sz w:val="21"/>
+                <w:sz w:val="18"/>
               </w:rPr>
-              <w:t xml:space="preserve"> | </w:t>
+              <w:t xml:space="preserve">  |  </w:t>
             </w:r>
             <w:r>
               <w:rPr>
-                <w:rFonts w:ascii="Aptos" w:hAnsi="Aptos" w:eastAsia="Aptos"/>
+                <w:rFonts w:ascii="Carlito" w:hAnsi="Carlito" w:eastAsia="Carlito"/>
                 <w:b/>
                 <w:i w:val="0"/>
                 <w:color w:val="087A73"/>
-                <w:sz w:val="20"/>
+                <w:sz w:val="18"/>
               </w:rPr>
               <w:t>Owner-Operator, Building Systems &amp; Field Services</w:t>
             </w:r>
@@ -879,16 +836,13 @@
         </w:tc>
         <w:tc>
           <w:tcPr>
-            <w:tcW w:type="dxa" w:w="5429"/>
+            <w:tcW w:type="dxa" w:w="5112"/>
             <w:tcMar>
-              <w:top w:w="30" w:type="dxa"/>
+              <w:top w:w="25" w:type="dxa"/>
               <w:start w:w="0" w:type="dxa"/>
-              <w:bottom w:w="15" w:type="dxa"/>
+              <w:bottom w:w="10" w:type="dxa"/>
               <w:end w:w="0" w:type="dxa"/>
             </w:tcMar>
-            <w:tcBorders>
-              <w:bottom w:val="nil"/>
-            </w:tcBorders>
           </w:tcPr>
           <w:p>
             <w:pPr>
@@ -897,11 +851,11 @@
             </w:pPr>
             <w:r>
               <w:rPr>
-                <w:rFonts w:ascii="Aptos" w:hAnsi="Aptos" w:eastAsia="Aptos"/>
+                <w:rFonts w:ascii="Carlito" w:hAnsi="Carlito" w:eastAsia="Carlito"/>
                 <w:b/>
                 <w:i w:val="0"/>
                 <w:color w:val="5B6D75"/>
-                <w:sz w:val="17"/>
+                <w:sz w:val="16"/>
               </w:rPr>
               <w:t>2017-Present</w:t>
             </w:r>
@@ -911,31 +865,17 @@
     </w:tbl>
     <w:p>
       <w:pPr>
-        <w:spacing w:before="0" w:after="20" w:line="240" w:lineRule="auto"/>
+        <w:pStyle w:val="ListBullet"/>
+        <w:spacing w:before="0" w:after="14" w:line="247" w:lineRule="auto"/>
+        <w:ind w:left="259" w:hanging="202"/>
       </w:pPr>
       <w:r>
         <w:rPr>
-          <w:rFonts w:ascii="Aptos" w:hAnsi="Aptos" w:eastAsia="Aptos"/>
+          <w:rFonts w:ascii="Carlito" w:hAnsi="Carlito" w:eastAsia="Carlito"/>
           <w:b w:val="0"/>
-          <w:i/>
-          <w:color w:val="5B6D75"/>
+          <w:i w:val="0"/>
+          <w:color w:val="14232A"/>
           <w:sz w:val="17"/>
-        </w:rPr>
-        <w:t>Honolulu, Hawaii</w:t>
-      </w:r>
-    </w:p>
-    <w:p>
-      <w:pPr>
-        <w:pStyle w:val="ListBullet"/>
-        <w:spacing w:after="8" w:line="240" w:lineRule="auto"/>
-        <w:ind w:left="245" w:hanging="202"/>
-        <w:keepLines/>
-      </w:pPr>
-      <w:r>
-        <w:rPr>
-          <w:rFonts w:ascii="Aptos" w:hAnsi="Aptos" w:eastAsia="Aptos"/>
-          <w:color w:val="14232A"/>
-          <w:sz w:val="18"/>
         </w:rPr>
         <w:t>Scope residential repair and service work, prepare estimates, coordinate execution, and communicate assumptions, constraints, and completion status with clients.</w:t>
       </w:r>
@@ -943,37 +883,51 @@
     <w:p>
       <w:pPr>
         <w:pStyle w:val="ListBullet"/>
-        <w:spacing w:after="8" w:line="240" w:lineRule="auto"/>
-        <w:ind w:left="245" w:hanging="202"/>
-        <w:keepLines/>
+        <w:spacing w:before="0" w:after="14" w:line="247" w:lineRule="auto"/>
+        <w:ind w:left="259" w:hanging="202"/>
       </w:pPr>
       <w:r>
         <w:rPr>
-          <w:rFonts w:ascii="Aptos" w:hAnsi="Aptos" w:eastAsia="Aptos"/>
+          <w:rFonts w:ascii="Carlito" w:hAnsi="Carlito" w:eastAsia="Carlito"/>
+          <w:b w:val="0"/>
+          <w:i w:val="0"/>
           <w:color w:val="14232A"/>
-          <w:sz w:val="18"/>
+          <w:sz w:val="17"/>
         </w:rPr>
-        <w:t>Work across practical building-system problems including minor carpentry, plumbing, electrical fixture replacement, drywall, painting, flooring, and maintenance planning.</w:t>
+        <w:t>Translate incomplete real-world requirements into bounded work packages, explicit assumptions, and usable closeout artifacts.</w:t>
       </w:r>
     </w:p>
     <w:p>
       <w:pPr>
-        <w:spacing w:before="120" w:after="60" w:line="240" w:lineRule="auto"/>
-        <w:keepNext/>
-        <w:keepLines/>
+        <w:spacing w:before="140" w:after="20" w:line="240" w:lineRule="auto"/>
+      </w:pPr>
+      <w:r>
+        <w:rPr>
+          <w:rFonts w:ascii="Carlito" w:hAnsi="Carlito" w:eastAsia="Carlito"/>
+          <w:b/>
+          <w:i w:val="0"/>
+          <w:color w:val="087A73"/>
+          <w:sz w:val="14"/>
+        </w:rPr>
+        <w:t>CAPABILITY FIELD</w:t>
+      </w:r>
+    </w:p>
+    <w:p>
+      <w:pPr>
+        <w:spacing w:before="0" w:after="80" w:line="240" w:lineRule="auto"/>
         <w:pBdr>
-          <w:bottom w:val="single" w:sz="10" w:space="2" w:color="087A73"/>
+          <w:bottom w:val="single" w:sz="8" w:space="2" w:color="087A73"/>
         </w:pBdr>
       </w:pPr>
       <w:r>
         <w:rPr>
-          <w:rFonts w:ascii="Aptos" w:hAnsi="Aptos" w:eastAsia="Aptos"/>
+          <w:rFonts w:ascii="Carlito" w:hAnsi="Carlito" w:eastAsia="Carlito"/>
           <w:b/>
           <w:i w:val="0"/>
-          <w:color w:val="087A73"/>
-          <w:sz w:val="24"/>
+          <w:color w:val="14232A"/>
+          <w:sz w:val="26"/>
         </w:rPr>
-        <w:t>CORE CAPABILITY MATRIX</w:t>
+        <w:t>Core Capabilities</w:t>
       </w:r>
     </w:p>
     <w:tbl>
@@ -985,13 +939,13 @@
         <w:tblCellSpacing w:w="0" w:type="dxa"/>
       </w:tblPr>
       <w:tblGrid>
-        <w:gridCol w:w="5429"/>
-        <w:gridCol w:w="5429"/>
+        <w:gridCol w:w="5112"/>
+        <w:gridCol w:w="5112"/>
       </w:tblGrid>
       <w:tr>
         <w:tc>
           <w:tcPr>
-            <w:tcW w:type="dxa" w:w="5429"/>
+            <w:tcW w:type="dxa" w:w="5112"/>
             <w:shd w:fill="EEF6F4"/>
             <w:tcMar>
               <w:top w:w="65" w:type="dxa"/>
@@ -1000,10 +954,10 @@
               <w:end w:w="80" w:type="dxa"/>
             </w:tcMar>
             <w:tcBorders>
-              <w:top w:sz="2" w:val="single" w:color="D4E4E1"/>
-              <w:left w:sz="2" w:val="single" w:color="D4E4E1"/>
-              <w:bottom w:sz="2" w:val="single" w:color="D4E4E1"/>
-              <w:right w:sz="2" w:val="single" w:color="D4E4E1"/>
+              <w:top w:val="single" w:sz="2" w:color="D4E4E1"/>
+              <w:left w:val="single" w:sz="2" w:color="D4E4E1"/>
+              <w:bottom w:val="single" w:sz="2" w:color="D4E4E1"/>
+              <w:right w:val="single" w:sz="2" w:color="D4E4E1"/>
             </w:tcBorders>
           </w:tcPr>
           <w:p>
@@ -1012,7 +966,7 @@
             </w:pPr>
             <w:r>
               <w:rPr>
-                <w:rFonts w:ascii="Aptos" w:hAnsi="Aptos" w:eastAsia="Aptos"/>
+                <w:rFonts w:ascii="Carlito" w:hAnsi="Carlito" w:eastAsia="Carlito"/>
                 <w:b/>
                 <w:i w:val="0"/>
                 <w:color w:val="087A73"/>
@@ -1027,7 +981,7 @@
             </w:pPr>
             <w:r>
               <w:rPr>
-                <w:rFonts w:ascii="Aptos" w:hAnsi="Aptos" w:eastAsia="Aptos"/>
+                <w:rFonts w:ascii="Carlito" w:hAnsi="Carlito" w:eastAsia="Carlito"/>
                 <w:b w:val="0"/>
                 <w:i w:val="0"/>
                 <w:color w:val="14232A"/>
@@ -1039,7 +993,7 @@
         </w:tc>
         <w:tc>
           <w:tcPr>
-            <w:tcW w:type="dxa" w:w="5429"/>
+            <w:tcW w:type="dxa" w:w="5112"/>
             <w:shd w:fill="F7FAF9"/>
             <w:tcMar>
               <w:top w:w="65" w:type="dxa"/>
@@ -1048,10 +1002,10 @@
               <w:end w:w="80" w:type="dxa"/>
             </w:tcMar>
             <w:tcBorders>
-              <w:top w:sz="2" w:val="single" w:color="D4E4E1"/>
-              <w:left w:sz="2" w:val="single" w:color="D4E4E1"/>
-              <w:bottom w:sz="2" w:val="single" w:color="D4E4E1"/>
-              <w:right w:sz="2" w:val="single" w:color="D4E4E1"/>
+              <w:top w:val="single" w:sz="2" w:color="D4E4E1"/>
+              <w:left w:val="single" w:sz="2" w:color="D4E4E1"/>
+              <w:bottom w:val="single" w:sz="2" w:color="D4E4E1"/>
+              <w:right w:val="single" w:sz="2" w:color="D4E4E1"/>
             </w:tcBorders>
           </w:tcPr>
           <w:p>
@@ -1060,7 +1014,7 @@
             </w:pPr>
             <w:r>
               <w:rPr>
-                <w:rFonts w:ascii="Aptos" w:hAnsi="Aptos" w:eastAsia="Aptos"/>
+                <w:rFonts w:ascii="Carlito" w:hAnsi="Carlito" w:eastAsia="Carlito"/>
                 <w:b/>
                 <w:i w:val="0"/>
                 <w:color w:val="087A73"/>
@@ -1075,13 +1029,13 @@
             </w:pPr>
             <w:r>
               <w:rPr>
-                <w:rFonts w:ascii="Aptos" w:hAnsi="Aptos" w:eastAsia="Aptos"/>
+                <w:rFonts w:ascii="Carlito" w:hAnsi="Carlito" w:eastAsia="Carlito"/>
                 <w:b w:val="0"/>
                 <w:i w:val="0"/>
                 <w:color w:val="14232A"/>
                 <w:sz w:val="15"/>
               </w:rPr>
-              <w:t>Provenance; claim-to-source mapping; deterministic testing; JSON Schema; CI/CD; static analysis; integrity hashing; machine-readable receipts.</w:t>
+              <w:t>Provenance; claim-to-source mapping; deterministic testing; JSON Schema; CI/CD; static analysis; dependency auditing; integrity hashing; machine-readable receipts.</w:t>
             </w:r>
           </w:p>
         </w:tc>
@@ -1089,7 +1043,7 @@
       <w:tr>
         <w:tc>
           <w:tcPr>
-            <w:tcW w:type="dxa" w:w="5429"/>
+            <w:tcW w:type="dxa" w:w="5112"/>
             <w:shd w:fill="F7FAF9"/>
             <w:tcMar>
               <w:top w:w="65" w:type="dxa"/>
@@ -1098,10 +1052,10 @@
               <w:end w:w="80" w:type="dxa"/>
             </w:tcMar>
             <w:tcBorders>
-              <w:top w:sz="2" w:val="single" w:color="D4E4E1"/>
-              <w:left w:sz="2" w:val="single" w:color="D4E4E1"/>
-              <w:bottom w:sz="2" w:val="single" w:color="D4E4E1"/>
-              <w:right w:sz="2" w:val="single" w:color="D4E4E1"/>
+              <w:top w:val="single" w:sz="2" w:color="D4E4E1"/>
+              <w:left w:val="single" w:sz="2" w:color="D4E4E1"/>
+              <w:bottom w:val="single" w:sz="2" w:color="D4E4E1"/>
+              <w:right w:val="single" w:sz="2" w:color="D4E4E1"/>
             </w:tcBorders>
           </w:tcPr>
           <w:p>
@@ -1110,7 +1064,7 @@
             </w:pPr>
             <w:r>
               <w:rPr>
-                <w:rFonts w:ascii="Aptos" w:hAnsi="Aptos" w:eastAsia="Aptos"/>
+                <w:rFonts w:ascii="Carlito" w:hAnsi="Carlito" w:eastAsia="Carlito"/>
                 <w:b/>
                 <w:i w:val="0"/>
                 <w:color w:val="087A73"/>
@@ -1125,19 +1079,19 @@
             </w:pPr>
             <w:r>
               <w:rPr>
-                <w:rFonts w:ascii="Aptos" w:hAnsi="Aptos" w:eastAsia="Aptos"/>
+                <w:rFonts w:ascii="Carlito" w:hAnsi="Carlito" w:eastAsia="Carlito"/>
                 <w:b w:val="0"/>
                 <w:i w:val="0"/>
                 <w:color w:val="14232A"/>
                 <w:sz w:val="15"/>
               </w:rPr>
-              <w:t>Role research; evidence-qualified resume generation; document extraction; structured artifacts; human and machine presentation layers.</w:t>
+              <w:t>Role research; evidence-qualified resume generation; document extraction; structured artifacts; human and machine presentation surfaces.</w:t>
             </w:r>
           </w:p>
         </w:tc>
         <w:tc>
           <w:tcPr>
-            <w:tcW w:type="dxa" w:w="5429"/>
+            <w:tcW w:type="dxa" w:w="5112"/>
             <w:shd w:fill="EEF6F4"/>
             <w:tcMar>
               <w:top w:w="65" w:type="dxa"/>
@@ -1146,10 +1100,10 @@
               <w:end w:w="80" w:type="dxa"/>
             </w:tcMar>
             <w:tcBorders>
-              <w:top w:sz="2" w:val="single" w:color="D4E4E1"/>
-              <w:left w:sz="2" w:val="single" w:color="D4E4E1"/>
-              <w:bottom w:sz="2" w:val="single" w:color="D4E4E1"/>
-              <w:right w:sz="2" w:val="single" w:color="D4E4E1"/>
+              <w:top w:val="single" w:sz="2" w:color="D4E4E1"/>
+              <w:left w:val="single" w:sz="2" w:color="D4E4E1"/>
+              <w:bottom w:val="single" w:sz="2" w:color="D4E4E1"/>
+              <w:right w:val="single" w:sz="2" w:color="D4E4E1"/>
             </w:tcBorders>
           </w:tcPr>
           <w:p>
@@ -1158,7 +1112,7 @@
             </w:pPr>
             <w:r>
               <w:rPr>
-                <w:rFonts w:ascii="Aptos" w:hAnsi="Aptos" w:eastAsia="Aptos"/>
+                <w:rFonts w:ascii="Carlito" w:hAnsi="Carlito" w:eastAsia="Carlito"/>
                 <w:b/>
                 <w:i w:val="0"/>
                 <w:color w:val="087A73"/>
@@ -1173,7 +1127,7 @@
             </w:pPr>
             <w:r>
               <w:rPr>
-                <w:rFonts w:ascii="Aptos" w:hAnsi="Aptos" w:eastAsia="Aptos"/>
+                <w:rFonts w:ascii="Carlito" w:hAnsi="Carlito" w:eastAsia="Carlito"/>
                 <w:b w:val="0"/>
                 <w:i w:val="0"/>
                 <w:color w:val="14232A"/>
@@ -1192,22 +1146,35 @@
     </w:p>
     <w:p>
       <w:pPr>
-        <w:spacing w:before="120" w:after="60" w:line="240" w:lineRule="auto"/>
-        <w:keepNext/>
-        <w:keepLines/>
+        <w:spacing w:before="140" w:after="20" w:line="240" w:lineRule="auto"/>
+      </w:pPr>
+      <w:r>
+        <w:rPr>
+          <w:rFonts w:ascii="Carlito" w:hAnsi="Carlito" w:eastAsia="Carlito"/>
+          <w:b/>
+          <w:i w:val="0"/>
+          <w:color w:val="087A73"/>
+          <w:sz w:val="14"/>
+        </w:rPr>
+        <w:t>SELECTED SYSTEMS</w:t>
+      </w:r>
+    </w:p>
+    <w:p>
+      <w:pPr>
+        <w:spacing w:before="0" w:after="80" w:line="240" w:lineRule="auto"/>
         <w:pBdr>
-          <w:bottom w:val="single" w:sz="10" w:space="2" w:color="087A73"/>
+          <w:bottom w:val="single" w:sz="8" w:space="2" w:color="087A73"/>
         </w:pBdr>
       </w:pPr>
       <w:r>
         <w:rPr>
-          <w:rFonts w:ascii="Aptos" w:hAnsi="Aptos" w:eastAsia="Aptos"/>
+          <w:rFonts w:ascii="Carlito" w:hAnsi="Carlito" w:eastAsia="Carlito"/>
           <w:b/>
           <w:i w:val="0"/>
-          <w:color w:val="087A73"/>
-          <w:sz w:val="24"/>
+          <w:color w:val="14232A"/>
+          <w:sz w:val="26"/>
         </w:rPr>
-        <w:t>SELECTED SYSTEMS AND EVIDENCE STATES</w:t>
+        <w:t>Evidence states, not hype</w:t>
       </w:r>
     </w:p>
     <w:tbl>
@@ -1219,27 +1186,26 @@
         <w:tblCellSpacing w:w="0" w:type="dxa"/>
       </w:tblPr>
       <w:tblGrid>
-        <w:gridCol w:w="5616"/>
-        <w:gridCol w:w="5256"/>
+        <w:gridCol w:w="4680"/>
+        <w:gridCol w:w="5544"/>
       </w:tblGrid>
       <w:tr>
         <w:tc>
           <w:tcPr>
-            <w:tcW w:type="dxa" w:w="5429"/>
+            <w:tcW w:type="dxa" w:w="5112"/>
             <w:shd w:fill="EEF6F4"/>
             <w:tcMar>
               <w:top w:w="65" w:type="dxa"/>
-              <w:start w:w="65" w:type="dxa"/>
+              <w:start w:w="70" w:type="dxa"/>
               <w:bottom w:w="65" w:type="dxa"/>
-              <w:end w:w="65" w:type="dxa"/>
+              <w:end w:w="70" w:type="dxa"/>
             </w:tcMar>
             <w:tcBorders>
-              <w:top w:sz="2" w:val="single" w:color="D4E4E1"/>
-              <w:left w:sz="2" w:val="single" w:color="D4E4E1"/>
-              <w:bottom w:sz="2" w:val="single" w:color="D4E4E1"/>
-              <w:right w:sz="2" w:val="single" w:color="D4E4E1"/>
+              <w:top w:val="single" w:sz="2" w:color="D4E4E1"/>
+              <w:left w:val="single" w:sz="2" w:color="D4E4E1"/>
+              <w:bottom w:val="single" w:sz="2" w:color="D4E4E1"/>
+              <w:right w:val="single" w:sz="2" w:color="D4E4E1"/>
             </w:tcBorders>
-            <w:vAlign w:val="top"/>
           </w:tcPr>
           <w:p>
             <w:pPr>
@@ -1247,11 +1213,11 @@
             </w:pPr>
             <w:r>
               <w:rPr>
-                <w:rFonts w:ascii="Aptos" w:hAnsi="Aptos" w:eastAsia="Aptos"/>
+                <w:rFonts w:ascii="Carlito" w:hAnsi="Carlito" w:eastAsia="Carlito"/>
                 <w:b/>
                 <w:i w:val="0"/>
                 <w:color w:val="14232A"/>
-                <w:sz w:val="20"/>
+                <w:sz w:val="19"/>
               </w:rPr>
               <w:t>Portfolio Receipt Router</w:t>
             </w:r>
@@ -1262,7 +1228,7 @@
             </w:pPr>
             <w:r>
               <w:rPr>
-                <w:rFonts w:ascii="Aptos" w:hAnsi="Aptos" w:eastAsia="Aptos"/>
+                <w:rFonts w:ascii="Carlito" w:hAnsi="Carlito" w:eastAsia="Carlito"/>
                 <w:b/>
                 <w:i w:val="0"/>
                 <w:color w:val="087A73"/>
@@ -1277,42 +1243,40 @@
             </w:pPr>
             <w:r>
               <w:rPr>
-                <w:rFonts w:ascii="Aptos" w:hAnsi="Aptos" w:eastAsia="Aptos"/>
+                <w:rFonts w:ascii="Carlito" w:hAnsi="Carlito" w:eastAsia="Carlito"/>
                 <w:b w:val="0"/>
                 <w:i w:val="0"/>
                 <w:color w:val="14232A"/>
-                <w:sz w:val="16"/>
+                <w:sz w:val="15"/>
               </w:rPr>
-              <w:t>Compatibility-safe architecture repair and evidence routing.</w:t>
+              <w:t>Fail-closed evidence routing and compatibility-safe architecture repair.</w:t>
             </w:r>
           </w:p>
         </w:tc>
         <w:tc>
           <w:tcPr>
-            <w:tcW w:type="dxa" w:w="5429"/>
+            <w:tcW w:type="dxa" w:w="5112"/>
             <w:shd w:fill="EEF6F4"/>
             <w:tcMar>
               <w:top w:w="65" w:type="dxa"/>
-              <w:start w:w="65" w:type="dxa"/>
+              <w:start w:w="70" w:type="dxa"/>
               <w:bottom w:w="65" w:type="dxa"/>
-              <w:end w:w="65" w:type="dxa"/>
+              <w:end w:w="70" w:type="dxa"/>
             </w:tcMar>
             <w:tcBorders>
-              <w:top w:sz="2" w:val="single" w:color="D4E4E1"/>
-              <w:left w:sz="2" w:val="single" w:color="D4E4E1"/>
-              <w:bottom w:sz="2" w:val="single" w:color="D4E4E1"/>
-              <w:right w:sz="2" w:val="single" w:color="D4E4E1"/>
+              <w:top w:val="single" w:sz="2" w:color="D4E4E1"/>
+              <w:left w:val="single" w:sz="2" w:color="D4E4E1"/>
+              <w:bottom w:val="single" w:sz="2" w:color="D4E4E1"/>
+              <w:right w:val="single" w:sz="2" w:color="D4E4E1"/>
             </w:tcBorders>
-            <w:vAlign w:val="top"/>
           </w:tcPr>
-          <w:p/>
           <w:p>
             <w:pPr>
               <w:spacing w:before="0" w:after="20" w:line="240" w:lineRule="auto"/>
             </w:pPr>
             <w:r>
               <w:rPr>
-                <w:rFonts w:ascii="Aptos" w:hAnsi="Aptos" w:eastAsia="Aptos"/>
+                <w:rFonts w:ascii="Carlito" w:hAnsi="Carlito" w:eastAsia="Carlito"/>
                 <w:b/>
                 <w:i w:val="0"/>
                 <w:color w:val="087A73"/>
@@ -1323,15 +1287,15 @@
           </w:p>
           <w:p>
             <w:pPr>
-              <w:spacing w:before="0" w:after="40" w:line="245" w:lineRule="auto"/>
+              <w:spacing w:before="0" w:after="60" w:line="240" w:lineRule="auto"/>
             </w:pPr>
             <w:r>
               <w:rPr>
-                <w:rFonts w:ascii="Aptos" w:hAnsi="Aptos" w:eastAsia="Aptos"/>
+                <w:rFonts w:ascii="Carlito" w:hAnsi="Carlito" w:eastAsia="Carlito"/>
                 <w:b w:val="0"/>
                 <w:i w:val="0"/>
                 <w:color w:val="14232A"/>
-                <w:sz w:val="16"/>
+                <w:sz w:val="15"/>
               </w:rPr>
               <w:t>69/69 tests; direct and reusable CI; artifact 8910423397; zero external actions.</w:t>
             </w:r>
@@ -1342,7 +1306,7 @@
             </w:pPr>
             <w:r>
               <w:rPr>
-                <w:rFonts w:ascii="Aptos" w:hAnsi="Aptos" w:eastAsia="Aptos"/>
+                <w:rFonts w:ascii="Carlito" w:hAnsi="Carlito" w:eastAsia="Carlito"/>
                 <w:b/>
                 <w:i w:val="0"/>
                 <w:color w:val="A56600"/>
@@ -1353,17 +1317,17 @@
           </w:p>
           <w:p>
             <w:pPr>
-              <w:spacing w:before="0" w:after="40" w:line="245" w:lineRule="auto"/>
+              <w:spacing w:before="0" w:after="0" w:line="240" w:lineRule="auto"/>
             </w:pPr>
             <w:r>
               <w:rPr>
-                <w:rFonts w:ascii="Aptos" w:hAnsi="Aptos" w:eastAsia="Aptos"/>
+                <w:rFonts w:ascii="Carlito" w:hAnsi="Carlito" w:eastAsia="Carlito"/>
                 <w:b w:val="0"/>
                 <w:i w:val="0"/>
                 <w:color w:val="5B6D75"/>
                 <w:sz w:val="15"/>
               </w:rPr>
-              <w:t>Independent technical exhibit; no datacenter control, company affiliation, or production-operation claim.</w:t>
+              <w:t>Independent technical exhibit; no production-operation or company-affiliation claim.</w:t>
             </w:r>
           </w:p>
         </w:tc>
@@ -1371,21 +1335,20 @@
       <w:tr>
         <w:tc>
           <w:tcPr>
-            <w:tcW w:type="dxa" w:w="5429"/>
+            <w:tcW w:type="dxa" w:w="5112"/>
             <w:shd w:fill="F7FAF9"/>
             <w:tcMar>
               <w:top w:w="65" w:type="dxa"/>
-              <w:start w:w="65" w:type="dxa"/>
+              <w:start w:w="70" w:type="dxa"/>
               <w:bottom w:w="65" w:type="dxa"/>
-              <w:end w:w="65" w:type="dxa"/>
+              <w:end w:w="70" w:type="dxa"/>
             </w:tcMar>
             <w:tcBorders>
-              <w:top w:sz="2" w:val="single" w:color="D4E4E1"/>
-              <w:left w:sz="2" w:val="single" w:color="D4E4E1"/>
-              <w:bottom w:sz="2" w:val="single" w:color="D4E4E1"/>
-              <w:right w:sz="2" w:val="single" w:color="D4E4E1"/>
+              <w:top w:val="single" w:sz="2" w:color="D4E4E1"/>
+              <w:left w:val="single" w:sz="2" w:color="D4E4E1"/>
+              <w:bottom w:val="single" w:sz="2" w:color="D4E4E1"/>
+              <w:right w:val="single" w:sz="2" w:color="D4E4E1"/>
             </w:tcBorders>
-            <w:vAlign w:val="top"/>
           </w:tcPr>
           <w:p>
             <w:pPr>
@@ -1393,11 +1356,11 @@
             </w:pPr>
             <w:r>
               <w:rPr>
-                <w:rFonts w:ascii="Aptos" w:hAnsi="Aptos" w:eastAsia="Aptos"/>
+                <w:rFonts w:ascii="Carlito" w:hAnsi="Carlito" w:eastAsia="Carlito"/>
                 <w:b/>
                 <w:i w:val="0"/>
                 <w:color w:val="14232A"/>
-                <w:sz w:val="20"/>
+                <w:sz w:val="19"/>
               </w:rPr>
               <w:t>Job Application Helix</w:t>
             </w:r>
@@ -1408,13 +1371,13 @@
             </w:pPr>
             <w:r>
               <w:rPr>
-                <w:rFonts w:ascii="Aptos" w:hAnsi="Aptos" w:eastAsia="Aptos"/>
+                <w:rFonts w:ascii="Carlito" w:hAnsi="Carlito" w:eastAsia="Carlito"/>
                 <w:b/>
                 <w:i w:val="0"/>
                 <w:color w:val="087A73"/>
                 <w:sz w:val="14"/>
               </w:rPr>
-              <w:t>RECORDED 148/148</w:t>
+              <w:t>PARTIALLY VERIFIED</w:t>
             </w:r>
           </w:p>
           <w:p>
@@ -1423,42 +1386,40 @@
             </w:pPr>
             <w:r>
               <w:rPr>
-                <w:rFonts w:ascii="Aptos" w:hAnsi="Aptos" w:eastAsia="Aptos"/>
+                <w:rFonts w:ascii="Carlito" w:hAnsi="Carlito" w:eastAsia="Carlito"/>
                 <w:b w:val="0"/>
                 <w:i w:val="0"/>
                 <w:color w:val="14232A"/>
-                <w:sz w:val="16"/>
+                <w:sz w:val="15"/>
               </w:rPr>
-              <w:t>Evidence-governed hiring and portfolio orchestration.</w:t>
+              <w:t>Evidence-governed hiring and portfolio orchestration with an exact 67-repository admitted public proof boundary.</w:t>
             </w:r>
           </w:p>
         </w:tc>
         <w:tc>
           <w:tcPr>
-            <w:tcW w:type="dxa" w:w="5429"/>
+            <w:tcW w:type="dxa" w:w="5112"/>
             <w:shd w:fill="F7FAF9"/>
             <w:tcMar>
               <w:top w:w="65" w:type="dxa"/>
-              <w:start w:w="65" w:type="dxa"/>
+              <w:start w:w="70" w:type="dxa"/>
               <w:bottom w:w="65" w:type="dxa"/>
-              <w:end w:w="65" w:type="dxa"/>
+              <w:end w:w="70" w:type="dxa"/>
             </w:tcMar>
             <w:tcBorders>
-              <w:top w:sz="2" w:val="single" w:color="D4E4E1"/>
-              <w:left w:sz="2" w:val="single" w:color="D4E4E1"/>
-              <w:bottom w:sz="2" w:val="single" w:color="D4E4E1"/>
-              <w:right w:sz="2" w:val="single" w:color="D4E4E1"/>
+              <w:top w:val="single" w:sz="2" w:color="D4E4E1"/>
+              <w:left w:val="single" w:sz="2" w:color="D4E4E1"/>
+              <w:bottom w:val="single" w:sz="2" w:color="D4E4E1"/>
+              <w:right w:val="single" w:sz="2" w:color="D4E4E1"/>
             </w:tcBorders>
-            <w:vAlign w:val="top"/>
           </w:tcPr>
-          <w:p/>
           <w:p>
             <w:pPr>
               <w:spacing w:before="0" w:after="20" w:line="240" w:lineRule="auto"/>
             </w:pPr>
             <w:r>
               <w:rPr>
-                <w:rFonts w:ascii="Aptos" w:hAnsi="Aptos" w:eastAsia="Aptos"/>
+                <w:rFonts w:ascii="Carlito" w:hAnsi="Carlito" w:eastAsia="Carlito"/>
                 <w:b/>
                 <w:i w:val="0"/>
                 <w:color w:val="087A73"/>
@@ -1469,17 +1430,17 @@
           </w:p>
           <w:p>
             <w:pPr>
-              <w:spacing w:before="0" w:after="40" w:line="245" w:lineRule="auto"/>
+              <w:spacing w:before="0" w:after="60" w:line="240" w:lineRule="auto"/>
             </w:pPr>
             <w:r>
               <w:rPr>
-                <w:rFonts w:ascii="Aptos" w:hAnsi="Aptos" w:eastAsia="Aptos"/>
+                <w:rFonts w:ascii="Carlito" w:hAnsi="Carlito" w:eastAsia="Carlito"/>
                 <w:b w:val="0"/>
                 <w:i w:val="0"/>
                 <w:color w:val="14232A"/>
-                <w:sz w:val="16"/>
+                <w:sz w:val="15"/>
               </w:rPr>
-              <w:t>148/148 recorded repository tests.</w:t>
+              <w:t>Fail-closed evidence levels, repository-state separation, promotion gates, machine contracts, and role-calibrated package generation.</w:t>
             </w:r>
           </w:p>
           <w:p>
@@ -1488,7 +1449,7 @@
             </w:pPr>
             <w:r>
               <w:rPr>
-                <w:rFonts w:ascii="Aptos" w:hAnsi="Aptos" w:eastAsia="Aptos"/>
+                <w:rFonts w:ascii="Carlito" w:hAnsi="Carlito" w:eastAsia="Carlito"/>
                 <w:b/>
                 <w:i w:val="0"/>
                 <w:color w:val="A56600"/>
@@ -1499,17 +1460,17 @@
           </w:p>
           <w:p>
             <w:pPr>
-              <w:spacing w:before="0" w:after="40" w:line="245" w:lineRule="auto"/>
+              <w:spacing w:before="0" w:after="0" w:line="240" w:lineRule="auto"/>
             </w:pPr>
             <w:r>
               <w:rPr>
-                <w:rFonts w:ascii="Aptos" w:hAnsi="Aptos" w:eastAsia="Aptos"/>
+                <w:rFonts w:ascii="Carlito" w:hAnsi="Carlito" w:eastAsia="Carlito"/>
                 <w:b w:val="0"/>
                 <w:i w:val="0"/>
                 <w:color w:val="5B6D75"/>
                 <w:sz w:val="15"/>
               </w:rPr>
-              <w:t>Release-specific current-SHA and deployment gates remain separate.</w:t>
+              <w:t>The 67 admitted repositories are a public proof set, not accomplishment count or the full owned estate; child repositories retain independent evidence states.</w:t>
             </w:r>
           </w:p>
         </w:tc>
@@ -1517,21 +1478,20 @@
       <w:tr>
         <w:tc>
           <w:tcPr>
-            <w:tcW w:type="dxa" w:w="5429"/>
+            <w:tcW w:type="dxa" w:w="5112"/>
             <w:shd w:fill="EEF6F4"/>
             <w:tcMar>
               <w:top w:w="65" w:type="dxa"/>
-              <w:start w:w="65" w:type="dxa"/>
+              <w:start w:w="70" w:type="dxa"/>
               <w:bottom w:w="65" w:type="dxa"/>
-              <w:end w:w="65" w:type="dxa"/>
+              <w:end w:w="70" w:type="dxa"/>
             </w:tcMar>
             <w:tcBorders>
-              <w:top w:sz="2" w:val="single" w:color="D4E4E1"/>
-              <w:left w:sz="2" w:val="single" w:color="D4E4E1"/>
-              <w:bottom w:sz="2" w:val="single" w:color="D4E4E1"/>
-              <w:right w:sz="2" w:val="single" w:color="D4E4E1"/>
+              <w:top w:val="single" w:sz="2" w:color="D4E4E1"/>
+              <w:left w:val="single" w:sz="2" w:color="D4E4E1"/>
+              <w:bottom w:val="single" w:sz="2" w:color="D4E4E1"/>
+              <w:right w:val="single" w:sz="2" w:color="D4E4E1"/>
             </w:tcBorders>
-            <w:vAlign w:val="top"/>
           </w:tcPr>
           <w:p>
             <w:pPr>
@@ -1539,11 +1499,11 @@
             </w:pPr>
             <w:r>
               <w:rPr>
-                <w:rFonts w:ascii="Aptos" w:hAnsi="Aptos" w:eastAsia="Aptos"/>
+                <w:rFonts w:ascii="Carlito" w:hAnsi="Carlito" w:eastAsia="Carlito"/>
                 <w:b/>
                 <w:i w:val="0"/>
                 <w:color w:val="14232A"/>
-                <w:sz w:val="20"/>
+                <w:sz w:val="19"/>
               </w:rPr>
               <w:t>Agent Coordinator</w:t>
             </w:r>
@@ -1554,7 +1514,7 @@
             </w:pPr>
             <w:r>
               <w:rPr>
-                <w:rFonts w:ascii="Aptos" w:hAnsi="Aptos" w:eastAsia="Aptos"/>
+                <w:rFonts w:ascii="Carlito" w:hAnsi="Carlito" w:eastAsia="Carlito"/>
                 <w:b/>
                 <w:i w:val="0"/>
                 <w:color w:val="087A73"/>
@@ -1569,42 +1529,40 @@
             </w:pPr>
             <w:r>
               <w:rPr>
-                <w:rFonts w:ascii="Aptos" w:hAnsi="Aptos" w:eastAsia="Aptos"/>
+                <w:rFonts w:ascii="Carlito" w:hAnsi="Carlito" w:eastAsia="Carlito"/>
                 <w:b w:val="0"/>
                 <w:i w:val="0"/>
                 <w:color w:val="14232A"/>
-                <w:sz w:val="16"/>
+                <w:sz w:val="15"/>
               </w:rPr>
-              <w:t>Deterministic task ownership, dependencies, capacity, priority, and shared budgets.</w:t>
+              <w:t>Deterministic task ownership, dependency order, capacity, stable priority, and shared budgets.</w:t>
             </w:r>
           </w:p>
         </w:tc>
         <w:tc>
           <w:tcPr>
-            <w:tcW w:type="dxa" w:w="5429"/>
+            <w:tcW w:type="dxa" w:w="5112"/>
             <w:shd w:fill="EEF6F4"/>
             <w:tcMar>
               <w:top w:w="65" w:type="dxa"/>
-              <w:start w:w="65" w:type="dxa"/>
+              <w:start w:w="70" w:type="dxa"/>
               <w:bottom w:w="65" w:type="dxa"/>
-              <w:end w:w="65" w:type="dxa"/>
+              <w:end w:w="70" w:type="dxa"/>
             </w:tcMar>
             <w:tcBorders>
-              <w:top w:sz="2" w:val="single" w:color="D4E4E1"/>
-              <w:left w:sz="2" w:val="single" w:color="D4E4E1"/>
-              <w:bottom w:sz="2" w:val="single" w:color="D4E4E1"/>
-              <w:right w:sz="2" w:val="single" w:color="D4E4E1"/>
+              <w:top w:val="single" w:sz="2" w:color="D4E4E1"/>
+              <w:left w:val="single" w:sz="2" w:color="D4E4E1"/>
+              <w:bottom w:val="single" w:sz="2" w:color="D4E4E1"/>
+              <w:right w:val="single" w:sz="2" w:color="D4E4E1"/>
             </w:tcBorders>
-            <w:vAlign w:val="top"/>
           </w:tcPr>
-          <w:p/>
           <w:p>
             <w:pPr>
               <w:spacing w:before="0" w:after="20" w:line="240" w:lineRule="auto"/>
             </w:pPr>
             <w:r>
               <w:rPr>
-                <w:rFonts w:ascii="Aptos" w:hAnsi="Aptos" w:eastAsia="Aptos"/>
+                <w:rFonts w:ascii="Carlito" w:hAnsi="Carlito" w:eastAsia="Carlito"/>
                 <w:b/>
                 <w:i w:val="0"/>
                 <w:color w:val="087A73"/>
@@ -1615,15 +1573,15 @@
           </w:p>
           <w:p>
             <w:pPr>
-              <w:spacing w:before="0" w:after="40" w:line="245" w:lineRule="auto"/>
+              <w:spacing w:before="0" w:after="60" w:line="240" w:lineRule="auto"/>
             </w:pPr>
             <w:r>
               <w:rPr>
-                <w:rFonts w:ascii="Aptos" w:hAnsi="Aptos" w:eastAsia="Aptos"/>
+                <w:rFonts w:ascii="Carlito" w:hAnsi="Carlito" w:eastAsia="Carlito"/>
                 <w:b w:val="0"/>
                 <w:i w:val="0"/>
                 <w:color w:val="14232A"/>
-                <w:sz w:val="16"/>
+                <w:sz w:val="15"/>
               </w:rPr>
               <w:t>62/62 recorded Python tests.</w:t>
             </w:r>
@@ -1634,7 +1592,7 @@
             </w:pPr>
             <w:r>
               <w:rPr>
-                <w:rFonts w:ascii="Aptos" w:hAnsi="Aptos" w:eastAsia="Aptos"/>
+                <w:rFonts w:ascii="Carlito" w:hAnsi="Carlito" w:eastAsia="Carlito"/>
                 <w:b/>
                 <w:i w:val="0"/>
                 <w:color w:val="A56600"/>
@@ -1645,17 +1603,17 @@
           </w:p>
           <w:p>
             <w:pPr>
-              <w:spacing w:before="0" w:after="40" w:line="245" w:lineRule="auto"/>
+              <w:spacing w:before="0" w:after="0" w:line="240" w:lineRule="auto"/>
             </w:pPr>
             <w:r>
               <w:rPr>
-                <w:rFonts w:ascii="Aptos" w:hAnsi="Aptos" w:eastAsia="Aptos"/>
+                <w:rFonts w:ascii="Carlito" w:hAnsi="Carlito" w:eastAsia="Carlito"/>
                 <w:b w:val="0"/>
                 <w:i w:val="0"/>
                 <w:color w:val="5B6D75"/>
                 <w:sz w:val="15"/>
               </w:rPr>
-              <w:t>Hosted matrix and build-wheel promotion remain open.</w:t>
+              <w:t>Hosted matrix and broader promotion gates remain separate.</w:t>
             </w:r>
           </w:p>
         </w:tc>
@@ -1663,21 +1621,20 @@
       <w:tr>
         <w:tc>
           <w:tcPr>
-            <w:tcW w:type="dxa" w:w="5429"/>
+            <w:tcW w:type="dxa" w:w="5112"/>
             <w:shd w:fill="F7FAF9"/>
             <w:tcMar>
               <w:top w:w="65" w:type="dxa"/>
-              <w:start w:w="65" w:type="dxa"/>
+              <w:start w:w="70" w:type="dxa"/>
               <w:bottom w:w="65" w:type="dxa"/>
-              <w:end w:w="65" w:type="dxa"/>
+              <w:end w:w="70" w:type="dxa"/>
             </w:tcMar>
             <w:tcBorders>
-              <w:top w:sz="2" w:val="single" w:color="D4E4E1"/>
-              <w:left w:sz="2" w:val="single" w:color="D4E4E1"/>
-              <w:bottom w:sz="2" w:val="single" w:color="D4E4E1"/>
-              <w:right w:sz="2" w:val="single" w:color="D4E4E1"/>
+              <w:top w:val="single" w:sz="2" w:color="D4E4E1"/>
+              <w:left w:val="single" w:sz="2" w:color="D4E4E1"/>
+              <w:bottom w:val="single" w:sz="2" w:color="D4E4E1"/>
+              <w:right w:val="single" w:sz="2" w:color="D4E4E1"/>
             </w:tcBorders>
-            <w:vAlign w:val="top"/>
           </w:tcPr>
           <w:p>
             <w:pPr>
@@ -1685,13 +1642,13 @@
             </w:pPr>
             <w:r>
               <w:rPr>
-                <w:rFonts w:ascii="Aptos" w:hAnsi="Aptos" w:eastAsia="Aptos"/>
+                <w:rFonts w:ascii="Carlito" w:hAnsi="Carlito" w:eastAsia="Carlito"/>
                 <w:b/>
                 <w:i w:val="0"/>
                 <w:color w:val="14232A"/>
-                <w:sz w:val="20"/>
+                <w:sz w:val="19"/>
               </w:rPr>
-              <w:t>Microcode Governance</w:t>
+              <w:t>AKOS / PSYSOC-X</w:t>
             </w:r>
           </w:p>
           <w:p>
@@ -1700,13 +1657,13 @@
             </w:pPr>
             <w:r>
               <w:rPr>
-                <w:rFonts w:ascii="Aptos" w:hAnsi="Aptos" w:eastAsia="Aptos"/>
+                <w:rFonts w:ascii="Carlito" w:hAnsi="Carlito" w:eastAsia="Carlito"/>
                 <w:b/>
                 <w:i w:val="0"/>
-                <w:color w:val="A56600"/>
+                <w:color w:val="087A73"/>
                 <w:sz w:val="14"/>
               </w:rPr>
-              <w:t>REVIEWED - EXECUTION BLOCKED</w:t>
+              <w:t>BOUNDED VERIFIED SURFACES</w:t>
             </w:r>
           </w:p>
           <w:p>
@@ -1715,42 +1672,40 @@
             </w:pPr>
             <w:r>
               <w:rPr>
-                <w:rFonts w:ascii="Aptos" w:hAnsi="Aptos" w:eastAsia="Aptos"/>
+                <w:rFonts w:ascii="Carlito" w:hAnsi="Carlito" w:eastAsia="Carlito"/>
                 <w:b w:val="0"/>
                 <w:i w:val="0"/>
                 <w:color w:val="14232A"/>
-                <w:sz w:val="16"/>
+                <w:sz w:val="15"/>
               </w:rPr>
-              <w:t>Firmware manifests, drift, SBOMs, provenance, compatibility policy, and approval-gated rollout planning.</w:t>
+              <w:t>Authority, evidence, closure, and deterministic audience-calibration primitives.</w:t>
             </w:r>
           </w:p>
         </w:tc>
         <w:tc>
           <w:tcPr>
-            <w:tcW w:type="dxa" w:w="5429"/>
+            <w:tcW w:type="dxa" w:w="5112"/>
             <w:shd w:fill="F7FAF9"/>
             <w:tcMar>
               <w:top w:w="65" w:type="dxa"/>
-              <w:start w:w="65" w:type="dxa"/>
+              <w:start w:w="70" w:type="dxa"/>
               <w:bottom w:w="65" w:type="dxa"/>
-              <w:end w:w="65" w:type="dxa"/>
+              <w:end w:w="70" w:type="dxa"/>
             </w:tcMar>
             <w:tcBorders>
-              <w:top w:sz="2" w:val="single" w:color="D4E4E1"/>
-              <w:left w:sz="2" w:val="single" w:color="D4E4E1"/>
-              <w:bottom w:sz="2" w:val="single" w:color="D4E4E1"/>
-              <w:right w:sz="2" w:val="single" w:color="D4E4E1"/>
+              <w:top w:val="single" w:sz="2" w:color="D4E4E1"/>
+              <w:left w:val="single" w:sz="2" w:color="D4E4E1"/>
+              <w:bottom w:val="single" w:sz="2" w:color="D4E4E1"/>
+              <w:right w:val="single" w:sz="2" w:color="D4E4E1"/>
             </w:tcBorders>
-            <w:vAlign w:val="top"/>
           </w:tcPr>
-          <w:p/>
           <w:p>
             <w:pPr>
               <w:spacing w:before="0" w:after="20" w:line="240" w:lineRule="auto"/>
             </w:pPr>
             <w:r>
               <w:rPr>
-                <w:rFonts w:ascii="Aptos" w:hAnsi="Aptos" w:eastAsia="Aptos"/>
+                <w:rFonts w:ascii="Carlito" w:hAnsi="Carlito" w:eastAsia="Carlito"/>
                 <w:b/>
                 <w:i w:val="0"/>
                 <w:color w:val="087A73"/>
@@ -1761,17 +1716,17 @@
           </w:p>
           <w:p>
             <w:pPr>
-              <w:spacing w:before="0" w:after="40" w:line="245" w:lineRule="auto"/>
+              <w:spacing w:before="0" w:after="60" w:line="240" w:lineRule="auto"/>
             </w:pPr>
             <w:r>
               <w:rPr>
-                <w:rFonts w:ascii="Aptos" w:hAnsi="Aptos" w:eastAsia="Aptos"/>
+                <w:rFonts w:ascii="Carlito" w:hAnsi="Carlito" w:eastAsia="Carlito"/>
                 <w:b w:val="0"/>
                 <w:i w:val="0"/>
                 <w:color w:val="14232A"/>
-                <w:sz w:val="16"/>
+                <w:sz w:val="15"/>
               </w:rPr>
-              <w:t>132-check generated contract; static review found no critical defect.</w:t>
+              <w:t>Repository-native verification supports bounded current surfaces.</w:t>
             </w:r>
           </w:p>
           <w:p>
@@ -1780,7 +1735,7 @@
             </w:pPr>
             <w:r>
               <w:rPr>
-                <w:rFonts w:ascii="Aptos" w:hAnsi="Aptos" w:eastAsia="Aptos"/>
+                <w:rFonts w:ascii="Carlito" w:hAnsi="Carlito" w:eastAsia="Carlito"/>
                 <w:b/>
                 <w:i w:val="0"/>
                 <w:color w:val="A56600"/>
@@ -1791,163 +1746,17 @@
           </w:p>
           <w:p>
             <w:pPr>
-              <w:spacing w:before="0" w:after="40" w:line="245" w:lineRule="auto"/>
+              <w:spacing w:before="0" w:after="0" w:line="240" w:lineRule="auto"/>
             </w:pPr>
             <w:r>
               <w:rPr>
-                <w:rFonts w:ascii="Aptos" w:hAnsi="Aptos" w:eastAsia="Aptos"/>
+                <w:rFonts w:ascii="Carlito" w:hAnsi="Carlito" w:eastAsia="Carlito"/>
                 <w:b w:val="0"/>
                 <w:i w:val="0"/>
                 <w:color w:val="5B6D75"/>
                 <w:sz w:val="15"/>
               </w:rPr>
-              <w:t>Private CI did not execute; not test verified and performs no firmware mutation.</w:t>
-            </w:r>
-          </w:p>
-        </w:tc>
-      </w:tr>
-      <w:tr>
-        <w:tc>
-          <w:tcPr>
-            <w:tcW w:type="dxa" w:w="5429"/>
-            <w:shd w:fill="EEF6F4"/>
-            <w:tcMar>
-              <w:top w:w="65" w:type="dxa"/>
-              <w:start w:w="65" w:type="dxa"/>
-              <w:bottom w:w="65" w:type="dxa"/>
-              <w:end w:w="65" w:type="dxa"/>
-            </w:tcMar>
-            <w:tcBorders>
-              <w:top w:sz="2" w:val="single" w:color="D4E4E1"/>
-              <w:left w:sz="2" w:val="single" w:color="D4E4E1"/>
-              <w:bottom w:sz="2" w:val="single" w:color="D4E4E1"/>
-              <w:right w:sz="2" w:val="single" w:color="D4E4E1"/>
-            </w:tcBorders>
-            <w:vAlign w:val="top"/>
-          </w:tcPr>
-          <w:p>
-            <w:pPr>
-              <w:spacing w:before="0" w:after="20" w:line="240" w:lineRule="auto"/>
-            </w:pPr>
-            <w:r>
-              <w:rPr>
-                <w:rFonts w:ascii="Aptos" w:hAnsi="Aptos" w:eastAsia="Aptos"/>
-                <w:b/>
-                <w:i w:val="0"/>
-                <w:color w:val="14232A"/>
-                <w:sz w:val="20"/>
-              </w:rPr>
-              <w:t>PSYSOC-X</w:t>
-            </w:r>
-          </w:p>
-          <w:p>
-            <w:pPr>
-              <w:spacing w:before="0" w:after="40" w:line="240" w:lineRule="auto"/>
-            </w:pPr>
-            <w:r>
-              <w:rPr>
-                <w:rFonts w:ascii="Aptos" w:hAnsi="Aptos" w:eastAsia="Aptos"/>
-                <w:b/>
-                <w:i w:val="0"/>
-                <w:color w:val="087A73"/>
-                <w:sz w:val="14"/>
-              </w:rPr>
-              <w:t>BOUNDED TEST SCOPE</w:t>
-            </w:r>
-          </w:p>
-          <w:p>
-            <w:pPr>
-              <w:spacing w:before="0" w:after="0" w:line="240" w:lineRule="auto"/>
-            </w:pPr>
-            <w:r>
-              <w:rPr>
-                <w:rFonts w:ascii="Aptos" w:hAnsi="Aptos" w:eastAsia="Aptos"/>
-                <w:b w:val="0"/>
-                <w:i w:val="0"/>
-                <w:color w:val="14232A"/>
-                <w:sz w:val="16"/>
-              </w:rPr>
-              <w:t>Audience calibration across recruiter, master, machine, and relationship views.</w:t>
-            </w:r>
-          </w:p>
-        </w:tc>
-        <w:tc>
-          <w:tcPr>
-            <w:tcW w:type="dxa" w:w="5429"/>
-            <w:shd w:fill="EEF6F4"/>
-            <w:tcMar>
-              <w:top w:w="65" w:type="dxa"/>
-              <w:start w:w="65" w:type="dxa"/>
-              <w:bottom w:w="65" w:type="dxa"/>
-              <w:end w:w="65" w:type="dxa"/>
-            </w:tcMar>
-            <w:tcBorders>
-              <w:top w:sz="2" w:val="single" w:color="D4E4E1"/>
-              <w:left w:sz="2" w:val="single" w:color="D4E4E1"/>
-              <w:bottom w:sz="2" w:val="single" w:color="D4E4E1"/>
-              <w:right w:sz="2" w:val="single" w:color="D4E4E1"/>
-            </w:tcBorders>
-            <w:vAlign w:val="top"/>
-          </w:tcPr>
-          <w:p/>
-          <w:p>
-            <w:pPr>
-              <w:spacing w:before="0" w:after="20" w:line="240" w:lineRule="auto"/>
-            </w:pPr>
-            <w:r>
-              <w:rPr>
-                <w:rFonts w:ascii="Aptos" w:hAnsi="Aptos" w:eastAsia="Aptos"/>
-                <w:b/>
-                <w:i w:val="0"/>
-                <w:color w:val="087A73"/>
-                <w:sz w:val="14"/>
-              </w:rPr>
-              <w:t>EVIDENCE</w:t>
-            </w:r>
-          </w:p>
-          <w:p>
-            <w:pPr>
-              <w:spacing w:before="0" w:after="40" w:line="245" w:lineRule="auto"/>
-            </w:pPr>
-            <w:r>
-              <w:rPr>
-                <w:rFonts w:ascii="Aptos" w:hAnsi="Aptos" w:eastAsia="Aptos"/>
-                <w:b w:val="0"/>
-                <w:i w:val="0"/>
-                <w:color w:val="14232A"/>
-                <w:sz w:val="16"/>
-              </w:rPr>
-              <w:t>Deterministic profile and invariant cases.</w:t>
-            </w:r>
-          </w:p>
-          <w:p>
-            <w:pPr>
-              <w:spacing w:before="0" w:after="20" w:line="240" w:lineRule="auto"/>
-            </w:pPr>
-            <w:r>
-              <w:rPr>
-                <w:rFonts w:ascii="Aptos" w:hAnsi="Aptos" w:eastAsia="Aptos"/>
-                <w:b/>
-                <w:i w:val="0"/>
-                <w:color w:val="A56600"/>
-                <w:sz w:val="14"/>
-              </w:rPr>
-              <w:t>BOUNDARY</w:t>
-            </w:r>
-          </w:p>
-          <w:p>
-            <w:pPr>
-              <w:spacing w:before="0" w:after="40" w:line="245" w:lineRule="auto"/>
-            </w:pPr>
-            <w:r>
-              <w:rPr>
-                <w:rFonts w:ascii="Aptos" w:hAnsi="Aptos" w:eastAsia="Aptos"/>
-                <w:b w:val="0"/>
-                <w:i w:val="0"/>
-                <w:color w:val="5B6D75"/>
-                <w:sz w:val="15"/>
-              </w:rPr>
-              <w:t>No diagnosis, covert persuasion, or manipulation capability is claimed.</w:t>
+              <w:t>Presentation depth can change; facts, uncertainty, dignity, and authority may not.</w:t>
             </w:r>
           </w:p>
         </w:tc>
@@ -1955,22 +1764,35 @@
     </w:tbl>
     <w:p>
       <w:pPr>
-        <w:spacing w:before="120" w:after="60" w:line="240" w:lineRule="auto"/>
-        <w:keepNext/>
-        <w:keepLines/>
+        <w:spacing w:before="140" w:after="20" w:line="240" w:lineRule="auto"/>
+      </w:pPr>
+      <w:r>
+        <w:rPr>
+          <w:rFonts w:ascii="Carlito" w:hAnsi="Carlito" w:eastAsia="Carlito"/>
+          <w:b/>
+          <w:i w:val="0"/>
+          <w:color w:val="087A73"/>
+          <w:sz w:val="14"/>
+        </w:rPr>
+        <w:t>SYSTEMS FOUNDATION</w:t>
+      </w:r>
+    </w:p>
+    <w:p>
+      <w:pPr>
+        <w:spacing w:before="0" w:after="80" w:line="240" w:lineRule="auto"/>
         <w:pBdr>
-          <w:bottom w:val="single" w:sz="10" w:space="2" w:color="087A73"/>
+          <w:bottom w:val="single" w:sz="8" w:space="2" w:color="087A73"/>
         </w:pBdr>
       </w:pPr>
       <w:r>
         <w:rPr>
-          <w:rFonts w:ascii="Aptos" w:hAnsi="Aptos" w:eastAsia="Aptos"/>
+          <w:rFonts w:ascii="Carlito" w:hAnsi="Carlito" w:eastAsia="Carlito"/>
           <w:b/>
           <w:i w:val="0"/>
-          <w:color w:val="087A73"/>
-          <w:sz w:val="24"/>
+          <w:color w:val="14232A"/>
+          <w:sz w:val="26"/>
         </w:rPr>
-        <w:t>CROSS-DOMAIN SYSTEMS FOUNDATION</w:t>
+        <w:t>Cross-domain operating perspective</w:t>
       </w:r>
     </w:p>
     <w:tbl>
@@ -1982,25 +1804,25 @@
         <w:tblCellSpacing w:w="0" w:type="dxa"/>
       </w:tblPr>
       <w:tblGrid>
-        <w:gridCol w:w="3024"/>
-        <w:gridCol w:w="7848"/>
+        <w:gridCol w:w="2880"/>
+        <w:gridCol w:w="7344"/>
       </w:tblGrid>
       <w:tr>
         <w:tc>
           <w:tcPr>
-            <w:tcW w:type="dxa" w:w="5429"/>
+            <w:tcW w:type="dxa" w:w="5112"/>
             <w:shd w:fill="EEF6F4"/>
             <w:tcMar>
-              <w:top w:w="55" w:type="dxa"/>
+              <w:top w:w="50" w:type="dxa"/>
               <w:start w:w="65" w:type="dxa"/>
-              <w:bottom w:w="55" w:type="dxa"/>
+              <w:bottom w:w="50" w:type="dxa"/>
               <w:end w:w="65" w:type="dxa"/>
             </w:tcMar>
             <w:tcBorders>
-              <w:top w:sz="2" w:val="single" w:color="D4E4E1"/>
-              <w:left w:sz="2" w:val="single" w:color="D4E4E1"/>
-              <w:bottom w:sz="2" w:val="single" w:color="D4E4E1"/>
-              <w:right w:sz="2" w:val="single" w:color="D4E4E1"/>
+              <w:top w:val="single" w:sz="2" w:color="D4E4E1"/>
+              <w:left w:val="single" w:sz="2" w:color="D4E4E1"/>
+              <w:bottom w:val="single" w:sz="2" w:color="D4E4E1"/>
+              <w:right w:val="single" w:sz="2" w:color="D4E4E1"/>
             </w:tcBorders>
           </w:tcPr>
           <w:p>
@@ -2009,11 +1831,11 @@
             </w:pPr>
             <w:r>
               <w:rPr>
-                <w:rFonts w:ascii="Aptos" w:hAnsi="Aptos" w:eastAsia="Aptos"/>
+                <w:rFonts w:ascii="Carlito" w:hAnsi="Carlito" w:eastAsia="Carlito"/>
                 <w:b/>
                 <w:i w:val="0"/>
                 <w:color w:val="087A73"/>
-                <w:sz w:val="16"/>
+                <w:sz w:val="15"/>
               </w:rPr>
               <w:t>Scientific measurement</w:t>
             </w:r>
@@ -2021,19 +1843,19 @@
         </w:tc>
         <w:tc>
           <w:tcPr>
-            <w:tcW w:type="dxa" w:w="5429"/>
+            <w:tcW w:type="dxa" w:w="5112"/>
             <w:shd w:fill="EEF6F4"/>
             <w:tcMar>
-              <w:top w:w="55" w:type="dxa"/>
+              <w:top w:w="50" w:type="dxa"/>
               <w:start w:w="65" w:type="dxa"/>
-              <w:bottom w:w="55" w:type="dxa"/>
+              <w:bottom w:w="50" w:type="dxa"/>
               <w:end w:w="65" w:type="dxa"/>
             </w:tcMar>
             <w:tcBorders>
-              <w:top w:sz="2" w:val="single" w:color="D4E4E1"/>
-              <w:left w:sz="2" w:val="single" w:color="D4E4E1"/>
-              <w:bottom w:sz="2" w:val="single" w:color="D4E4E1"/>
-              <w:right w:sz="2" w:val="single" w:color="D4E4E1"/>
+              <w:top w:val="single" w:sz="2" w:color="D4E4E1"/>
+              <w:left w:val="single" w:sz="2" w:color="D4E4E1"/>
+              <w:bottom w:val="single" w:sz="2" w:color="D4E4E1"/>
+              <w:right w:val="single" w:sz="2" w:color="D4E4E1"/>
             </w:tcBorders>
           </w:tcPr>
           <w:p>
@@ -2042,11 +1864,11 @@
             </w:pPr>
             <w:r>
               <w:rPr>
-                <w:rFonts w:ascii="Aptos" w:hAnsi="Aptos" w:eastAsia="Aptos"/>
+                <w:rFonts w:ascii="Carlito" w:hAnsi="Carlito" w:eastAsia="Carlito"/>
                 <w:b w:val="0"/>
                 <w:i w:val="0"/>
                 <w:color w:val="14232A"/>
-                <w:sz w:val="16"/>
+                <w:sz w:val="15"/>
               </w:rPr>
               <w:t>University of Hawaii sea-urchin morphometric research, 2016-2017: processed physical measurements of gill structures to support visual species identification.</w:t>
             </w:r>
@@ -2056,19 +1878,19 @@
       <w:tr>
         <w:tc>
           <w:tcPr>
-            <w:tcW w:type="dxa" w:w="5429"/>
+            <w:tcW w:type="dxa" w:w="5112"/>
             <w:shd w:fill="F7FAF9"/>
             <w:tcMar>
-              <w:top w:w="55" w:type="dxa"/>
+              <w:top w:w="50" w:type="dxa"/>
               <w:start w:w="65" w:type="dxa"/>
-              <w:bottom w:w="55" w:type="dxa"/>
+              <w:bottom w:w="50" w:type="dxa"/>
               <w:end w:w="65" w:type="dxa"/>
             </w:tcMar>
             <w:tcBorders>
-              <w:top w:sz="2" w:val="single" w:color="D4E4E1"/>
-              <w:left w:sz="2" w:val="single" w:color="D4E4E1"/>
-              <w:bottom w:sz="2" w:val="single" w:color="D4E4E1"/>
-              <w:right w:sz="2" w:val="single" w:color="D4E4E1"/>
+              <w:top w:val="single" w:sz="2" w:color="D4E4E1"/>
+              <w:left w:val="single" w:sz="2" w:color="D4E4E1"/>
+              <w:bottom w:val="single" w:sz="2" w:color="D4E4E1"/>
+              <w:right w:val="single" w:sz="2" w:color="D4E4E1"/>
             </w:tcBorders>
           </w:tcPr>
           <w:p>
@@ -2077,11 +1899,11 @@
             </w:pPr>
             <w:r>
               <w:rPr>
-                <w:rFonts w:ascii="Aptos" w:hAnsi="Aptos" w:eastAsia="Aptos"/>
+                <w:rFonts w:ascii="Carlito" w:hAnsi="Carlito" w:eastAsia="Carlito"/>
                 <w:b/>
                 <w:i w:val="0"/>
                 <w:color w:val="087A73"/>
-                <w:sz w:val="16"/>
+                <w:sz w:val="15"/>
               </w:rPr>
               <w:t>Compressed-gas systems</w:t>
             </w:r>
@@ -2089,19 +1911,19 @@
         </w:tc>
         <w:tc>
           <w:tcPr>
-            <w:tcW w:type="dxa" w:w="5429"/>
+            <w:tcW w:type="dxa" w:w="5112"/>
             <w:shd w:fill="F7FAF9"/>
             <w:tcMar>
-              <w:top w:w="55" w:type="dxa"/>
+              <w:top w:w="50" w:type="dxa"/>
               <w:start w:w="65" w:type="dxa"/>
-              <w:bottom w:w="55" w:type="dxa"/>
+              <w:bottom w:w="50" w:type="dxa"/>
               <w:end w:w="65" w:type="dxa"/>
             </w:tcMar>
             <w:tcBorders>
-              <w:top w:sz="2" w:val="single" w:color="D4E4E1"/>
-              <w:left w:sz="2" w:val="single" w:color="D4E4E1"/>
-              <w:bottom w:sz="2" w:val="single" w:color="D4E4E1"/>
-              <w:right w:sz="2" w:val="single" w:color="D4E4E1"/>
+              <w:top w:val="single" w:sz="2" w:color="D4E4E1"/>
+              <w:left w:val="single" w:sz="2" w:color="D4E4E1"/>
+              <w:bottom w:val="single" w:sz="2" w:color="D4E4E1"/>
+              <w:right w:val="single" w:sz="2" w:color="D4E4E1"/>
             </w:tcBorders>
           </w:tcPr>
           <w:p>
@@ -2110,11 +1932,11 @@
             </w:pPr>
             <w:r>
               <w:rPr>
-                <w:rFonts w:ascii="Aptos" w:hAnsi="Aptos" w:eastAsia="Aptos"/>
+                <w:rFonts w:ascii="Carlito" w:hAnsi="Carlito" w:eastAsia="Carlito"/>
                 <w:b w:val="0"/>
                 <w:i w:val="0"/>
                 <w:color w:val="14232A"/>
-                <w:sz w:val="16"/>
+                <w:sz w:val="15"/>
               </w:rPr>
               <w:t>Scuba Tank Technician, Hawaiian Diving Adventures and UH Dive Office, 2016-2017: tank filling, transport, inspection and repair support, and gas mixing under safety-critical procedures.</w:t>
             </w:r>
@@ -2124,19 +1946,19 @@
       <w:tr>
         <w:tc>
           <w:tcPr>
-            <w:tcW w:type="dxa" w:w="5429"/>
+            <w:tcW w:type="dxa" w:w="5112"/>
             <w:shd w:fill="EEF6F4"/>
             <w:tcMar>
-              <w:top w:w="55" w:type="dxa"/>
+              <w:top w:w="50" w:type="dxa"/>
               <w:start w:w="65" w:type="dxa"/>
-              <w:bottom w:w="55" w:type="dxa"/>
+              <w:bottom w:w="50" w:type="dxa"/>
               <w:end w:w="65" w:type="dxa"/>
             </w:tcMar>
             <w:tcBorders>
-              <w:top w:sz="2" w:val="single" w:color="D4E4E1"/>
-              <w:left w:sz="2" w:val="single" w:color="D4E4E1"/>
-              <w:bottom w:sz="2" w:val="single" w:color="D4E4E1"/>
-              <w:right w:sz="2" w:val="single" w:color="D4E4E1"/>
+              <w:top w:val="single" w:sz="2" w:color="D4E4E1"/>
+              <w:left w:val="single" w:sz="2" w:color="D4E4E1"/>
+              <w:bottom w:val="single" w:sz="2" w:color="D4E4E1"/>
+              <w:right w:val="single" w:sz="2" w:color="D4E4E1"/>
             </w:tcBorders>
           </w:tcPr>
           <w:p>
@@ -2145,11 +1967,11 @@
             </w:pPr>
             <w:r>
               <w:rPr>
-                <w:rFonts w:ascii="Aptos" w:hAnsi="Aptos" w:eastAsia="Aptos"/>
+                <w:rFonts w:ascii="Carlito" w:hAnsi="Carlito" w:eastAsia="Carlito"/>
                 <w:b/>
                 <w:i w:val="0"/>
                 <w:color w:val="087A73"/>
-                <w:sz w:val="16"/>
+                <w:sz w:val="15"/>
               </w:rPr>
               <w:t>Field systems operations</w:t>
             </w:r>
@@ -2157,19 +1979,19 @@
         </w:tc>
         <w:tc>
           <w:tcPr>
-            <w:tcW w:type="dxa" w:w="5429"/>
+            <w:tcW w:type="dxa" w:w="5112"/>
             <w:shd w:fill="EEF6F4"/>
             <w:tcMar>
-              <w:top w:w="55" w:type="dxa"/>
+              <w:top w:w="50" w:type="dxa"/>
               <w:start w:w="65" w:type="dxa"/>
-              <w:bottom w:w="55" w:type="dxa"/>
+              <w:bottom w:w="50" w:type="dxa"/>
               <w:end w:w="65" w:type="dxa"/>
             </w:tcMar>
             <w:tcBorders>
-              <w:top w:sz="2" w:val="single" w:color="D4E4E1"/>
-              <w:left w:sz="2" w:val="single" w:color="D4E4E1"/>
-              <w:bottom w:sz="2" w:val="single" w:color="D4E4E1"/>
-              <w:right w:sz="2" w:val="single" w:color="D4E4E1"/>
+              <w:top w:val="single" w:sz="2" w:color="D4E4E1"/>
+              <w:left w:val="single" w:sz="2" w:color="D4E4E1"/>
+              <w:bottom w:val="single" w:sz="2" w:color="D4E4E1"/>
+              <w:right w:val="single" w:sz="2" w:color="D4E4E1"/>
             </w:tcBorders>
           </w:tcPr>
           <w:p>
@@ -2178,81 +2000,13 @@
             </w:pPr>
             <w:r>
               <w:rPr>
-                <w:rFonts w:ascii="Aptos" w:hAnsi="Aptos" w:eastAsia="Aptos"/>
+                <w:rFonts w:ascii="Carlito" w:hAnsi="Carlito" w:eastAsia="Carlito"/>
                 <w:b w:val="0"/>
                 <w:i w:val="0"/>
                 <w:color w:val="14232A"/>
-                <w:sz w:val="16"/>
+                <w:sz w:val="15"/>
               </w:rPr>
               <w:t>Residential inspection and repair work developed practical judgment around interacting systems, failure consequences, uncertainty, and clear client communication.</w:t>
-            </w:r>
-          </w:p>
-        </w:tc>
-      </w:tr>
-      <w:tr>
-        <w:tc>
-          <w:tcPr>
-            <w:tcW w:type="dxa" w:w="5429"/>
-            <w:shd w:fill="F7FAF9"/>
-            <w:tcMar>
-              <w:top w:w="55" w:type="dxa"/>
-              <w:start w:w="65" w:type="dxa"/>
-              <w:bottom w:w="55" w:type="dxa"/>
-              <w:end w:w="65" w:type="dxa"/>
-            </w:tcMar>
-            <w:tcBorders>
-              <w:top w:sz="2" w:val="single" w:color="D4E4E1"/>
-              <w:left w:sz="2" w:val="single" w:color="D4E4E1"/>
-              <w:bottom w:sz="2" w:val="single" w:color="D4E4E1"/>
-              <w:right w:sz="2" w:val="single" w:color="D4E4E1"/>
-            </w:tcBorders>
-          </w:tcPr>
-          <w:p>
-            <w:pPr>
-              <w:spacing w:before="0" w:after="0" w:line="240" w:lineRule="auto"/>
-            </w:pPr>
-            <w:r>
-              <w:rPr>
-                <w:rFonts w:ascii="Aptos" w:hAnsi="Aptos" w:eastAsia="Aptos"/>
-                <w:b/>
-                <w:i w:val="0"/>
-                <w:color w:val="087A73"/>
-                <w:sz w:val="16"/>
-              </w:rPr>
-              <w:t>Earlier leadership</w:t>
-            </w:r>
-          </w:p>
-        </w:tc>
-        <w:tc>
-          <w:tcPr>
-            <w:tcW w:type="dxa" w:w="5429"/>
-            <w:shd w:fill="F7FAF9"/>
-            <w:tcMar>
-              <w:top w:w="55" w:type="dxa"/>
-              <w:start w:w="65" w:type="dxa"/>
-              <w:bottom w:w="55" w:type="dxa"/>
-              <w:end w:w="65" w:type="dxa"/>
-            </w:tcMar>
-            <w:tcBorders>
-              <w:top w:sz="2" w:val="single" w:color="D4E4E1"/>
-              <w:left w:sz="2" w:val="single" w:color="D4E4E1"/>
-              <w:bottom w:sz="2" w:val="single" w:color="D4E4E1"/>
-              <w:right w:sz="2" w:val="single" w:color="D4E4E1"/>
-            </w:tcBorders>
-          </w:tcPr>
-          <w:p>
-            <w:pPr>
-              <w:spacing w:before="0" w:after="0" w:line="240" w:lineRule="auto"/>
-            </w:pPr>
-            <w:r>
-              <w:rPr>
-                <w:rFonts w:ascii="Aptos" w:hAnsi="Aptos" w:eastAsia="Aptos"/>
-                <w:b w:val="0"/>
-                <w:i w:val="0"/>
-                <w:color w:val="14232A"/>
-                <w:sz w:val="16"/>
-              </w:rPr>
-              <w:t>Civil Air Patrol Cadet Commander and Search-and-Rescue Ground Team Leader, 2007-2011; included as historical leadership context, not as formal professional management experience.</w:t>
             </w:r>
           </w:p>
         </w:tc>
@@ -2260,22 +2014,168 @@
     </w:tbl>
     <w:p>
       <w:pPr>
-        <w:spacing w:before="120" w:after="60" w:line="240" w:lineRule="auto"/>
-        <w:keepNext/>
-        <w:keepLines/>
+        <w:spacing w:before="140" w:after="20" w:line="240" w:lineRule="auto"/>
+      </w:pPr>
+      <w:r>
+        <w:rPr>
+          <w:rFonts w:ascii="Carlito" w:hAnsi="Carlito" w:eastAsia="Carlito"/>
+          <w:b/>
+          <w:i w:val="0"/>
+          <w:color w:val="087A73"/>
+          <w:sz w:val="14"/>
+        </w:rPr>
+        <w:t>TECHNICAL PROFILE</w:t>
+      </w:r>
+    </w:p>
+    <w:p>
+      <w:pPr>
+        <w:spacing w:before="0" w:after="80" w:line="240" w:lineRule="auto"/>
         <w:pBdr>
-          <w:bottom w:val="single" w:sz="10" w:space="2" w:color="087A73"/>
+          <w:bottom w:val="single" w:sz="8" w:space="2" w:color="087A73"/>
         </w:pBdr>
       </w:pPr>
       <w:r>
         <w:rPr>
-          <w:rFonts w:ascii="Aptos" w:hAnsi="Aptos" w:eastAsia="Aptos"/>
+          <w:rFonts w:ascii="Carlito" w:hAnsi="Carlito" w:eastAsia="Carlito"/>
+          <w:b/>
+          <w:i w:val="0"/>
+          <w:color w:val="14232A"/>
+          <w:sz w:val="26"/>
+        </w:rPr>
+        <w:t>Tools and architecture</w:t>
+      </w:r>
+    </w:p>
+    <w:p>
+      <w:pPr>
+        <w:spacing w:before="0" w:after="40" w:line="240" w:lineRule="auto"/>
+      </w:pPr>
+      <w:r>
+        <w:rPr>
+          <w:rFonts w:ascii="Carlito" w:hAnsi="Carlito" w:eastAsia="Carlito"/>
           <w:b/>
           <w:i w:val="0"/>
           <w:color w:val="087A73"/>
-          <w:sz w:val="24"/>
+          <w:sz w:val="16"/>
         </w:rPr>
-        <w:t>EDUCATION AND EARLIER TECHNICAL CREDENTIALS</w:t>
+        <w:t xml:space="preserve">Primary: </w:t>
+      </w:r>
+      <w:r>
+        <w:rPr>
+          <w:rFonts w:ascii="Carlito" w:hAnsi="Carlito" w:eastAsia="Carlito"/>
+          <w:b w:val="0"/>
+          <w:i w:val="0"/>
+          <w:color w:val="14232A"/>
+          <w:sz w:val="16"/>
+        </w:rPr>
+        <w:t>Python, TypeScript, JavaScript, SQL, Bash, Node.js, React, Next.js, FastAPI</w:t>
+      </w:r>
+    </w:p>
+    <w:p>
+      <w:pPr>
+        <w:spacing w:before="0" w:after="40" w:line="240" w:lineRule="auto"/>
+      </w:pPr>
+      <w:r>
+        <w:rPr>
+          <w:rFonts w:ascii="Carlito" w:hAnsi="Carlito" w:eastAsia="Carlito"/>
+          <w:b/>
+          <w:i w:val="0"/>
+          <w:color w:val="087A73"/>
+          <w:sz w:val="16"/>
+        </w:rPr>
+        <w:t xml:space="preserve">Architecture: </w:t>
+      </w:r>
+      <w:r>
+        <w:rPr>
+          <w:rFonts w:ascii="Carlito" w:hAnsi="Carlito" w:eastAsia="Carlito"/>
+          <w:b w:val="0"/>
+          <w:i w:val="0"/>
+          <w:color w:val="14232A"/>
+          <w:sz w:val="16"/>
+        </w:rPr>
+        <w:t>REST, JSON-RPC 2.0, MCP, JSON Schema, Protocol Buffers, events, state machines, idempotency, authority models, evidence models</w:t>
+      </w:r>
+    </w:p>
+    <w:p>
+      <w:pPr>
+        <w:spacing w:before="0" w:after="40" w:line="240" w:lineRule="auto"/>
+      </w:pPr>
+      <w:r>
+        <w:rPr>
+          <w:rFonts w:ascii="Carlito" w:hAnsi="Carlito" w:eastAsia="Carlito"/>
+          <w:b/>
+          <w:i w:val="0"/>
+          <w:color w:val="087A73"/>
+          <w:sz w:val="16"/>
+        </w:rPr>
+        <w:t xml:space="preserve">Delivery: </w:t>
+      </w:r>
+      <w:r>
+        <w:rPr>
+          <w:rFonts w:ascii="Carlito" w:hAnsi="Carlito" w:eastAsia="Carlito"/>
+          <w:b w:val="0"/>
+          <w:i w:val="0"/>
+          <w:color w:val="14232A"/>
+          <w:sz w:val="16"/>
+        </w:rPr>
+        <w:t>Git, GitHub Actions, Docker, Vercel, automated testing, static analysis, dependency auditing, deterministic release checks</w:t>
+      </w:r>
+    </w:p>
+    <w:p>
+      <w:pPr>
+        <w:spacing w:before="0" w:after="0" w:line="240" w:lineRule="auto"/>
+      </w:pPr>
+      <w:r>
+        <w:rPr>
+          <w:rFonts w:ascii="Carlito" w:hAnsi="Carlito" w:eastAsia="Carlito"/>
+          <w:b/>
+          <w:i w:val="0"/>
+          <w:color w:val="087A73"/>
+          <w:sz w:val="16"/>
+        </w:rPr>
+        <w:t xml:space="preserve">Additional evidence-bounded exposure: </w:t>
+      </w:r>
+      <w:r>
+        <w:rPr>
+          <w:rFonts w:ascii="Carlito" w:hAnsi="Carlito" w:eastAsia="Carlito"/>
+          <w:b w:val="0"/>
+          <w:i w:val="0"/>
+          <w:color w:val="14232A"/>
+          <w:sz w:val="16"/>
+        </w:rPr>
+        <w:t>Go, Rust, C, C++, CUDA, Swift/Metal, Julia, R, Verilog/SystemVerilog, WebAssembly</w:t>
+      </w:r>
+    </w:p>
+    <w:p>
+      <w:pPr>
+        <w:spacing w:before="140" w:after="20" w:line="240" w:lineRule="auto"/>
+      </w:pPr>
+      <w:r>
+        <w:rPr>
+          <w:rFonts w:ascii="Carlito" w:hAnsi="Carlito" w:eastAsia="Carlito"/>
+          <w:b/>
+          <w:i w:val="0"/>
+          <w:color w:val="087A73"/>
+          <w:sz w:val="14"/>
+        </w:rPr>
+        <w:t>EDUCATION</w:t>
+      </w:r>
+    </w:p>
+    <w:p>
+      <w:pPr>
+        <w:spacing w:before="0" w:after="80" w:line="240" w:lineRule="auto"/>
+        <w:pBdr>
+          <w:bottom w:val="single" w:sz="8" w:space="2" w:color="087A73"/>
+        </w:pBdr>
+      </w:pPr>
+      <w:r>
+        <w:rPr>
+          <w:rFonts w:ascii="Carlito" w:hAnsi="Carlito" w:eastAsia="Carlito"/>
+          <w:b/>
+          <w:i w:val="0"/>
+          <w:color w:val="14232A"/>
+          <w:sz w:val="26"/>
+        </w:rPr>
+        <w:t>Scientific foundation and current cloud training</w:t>
       </w:r>
     </w:p>
     <w:tbl>
@@ -2287,22 +2187,19 @@
         <w:tblCellSpacing w:w="0" w:type="dxa"/>
       </w:tblPr>
       <w:tblGrid>
-        <w:gridCol w:w="6912"/>
-        <w:gridCol w:w="3960"/>
+        <w:gridCol w:w="6336"/>
+        <w:gridCol w:w="3888"/>
       </w:tblGrid>
       <w:tr>
         <w:tc>
           <w:tcPr>
-            <w:tcW w:type="dxa" w:w="5429"/>
+            <w:tcW w:type="dxa" w:w="5112"/>
             <w:tcMar>
-              <w:top w:w="35" w:type="dxa"/>
+              <w:top w:w="30" w:type="dxa"/>
               <w:start w:w="20" w:type="dxa"/>
-              <w:bottom w:w="35" w:type="dxa"/>
+              <w:bottom w:w="30" w:type="dxa"/>
               <w:end w:w="20" w:type="dxa"/>
             </w:tcMar>
-            <w:tcBorders>
-              <w:bottom w:val="nil"/>
-            </w:tcBorders>
           </w:tcPr>
           <w:p>
             <w:pPr>
@@ -2310,11 +2207,11 @@
             </w:pPr>
             <w:r>
               <w:rPr>
-                <w:rFonts w:ascii="Aptos" w:hAnsi="Aptos" w:eastAsia="Aptos"/>
+                <w:rFonts w:ascii="Carlito" w:hAnsi="Carlito" w:eastAsia="Carlito"/>
                 <w:b/>
                 <w:i w:val="0"/>
                 <w:color w:val="14232A"/>
-                <w:sz w:val="18"/>
+                <w:sz w:val="17"/>
               </w:rPr>
               <w:t>University of Hawaii at Manoa</w:t>
             </w:r>
@@ -2322,16 +2219,13 @@
         </w:tc>
         <w:tc>
           <w:tcPr>
-            <w:tcW w:type="dxa" w:w="5429"/>
+            <w:tcW w:type="dxa" w:w="5112"/>
             <w:tcMar>
-              <w:top w:w="35" w:type="dxa"/>
+              <w:top w:w="30" w:type="dxa"/>
               <w:start w:w="20" w:type="dxa"/>
-              <w:bottom w:w="35" w:type="dxa"/>
+              <w:bottom w:w="30" w:type="dxa"/>
               <w:end w:w="20" w:type="dxa"/>
             </w:tcMar>
-            <w:tcBorders>
-              <w:bottom w:val="nil"/>
-            </w:tcBorders>
           </w:tcPr>
           <w:p>
             <w:pPr>
@@ -2340,11 +2234,11 @@
             </w:pPr>
             <w:r>
               <w:rPr>
-                <w:rFonts w:ascii="Aptos" w:hAnsi="Aptos" w:eastAsia="Aptos"/>
+                <w:rFonts w:ascii="Carlito" w:hAnsi="Carlito" w:eastAsia="Carlito"/>
                 <w:b w:val="0"/>
                 <w:i w:val="0"/>
                 <w:color w:val="5B6D75"/>
-                <w:sz w:val="17"/>
+                <w:sz w:val="16"/>
               </w:rPr>
               <w:t>B.S., Marine Biology - 2016</w:t>
             </w:r>
@@ -2354,15 +2248,85 @@
       <w:tr>
         <w:tc>
           <w:tcPr>
-            <w:tcW w:type="dxa" w:w="5429"/>
+            <w:tcW w:type="dxa" w:w="5112"/>
             <w:tcMar>
-              <w:top w:w="35" w:type="dxa"/>
+              <w:top w:w="30" w:type="dxa"/>
               <w:start w:w="20" w:type="dxa"/>
-              <w:bottom w:w="35" w:type="dxa"/>
+              <w:bottom w:w="30" w:type="dxa"/>
               <w:end w:w="20" w:type="dxa"/>
             </w:tcMar>
+          </w:tcPr>
+          <w:p>
+            <w:pPr>
+              <w:spacing w:before="0" w:after="0" w:line="240" w:lineRule="auto"/>
+            </w:pPr>
+            <w:r>
+              <w:rPr>
+                <w:rFonts w:ascii="Carlito" w:hAnsi="Carlito" w:eastAsia="Carlito"/>
+                <w:b/>
+                <w:i w:val="0"/>
+                <w:color w:val="14232A"/>
+                <w:sz w:val="17"/>
+              </w:rPr>
+              <w:t>AWS Cloud Institute</w:t>
+            </w:r>
+          </w:p>
+        </w:tc>
+        <w:tc>
+          <w:tcPr>
+            <w:tcW w:type="dxa" w:w="5112"/>
+            <w:tcMar>
+              <w:top w:w="30" w:type="dxa"/>
+              <w:start w:w="20" w:type="dxa"/>
+              <w:bottom w:w="30" w:type="dxa"/>
+              <w:end w:w="20" w:type="dxa"/>
+            </w:tcMar>
+          </w:tcPr>
+          <w:p>
+            <w:pPr>
+              <w:spacing w:before="0" w:after="0" w:line="240" w:lineRule="auto"/>
+              <w:jc w:val="right"/>
+            </w:pPr>
+            <w:r>
+              <w:rPr>
+                <w:rFonts w:ascii="Carlito" w:hAnsi="Carlito" w:eastAsia="Carlito"/>
+                <w:b w:val="0"/>
+                <w:i w:val="0"/>
+                <w:color w:val="5B6D75"/>
+                <w:sz w:val="16"/>
+              </w:rPr>
+              <w:t>Cloud Application Developer program - 2025-2026, in progress</w:t>
+            </w:r>
+          </w:p>
+        </w:tc>
+      </w:tr>
+    </w:tbl>
+    <w:tbl>
+      <w:tblPr>
+        <w:tblW w:type="auto" w:w="0"/>
+        <w:jc w:val="center"/>
+        <w:tblLook w:firstColumn="1" w:firstRow="1" w:lastColumn="0" w:lastRow="0" w:noHBand="0" w:noVBand="1" w:val="04A0"/>
+        <w:tblCellSpacing w:w="0" w:type="dxa"/>
+      </w:tblPr>
+      <w:tblGrid>
+        <w:gridCol w:w="10224"/>
+      </w:tblGrid>
+      <w:tr>
+        <w:tc>
+          <w:tcPr>
+            <w:tcW w:type="dxa" w:w="10224"/>
+            <w:shd w:fill="FFF5DE"/>
+            <w:tcMar>
+              <w:top w:w="65" w:type="dxa"/>
+              <w:start w:w="80" w:type="dxa"/>
+              <w:bottom w:w="65" w:type="dxa"/>
+              <w:end w:w="80" w:type="dxa"/>
+            </w:tcMar>
             <w:tcBorders>
-              <w:bottom w:val="nil"/>
+              <w:top w:val="single" w:sz="4" w:color="E5B34B"/>
+              <w:left w:val="single" w:sz="4" w:color="E5B34B"/>
+              <w:bottom w:val="single" w:sz="4" w:color="E5B34B"/>
+              <w:right w:val="single" w:sz="4" w:color="E5B34B"/>
             </w:tcBorders>
           </w:tcPr>
           <w:p>
@@ -2371,124 +2335,23 @@
             </w:pPr>
             <w:r>
               <w:rPr>
-                <w:rFonts w:ascii="Aptos" w:hAnsi="Aptos" w:eastAsia="Aptos"/>
-                <w:b/>
-                <w:i w:val="0"/>
-                <w:color w:val="14232A"/>
-                <w:sz w:val="18"/>
-              </w:rPr>
-              <w:t>AWS Cloud Institute</w:t>
-            </w:r>
-          </w:p>
-        </w:tc>
-        <w:tc>
-          <w:tcPr>
-            <w:tcW w:type="dxa" w:w="5429"/>
-            <w:tcMar>
-              <w:top w:w="35" w:type="dxa"/>
-              <w:start w:w="20" w:type="dxa"/>
-              <w:bottom w:w="35" w:type="dxa"/>
-              <w:end w:w="20" w:type="dxa"/>
-            </w:tcMar>
-            <w:tcBorders>
-              <w:bottom w:val="nil"/>
-            </w:tcBorders>
-          </w:tcPr>
-          <w:p>
-            <w:pPr>
-              <w:spacing w:before="0" w:after="0" w:line="240" w:lineRule="auto"/>
-              <w:jc w:val="right"/>
-            </w:pPr>
-            <w:r>
-              <w:rPr>
-                <w:rFonts w:ascii="Aptos" w:hAnsi="Aptos" w:eastAsia="Aptos"/>
-                <w:b w:val="0"/>
-                <w:i w:val="0"/>
-                <w:color w:val="5B6D75"/>
-                <w:sz w:val="17"/>
-              </w:rPr>
-              <w:t>Cloud Application Developer program - 2025-2026, in progress</w:t>
-            </w:r>
-          </w:p>
-        </w:tc>
-      </w:tr>
-    </w:tbl>
-    <w:p>
-      <w:pPr>
-        <w:spacing w:before="80" w:after="80" w:line="240" w:lineRule="auto"/>
-      </w:pPr>
-      <w:r>
-        <w:rPr>
-          <w:rFonts w:ascii="Aptos" w:hAnsi="Aptos" w:eastAsia="Aptos"/>
-          <w:b/>
-          <w:i w:val="0"/>
-          <w:color w:val="087A73"/>
-          <w:sz w:val="15"/>
-        </w:rPr>
-        <w:t xml:space="preserve">Earlier technical certifications recorded in prior resumes: </w:t>
-      </w:r>
-      <w:r>
-        <w:rPr>
-          <w:rFonts w:ascii="Aptos" w:hAnsi="Aptos" w:eastAsia="Aptos"/>
-          <w:b w:val="0"/>
-          <w:i w:val="0"/>
-          <w:color w:val="5B6D75"/>
-          <w:sz w:val="15"/>
-        </w:rPr>
-        <w:t>PSI Visual Cylinder Inspector, Eddy Current Technician, Valve Repair Technician, Oxygen Cleaning Cylinder Technician; NAUI Rescue and Master Diver; PADI Enriched Air Diver. Current status is not represented as active without updated documentation.</w:t>
-      </w:r>
-    </w:p>
-    <w:tbl>
-      <w:tblPr>
-        <w:tblW w:type="auto" w:w="0"/>
-        <w:jc w:val="center"/>
-        <w:tblLook w:firstColumn="1" w:firstRow="1" w:lastColumn="0" w:lastRow="0" w:noHBand="0" w:noVBand="1" w:val="04A0"/>
-        <w:tblCellSpacing w:w="0" w:type="dxa"/>
-      </w:tblPr>
-      <w:tblGrid>
-        <w:gridCol w:w="10858"/>
-      </w:tblGrid>
-      <w:tr>
-        <w:tc>
-          <w:tcPr>
-            <w:tcW w:type="dxa" w:w="10858"/>
-            <w:shd w:fill="FFF5DE"/>
-            <w:tcMar>
-              <w:top w:w="65" w:type="dxa"/>
-              <w:start w:w="75" w:type="dxa"/>
-              <w:bottom w:w="65" w:type="dxa"/>
-              <w:end w:w="75" w:type="dxa"/>
-            </w:tcMar>
-            <w:tcBorders>
-              <w:top w:sz="4" w:val="single" w:color="E5B34B"/>
-              <w:left w:sz="2" w:val="single" w:color="F2D99A"/>
-              <w:bottom w:sz="4" w:val="single" w:color="E5B34B"/>
-              <w:right w:sz="2" w:val="single" w:color="F2D99A"/>
-            </w:tcBorders>
-          </w:tcPr>
-          <w:p>
-            <w:pPr>
-              <w:spacing w:before="0" w:after="0" w:line="240" w:lineRule="auto"/>
-            </w:pPr>
-            <w:r>
-              <w:rPr>
-                <w:rFonts w:ascii="Aptos" w:hAnsi="Aptos" w:eastAsia="Aptos"/>
+                <w:rFonts w:ascii="Carlito" w:hAnsi="Carlito" w:eastAsia="Carlito"/>
                 <w:b/>
                 <w:i w:val="0"/>
                 <w:color w:val="A56600"/>
-                <w:sz w:val="16"/>
+                <w:sz w:val="15"/>
               </w:rPr>
               <w:t xml:space="preserve">EVIDENCE BOUNDARY  </w:t>
             </w:r>
             <w:r>
               <w:rPr>
-                <w:rFonts w:ascii="Aptos" w:hAnsi="Aptos" w:eastAsia="Aptos"/>
+                <w:rFonts w:ascii="Carlito" w:hAnsi="Carlito" w:eastAsia="Carlito"/>
                 <w:b w:val="0"/>
                 <w:i w:val="0"/>
                 <w:color w:val="14232A"/>
                 <w:sz w:val="15"/>
               </w:rPr>
-              <w:t>Independent GlacierEQ work and bounded technical exhibits. Test counts refer only to their stated repository and scope. No company affiliation, proprietary access, production use, customer impact, formal people-management experience, current certification status, or hardware validation is claimed without direct evidence.</w:t>
+              <w:t>Independent GlacierEQ work and bounded technical exhibits. Test counts refer only to their stated repository and scope. No company affiliation, proprietary access, production deployment, customer impact, formal people-management experience, current certification status, hardware validation, or measured business outcome is claimed without direct evidence.</w:t>
             </w:r>
           </w:p>
         </w:tc>
@@ -2497,7 +2360,7 @@
     <w:sectPr>
       <w:footerReference w:type="default" r:id="rId13"/>
       <w:pgSz w:w="12240" w:h="15840"/>
-      <w:pgMar w:top="605" w:right="691" w:bottom="648" w:left="691" w:header="216" w:footer="360" w:gutter="0"/>
+      <w:pgMar w:top="864" w:right="1008" w:bottom="864" w:left="1008" w:header="317" w:footer="403" w:gutter="0"/>
       <w:cols w:space="720"/>
       <w:docGrid w:linePitch="360"/>
     </w:sectPr>
@@ -2515,13 +2378,13 @@
     </w:pPr>
     <w:r>
       <w:rPr>
-        <w:rFonts w:ascii="Aptos" w:hAnsi="Aptos" w:eastAsia="Aptos"/>
+        <w:rFonts w:ascii="Carlito" w:hAnsi="Carlito" w:eastAsia="Carlito"/>
         <w:b/>
         <w:i w:val="0"/>
         <w:color w:val="5B6D75"/>
         <w:sz w:val="13"/>
       </w:rPr>
-      <w:t>CASEY BARTON  |  PSYSOC-X V17 RESUME INTELLIGENCE  |  HUMAN SIGNAL + MACHINE-VERIFIABLE FACTS</w:t>
+      <w:t>CASEY BARTON  |  EVIDENCE-BOUND AI SYSTEMS  |  HONOLULU, HAWAII</w:t>
     </w:r>
   </w:p>
 </w:ftr>
@@ -2894,7 +2757,7 @@
       <w:spacing w:after="0"/>
     </w:pPr>
     <w:rPr>
-      <w:rFonts w:ascii="Aptos" w:hAnsi="Aptos" w:eastAsia="Aptos"/>
+      <w:rFonts w:ascii="Carlito" w:hAnsi="Carlito" w:eastAsia="Carlito"/>
       <w:color w:val="14232A"/>
       <w:sz w:val="18"/>
     </w:rPr>
@@ -3428,7 +3291,9 @@
       <w:contextualSpacing/>
     </w:pPr>
     <w:rPr>
-      <w:rFonts w:ascii="Aptos" w:hAnsi="Aptos" w:eastAsia="Aptos"/>
+      <w:rFonts w:ascii="Carlito" w:hAnsi="Carlito" w:eastAsia="Carlito"/>
+      <w:color w:val="14232A"/>
+      <w:sz w:val="18"/>
     </w:rPr>
   </w:style>
   <w:style w:type="paragraph" w:styleId="ListBullet2">

</xml_diff>

<commit_message>
Finalize resume margins and synchronize proof truth
* Finalize resume layout, margins, and evidence boundaries

* Add print-safe resume page margins

* Synchronize final resume web surface with current proof

* Synchronize ATS resume with final evidence boundaries

* Synchronize ATS text with final resume truth

* Update machine resume to final current proof model

* Update resume validation for final margins and proof model

* Bring V16 invariance gate up to current resume proof truth

* Make final resume margin CSS part of the release gate

* Route deterministic resume generator through its dedicated validation gate

* Persist exact final resume artifacts for deterministic promotion

* Regenerate deterministic final resume artifacts

* Restore resume validation workflow to read-only after artifact promotion

---------

Co-authored-by: github-actions[bot] <41898282+github-actions[bot]@users.noreply.github.com>
</commit_message>
<xml_diff>
--- a/site-v15/downloads/Casey_Barton_Resume.docx
+++ b/site-v15/downloads/Casey_Barton_Resume.docx
@@ -11,26 +11,20 @@
         <w:tblCellSpacing w:w="0" w:type="dxa"/>
       </w:tblPr>
       <w:tblGrid>
-        <w:gridCol w:w="7992"/>
-        <w:gridCol w:w="2880"/>
+        <w:gridCol w:w="7128"/>
+        <w:gridCol w:w="3096"/>
       </w:tblGrid>
       <w:tr>
         <w:tc>
           <w:tcPr>
-            <w:tcW w:type="dxa" w:w="5429"/>
+            <w:tcW w:type="dxa" w:w="5112"/>
             <w:shd w:fill="0B2028"/>
             <w:tcMar>
-              <w:top w:w="125" w:type="dxa"/>
-              <w:start w:w="115" w:type="dxa"/>
-              <w:bottom w:w="115" w:type="dxa"/>
-              <w:end w:w="115" w:type="dxa"/>
+              <w:top w:w="115" w:type="dxa"/>
+              <w:start w:w="125" w:type="dxa"/>
+              <w:bottom w:w="105" w:type="dxa"/>
+              <w:end w:w="125" w:type="dxa"/>
             </w:tcMar>
-            <w:tcBorders>
-              <w:top w:val="nil"/>
-              <w:left w:val="nil"/>
-              <w:bottom w:val="nil"/>
-              <w:right w:val="nil"/>
-            </w:tcBorders>
             <w:vAlign w:val="center"/>
           </w:tcPr>
           <w:p>
@@ -39,11 +33,11 @@
             </w:pPr>
             <w:r>
               <w:rPr>
-                <w:rFonts w:ascii="Aptos" w:hAnsi="Aptos" w:eastAsia="Aptos"/>
+                <w:rFonts w:ascii="Carlito" w:hAnsi="Carlito" w:eastAsia="Carlito"/>
                 <w:b/>
                 <w:i w:val="0"/>
                 <w:color w:val="FFFFFF"/>
-                <w:sz w:val="41"/>
+                <w:sz w:val="38"/>
               </w:rPr>
               <w:t>CASEY DEL CARPIO BARTON</w:t>
             </w:r>
@@ -54,21 +48,21 @@
             </w:pPr>
             <w:r>
               <w:rPr>
-                <w:rFonts w:ascii="Aptos" w:hAnsi="Aptos" w:eastAsia="Aptos"/>
+                <w:rFonts w:ascii="Carlito" w:hAnsi="Carlito" w:eastAsia="Carlito"/>
                 <w:b/>
                 <w:i w:val="0"/>
                 <w:color w:val="7DEAD4"/>
-                <w:sz w:val="21"/>
+                <w:sz w:val="20"/>
               </w:rPr>
               <w:t>APPLIED AI SYSTEMS ARCHITECT</w:t>
             </w:r>
             <w:r>
               <w:rPr>
-                <w:rFonts w:ascii="Aptos" w:hAnsi="Aptos" w:eastAsia="Aptos"/>
+                <w:rFonts w:ascii="Carlito" w:hAnsi="Carlito" w:eastAsia="Carlito"/>
                 <w:b w:val="0"/>
                 <w:i w:val="0"/>
                 <w:color w:val="D7E4E7"/>
-                <w:sz w:val="18"/>
+                <w:sz w:val="17"/>
               </w:rPr>
               <w:t xml:space="preserve">  |  Agent Infrastructure Engineer</w:t>
             </w:r>
@@ -79,42 +73,36 @@
             </w:pPr>
             <w:r>
               <w:rPr>
-                <w:rFonts w:ascii="Aptos" w:hAnsi="Aptos" w:eastAsia="Aptos"/>
+                <w:rFonts w:ascii="Carlito" w:hAnsi="Carlito" w:eastAsia="Carlito"/>
                 <w:b w:val="0"/>
                 <w:i w:val="0"/>
                 <w:color w:val="C1D1D5"/>
                 <w:sz w:val="16"/>
               </w:rPr>
-              <w:t>Forward-Deployed AI  |  Evidence-bound execution for ambitious systems and high-consequence decisions.</w:t>
+              <w:t>Forward-Deployed AI  |  Builds the operating layer that makes powerful AI dependable enough to use.</w:t>
             </w:r>
           </w:p>
         </w:tc>
         <w:tc>
           <w:tcPr>
-            <w:tcW w:type="dxa" w:w="5429"/>
+            <w:tcW w:type="dxa" w:w="5112"/>
             <w:shd w:fill="0B2028"/>
             <w:tcMar>
-              <w:top w:w="125" w:type="dxa"/>
-              <w:start w:w="115" w:type="dxa"/>
-              <w:bottom w:w="115" w:type="dxa"/>
-              <w:end w:w="115" w:type="dxa"/>
+              <w:top w:w="115" w:type="dxa"/>
+              <w:start w:w="125" w:type="dxa"/>
+              <w:bottom w:w="105" w:type="dxa"/>
+              <w:end w:w="125" w:type="dxa"/>
             </w:tcMar>
-            <w:tcBorders>
-              <w:top w:val="nil"/>
-              <w:left w:val="nil"/>
-              <w:bottom w:val="nil"/>
-              <w:right w:val="nil"/>
-            </w:tcBorders>
             <w:vAlign w:val="center"/>
           </w:tcPr>
           <w:p>
             <w:pPr>
-              <w:spacing w:before="0" w:after="20" w:line="240" w:lineRule="auto"/>
+              <w:spacing w:before="0" w:after="40" w:line="240" w:lineRule="auto"/>
               <w:jc w:val="right"/>
             </w:pPr>
             <w:r>
               <w:rPr>
-                <w:rFonts w:ascii="Aptos" w:hAnsi="Aptos" w:eastAsia="Aptos"/>
+                <w:rFonts w:ascii="Carlito" w:hAnsi="Carlito" w:eastAsia="Carlito"/>
                 <w:b/>
                 <w:i w:val="0"/>
                 <w:color w:val="FFFFFF"/>
@@ -135,19 +123,17 @@
                   <w:u w:val="none"/>
                   <w:sz w:val="16"/>
                   <w:szCs w:val="16"/>
+                  <w:rFonts w:ascii="Carlito" w:hAnsi="Carlito"/>
                 </w:rPr>
                 <w:t>808-936-5654</w:t>
               </w:r>
             </w:hyperlink>
-            <w:r>
-              <w:rPr>
-                <w:rFonts w:ascii="Aptos" w:hAnsi="Aptos" w:eastAsia="Aptos"/>
-                <w:b w:val="0"/>
-                <w:i w:val="0"/>
-                <w:sz w:val="2"/>
-              </w:rPr>
-              <w:br/>
-            </w:r>
+          </w:p>
+          <w:p>
+            <w:pPr>
+              <w:spacing w:before="0" w:after="0" w:line="240" w:lineRule="auto"/>
+              <w:jc w:val="right"/>
+            </w:pPr>
             <w:hyperlink r:id="rId10">
               <w:r>
                 <w:rPr>
@@ -155,19 +141,17 @@
                   <w:u w:val="none"/>
                   <w:sz w:val="16"/>
                   <w:szCs w:val="16"/>
+                  <w:rFonts w:ascii="Carlito" w:hAnsi="Carlito"/>
                 </w:rPr>
                 <w:t>glacier.equilibrium@gmail.com</w:t>
               </w:r>
             </w:hyperlink>
-            <w:r>
-              <w:rPr>
-                <w:rFonts w:ascii="Aptos" w:hAnsi="Aptos" w:eastAsia="Aptos"/>
-                <w:b w:val="0"/>
-                <w:i w:val="0"/>
-                <w:sz w:val="2"/>
-              </w:rPr>
-              <w:br/>
-            </w:r>
+          </w:p>
+          <w:p>
+            <w:pPr>
+              <w:spacing w:before="0" w:after="0" w:line="240" w:lineRule="auto"/>
+              <w:jc w:val="right"/>
+            </w:pPr>
             <w:hyperlink r:id="rId11">
               <w:r>
                 <w:rPr>
@@ -175,19 +159,17 @@
                   <w:u w:val="none"/>
                   <w:sz w:val="16"/>
                   <w:szCs w:val="16"/>
+                  <w:rFonts w:ascii="Carlito" w:hAnsi="Carlito"/>
                 </w:rPr>
                 <w:t>casey-barton-glaciereq.vercel.app</w:t>
               </w:r>
             </w:hyperlink>
-            <w:r>
-              <w:rPr>
-                <w:rFonts w:ascii="Aptos" w:hAnsi="Aptos" w:eastAsia="Aptos"/>
-                <w:b w:val="0"/>
-                <w:i w:val="0"/>
-                <w:sz w:val="2"/>
-              </w:rPr>
-              <w:br/>
-            </w:r>
+          </w:p>
+          <w:p>
+            <w:pPr>
+              <w:spacing w:before="0" w:after="0" w:line="240" w:lineRule="auto"/>
+              <w:jc w:val="right"/>
+            </w:pPr>
             <w:hyperlink r:id="rId12">
               <w:r>
                 <w:rPr>
@@ -195,6 +177,7 @@
                   <w:u w:val="none"/>
                   <w:sz w:val="16"/>
                   <w:szCs w:val="16"/>
+                  <w:rFonts w:ascii="Carlito" w:hAnsi="Carlito"/>
                 </w:rPr>
                 <w:t>github.com/GlacierEQ</w:t>
               </w:r>
@@ -211,24 +194,24 @@
         <w:tblCellSpacing w:w="0" w:type="dxa"/>
       </w:tblPr>
       <w:tblGrid>
-        <w:gridCol w:w="10858"/>
+        <w:gridCol w:w="10224"/>
       </w:tblGrid>
       <w:tr>
         <w:tc>
           <w:tcPr>
-            <w:tcW w:type="dxa" w:w="10858"/>
+            <w:tcW w:type="dxa" w:w="10224"/>
             <w:shd w:fill="EEF6F4"/>
             <w:tcMar>
-              <w:top w:w="75" w:type="dxa"/>
-              <w:start w:w="90" w:type="dxa"/>
-              <w:bottom w:w="75" w:type="dxa"/>
-              <w:end w:w="90" w:type="dxa"/>
+              <w:top w:w="80" w:type="dxa"/>
+              <w:start w:w="105" w:type="dxa"/>
+              <w:bottom w:w="80" w:type="dxa"/>
+              <w:end w:w="105" w:type="dxa"/>
             </w:tcMar>
             <w:tcBorders>
-              <w:top w:sz="8" w:val="single" w:color="087A73"/>
-              <w:left w:sz="2" w:val="single" w:color="D4E4E1"/>
-              <w:bottom w:sz="8" w:val="single" w:color="087A73"/>
-              <w:right w:sz="2" w:val="single" w:color="D4E4E1"/>
+              <w:top w:val="single" w:sz="5" w:color="087A73"/>
+              <w:left w:val="single" w:sz="5" w:color="087A73"/>
+              <w:bottom w:val="single" w:sz="5" w:color="087A73"/>
+              <w:right w:val="single" w:sz="5" w:color="087A73"/>
             </w:tcBorders>
           </w:tcPr>
           <w:p>
@@ -237,28 +220,28 @@
             </w:pPr>
             <w:r>
               <w:rPr>
-                <w:rFonts w:ascii="Aptos" w:hAnsi="Aptos" w:eastAsia="Aptos"/>
+                <w:rFonts w:ascii="Carlito" w:hAnsi="Carlito" w:eastAsia="Carlito"/>
                 <w:b/>
                 <w:i w:val="0"/>
                 <w:color w:val="087A73"/>
-                <w:sz w:val="16"/>
+                <w:sz w:val="14"/>
               </w:rPr>
-              <w:t>EXECUTIVE SIGNAL</w:t>
+              <w:t>SYSTEMS SIGNAL</w:t>
             </w:r>
           </w:p>
           <w:p>
             <w:pPr>
-              <w:spacing w:before="0" w:after="0" w:line="254" w:lineRule="auto"/>
+              <w:spacing w:before="0" w:after="0" w:line="252" w:lineRule="auto"/>
             </w:pPr>
             <w:r>
               <w:rPr>
-                <w:rFonts w:ascii="Aptos" w:hAnsi="Aptos" w:eastAsia="Aptos"/>
+                <w:rFonts w:ascii="Carlito" w:hAnsi="Carlito" w:eastAsia="Carlito"/>
                 <w:b w:val="0"/>
                 <w:i w:val="0"/>
                 <w:color w:val="14232A"/>
-                <w:sz w:val="19"/>
+                <w:sz w:val="18"/>
               </w:rPr>
-              <w:t>Builds the operating layer between model capability and dependable outcomes: explicit authority, bounded tool use, deterministic evidence, controlled failure, continuity, and completion receipts. Combines software architecture with scientific measurement, compressed-gas safety, building-system inspection, and owner-operated field execution.</w:t>
+              <w:t>Applied AI systems architect who turns ambitious, ambiguous ideas into bounded operating systems with explicit authority, deterministic evidence, controlled failure behavior, and inspectable completion receipts. The method is simple: observe the actual system, separate evidence from inference, isolate the governing failure, build the narrowest useful mechanism, test the stated behavior, expose the limit, and leave a usable artifact.</w:t>
             </w:r>
           </w:p>
         </w:tc>
@@ -273,27 +256,27 @@
         <w:tblCellSpacing w:w="0" w:type="dxa"/>
       </w:tblPr>
       <w:tblGrid>
-        <w:gridCol w:w="2714"/>
-        <w:gridCol w:w="2714"/>
-        <w:gridCol w:w="2714"/>
-        <w:gridCol w:w="2714"/>
+        <w:gridCol w:w="2556"/>
+        <w:gridCol w:w="2556"/>
+        <w:gridCol w:w="2556"/>
+        <w:gridCol w:w="2556"/>
       </w:tblGrid>
       <w:tr>
         <w:tc>
           <w:tcPr>
-            <w:tcW w:type="dxa" w:w="2714"/>
+            <w:tcW w:type="dxa" w:w="2556"/>
             <w:shd w:fill="F7FAF9"/>
             <w:tcMar>
-              <w:top w:w="65" w:type="dxa"/>
-              <w:start w:w="40" w:type="dxa"/>
-              <w:bottom w:w="65" w:type="dxa"/>
-              <w:end w:w="40" w:type="dxa"/>
+              <w:top w:w="55" w:type="dxa"/>
+              <w:start w:w="35" w:type="dxa"/>
+              <w:bottom w:w="55" w:type="dxa"/>
+              <w:end w:w="35" w:type="dxa"/>
             </w:tcMar>
             <w:tcBorders>
-              <w:top w:sz="2" w:val="single" w:color="D4E4E1"/>
-              <w:left w:sz="2" w:val="single" w:color="D4E4E1"/>
-              <w:bottom w:sz="2" w:val="single" w:color="D4E4E1"/>
-              <w:right w:sz="2" w:val="single" w:color="D4E4E1"/>
+              <w:top w:val="single" w:sz="2" w:color="D4E4E1"/>
+              <w:left w:val="single" w:sz="2" w:color="D4E4E1"/>
+              <w:bottom w:val="single" w:sz="2" w:color="D4E4E1"/>
+              <w:right w:val="single" w:sz="2" w:color="D4E4E1"/>
             </w:tcBorders>
           </w:tcPr>
           <w:p>
@@ -303,11 +286,11 @@
             </w:pPr>
             <w:r>
               <w:rPr>
-                <w:rFonts w:ascii="Aptos" w:hAnsi="Aptos" w:eastAsia="Aptos"/>
+                <w:rFonts w:ascii="Carlito" w:hAnsi="Carlito" w:eastAsia="Carlito"/>
                 <w:b/>
                 <w:i w:val="0"/>
                 <w:color w:val="087A73"/>
-                <w:sz w:val="31"/>
+                <w:sz w:val="28"/>
               </w:rPr>
               <w:t>69/69</w:t>
             </w:r>
@@ -319,11 +302,11 @@
             </w:pPr>
             <w:r>
               <w:rPr>
-                <w:rFonts w:ascii="Aptos" w:hAnsi="Aptos" w:eastAsia="Aptos"/>
+                <w:rFonts w:ascii="Carlito" w:hAnsi="Carlito" w:eastAsia="Carlito"/>
                 <w:b w:val="0"/>
                 <w:i w:val="0"/>
                 <w:color w:val="5B6D75"/>
-                <w:sz w:val="15"/>
+                <w:sz w:val="14"/>
               </w:rPr>
               <w:t>Receipt Router tests</w:t>
             </w:r>
@@ -331,19 +314,19 @@
         </w:tc>
         <w:tc>
           <w:tcPr>
-            <w:tcW w:type="dxa" w:w="2714"/>
+            <w:tcW w:type="dxa" w:w="2556"/>
             <w:shd w:fill="EEF6F4"/>
             <w:tcMar>
-              <w:top w:w="65" w:type="dxa"/>
-              <w:start w:w="40" w:type="dxa"/>
-              <w:bottom w:w="65" w:type="dxa"/>
-              <w:end w:w="40" w:type="dxa"/>
+              <w:top w:w="55" w:type="dxa"/>
+              <w:start w:w="35" w:type="dxa"/>
+              <w:bottom w:w="55" w:type="dxa"/>
+              <w:end w:w="35" w:type="dxa"/>
             </w:tcMar>
             <w:tcBorders>
-              <w:top w:sz="2" w:val="single" w:color="D4E4E1"/>
-              <w:left w:sz="2" w:val="single" w:color="D4E4E1"/>
-              <w:bottom w:sz="2" w:val="single" w:color="D4E4E1"/>
-              <w:right w:sz="2" w:val="single" w:color="D4E4E1"/>
+              <w:top w:val="single" w:sz="2" w:color="D4E4E1"/>
+              <w:left w:val="single" w:sz="2" w:color="D4E4E1"/>
+              <w:bottom w:val="single" w:sz="2" w:color="D4E4E1"/>
+              <w:right w:val="single" w:sz="2" w:color="D4E4E1"/>
             </w:tcBorders>
           </w:tcPr>
           <w:p>
@@ -353,11 +336,11 @@
             </w:pPr>
             <w:r>
               <w:rPr>
-                <w:rFonts w:ascii="Aptos" w:hAnsi="Aptos" w:eastAsia="Aptos"/>
+                <w:rFonts w:ascii="Carlito" w:hAnsi="Carlito" w:eastAsia="Carlito"/>
                 <w:b/>
                 <w:i w:val="0"/>
                 <w:color w:val="087A73"/>
-                <w:sz w:val="31"/>
+                <w:sz w:val="28"/>
               </w:rPr>
               <w:t>166 + 19</w:t>
             </w:r>
@@ -369,31 +352,31 @@
             </w:pPr>
             <w:r>
               <w:rPr>
-                <w:rFonts w:ascii="Aptos" w:hAnsi="Aptos" w:eastAsia="Aptos"/>
+                <w:rFonts w:ascii="Carlito" w:hAnsi="Carlito" w:eastAsia="Carlito"/>
                 <w:b w:val="0"/>
                 <w:i w:val="0"/>
                 <w:color w:val="5B6D75"/>
-                <w:sz w:val="15"/>
+                <w:sz w:val="14"/>
               </w:rPr>
-              <w:t>Bounded source + memory tests</w:t>
+              <w:t>source + memory tests</w:t>
             </w:r>
           </w:p>
         </w:tc>
         <w:tc>
           <w:tcPr>
-            <w:tcW w:type="dxa" w:w="2714"/>
+            <w:tcW w:type="dxa" w:w="2556"/>
             <w:shd w:fill="F7FAF9"/>
             <w:tcMar>
-              <w:top w:w="65" w:type="dxa"/>
-              <w:start w:w="40" w:type="dxa"/>
-              <w:bottom w:w="65" w:type="dxa"/>
-              <w:end w:w="40" w:type="dxa"/>
+              <w:top w:w="55" w:type="dxa"/>
+              <w:start w:w="35" w:type="dxa"/>
+              <w:bottom w:w="55" w:type="dxa"/>
+              <w:end w:w="35" w:type="dxa"/>
             </w:tcMar>
             <w:tcBorders>
-              <w:top w:sz="2" w:val="single" w:color="D4E4E1"/>
-              <w:left w:sz="2" w:val="single" w:color="D4E4E1"/>
-              <w:bottom w:sz="2" w:val="single" w:color="D4E4E1"/>
-              <w:right w:sz="2" w:val="single" w:color="D4E4E1"/>
+              <w:top w:val="single" w:sz="2" w:color="D4E4E1"/>
+              <w:left w:val="single" w:sz="2" w:color="D4E4E1"/>
+              <w:bottom w:val="single" w:sz="2" w:color="D4E4E1"/>
+              <w:right w:val="single" w:sz="2" w:color="D4E4E1"/>
             </w:tcBorders>
           </w:tcPr>
           <w:p>
@@ -403,13 +386,13 @@
             </w:pPr>
             <w:r>
               <w:rPr>
-                <w:rFonts w:ascii="Aptos" w:hAnsi="Aptos" w:eastAsia="Aptos"/>
+                <w:rFonts w:ascii="Carlito" w:hAnsi="Carlito" w:eastAsia="Carlito"/>
                 <w:b/>
                 <w:i w:val="0"/>
                 <w:color w:val="087A73"/>
-                <w:sz w:val="31"/>
+                <w:sz w:val="28"/>
               </w:rPr>
-              <w:t>148/148</w:t>
+              <w:t>67</w:t>
             </w:r>
           </w:p>
           <w:p>
@@ -419,31 +402,31 @@
             </w:pPr>
             <w:r>
               <w:rPr>
-                <w:rFonts w:ascii="Aptos" w:hAnsi="Aptos" w:eastAsia="Aptos"/>
+                <w:rFonts w:ascii="Carlito" w:hAnsi="Carlito" w:eastAsia="Carlito"/>
                 <w:b w:val="0"/>
                 <w:i w:val="0"/>
                 <w:color w:val="5B6D75"/>
-                <w:sz w:val="15"/>
+                <w:sz w:val="14"/>
               </w:rPr>
-              <w:t>Job Application Helix tests</w:t>
+              <w:t>Helix admitted public set</w:t>
             </w:r>
           </w:p>
         </w:tc>
         <w:tc>
           <w:tcPr>
-            <w:tcW w:type="dxa" w:w="2714"/>
+            <w:tcW w:type="dxa" w:w="2556"/>
             <w:shd w:fill="EEF6F4"/>
             <w:tcMar>
-              <w:top w:w="65" w:type="dxa"/>
-              <w:start w:w="40" w:type="dxa"/>
-              <w:bottom w:w="65" w:type="dxa"/>
-              <w:end w:w="40" w:type="dxa"/>
+              <w:top w:w="55" w:type="dxa"/>
+              <w:start w:w="35" w:type="dxa"/>
+              <w:bottom w:w="55" w:type="dxa"/>
+              <w:end w:w="35" w:type="dxa"/>
             </w:tcMar>
             <w:tcBorders>
-              <w:top w:sz="2" w:val="single" w:color="D4E4E1"/>
-              <w:left w:sz="2" w:val="single" w:color="D4E4E1"/>
-              <w:bottom w:sz="2" w:val="single" w:color="D4E4E1"/>
-              <w:right w:sz="2" w:val="single" w:color="D4E4E1"/>
+              <w:top w:val="single" w:sz="2" w:color="D4E4E1"/>
+              <w:left w:val="single" w:sz="2" w:color="D4E4E1"/>
+              <w:bottom w:val="single" w:sz="2" w:color="D4E4E1"/>
+              <w:right w:val="single" w:sz="2" w:color="D4E4E1"/>
             </w:tcBorders>
           </w:tcPr>
           <w:p>
@@ -453,13 +436,13 @@
             </w:pPr>
             <w:r>
               <w:rPr>
-                <w:rFonts w:ascii="Aptos" w:hAnsi="Aptos" w:eastAsia="Aptos"/>
+                <w:rFonts w:ascii="Carlito" w:hAnsi="Carlito" w:eastAsia="Carlito"/>
                 <w:b/>
                 <w:i w:val="0"/>
                 <w:color w:val="087A73"/>
-                <w:sz w:val="31"/>
+                <w:sz w:val="28"/>
               </w:rPr>
-              <w:t>0</w:t>
+              <w:t>62/62</w:t>
             </w:r>
           </w:p>
           <w:p>
@@ -469,13 +452,13 @@
             </w:pPr>
             <w:r>
               <w:rPr>
-                <w:rFonts w:ascii="Aptos" w:hAnsi="Aptos" w:eastAsia="Aptos"/>
+                <w:rFonts w:ascii="Carlito" w:hAnsi="Carlito" w:eastAsia="Carlito"/>
                 <w:b w:val="0"/>
                 <w:i w:val="0"/>
                 <w:color w:val="5B6D75"/>
-                <w:sz w:val="15"/>
+                <w:sz w:val="14"/>
               </w:rPr>
-              <w:t>External actions in flagship verification</w:t>
+              <w:t>Agent Coordinator tests</w:t>
             </w:r>
           </w:p>
         </w:tc>
@@ -483,22 +466,35 @@
     </w:tbl>
     <w:p>
       <w:pPr>
-        <w:spacing w:before="120" w:after="60" w:line="240" w:lineRule="auto"/>
-        <w:keepNext/>
-        <w:keepLines/>
+        <w:spacing w:before="140" w:after="20" w:line="240" w:lineRule="auto"/>
+      </w:pPr>
+      <w:r>
+        <w:rPr>
+          <w:rFonts w:ascii="Carlito" w:hAnsi="Carlito" w:eastAsia="Carlito"/>
+          <w:b/>
+          <w:i w:val="0"/>
+          <w:color w:val="087A73"/>
+          <w:sz w:val="14"/>
+        </w:rPr>
+        <w:t>PROOF AT WORK</w:t>
+      </w:r>
+    </w:p>
+    <w:p>
+      <w:pPr>
+        <w:spacing w:before="0" w:after="80" w:line="240" w:lineRule="auto"/>
         <w:pBdr>
-          <w:bottom w:val="single" w:sz="10" w:space="2" w:color="087A73"/>
+          <w:bottom w:val="single" w:sz="8" w:space="2" w:color="087A73"/>
         </w:pBdr>
       </w:pPr>
       <w:r>
         <w:rPr>
-          <w:rFonts w:ascii="Aptos" w:hAnsi="Aptos" w:eastAsia="Aptos"/>
+          <w:rFonts w:ascii="Carlito" w:hAnsi="Carlito" w:eastAsia="Carlito"/>
           <w:b/>
           <w:i w:val="0"/>
-          <w:color w:val="087A73"/>
-          <w:sz w:val="24"/>
+          <w:color w:val="14232A"/>
+          <w:sz w:val="26"/>
         </w:rPr>
-        <w:t>PROFESSIONAL EXPERIENCE</w:t>
+        <w:t>Professional Experience</w:t>
       </w:r>
     </w:p>
     <w:tbl>
@@ -510,22 +506,19 @@
         <w:tblCellSpacing w:w="0" w:type="dxa"/>
       </w:tblPr>
       <w:tblGrid>
-        <w:gridCol w:w="8496"/>
-        <w:gridCol w:w="2376"/>
+        <w:gridCol w:w="8064"/>
+        <w:gridCol w:w="2160"/>
       </w:tblGrid>
       <w:tr>
         <w:tc>
           <w:tcPr>
-            <w:tcW w:type="dxa" w:w="5429"/>
+            <w:tcW w:type="dxa" w:w="5112"/>
             <w:tcMar>
-              <w:top w:w="30" w:type="dxa"/>
+              <w:top w:w="25" w:type="dxa"/>
               <w:start w:w="0" w:type="dxa"/>
-              <w:bottom w:w="15" w:type="dxa"/>
+              <w:bottom w:w="10" w:type="dxa"/>
               <w:end w:w="0" w:type="dxa"/>
             </w:tcMar>
-            <w:tcBorders>
-              <w:bottom w:val="nil"/>
-            </w:tcBorders>
           </w:tcPr>
           <w:p>
             <w:pPr>
@@ -533,31 +526,31 @@
             </w:pPr>
             <w:r>
               <w:rPr>
-                <w:rFonts w:ascii="Aptos" w:hAnsi="Aptos" w:eastAsia="Aptos"/>
+                <w:rFonts w:ascii="Carlito" w:hAnsi="Carlito" w:eastAsia="Carlito"/>
                 <w:b/>
                 <w:i w:val="0"/>
                 <w:color w:val="14232A"/>
-                <w:sz w:val="21"/>
+                <w:sz w:val="20"/>
               </w:rPr>
               <w:t>GlacierEQ</w:t>
             </w:r>
             <w:r>
               <w:rPr>
-                <w:rFonts w:ascii="Aptos" w:hAnsi="Aptos" w:eastAsia="Aptos"/>
+                <w:rFonts w:ascii="Carlito" w:hAnsi="Carlito" w:eastAsia="Carlito"/>
                 <w:b w:val="0"/>
                 <w:i w:val="0"/>
                 <w:color w:val="5B6D75"/>
-                <w:sz w:val="21"/>
+                <w:sz w:val="18"/>
               </w:rPr>
-              <w:t xml:space="preserve"> | </w:t>
+              <w:t xml:space="preserve">  |  </w:t>
             </w:r>
             <w:r>
               <w:rPr>
-                <w:rFonts w:ascii="Aptos" w:hAnsi="Aptos" w:eastAsia="Aptos"/>
+                <w:rFonts w:ascii="Carlito" w:hAnsi="Carlito" w:eastAsia="Carlito"/>
                 <w:b/>
                 <w:i w:val="0"/>
                 <w:color w:val="087A73"/>
-                <w:sz w:val="20"/>
+                <w:sz w:val="18"/>
               </w:rPr>
               <w:t>Founder / Applied AI Systems Builder</w:t>
             </w:r>
@@ -565,16 +558,13 @@
         </w:tc>
         <w:tc>
           <w:tcPr>
-            <w:tcW w:type="dxa" w:w="5429"/>
+            <w:tcW w:type="dxa" w:w="5112"/>
             <w:tcMar>
-              <w:top w:w="30" w:type="dxa"/>
+              <w:top w:w="25" w:type="dxa"/>
               <w:start w:w="0" w:type="dxa"/>
-              <w:bottom w:w="15" w:type="dxa"/>
+              <w:bottom w:w="10" w:type="dxa"/>
               <w:end w:w="0" w:type="dxa"/>
             </w:tcMar>
-            <w:tcBorders>
-              <w:bottom w:val="nil"/>
-            </w:tcBorders>
           </w:tcPr>
           <w:p>
             <w:pPr>
@@ -583,11 +573,11 @@
             </w:pPr>
             <w:r>
               <w:rPr>
-                <w:rFonts w:ascii="Aptos" w:hAnsi="Aptos" w:eastAsia="Aptos"/>
+                <w:rFonts w:ascii="Carlito" w:hAnsi="Carlito" w:eastAsia="Carlito"/>
                 <w:b/>
                 <w:i w:val="0"/>
                 <w:color w:val="5B6D75"/>
-                <w:sz w:val="17"/>
+                <w:sz w:val="16"/>
               </w:rPr>
               <w:t>Jan 2025-Present</w:t>
             </w:r>
@@ -597,31 +587,17 @@
     </w:tbl>
     <w:p>
       <w:pPr>
-        <w:spacing w:before="0" w:after="20" w:line="240" w:lineRule="auto"/>
+        <w:pStyle w:val="ListBullet"/>
+        <w:spacing w:before="0" w:after="14" w:line="247" w:lineRule="auto"/>
+        <w:ind w:left="259" w:hanging="202"/>
       </w:pPr>
       <w:r>
         <w:rPr>
-          <w:rFonts w:ascii="Aptos" w:hAnsi="Aptos" w:eastAsia="Aptos"/>
+          <w:rFonts w:ascii="Carlito" w:hAnsi="Carlito" w:eastAsia="Carlito"/>
           <w:b w:val="0"/>
-          <w:i/>
-          <w:color w:val="5B6D75"/>
+          <w:i w:val="0"/>
+          <w:color w:val="14232A"/>
           <w:sz w:val="17"/>
-        </w:rPr>
-        <w:t>Honolulu, Hawaii</w:t>
-      </w:r>
-    </w:p>
-    <w:p>
-      <w:pPr>
-        <w:pStyle w:val="ListBullet"/>
-        <w:spacing w:after="8" w:line="240" w:lineRule="auto"/>
-        <w:ind w:left="245" w:hanging="202"/>
-        <w:keepLines/>
-      </w:pPr>
-      <w:r>
-        <w:rPr>
-          <w:rFonts w:ascii="Aptos" w:hAnsi="Aptos" w:eastAsia="Aptos"/>
-          <w:color w:val="14232A"/>
-          <w:sz w:val="18"/>
         </w:rPr>
         <w:t>Design and implement evidence-bound systems spanning agent orchestration, application intelligence, document and evidence pipelines, memory and continuity, infrastructure governance, and human-machine interfaces.</w:t>
       </w:r>
@@ -629,49 +605,52 @@
     <w:p>
       <w:pPr>
         <w:pStyle w:val="ListBullet"/>
-        <w:spacing w:after="8" w:line="240" w:lineRule="auto"/>
-        <w:ind w:left="245" w:hanging="202"/>
-        <w:keepLines/>
+        <w:spacing w:before="0" w:after="14" w:line="247" w:lineRule="auto"/>
+        <w:ind w:left="259" w:hanging="202"/>
       </w:pPr>
       <w:r>
         <w:rPr>
-          <w:rFonts w:ascii="Aptos" w:hAnsi="Aptos" w:eastAsia="Aptos"/>
+          <w:rFonts w:ascii="Carlito" w:hAnsi="Carlito" w:eastAsia="Carlito"/>
+          <w:b w:val="0"/>
+          <w:i w:val="0"/>
           <w:color w:val="14232A"/>
-          <w:sz w:val="18"/>
+          <w:sz w:val="17"/>
         </w:rPr>
-        <w:t>Convert ambiguous architecture into typed contracts, runnable slices, deterministic tests, explicit refusal behavior, machine-readable facts, and reviewable completion receipts.</w:t>
+        <w:t>Convert broad architecture into typed contracts, runnable slices, deterministic tests, explicit refusal behavior, machine-readable facts, and reviewable completion receipts.</w:t>
       </w:r>
     </w:p>
     <w:p>
       <w:pPr>
         <w:pStyle w:val="ListBullet"/>
-        <w:spacing w:after="8" w:line="240" w:lineRule="auto"/>
-        <w:ind w:left="245" w:hanging="202"/>
-        <w:keepLines/>
+        <w:spacing w:before="0" w:after="14" w:line="247" w:lineRule="auto"/>
+        <w:ind w:left="259" w:hanging="202"/>
       </w:pPr>
       <w:r>
         <w:rPr>
-          <w:rFonts w:ascii="Aptos" w:hAnsi="Aptos" w:eastAsia="Aptos"/>
+          <w:rFonts w:ascii="Carlito" w:hAnsi="Carlito" w:eastAsia="Carlito"/>
+          <w:b w:val="0"/>
+          <w:i w:val="0"/>
           <w:color w:val="14232A"/>
-          <w:sz w:val="18"/>
+          <w:sz w:val="17"/>
         </w:rPr>
-        <w:t>Built a public Portfolio Receipt Router that replaced unsupported autonomous-control semantics with a local fail-closed evidence system; 69 of 69 tests passed through direct and reusable CI with zero external actions.</w:t>
+        <w:t>Built a public Portfolio Receipt Router that replaced unsupported autonomous-control semantics with a local fail-closed evidence system; 69/69 tests passed through direct and reusable CI with zero external actions.</w:t>
       </w:r>
     </w:p>
     <w:p>
       <w:pPr>
         <w:pStyle w:val="ListBullet"/>
-        <w:spacing w:after="8" w:line="240" w:lineRule="auto"/>
-        <w:ind w:left="245" w:hanging="202"/>
-        <w:keepLines/>
+        <w:spacing w:before="0" w:after="14" w:line="247" w:lineRule="auto"/>
+        <w:ind w:left="259" w:hanging="202"/>
       </w:pPr>
       <w:r>
         <w:rPr>
-          <w:rFonts w:ascii="Aptos" w:hAnsi="Aptos" w:eastAsia="Aptos"/>
+          <w:rFonts w:ascii="Carlito" w:hAnsi="Carlito" w:eastAsia="Carlito"/>
+          <w:b w:val="0"/>
+          <w:i w:val="0"/>
           <w:color w:val="14232A"/>
-          <w:sz w:val="18"/>
+          <w:sz w:val="17"/>
         </w:rPr>
-        <w:t>Govern a multi-repository portfolio by separating source presence, review, execution, deployment, authority, and verified completion so recruiter, technical, and machine views cannot drift.</w:t>
+        <w:t>Govern a multi-repository engineering estate by separating source presence, review, execution, deployment, authority, and verified completion so public claims cannot outrun proof.</w:t>
       </w:r>
     </w:p>
     <w:tbl>
@@ -683,22 +662,19 @@
         <w:tblCellSpacing w:w="0" w:type="dxa"/>
       </w:tblPr>
       <w:tblGrid>
-        <w:gridCol w:w="8496"/>
-        <w:gridCol w:w="2376"/>
+        <w:gridCol w:w="8064"/>
+        <w:gridCol w:w="2160"/>
       </w:tblGrid>
       <w:tr>
         <w:tc>
           <w:tcPr>
-            <w:tcW w:type="dxa" w:w="5429"/>
+            <w:tcW w:type="dxa" w:w="5112"/>
             <w:tcMar>
-              <w:top w:w="30" w:type="dxa"/>
+              <w:top w:w="25" w:type="dxa"/>
               <w:start w:w="0" w:type="dxa"/>
-              <w:bottom w:w="15" w:type="dxa"/>
+              <w:bottom w:w="10" w:type="dxa"/>
               <w:end w:w="0" w:type="dxa"/>
             </w:tcMar>
-            <w:tcBorders>
-              <w:bottom w:val="nil"/>
-            </w:tcBorders>
           </w:tcPr>
           <w:p>
             <w:pPr>
@@ -706,31 +682,31 @@
             </w:pPr>
             <w:r>
               <w:rPr>
-                <w:rFonts w:ascii="Aptos" w:hAnsi="Aptos" w:eastAsia="Aptos"/>
+                <w:rFonts w:ascii="Carlito" w:hAnsi="Carlito" w:eastAsia="Carlito"/>
                 <w:b/>
                 <w:i w:val="0"/>
                 <w:color w:val="14232A"/>
-                <w:sz w:val="21"/>
+                <w:sz w:val="20"/>
               </w:rPr>
               <w:t>Diamond Head Home Inspections</w:t>
             </w:r>
             <w:r>
               <w:rPr>
-                <w:rFonts w:ascii="Aptos" w:hAnsi="Aptos" w:eastAsia="Aptos"/>
+                <w:rFonts w:ascii="Carlito" w:hAnsi="Carlito" w:eastAsia="Carlito"/>
                 <w:b w:val="0"/>
                 <w:i w:val="0"/>
                 <w:color w:val="5B6D75"/>
-                <w:sz w:val="21"/>
+                <w:sz w:val="18"/>
               </w:rPr>
-              <w:t xml:space="preserve"> | </w:t>
+              <w:t xml:space="preserve">  |  </w:t>
             </w:r>
             <w:r>
               <w:rPr>
-                <w:rFonts w:ascii="Aptos" w:hAnsi="Aptos" w:eastAsia="Aptos"/>
+                <w:rFonts w:ascii="Carlito" w:hAnsi="Carlito" w:eastAsia="Carlito"/>
                 <w:b/>
                 <w:i w:val="0"/>
                 <w:color w:val="087A73"/>
-                <w:sz w:val="20"/>
+                <w:sz w:val="18"/>
               </w:rPr>
               <w:t>Certified Home Inspector</w:t>
             </w:r>
@@ -738,16 +714,13 @@
         </w:tc>
         <w:tc>
           <w:tcPr>
-            <w:tcW w:type="dxa" w:w="5429"/>
+            <w:tcW w:type="dxa" w:w="5112"/>
             <w:tcMar>
-              <w:top w:w="30" w:type="dxa"/>
+              <w:top w:w="25" w:type="dxa"/>
               <w:start w:w="0" w:type="dxa"/>
-              <w:bottom w:w="15" w:type="dxa"/>
+              <w:bottom w:w="10" w:type="dxa"/>
               <w:end w:w="0" w:type="dxa"/>
             </w:tcMar>
-            <w:tcBorders>
-              <w:bottom w:val="nil"/>
-            </w:tcBorders>
           </w:tcPr>
           <w:p>
             <w:pPr>
@@ -756,11 +729,11 @@
             </w:pPr>
             <w:r>
               <w:rPr>
-                <w:rFonts w:ascii="Aptos" w:hAnsi="Aptos" w:eastAsia="Aptos"/>
+                <w:rFonts w:ascii="Carlito" w:hAnsi="Carlito" w:eastAsia="Carlito"/>
                 <w:b/>
                 <w:i w:val="0"/>
                 <w:color w:val="5B6D75"/>
-                <w:sz w:val="17"/>
+                <w:sz w:val="16"/>
               </w:rPr>
               <w:t>2020-2024</w:t>
             </w:r>
@@ -770,31 +743,17 @@
     </w:tbl>
     <w:p>
       <w:pPr>
-        <w:spacing w:before="0" w:after="20" w:line="240" w:lineRule="auto"/>
+        <w:pStyle w:val="ListBullet"/>
+        <w:spacing w:before="0" w:after="14" w:line="247" w:lineRule="auto"/>
+        <w:ind w:left="259" w:hanging="202"/>
       </w:pPr>
       <w:r>
         <w:rPr>
-          <w:rFonts w:ascii="Aptos" w:hAnsi="Aptos" w:eastAsia="Aptos"/>
+          <w:rFonts w:ascii="Carlito" w:hAnsi="Carlito" w:eastAsia="Carlito"/>
           <w:b w:val="0"/>
-          <w:i/>
-          <w:color w:val="5B6D75"/>
+          <w:i w:val="0"/>
+          <w:color w:val="14232A"/>
           <w:sz w:val="17"/>
-        </w:rPr>
-        <w:t>Honolulu, Hawaii</w:t>
-      </w:r>
-    </w:p>
-    <w:p>
-      <w:pPr>
-        <w:pStyle w:val="ListBullet"/>
-        <w:spacing w:after="8" w:line="240" w:lineRule="auto"/>
-        <w:ind w:left="245" w:hanging="202"/>
-        <w:keepLines/>
-      </w:pPr>
-      <w:r>
-        <w:rPr>
-          <w:rFonts w:ascii="Aptos" w:hAnsi="Aptos" w:eastAsia="Aptos"/>
-          <w:color w:val="14232A"/>
-          <w:sz w:val="18"/>
         </w:rPr>
         <w:t>Inspected residential structural, roofing, electrical, plumbing, HVAC, moisture, and safety conditions; translated field evidence into clear, decision-ready reports under time constraints.</w:t>
       </w:r>
@@ -802,17 +761,18 @@
     <w:p>
       <w:pPr>
         <w:pStyle w:val="ListBullet"/>
-        <w:spacing w:after="8" w:line="240" w:lineRule="auto"/>
-        <w:ind w:left="245" w:hanging="202"/>
-        <w:keepLines/>
+        <w:spacing w:before="0" w:after="14" w:line="247" w:lineRule="auto"/>
+        <w:ind w:left="259" w:hanging="202"/>
       </w:pPr>
       <w:r>
         <w:rPr>
-          <w:rFonts w:ascii="Aptos" w:hAnsi="Aptos" w:eastAsia="Aptos"/>
+          <w:rFonts w:ascii="Carlito" w:hAnsi="Carlito" w:eastAsia="Carlito"/>
+          <w:b w:val="0"/>
+          <w:i w:val="0"/>
           <w:color w:val="14232A"/>
-          <w:sz w:val="18"/>
+          <w:sz w:val="17"/>
         </w:rPr>
-        <w:t>Developed disciplined habits around uncertainty labeling, defect prioritization, interacting-system analysis, client communication, and avoiding unsupported conclusions.</w:t>
+        <w:t>Built disciplined habits around uncertainty labeling, defect prioritization, interacting-system analysis, client communication, and avoiding unsupported conclusions.</w:t>
       </w:r>
     </w:p>
     <w:tbl>
@@ -824,22 +784,19 @@
         <w:tblCellSpacing w:w="0" w:type="dxa"/>
       </w:tblPr>
       <w:tblGrid>
-        <w:gridCol w:w="8496"/>
-        <w:gridCol w:w="2376"/>
+        <w:gridCol w:w="8064"/>
+        <w:gridCol w:w="2160"/>
       </w:tblGrid>
       <w:tr>
         <w:tc>
           <w:tcPr>
-            <w:tcW w:type="dxa" w:w="5429"/>
+            <w:tcW w:type="dxa" w:w="5112"/>
             <w:tcMar>
-              <w:top w:w="30" w:type="dxa"/>
+              <w:top w:w="25" w:type="dxa"/>
               <w:start w:w="0" w:type="dxa"/>
-              <w:bottom w:w="15" w:type="dxa"/>
+              <w:bottom w:w="10" w:type="dxa"/>
               <w:end w:w="0" w:type="dxa"/>
             </w:tcMar>
-            <w:tcBorders>
-              <w:bottom w:val="nil"/>
-            </w:tcBorders>
           </w:tcPr>
           <w:p>
             <w:pPr>
@@ -847,31 +804,31 @@
             </w:pPr>
             <w:r>
               <w:rPr>
-                <w:rFonts w:ascii="Aptos" w:hAnsi="Aptos" w:eastAsia="Aptos"/>
+                <w:rFonts w:ascii="Carlito" w:hAnsi="Carlito" w:eastAsia="Carlito"/>
                 <w:b/>
                 <w:i w:val="0"/>
                 <w:color w:val="14232A"/>
-                <w:sz w:val="21"/>
+                <w:sz w:val="20"/>
               </w:rPr>
               <w:t>Hi-Class Home Services / Hi Class Maintenance Oahu LLC</w:t>
             </w:r>
             <w:r>
               <w:rPr>
-                <w:rFonts w:ascii="Aptos" w:hAnsi="Aptos" w:eastAsia="Aptos"/>
+                <w:rFonts w:ascii="Carlito" w:hAnsi="Carlito" w:eastAsia="Carlito"/>
                 <w:b w:val="0"/>
                 <w:i w:val="0"/>
                 <w:color w:val="5B6D75"/>
-                <w:sz w:val="21"/>
+                <w:sz w:val="18"/>
               </w:rPr>
-              <w:t xml:space="preserve"> | </w:t>
+              <w:t xml:space="preserve">  |  </w:t>
             </w:r>
             <w:r>
               <w:rPr>
-                <w:rFonts w:ascii="Aptos" w:hAnsi="Aptos" w:eastAsia="Aptos"/>
+                <w:rFonts w:ascii="Carlito" w:hAnsi="Carlito" w:eastAsia="Carlito"/>
                 <w:b/>
                 <w:i w:val="0"/>
                 <w:color w:val="087A73"/>
-                <w:sz w:val="20"/>
+                <w:sz w:val="18"/>
               </w:rPr>
               <w:t>Owner-Operator, Building Systems &amp; Field Services</w:t>
             </w:r>
@@ -879,16 +836,13 @@
         </w:tc>
         <w:tc>
           <w:tcPr>
-            <w:tcW w:type="dxa" w:w="5429"/>
+            <w:tcW w:type="dxa" w:w="5112"/>
             <w:tcMar>
-              <w:top w:w="30" w:type="dxa"/>
+              <w:top w:w="25" w:type="dxa"/>
               <w:start w:w="0" w:type="dxa"/>
-              <w:bottom w:w="15" w:type="dxa"/>
+              <w:bottom w:w="10" w:type="dxa"/>
               <w:end w:w="0" w:type="dxa"/>
             </w:tcMar>
-            <w:tcBorders>
-              <w:bottom w:val="nil"/>
-            </w:tcBorders>
           </w:tcPr>
           <w:p>
             <w:pPr>
@@ -897,11 +851,11 @@
             </w:pPr>
             <w:r>
               <w:rPr>
-                <w:rFonts w:ascii="Aptos" w:hAnsi="Aptos" w:eastAsia="Aptos"/>
+                <w:rFonts w:ascii="Carlito" w:hAnsi="Carlito" w:eastAsia="Carlito"/>
                 <w:b/>
                 <w:i w:val="0"/>
                 <w:color w:val="5B6D75"/>
-                <w:sz w:val="17"/>
+                <w:sz w:val="16"/>
               </w:rPr>
               <w:t>2017-Present</w:t>
             </w:r>
@@ -911,31 +865,17 @@
     </w:tbl>
     <w:p>
       <w:pPr>
-        <w:spacing w:before="0" w:after="20" w:line="240" w:lineRule="auto"/>
+        <w:pStyle w:val="ListBullet"/>
+        <w:spacing w:before="0" w:after="14" w:line="247" w:lineRule="auto"/>
+        <w:ind w:left="259" w:hanging="202"/>
       </w:pPr>
       <w:r>
         <w:rPr>
-          <w:rFonts w:ascii="Aptos" w:hAnsi="Aptos" w:eastAsia="Aptos"/>
+          <w:rFonts w:ascii="Carlito" w:hAnsi="Carlito" w:eastAsia="Carlito"/>
           <w:b w:val="0"/>
-          <w:i/>
-          <w:color w:val="5B6D75"/>
+          <w:i w:val="0"/>
+          <w:color w:val="14232A"/>
           <w:sz w:val="17"/>
-        </w:rPr>
-        <w:t>Honolulu, Hawaii</w:t>
-      </w:r>
-    </w:p>
-    <w:p>
-      <w:pPr>
-        <w:pStyle w:val="ListBullet"/>
-        <w:spacing w:after="8" w:line="240" w:lineRule="auto"/>
-        <w:ind w:left="245" w:hanging="202"/>
-        <w:keepLines/>
-      </w:pPr>
-      <w:r>
-        <w:rPr>
-          <w:rFonts w:ascii="Aptos" w:hAnsi="Aptos" w:eastAsia="Aptos"/>
-          <w:color w:val="14232A"/>
-          <w:sz w:val="18"/>
         </w:rPr>
         <w:t>Scope residential repair and service work, prepare estimates, coordinate execution, and communicate assumptions, constraints, and completion status with clients.</w:t>
       </w:r>
@@ -943,37 +883,51 @@
     <w:p>
       <w:pPr>
         <w:pStyle w:val="ListBullet"/>
-        <w:spacing w:after="8" w:line="240" w:lineRule="auto"/>
-        <w:ind w:left="245" w:hanging="202"/>
-        <w:keepLines/>
+        <w:spacing w:before="0" w:after="14" w:line="247" w:lineRule="auto"/>
+        <w:ind w:left="259" w:hanging="202"/>
       </w:pPr>
       <w:r>
         <w:rPr>
-          <w:rFonts w:ascii="Aptos" w:hAnsi="Aptos" w:eastAsia="Aptos"/>
+          <w:rFonts w:ascii="Carlito" w:hAnsi="Carlito" w:eastAsia="Carlito"/>
+          <w:b w:val="0"/>
+          <w:i w:val="0"/>
           <w:color w:val="14232A"/>
-          <w:sz w:val="18"/>
+          <w:sz w:val="17"/>
         </w:rPr>
-        <w:t>Work across practical building-system problems including minor carpentry, plumbing, electrical fixture replacement, drywall, painting, flooring, and maintenance planning.</w:t>
+        <w:t>Translate incomplete real-world requirements into bounded work packages, explicit assumptions, and usable closeout artifacts.</w:t>
       </w:r>
     </w:p>
     <w:p>
       <w:pPr>
-        <w:spacing w:before="120" w:after="60" w:line="240" w:lineRule="auto"/>
-        <w:keepNext/>
-        <w:keepLines/>
+        <w:spacing w:before="140" w:after="20" w:line="240" w:lineRule="auto"/>
+      </w:pPr>
+      <w:r>
+        <w:rPr>
+          <w:rFonts w:ascii="Carlito" w:hAnsi="Carlito" w:eastAsia="Carlito"/>
+          <w:b/>
+          <w:i w:val="0"/>
+          <w:color w:val="087A73"/>
+          <w:sz w:val="14"/>
+        </w:rPr>
+        <w:t>CAPABILITY FIELD</w:t>
+      </w:r>
+    </w:p>
+    <w:p>
+      <w:pPr>
+        <w:spacing w:before="0" w:after="80" w:line="240" w:lineRule="auto"/>
         <w:pBdr>
-          <w:bottom w:val="single" w:sz="10" w:space="2" w:color="087A73"/>
+          <w:bottom w:val="single" w:sz="8" w:space="2" w:color="087A73"/>
         </w:pBdr>
       </w:pPr>
       <w:r>
         <w:rPr>
-          <w:rFonts w:ascii="Aptos" w:hAnsi="Aptos" w:eastAsia="Aptos"/>
+          <w:rFonts w:ascii="Carlito" w:hAnsi="Carlito" w:eastAsia="Carlito"/>
           <w:b/>
           <w:i w:val="0"/>
-          <w:color w:val="087A73"/>
-          <w:sz w:val="24"/>
+          <w:color w:val="14232A"/>
+          <w:sz w:val="26"/>
         </w:rPr>
-        <w:t>CORE CAPABILITY MATRIX</w:t>
+        <w:t>Core Capabilities</w:t>
       </w:r>
     </w:p>
     <w:tbl>
@@ -985,13 +939,13 @@
         <w:tblCellSpacing w:w="0" w:type="dxa"/>
       </w:tblPr>
       <w:tblGrid>
-        <w:gridCol w:w="5429"/>
-        <w:gridCol w:w="5429"/>
+        <w:gridCol w:w="5112"/>
+        <w:gridCol w:w="5112"/>
       </w:tblGrid>
       <w:tr>
         <w:tc>
           <w:tcPr>
-            <w:tcW w:type="dxa" w:w="5429"/>
+            <w:tcW w:type="dxa" w:w="5112"/>
             <w:shd w:fill="EEF6F4"/>
             <w:tcMar>
               <w:top w:w="65" w:type="dxa"/>
@@ -1000,10 +954,10 @@
               <w:end w:w="80" w:type="dxa"/>
             </w:tcMar>
             <w:tcBorders>
-              <w:top w:sz="2" w:val="single" w:color="D4E4E1"/>
-              <w:left w:sz="2" w:val="single" w:color="D4E4E1"/>
-              <w:bottom w:sz="2" w:val="single" w:color="D4E4E1"/>
-              <w:right w:sz="2" w:val="single" w:color="D4E4E1"/>
+              <w:top w:val="single" w:sz="2" w:color="D4E4E1"/>
+              <w:left w:val="single" w:sz="2" w:color="D4E4E1"/>
+              <w:bottom w:val="single" w:sz="2" w:color="D4E4E1"/>
+              <w:right w:val="single" w:sz="2" w:color="D4E4E1"/>
             </w:tcBorders>
           </w:tcPr>
           <w:p>
@@ -1012,7 +966,7 @@
             </w:pPr>
             <w:r>
               <w:rPr>
-                <w:rFonts w:ascii="Aptos" w:hAnsi="Aptos" w:eastAsia="Aptos"/>
+                <w:rFonts w:ascii="Carlito" w:hAnsi="Carlito" w:eastAsia="Carlito"/>
                 <w:b/>
                 <w:i w:val="0"/>
                 <w:color w:val="087A73"/>
@@ -1027,7 +981,7 @@
             </w:pPr>
             <w:r>
               <w:rPr>
-                <w:rFonts w:ascii="Aptos" w:hAnsi="Aptos" w:eastAsia="Aptos"/>
+                <w:rFonts w:ascii="Carlito" w:hAnsi="Carlito" w:eastAsia="Carlito"/>
                 <w:b w:val="0"/>
                 <w:i w:val="0"/>
                 <w:color w:val="14232A"/>
@@ -1039,7 +993,7 @@
         </w:tc>
         <w:tc>
           <w:tcPr>
-            <w:tcW w:type="dxa" w:w="5429"/>
+            <w:tcW w:type="dxa" w:w="5112"/>
             <w:shd w:fill="F7FAF9"/>
             <w:tcMar>
               <w:top w:w="65" w:type="dxa"/>
@@ -1048,10 +1002,10 @@
               <w:end w:w="80" w:type="dxa"/>
             </w:tcMar>
             <w:tcBorders>
-              <w:top w:sz="2" w:val="single" w:color="D4E4E1"/>
-              <w:left w:sz="2" w:val="single" w:color="D4E4E1"/>
-              <w:bottom w:sz="2" w:val="single" w:color="D4E4E1"/>
-              <w:right w:sz="2" w:val="single" w:color="D4E4E1"/>
+              <w:top w:val="single" w:sz="2" w:color="D4E4E1"/>
+              <w:left w:val="single" w:sz="2" w:color="D4E4E1"/>
+              <w:bottom w:val="single" w:sz="2" w:color="D4E4E1"/>
+              <w:right w:val="single" w:sz="2" w:color="D4E4E1"/>
             </w:tcBorders>
           </w:tcPr>
           <w:p>
@@ -1060,7 +1014,7 @@
             </w:pPr>
             <w:r>
               <w:rPr>
-                <w:rFonts w:ascii="Aptos" w:hAnsi="Aptos" w:eastAsia="Aptos"/>
+                <w:rFonts w:ascii="Carlito" w:hAnsi="Carlito" w:eastAsia="Carlito"/>
                 <w:b/>
                 <w:i w:val="0"/>
                 <w:color w:val="087A73"/>
@@ -1075,13 +1029,13 @@
             </w:pPr>
             <w:r>
               <w:rPr>
-                <w:rFonts w:ascii="Aptos" w:hAnsi="Aptos" w:eastAsia="Aptos"/>
+                <w:rFonts w:ascii="Carlito" w:hAnsi="Carlito" w:eastAsia="Carlito"/>
                 <w:b w:val="0"/>
                 <w:i w:val="0"/>
                 <w:color w:val="14232A"/>
                 <w:sz w:val="15"/>
               </w:rPr>
-              <w:t>Provenance; claim-to-source mapping; deterministic testing; JSON Schema; CI/CD; static analysis; integrity hashing; machine-readable receipts.</w:t>
+              <w:t>Provenance; claim-to-source mapping; deterministic testing; JSON Schema; CI/CD; static analysis; dependency auditing; integrity hashing; machine-readable receipts.</w:t>
             </w:r>
           </w:p>
         </w:tc>
@@ -1089,7 +1043,7 @@
       <w:tr>
         <w:tc>
           <w:tcPr>
-            <w:tcW w:type="dxa" w:w="5429"/>
+            <w:tcW w:type="dxa" w:w="5112"/>
             <w:shd w:fill="F7FAF9"/>
             <w:tcMar>
               <w:top w:w="65" w:type="dxa"/>
@@ -1098,10 +1052,10 @@
               <w:end w:w="80" w:type="dxa"/>
             </w:tcMar>
             <w:tcBorders>
-              <w:top w:sz="2" w:val="single" w:color="D4E4E1"/>
-              <w:left w:sz="2" w:val="single" w:color="D4E4E1"/>
-              <w:bottom w:sz="2" w:val="single" w:color="D4E4E1"/>
-              <w:right w:sz="2" w:val="single" w:color="D4E4E1"/>
+              <w:top w:val="single" w:sz="2" w:color="D4E4E1"/>
+              <w:left w:val="single" w:sz="2" w:color="D4E4E1"/>
+              <w:bottom w:val="single" w:sz="2" w:color="D4E4E1"/>
+              <w:right w:val="single" w:sz="2" w:color="D4E4E1"/>
             </w:tcBorders>
           </w:tcPr>
           <w:p>
@@ -1110,7 +1064,7 @@
             </w:pPr>
             <w:r>
               <w:rPr>
-                <w:rFonts w:ascii="Aptos" w:hAnsi="Aptos" w:eastAsia="Aptos"/>
+                <w:rFonts w:ascii="Carlito" w:hAnsi="Carlito" w:eastAsia="Carlito"/>
                 <w:b/>
                 <w:i w:val="0"/>
                 <w:color w:val="087A73"/>
@@ -1125,19 +1079,19 @@
             </w:pPr>
             <w:r>
               <w:rPr>
-                <w:rFonts w:ascii="Aptos" w:hAnsi="Aptos" w:eastAsia="Aptos"/>
+                <w:rFonts w:ascii="Carlito" w:hAnsi="Carlito" w:eastAsia="Carlito"/>
                 <w:b w:val="0"/>
                 <w:i w:val="0"/>
                 <w:color w:val="14232A"/>
                 <w:sz w:val="15"/>
               </w:rPr>
-              <w:t>Role research; evidence-qualified resume generation; document extraction; structured artifacts; human and machine presentation layers.</w:t>
+              <w:t>Role research; evidence-qualified resume generation; document extraction; structured artifacts; human and machine presentation surfaces.</w:t>
             </w:r>
           </w:p>
         </w:tc>
         <w:tc>
           <w:tcPr>
-            <w:tcW w:type="dxa" w:w="5429"/>
+            <w:tcW w:type="dxa" w:w="5112"/>
             <w:shd w:fill="EEF6F4"/>
             <w:tcMar>
               <w:top w:w="65" w:type="dxa"/>
@@ -1146,10 +1100,10 @@
               <w:end w:w="80" w:type="dxa"/>
             </w:tcMar>
             <w:tcBorders>
-              <w:top w:sz="2" w:val="single" w:color="D4E4E1"/>
-              <w:left w:sz="2" w:val="single" w:color="D4E4E1"/>
-              <w:bottom w:sz="2" w:val="single" w:color="D4E4E1"/>
-              <w:right w:sz="2" w:val="single" w:color="D4E4E1"/>
+              <w:top w:val="single" w:sz="2" w:color="D4E4E1"/>
+              <w:left w:val="single" w:sz="2" w:color="D4E4E1"/>
+              <w:bottom w:val="single" w:sz="2" w:color="D4E4E1"/>
+              <w:right w:val="single" w:sz="2" w:color="D4E4E1"/>
             </w:tcBorders>
           </w:tcPr>
           <w:p>
@@ -1158,7 +1112,7 @@
             </w:pPr>
             <w:r>
               <w:rPr>
-                <w:rFonts w:ascii="Aptos" w:hAnsi="Aptos" w:eastAsia="Aptos"/>
+                <w:rFonts w:ascii="Carlito" w:hAnsi="Carlito" w:eastAsia="Carlito"/>
                 <w:b/>
                 <w:i w:val="0"/>
                 <w:color w:val="087A73"/>
@@ -1173,7 +1127,7 @@
             </w:pPr>
             <w:r>
               <w:rPr>
-                <w:rFonts w:ascii="Aptos" w:hAnsi="Aptos" w:eastAsia="Aptos"/>
+                <w:rFonts w:ascii="Carlito" w:hAnsi="Carlito" w:eastAsia="Carlito"/>
                 <w:b w:val="0"/>
                 <w:i w:val="0"/>
                 <w:color w:val="14232A"/>
@@ -1192,22 +1146,35 @@
     </w:p>
     <w:p>
       <w:pPr>
-        <w:spacing w:before="120" w:after="60" w:line="240" w:lineRule="auto"/>
-        <w:keepNext/>
-        <w:keepLines/>
+        <w:spacing w:before="140" w:after="20" w:line="240" w:lineRule="auto"/>
+      </w:pPr>
+      <w:r>
+        <w:rPr>
+          <w:rFonts w:ascii="Carlito" w:hAnsi="Carlito" w:eastAsia="Carlito"/>
+          <w:b/>
+          <w:i w:val="0"/>
+          <w:color w:val="087A73"/>
+          <w:sz w:val="14"/>
+        </w:rPr>
+        <w:t>SELECTED SYSTEMS</w:t>
+      </w:r>
+    </w:p>
+    <w:p>
+      <w:pPr>
+        <w:spacing w:before="0" w:after="80" w:line="240" w:lineRule="auto"/>
         <w:pBdr>
-          <w:bottom w:val="single" w:sz="10" w:space="2" w:color="087A73"/>
+          <w:bottom w:val="single" w:sz="8" w:space="2" w:color="087A73"/>
         </w:pBdr>
       </w:pPr>
       <w:r>
         <w:rPr>
-          <w:rFonts w:ascii="Aptos" w:hAnsi="Aptos" w:eastAsia="Aptos"/>
+          <w:rFonts w:ascii="Carlito" w:hAnsi="Carlito" w:eastAsia="Carlito"/>
           <w:b/>
           <w:i w:val="0"/>
-          <w:color w:val="087A73"/>
-          <w:sz w:val="24"/>
+          <w:color w:val="14232A"/>
+          <w:sz w:val="26"/>
         </w:rPr>
-        <w:t>SELECTED SYSTEMS AND EVIDENCE STATES</w:t>
+        <w:t>Evidence states, not hype</w:t>
       </w:r>
     </w:p>
     <w:tbl>
@@ -1219,27 +1186,26 @@
         <w:tblCellSpacing w:w="0" w:type="dxa"/>
       </w:tblPr>
       <w:tblGrid>
-        <w:gridCol w:w="5616"/>
-        <w:gridCol w:w="5256"/>
+        <w:gridCol w:w="4680"/>
+        <w:gridCol w:w="5544"/>
       </w:tblGrid>
       <w:tr>
         <w:tc>
           <w:tcPr>
-            <w:tcW w:type="dxa" w:w="5429"/>
+            <w:tcW w:type="dxa" w:w="5112"/>
             <w:shd w:fill="EEF6F4"/>
             <w:tcMar>
               <w:top w:w="65" w:type="dxa"/>
-              <w:start w:w="65" w:type="dxa"/>
+              <w:start w:w="70" w:type="dxa"/>
               <w:bottom w:w="65" w:type="dxa"/>
-              <w:end w:w="65" w:type="dxa"/>
+              <w:end w:w="70" w:type="dxa"/>
             </w:tcMar>
             <w:tcBorders>
-              <w:top w:sz="2" w:val="single" w:color="D4E4E1"/>
-              <w:left w:sz="2" w:val="single" w:color="D4E4E1"/>
-              <w:bottom w:sz="2" w:val="single" w:color="D4E4E1"/>
-              <w:right w:sz="2" w:val="single" w:color="D4E4E1"/>
+              <w:top w:val="single" w:sz="2" w:color="D4E4E1"/>
+              <w:left w:val="single" w:sz="2" w:color="D4E4E1"/>
+              <w:bottom w:val="single" w:sz="2" w:color="D4E4E1"/>
+              <w:right w:val="single" w:sz="2" w:color="D4E4E1"/>
             </w:tcBorders>
-            <w:vAlign w:val="top"/>
           </w:tcPr>
           <w:p>
             <w:pPr>
@@ -1247,11 +1213,11 @@
             </w:pPr>
             <w:r>
               <w:rPr>
-                <w:rFonts w:ascii="Aptos" w:hAnsi="Aptos" w:eastAsia="Aptos"/>
+                <w:rFonts w:ascii="Carlito" w:hAnsi="Carlito" w:eastAsia="Carlito"/>
                 <w:b/>
                 <w:i w:val="0"/>
                 <w:color w:val="14232A"/>
-                <w:sz w:val="20"/>
+                <w:sz w:val="19"/>
               </w:rPr>
               <w:t>Portfolio Receipt Router</w:t>
             </w:r>
@@ -1262,7 +1228,7 @@
             </w:pPr>
             <w:r>
               <w:rPr>
-                <w:rFonts w:ascii="Aptos" w:hAnsi="Aptos" w:eastAsia="Aptos"/>
+                <w:rFonts w:ascii="Carlito" w:hAnsi="Carlito" w:eastAsia="Carlito"/>
                 <w:b/>
                 <w:i w:val="0"/>
                 <w:color w:val="087A73"/>
@@ -1277,42 +1243,40 @@
             </w:pPr>
             <w:r>
               <w:rPr>
-                <w:rFonts w:ascii="Aptos" w:hAnsi="Aptos" w:eastAsia="Aptos"/>
+                <w:rFonts w:ascii="Carlito" w:hAnsi="Carlito" w:eastAsia="Carlito"/>
                 <w:b w:val="0"/>
                 <w:i w:val="0"/>
                 <w:color w:val="14232A"/>
-                <w:sz w:val="16"/>
+                <w:sz w:val="15"/>
               </w:rPr>
-              <w:t>Compatibility-safe architecture repair and evidence routing.</w:t>
+              <w:t>Fail-closed evidence routing and compatibility-safe architecture repair.</w:t>
             </w:r>
           </w:p>
         </w:tc>
         <w:tc>
           <w:tcPr>
-            <w:tcW w:type="dxa" w:w="5429"/>
+            <w:tcW w:type="dxa" w:w="5112"/>
             <w:shd w:fill="EEF6F4"/>
             <w:tcMar>
               <w:top w:w="65" w:type="dxa"/>
-              <w:start w:w="65" w:type="dxa"/>
+              <w:start w:w="70" w:type="dxa"/>
               <w:bottom w:w="65" w:type="dxa"/>
-              <w:end w:w="65" w:type="dxa"/>
+              <w:end w:w="70" w:type="dxa"/>
             </w:tcMar>
             <w:tcBorders>
-              <w:top w:sz="2" w:val="single" w:color="D4E4E1"/>
-              <w:left w:sz="2" w:val="single" w:color="D4E4E1"/>
-              <w:bottom w:sz="2" w:val="single" w:color="D4E4E1"/>
-              <w:right w:sz="2" w:val="single" w:color="D4E4E1"/>
+              <w:top w:val="single" w:sz="2" w:color="D4E4E1"/>
+              <w:left w:val="single" w:sz="2" w:color="D4E4E1"/>
+              <w:bottom w:val="single" w:sz="2" w:color="D4E4E1"/>
+              <w:right w:val="single" w:sz="2" w:color="D4E4E1"/>
             </w:tcBorders>
-            <w:vAlign w:val="top"/>
           </w:tcPr>
-          <w:p/>
           <w:p>
             <w:pPr>
               <w:spacing w:before="0" w:after="20" w:line="240" w:lineRule="auto"/>
             </w:pPr>
             <w:r>
               <w:rPr>
-                <w:rFonts w:ascii="Aptos" w:hAnsi="Aptos" w:eastAsia="Aptos"/>
+                <w:rFonts w:ascii="Carlito" w:hAnsi="Carlito" w:eastAsia="Carlito"/>
                 <w:b/>
                 <w:i w:val="0"/>
                 <w:color w:val="087A73"/>
@@ -1323,15 +1287,15 @@
           </w:p>
           <w:p>
             <w:pPr>
-              <w:spacing w:before="0" w:after="40" w:line="245" w:lineRule="auto"/>
+              <w:spacing w:before="0" w:after="60" w:line="240" w:lineRule="auto"/>
             </w:pPr>
             <w:r>
               <w:rPr>
-                <w:rFonts w:ascii="Aptos" w:hAnsi="Aptos" w:eastAsia="Aptos"/>
+                <w:rFonts w:ascii="Carlito" w:hAnsi="Carlito" w:eastAsia="Carlito"/>
                 <w:b w:val="0"/>
                 <w:i w:val="0"/>
                 <w:color w:val="14232A"/>
-                <w:sz w:val="16"/>
+                <w:sz w:val="15"/>
               </w:rPr>
               <w:t>69/69 tests; direct and reusable CI; artifact 8910423397; zero external actions.</w:t>
             </w:r>
@@ -1342,7 +1306,7 @@
             </w:pPr>
             <w:r>
               <w:rPr>
-                <w:rFonts w:ascii="Aptos" w:hAnsi="Aptos" w:eastAsia="Aptos"/>
+                <w:rFonts w:ascii="Carlito" w:hAnsi="Carlito" w:eastAsia="Carlito"/>
                 <w:b/>
                 <w:i w:val="0"/>
                 <w:color w:val="A56600"/>
@@ -1353,17 +1317,17 @@
           </w:p>
           <w:p>
             <w:pPr>
-              <w:spacing w:before="0" w:after="40" w:line="245" w:lineRule="auto"/>
+              <w:spacing w:before="0" w:after="0" w:line="240" w:lineRule="auto"/>
             </w:pPr>
             <w:r>
               <w:rPr>
-                <w:rFonts w:ascii="Aptos" w:hAnsi="Aptos" w:eastAsia="Aptos"/>
+                <w:rFonts w:ascii="Carlito" w:hAnsi="Carlito" w:eastAsia="Carlito"/>
                 <w:b w:val="0"/>
                 <w:i w:val="0"/>
                 <w:color w:val="5B6D75"/>
                 <w:sz w:val="15"/>
               </w:rPr>
-              <w:t>Independent technical exhibit; no datacenter control, company affiliation, or production-operation claim.</w:t>
+              <w:t>Independent technical exhibit; no production-operation or company-affiliation claim.</w:t>
             </w:r>
           </w:p>
         </w:tc>
@@ -1371,21 +1335,20 @@
       <w:tr>
         <w:tc>
           <w:tcPr>
-            <w:tcW w:type="dxa" w:w="5429"/>
+            <w:tcW w:type="dxa" w:w="5112"/>
             <w:shd w:fill="F7FAF9"/>
             <w:tcMar>
               <w:top w:w="65" w:type="dxa"/>
-              <w:start w:w="65" w:type="dxa"/>
+              <w:start w:w="70" w:type="dxa"/>
               <w:bottom w:w="65" w:type="dxa"/>
-              <w:end w:w="65" w:type="dxa"/>
+              <w:end w:w="70" w:type="dxa"/>
             </w:tcMar>
             <w:tcBorders>
-              <w:top w:sz="2" w:val="single" w:color="D4E4E1"/>
-              <w:left w:sz="2" w:val="single" w:color="D4E4E1"/>
-              <w:bottom w:sz="2" w:val="single" w:color="D4E4E1"/>
-              <w:right w:sz="2" w:val="single" w:color="D4E4E1"/>
+              <w:top w:val="single" w:sz="2" w:color="D4E4E1"/>
+              <w:left w:val="single" w:sz="2" w:color="D4E4E1"/>
+              <w:bottom w:val="single" w:sz="2" w:color="D4E4E1"/>
+              <w:right w:val="single" w:sz="2" w:color="D4E4E1"/>
             </w:tcBorders>
-            <w:vAlign w:val="top"/>
           </w:tcPr>
           <w:p>
             <w:pPr>
@@ -1393,11 +1356,11 @@
             </w:pPr>
             <w:r>
               <w:rPr>
-                <w:rFonts w:ascii="Aptos" w:hAnsi="Aptos" w:eastAsia="Aptos"/>
+                <w:rFonts w:ascii="Carlito" w:hAnsi="Carlito" w:eastAsia="Carlito"/>
                 <w:b/>
                 <w:i w:val="0"/>
                 <w:color w:val="14232A"/>
-                <w:sz w:val="20"/>
+                <w:sz w:val="19"/>
               </w:rPr>
               <w:t>Job Application Helix</w:t>
             </w:r>
@@ -1408,13 +1371,13 @@
             </w:pPr>
             <w:r>
               <w:rPr>
-                <w:rFonts w:ascii="Aptos" w:hAnsi="Aptos" w:eastAsia="Aptos"/>
+                <w:rFonts w:ascii="Carlito" w:hAnsi="Carlito" w:eastAsia="Carlito"/>
                 <w:b/>
                 <w:i w:val="0"/>
                 <w:color w:val="087A73"/>
                 <w:sz w:val="14"/>
               </w:rPr>
-              <w:t>RECORDED 148/148</w:t>
+              <w:t>PARTIALLY VERIFIED</w:t>
             </w:r>
           </w:p>
           <w:p>
@@ -1423,42 +1386,40 @@
             </w:pPr>
             <w:r>
               <w:rPr>
-                <w:rFonts w:ascii="Aptos" w:hAnsi="Aptos" w:eastAsia="Aptos"/>
+                <w:rFonts w:ascii="Carlito" w:hAnsi="Carlito" w:eastAsia="Carlito"/>
                 <w:b w:val="0"/>
                 <w:i w:val="0"/>
                 <w:color w:val="14232A"/>
-                <w:sz w:val="16"/>
+                <w:sz w:val="15"/>
               </w:rPr>
-              <w:t>Evidence-governed hiring and portfolio orchestration.</w:t>
+              <w:t>Evidence-governed hiring and portfolio orchestration with an exact 67-repository admitted public proof boundary.</w:t>
             </w:r>
           </w:p>
         </w:tc>
         <w:tc>
           <w:tcPr>
-            <w:tcW w:type="dxa" w:w="5429"/>
+            <w:tcW w:type="dxa" w:w="5112"/>
             <w:shd w:fill="F7FAF9"/>
             <w:tcMar>
               <w:top w:w="65" w:type="dxa"/>
-              <w:start w:w="65" w:type="dxa"/>
+              <w:start w:w="70" w:type="dxa"/>
               <w:bottom w:w="65" w:type="dxa"/>
-              <w:end w:w="65" w:type="dxa"/>
+              <w:end w:w="70" w:type="dxa"/>
             </w:tcMar>
             <w:tcBorders>
-              <w:top w:sz="2" w:val="single" w:color="D4E4E1"/>
-              <w:left w:sz="2" w:val="single" w:color="D4E4E1"/>
-              <w:bottom w:sz="2" w:val="single" w:color="D4E4E1"/>
-              <w:right w:sz="2" w:val="single" w:color="D4E4E1"/>
+              <w:top w:val="single" w:sz="2" w:color="D4E4E1"/>
+              <w:left w:val="single" w:sz="2" w:color="D4E4E1"/>
+              <w:bottom w:val="single" w:sz="2" w:color="D4E4E1"/>
+              <w:right w:val="single" w:sz="2" w:color="D4E4E1"/>
             </w:tcBorders>
-            <w:vAlign w:val="top"/>
           </w:tcPr>
-          <w:p/>
           <w:p>
             <w:pPr>
               <w:spacing w:before="0" w:after="20" w:line="240" w:lineRule="auto"/>
             </w:pPr>
             <w:r>
               <w:rPr>
-                <w:rFonts w:ascii="Aptos" w:hAnsi="Aptos" w:eastAsia="Aptos"/>
+                <w:rFonts w:ascii="Carlito" w:hAnsi="Carlito" w:eastAsia="Carlito"/>
                 <w:b/>
                 <w:i w:val="0"/>
                 <w:color w:val="087A73"/>
@@ -1469,17 +1430,17 @@
           </w:p>
           <w:p>
             <w:pPr>
-              <w:spacing w:before="0" w:after="40" w:line="245" w:lineRule="auto"/>
+              <w:spacing w:before="0" w:after="60" w:line="240" w:lineRule="auto"/>
             </w:pPr>
             <w:r>
               <w:rPr>
-                <w:rFonts w:ascii="Aptos" w:hAnsi="Aptos" w:eastAsia="Aptos"/>
+                <w:rFonts w:ascii="Carlito" w:hAnsi="Carlito" w:eastAsia="Carlito"/>
                 <w:b w:val="0"/>
                 <w:i w:val="0"/>
                 <w:color w:val="14232A"/>
-                <w:sz w:val="16"/>
+                <w:sz w:val="15"/>
               </w:rPr>
-              <w:t>148/148 recorded repository tests.</w:t>
+              <w:t>Fail-closed evidence levels, repository-state separation, promotion gates, machine contracts, and role-calibrated package generation.</w:t>
             </w:r>
           </w:p>
           <w:p>
@@ -1488,7 +1449,7 @@
             </w:pPr>
             <w:r>
               <w:rPr>
-                <w:rFonts w:ascii="Aptos" w:hAnsi="Aptos" w:eastAsia="Aptos"/>
+                <w:rFonts w:ascii="Carlito" w:hAnsi="Carlito" w:eastAsia="Carlito"/>
                 <w:b/>
                 <w:i w:val="0"/>
                 <w:color w:val="A56600"/>
@@ -1499,17 +1460,17 @@
           </w:p>
           <w:p>
             <w:pPr>
-              <w:spacing w:before="0" w:after="40" w:line="245" w:lineRule="auto"/>
+              <w:spacing w:before="0" w:after="0" w:line="240" w:lineRule="auto"/>
             </w:pPr>
             <w:r>
               <w:rPr>
-                <w:rFonts w:ascii="Aptos" w:hAnsi="Aptos" w:eastAsia="Aptos"/>
+                <w:rFonts w:ascii="Carlito" w:hAnsi="Carlito" w:eastAsia="Carlito"/>
                 <w:b w:val="0"/>
                 <w:i w:val="0"/>
                 <w:color w:val="5B6D75"/>
                 <w:sz w:val="15"/>
               </w:rPr>
-              <w:t>Release-specific current-SHA and deployment gates remain separate.</w:t>
+              <w:t>The 67 admitted repositories are a public proof set, not accomplishment count or the full owned estate; child repositories retain independent evidence states.</w:t>
             </w:r>
           </w:p>
         </w:tc>
@@ -1517,21 +1478,20 @@
       <w:tr>
         <w:tc>
           <w:tcPr>
-            <w:tcW w:type="dxa" w:w="5429"/>
+            <w:tcW w:type="dxa" w:w="5112"/>
             <w:shd w:fill="EEF6F4"/>
             <w:tcMar>
               <w:top w:w="65" w:type="dxa"/>
-              <w:start w:w="65" w:type="dxa"/>
+              <w:start w:w="70" w:type="dxa"/>
               <w:bottom w:w="65" w:type="dxa"/>
-              <w:end w:w="65" w:type="dxa"/>
+              <w:end w:w="70" w:type="dxa"/>
             </w:tcMar>
             <w:tcBorders>
-              <w:top w:sz="2" w:val="single" w:color="D4E4E1"/>
-              <w:left w:sz="2" w:val="single" w:color="D4E4E1"/>
-              <w:bottom w:sz="2" w:val="single" w:color="D4E4E1"/>
-              <w:right w:sz="2" w:val="single" w:color="D4E4E1"/>
+              <w:top w:val="single" w:sz="2" w:color="D4E4E1"/>
+              <w:left w:val="single" w:sz="2" w:color="D4E4E1"/>
+              <w:bottom w:val="single" w:sz="2" w:color="D4E4E1"/>
+              <w:right w:val="single" w:sz="2" w:color="D4E4E1"/>
             </w:tcBorders>
-            <w:vAlign w:val="top"/>
           </w:tcPr>
           <w:p>
             <w:pPr>
@@ -1539,11 +1499,11 @@
             </w:pPr>
             <w:r>
               <w:rPr>
-                <w:rFonts w:ascii="Aptos" w:hAnsi="Aptos" w:eastAsia="Aptos"/>
+                <w:rFonts w:ascii="Carlito" w:hAnsi="Carlito" w:eastAsia="Carlito"/>
                 <w:b/>
                 <w:i w:val="0"/>
                 <w:color w:val="14232A"/>
-                <w:sz w:val="20"/>
+                <w:sz w:val="19"/>
               </w:rPr>
               <w:t>Agent Coordinator</w:t>
             </w:r>
@@ -1554,7 +1514,7 @@
             </w:pPr>
             <w:r>
               <w:rPr>
-                <w:rFonts w:ascii="Aptos" w:hAnsi="Aptos" w:eastAsia="Aptos"/>
+                <w:rFonts w:ascii="Carlito" w:hAnsi="Carlito" w:eastAsia="Carlito"/>
                 <w:b/>
                 <w:i w:val="0"/>
                 <w:color w:val="087A73"/>
@@ -1569,42 +1529,40 @@
             </w:pPr>
             <w:r>
               <w:rPr>
-                <w:rFonts w:ascii="Aptos" w:hAnsi="Aptos" w:eastAsia="Aptos"/>
+                <w:rFonts w:ascii="Carlito" w:hAnsi="Carlito" w:eastAsia="Carlito"/>
                 <w:b w:val="0"/>
                 <w:i w:val="0"/>
                 <w:color w:val="14232A"/>
-                <w:sz w:val="16"/>
+                <w:sz w:val="15"/>
               </w:rPr>
-              <w:t>Deterministic task ownership, dependencies, capacity, priority, and shared budgets.</w:t>
+              <w:t>Deterministic task ownership, dependency order, capacity, stable priority, and shared budgets.</w:t>
             </w:r>
           </w:p>
         </w:tc>
         <w:tc>
           <w:tcPr>
-            <w:tcW w:type="dxa" w:w="5429"/>
+            <w:tcW w:type="dxa" w:w="5112"/>
             <w:shd w:fill="EEF6F4"/>
             <w:tcMar>
               <w:top w:w="65" w:type="dxa"/>
-              <w:start w:w="65" w:type="dxa"/>
+              <w:start w:w="70" w:type="dxa"/>
               <w:bottom w:w="65" w:type="dxa"/>
-              <w:end w:w="65" w:type="dxa"/>
+              <w:end w:w="70" w:type="dxa"/>
             </w:tcMar>
             <w:tcBorders>
-              <w:top w:sz="2" w:val="single" w:color="D4E4E1"/>
-              <w:left w:sz="2" w:val="single" w:color="D4E4E1"/>
-              <w:bottom w:sz="2" w:val="single" w:color="D4E4E1"/>
-              <w:right w:sz="2" w:val="single" w:color="D4E4E1"/>
+              <w:top w:val="single" w:sz="2" w:color="D4E4E1"/>
+              <w:left w:val="single" w:sz="2" w:color="D4E4E1"/>
+              <w:bottom w:val="single" w:sz="2" w:color="D4E4E1"/>
+              <w:right w:val="single" w:sz="2" w:color="D4E4E1"/>
             </w:tcBorders>
-            <w:vAlign w:val="top"/>
           </w:tcPr>
-          <w:p/>
           <w:p>
             <w:pPr>
               <w:spacing w:before="0" w:after="20" w:line="240" w:lineRule="auto"/>
             </w:pPr>
             <w:r>
               <w:rPr>
-                <w:rFonts w:ascii="Aptos" w:hAnsi="Aptos" w:eastAsia="Aptos"/>
+                <w:rFonts w:ascii="Carlito" w:hAnsi="Carlito" w:eastAsia="Carlito"/>
                 <w:b/>
                 <w:i w:val="0"/>
                 <w:color w:val="087A73"/>
@@ -1615,15 +1573,15 @@
           </w:p>
           <w:p>
             <w:pPr>
-              <w:spacing w:before="0" w:after="40" w:line="245" w:lineRule="auto"/>
+              <w:spacing w:before="0" w:after="60" w:line="240" w:lineRule="auto"/>
             </w:pPr>
             <w:r>
               <w:rPr>
-                <w:rFonts w:ascii="Aptos" w:hAnsi="Aptos" w:eastAsia="Aptos"/>
+                <w:rFonts w:ascii="Carlito" w:hAnsi="Carlito" w:eastAsia="Carlito"/>
                 <w:b w:val="0"/>
                 <w:i w:val="0"/>
                 <w:color w:val="14232A"/>
-                <w:sz w:val="16"/>
+                <w:sz w:val="15"/>
               </w:rPr>
               <w:t>62/62 recorded Python tests.</w:t>
             </w:r>
@@ -1634,7 +1592,7 @@
             </w:pPr>
             <w:r>
               <w:rPr>
-                <w:rFonts w:ascii="Aptos" w:hAnsi="Aptos" w:eastAsia="Aptos"/>
+                <w:rFonts w:ascii="Carlito" w:hAnsi="Carlito" w:eastAsia="Carlito"/>
                 <w:b/>
                 <w:i w:val="0"/>
                 <w:color w:val="A56600"/>
@@ -1645,17 +1603,17 @@
           </w:p>
           <w:p>
             <w:pPr>
-              <w:spacing w:before="0" w:after="40" w:line="245" w:lineRule="auto"/>
+              <w:spacing w:before="0" w:after="0" w:line="240" w:lineRule="auto"/>
             </w:pPr>
             <w:r>
               <w:rPr>
-                <w:rFonts w:ascii="Aptos" w:hAnsi="Aptos" w:eastAsia="Aptos"/>
+                <w:rFonts w:ascii="Carlito" w:hAnsi="Carlito" w:eastAsia="Carlito"/>
                 <w:b w:val="0"/>
                 <w:i w:val="0"/>
                 <w:color w:val="5B6D75"/>
                 <w:sz w:val="15"/>
               </w:rPr>
-              <w:t>Hosted matrix and build-wheel promotion remain open.</w:t>
+              <w:t>Hosted matrix and broader promotion gates remain separate.</w:t>
             </w:r>
           </w:p>
         </w:tc>
@@ -1663,21 +1621,20 @@
       <w:tr>
         <w:tc>
           <w:tcPr>
-            <w:tcW w:type="dxa" w:w="5429"/>
+            <w:tcW w:type="dxa" w:w="5112"/>
             <w:shd w:fill="F7FAF9"/>
             <w:tcMar>
               <w:top w:w="65" w:type="dxa"/>
-              <w:start w:w="65" w:type="dxa"/>
+              <w:start w:w="70" w:type="dxa"/>
               <w:bottom w:w="65" w:type="dxa"/>
-              <w:end w:w="65" w:type="dxa"/>
+              <w:end w:w="70" w:type="dxa"/>
             </w:tcMar>
             <w:tcBorders>
-              <w:top w:sz="2" w:val="single" w:color="D4E4E1"/>
-              <w:left w:sz="2" w:val="single" w:color="D4E4E1"/>
-              <w:bottom w:sz="2" w:val="single" w:color="D4E4E1"/>
-              <w:right w:sz="2" w:val="single" w:color="D4E4E1"/>
+              <w:top w:val="single" w:sz="2" w:color="D4E4E1"/>
+              <w:left w:val="single" w:sz="2" w:color="D4E4E1"/>
+              <w:bottom w:val="single" w:sz="2" w:color="D4E4E1"/>
+              <w:right w:val="single" w:sz="2" w:color="D4E4E1"/>
             </w:tcBorders>
-            <w:vAlign w:val="top"/>
           </w:tcPr>
           <w:p>
             <w:pPr>
@@ -1685,13 +1642,13 @@
             </w:pPr>
             <w:r>
               <w:rPr>
-                <w:rFonts w:ascii="Aptos" w:hAnsi="Aptos" w:eastAsia="Aptos"/>
+                <w:rFonts w:ascii="Carlito" w:hAnsi="Carlito" w:eastAsia="Carlito"/>
                 <w:b/>
                 <w:i w:val="0"/>
                 <w:color w:val="14232A"/>
-                <w:sz w:val="20"/>
+                <w:sz w:val="19"/>
               </w:rPr>
-              <w:t>Microcode Governance</w:t>
+              <w:t>AKOS / PSYSOC-X</w:t>
             </w:r>
           </w:p>
           <w:p>
@@ -1700,13 +1657,13 @@
             </w:pPr>
             <w:r>
               <w:rPr>
-                <w:rFonts w:ascii="Aptos" w:hAnsi="Aptos" w:eastAsia="Aptos"/>
+                <w:rFonts w:ascii="Carlito" w:hAnsi="Carlito" w:eastAsia="Carlito"/>
                 <w:b/>
                 <w:i w:val="0"/>
-                <w:color w:val="A56600"/>
+                <w:color w:val="087A73"/>
                 <w:sz w:val="14"/>
               </w:rPr>
-              <w:t>REVIEWED - EXECUTION BLOCKED</w:t>
+              <w:t>BOUNDED VERIFIED SURFACES</w:t>
             </w:r>
           </w:p>
           <w:p>
@@ -1715,42 +1672,40 @@
             </w:pPr>
             <w:r>
               <w:rPr>
-                <w:rFonts w:ascii="Aptos" w:hAnsi="Aptos" w:eastAsia="Aptos"/>
+                <w:rFonts w:ascii="Carlito" w:hAnsi="Carlito" w:eastAsia="Carlito"/>
                 <w:b w:val="0"/>
                 <w:i w:val="0"/>
                 <w:color w:val="14232A"/>
-                <w:sz w:val="16"/>
+                <w:sz w:val="15"/>
               </w:rPr>
-              <w:t>Firmware manifests, drift, SBOMs, provenance, compatibility policy, and approval-gated rollout planning.</w:t>
+              <w:t>Authority, evidence, closure, and deterministic audience-calibration primitives.</w:t>
             </w:r>
           </w:p>
         </w:tc>
         <w:tc>
           <w:tcPr>
-            <w:tcW w:type="dxa" w:w="5429"/>
+            <w:tcW w:type="dxa" w:w="5112"/>
             <w:shd w:fill="F7FAF9"/>
             <w:tcMar>
               <w:top w:w="65" w:type="dxa"/>
-              <w:start w:w="65" w:type="dxa"/>
+              <w:start w:w="70" w:type="dxa"/>
               <w:bottom w:w="65" w:type="dxa"/>
-              <w:end w:w="65" w:type="dxa"/>
+              <w:end w:w="70" w:type="dxa"/>
             </w:tcMar>
             <w:tcBorders>
-              <w:top w:sz="2" w:val="single" w:color="D4E4E1"/>
-              <w:left w:sz="2" w:val="single" w:color="D4E4E1"/>
-              <w:bottom w:sz="2" w:val="single" w:color="D4E4E1"/>
-              <w:right w:sz="2" w:val="single" w:color="D4E4E1"/>
+              <w:top w:val="single" w:sz="2" w:color="D4E4E1"/>
+              <w:left w:val="single" w:sz="2" w:color="D4E4E1"/>
+              <w:bottom w:val="single" w:sz="2" w:color="D4E4E1"/>
+              <w:right w:val="single" w:sz="2" w:color="D4E4E1"/>
             </w:tcBorders>
-            <w:vAlign w:val="top"/>
           </w:tcPr>
-          <w:p/>
           <w:p>
             <w:pPr>
               <w:spacing w:before="0" w:after="20" w:line="240" w:lineRule="auto"/>
             </w:pPr>
             <w:r>
               <w:rPr>
-                <w:rFonts w:ascii="Aptos" w:hAnsi="Aptos" w:eastAsia="Aptos"/>
+                <w:rFonts w:ascii="Carlito" w:hAnsi="Carlito" w:eastAsia="Carlito"/>
                 <w:b/>
                 <w:i w:val="0"/>
                 <w:color w:val="087A73"/>
@@ -1761,17 +1716,17 @@
           </w:p>
           <w:p>
             <w:pPr>
-              <w:spacing w:before="0" w:after="40" w:line="245" w:lineRule="auto"/>
+              <w:spacing w:before="0" w:after="60" w:line="240" w:lineRule="auto"/>
             </w:pPr>
             <w:r>
               <w:rPr>
-                <w:rFonts w:ascii="Aptos" w:hAnsi="Aptos" w:eastAsia="Aptos"/>
+                <w:rFonts w:ascii="Carlito" w:hAnsi="Carlito" w:eastAsia="Carlito"/>
                 <w:b w:val="0"/>
                 <w:i w:val="0"/>
                 <w:color w:val="14232A"/>
-                <w:sz w:val="16"/>
+                <w:sz w:val="15"/>
               </w:rPr>
-              <w:t>132-check generated contract; static review found no critical defect.</w:t>
+              <w:t>Repository-native verification supports bounded current surfaces.</w:t>
             </w:r>
           </w:p>
           <w:p>
@@ -1780,7 +1735,7 @@
             </w:pPr>
             <w:r>
               <w:rPr>
-                <w:rFonts w:ascii="Aptos" w:hAnsi="Aptos" w:eastAsia="Aptos"/>
+                <w:rFonts w:ascii="Carlito" w:hAnsi="Carlito" w:eastAsia="Carlito"/>
                 <w:b/>
                 <w:i w:val="0"/>
                 <w:color w:val="A56600"/>
@@ -1791,163 +1746,17 @@
           </w:p>
           <w:p>
             <w:pPr>
-              <w:spacing w:before="0" w:after="40" w:line="245" w:lineRule="auto"/>
+              <w:spacing w:before="0" w:after="0" w:line="240" w:lineRule="auto"/>
             </w:pPr>
             <w:r>
               <w:rPr>
-                <w:rFonts w:ascii="Aptos" w:hAnsi="Aptos" w:eastAsia="Aptos"/>
+                <w:rFonts w:ascii="Carlito" w:hAnsi="Carlito" w:eastAsia="Carlito"/>
                 <w:b w:val="0"/>
                 <w:i w:val="0"/>
                 <w:color w:val="5B6D75"/>
                 <w:sz w:val="15"/>
               </w:rPr>
-              <w:t>Private CI did not execute; not test verified and performs no firmware mutation.</w:t>
-            </w:r>
-          </w:p>
-        </w:tc>
-      </w:tr>
-      <w:tr>
-        <w:tc>
-          <w:tcPr>
-            <w:tcW w:type="dxa" w:w="5429"/>
-            <w:shd w:fill="EEF6F4"/>
-            <w:tcMar>
-              <w:top w:w="65" w:type="dxa"/>
-              <w:start w:w="65" w:type="dxa"/>
-              <w:bottom w:w="65" w:type="dxa"/>
-              <w:end w:w="65" w:type="dxa"/>
-            </w:tcMar>
-            <w:tcBorders>
-              <w:top w:sz="2" w:val="single" w:color="D4E4E1"/>
-              <w:left w:sz="2" w:val="single" w:color="D4E4E1"/>
-              <w:bottom w:sz="2" w:val="single" w:color="D4E4E1"/>
-              <w:right w:sz="2" w:val="single" w:color="D4E4E1"/>
-            </w:tcBorders>
-            <w:vAlign w:val="top"/>
-          </w:tcPr>
-          <w:p>
-            <w:pPr>
-              <w:spacing w:before="0" w:after="20" w:line="240" w:lineRule="auto"/>
-            </w:pPr>
-            <w:r>
-              <w:rPr>
-                <w:rFonts w:ascii="Aptos" w:hAnsi="Aptos" w:eastAsia="Aptos"/>
-                <w:b/>
-                <w:i w:val="0"/>
-                <w:color w:val="14232A"/>
-                <w:sz w:val="20"/>
-              </w:rPr>
-              <w:t>PSYSOC-X</w:t>
-            </w:r>
-          </w:p>
-          <w:p>
-            <w:pPr>
-              <w:spacing w:before="0" w:after="40" w:line="240" w:lineRule="auto"/>
-            </w:pPr>
-            <w:r>
-              <w:rPr>
-                <w:rFonts w:ascii="Aptos" w:hAnsi="Aptos" w:eastAsia="Aptos"/>
-                <w:b/>
-                <w:i w:val="0"/>
-                <w:color w:val="087A73"/>
-                <w:sz w:val="14"/>
-              </w:rPr>
-              <w:t>BOUNDED TEST SCOPE</w:t>
-            </w:r>
-          </w:p>
-          <w:p>
-            <w:pPr>
-              <w:spacing w:before="0" w:after="0" w:line="240" w:lineRule="auto"/>
-            </w:pPr>
-            <w:r>
-              <w:rPr>
-                <w:rFonts w:ascii="Aptos" w:hAnsi="Aptos" w:eastAsia="Aptos"/>
-                <w:b w:val="0"/>
-                <w:i w:val="0"/>
-                <w:color w:val="14232A"/>
-                <w:sz w:val="16"/>
-              </w:rPr>
-              <w:t>Audience calibration across recruiter, master, machine, and relationship views.</w:t>
-            </w:r>
-          </w:p>
-        </w:tc>
-        <w:tc>
-          <w:tcPr>
-            <w:tcW w:type="dxa" w:w="5429"/>
-            <w:shd w:fill="EEF6F4"/>
-            <w:tcMar>
-              <w:top w:w="65" w:type="dxa"/>
-              <w:start w:w="65" w:type="dxa"/>
-              <w:bottom w:w="65" w:type="dxa"/>
-              <w:end w:w="65" w:type="dxa"/>
-            </w:tcMar>
-            <w:tcBorders>
-              <w:top w:sz="2" w:val="single" w:color="D4E4E1"/>
-              <w:left w:sz="2" w:val="single" w:color="D4E4E1"/>
-              <w:bottom w:sz="2" w:val="single" w:color="D4E4E1"/>
-              <w:right w:sz="2" w:val="single" w:color="D4E4E1"/>
-            </w:tcBorders>
-            <w:vAlign w:val="top"/>
-          </w:tcPr>
-          <w:p/>
-          <w:p>
-            <w:pPr>
-              <w:spacing w:before="0" w:after="20" w:line="240" w:lineRule="auto"/>
-            </w:pPr>
-            <w:r>
-              <w:rPr>
-                <w:rFonts w:ascii="Aptos" w:hAnsi="Aptos" w:eastAsia="Aptos"/>
-                <w:b/>
-                <w:i w:val="0"/>
-                <w:color w:val="087A73"/>
-                <w:sz w:val="14"/>
-              </w:rPr>
-              <w:t>EVIDENCE</w:t>
-            </w:r>
-          </w:p>
-          <w:p>
-            <w:pPr>
-              <w:spacing w:before="0" w:after="40" w:line="245" w:lineRule="auto"/>
-            </w:pPr>
-            <w:r>
-              <w:rPr>
-                <w:rFonts w:ascii="Aptos" w:hAnsi="Aptos" w:eastAsia="Aptos"/>
-                <w:b w:val="0"/>
-                <w:i w:val="0"/>
-                <w:color w:val="14232A"/>
-                <w:sz w:val="16"/>
-              </w:rPr>
-              <w:t>Deterministic profile and invariant cases.</w:t>
-            </w:r>
-          </w:p>
-          <w:p>
-            <w:pPr>
-              <w:spacing w:before="0" w:after="20" w:line="240" w:lineRule="auto"/>
-            </w:pPr>
-            <w:r>
-              <w:rPr>
-                <w:rFonts w:ascii="Aptos" w:hAnsi="Aptos" w:eastAsia="Aptos"/>
-                <w:b/>
-                <w:i w:val="0"/>
-                <w:color w:val="A56600"/>
-                <w:sz w:val="14"/>
-              </w:rPr>
-              <w:t>BOUNDARY</w:t>
-            </w:r>
-          </w:p>
-          <w:p>
-            <w:pPr>
-              <w:spacing w:before="0" w:after="40" w:line="245" w:lineRule="auto"/>
-            </w:pPr>
-            <w:r>
-              <w:rPr>
-                <w:rFonts w:ascii="Aptos" w:hAnsi="Aptos" w:eastAsia="Aptos"/>
-                <w:b w:val="0"/>
-                <w:i w:val="0"/>
-                <w:color w:val="5B6D75"/>
-                <w:sz w:val="15"/>
-              </w:rPr>
-              <w:t>No diagnosis, covert persuasion, or manipulation capability is claimed.</w:t>
+              <w:t>Presentation depth can change; facts, uncertainty, dignity, and authority may not.</w:t>
             </w:r>
           </w:p>
         </w:tc>
@@ -1955,22 +1764,35 @@
     </w:tbl>
     <w:p>
       <w:pPr>
-        <w:spacing w:before="120" w:after="60" w:line="240" w:lineRule="auto"/>
-        <w:keepNext/>
-        <w:keepLines/>
+        <w:spacing w:before="140" w:after="20" w:line="240" w:lineRule="auto"/>
+      </w:pPr>
+      <w:r>
+        <w:rPr>
+          <w:rFonts w:ascii="Carlito" w:hAnsi="Carlito" w:eastAsia="Carlito"/>
+          <w:b/>
+          <w:i w:val="0"/>
+          <w:color w:val="087A73"/>
+          <w:sz w:val="14"/>
+        </w:rPr>
+        <w:t>SYSTEMS FOUNDATION</w:t>
+      </w:r>
+    </w:p>
+    <w:p>
+      <w:pPr>
+        <w:spacing w:before="0" w:after="80" w:line="240" w:lineRule="auto"/>
         <w:pBdr>
-          <w:bottom w:val="single" w:sz="10" w:space="2" w:color="087A73"/>
+          <w:bottom w:val="single" w:sz="8" w:space="2" w:color="087A73"/>
         </w:pBdr>
       </w:pPr>
       <w:r>
         <w:rPr>
-          <w:rFonts w:ascii="Aptos" w:hAnsi="Aptos" w:eastAsia="Aptos"/>
+          <w:rFonts w:ascii="Carlito" w:hAnsi="Carlito" w:eastAsia="Carlito"/>
           <w:b/>
           <w:i w:val="0"/>
-          <w:color w:val="087A73"/>
-          <w:sz w:val="24"/>
+          <w:color w:val="14232A"/>
+          <w:sz w:val="26"/>
         </w:rPr>
-        <w:t>CROSS-DOMAIN SYSTEMS FOUNDATION</w:t>
+        <w:t>Cross-domain operating perspective</w:t>
       </w:r>
     </w:p>
     <w:tbl>
@@ -1982,25 +1804,25 @@
         <w:tblCellSpacing w:w="0" w:type="dxa"/>
       </w:tblPr>
       <w:tblGrid>
-        <w:gridCol w:w="3024"/>
-        <w:gridCol w:w="7848"/>
+        <w:gridCol w:w="2880"/>
+        <w:gridCol w:w="7344"/>
       </w:tblGrid>
       <w:tr>
         <w:tc>
           <w:tcPr>
-            <w:tcW w:type="dxa" w:w="5429"/>
+            <w:tcW w:type="dxa" w:w="5112"/>
             <w:shd w:fill="EEF6F4"/>
             <w:tcMar>
-              <w:top w:w="55" w:type="dxa"/>
+              <w:top w:w="50" w:type="dxa"/>
               <w:start w:w="65" w:type="dxa"/>
-              <w:bottom w:w="55" w:type="dxa"/>
+              <w:bottom w:w="50" w:type="dxa"/>
               <w:end w:w="65" w:type="dxa"/>
             </w:tcMar>
             <w:tcBorders>
-              <w:top w:sz="2" w:val="single" w:color="D4E4E1"/>
-              <w:left w:sz="2" w:val="single" w:color="D4E4E1"/>
-              <w:bottom w:sz="2" w:val="single" w:color="D4E4E1"/>
-              <w:right w:sz="2" w:val="single" w:color="D4E4E1"/>
+              <w:top w:val="single" w:sz="2" w:color="D4E4E1"/>
+              <w:left w:val="single" w:sz="2" w:color="D4E4E1"/>
+              <w:bottom w:val="single" w:sz="2" w:color="D4E4E1"/>
+              <w:right w:val="single" w:sz="2" w:color="D4E4E1"/>
             </w:tcBorders>
           </w:tcPr>
           <w:p>
@@ -2009,11 +1831,11 @@
             </w:pPr>
             <w:r>
               <w:rPr>
-                <w:rFonts w:ascii="Aptos" w:hAnsi="Aptos" w:eastAsia="Aptos"/>
+                <w:rFonts w:ascii="Carlito" w:hAnsi="Carlito" w:eastAsia="Carlito"/>
                 <w:b/>
                 <w:i w:val="0"/>
                 <w:color w:val="087A73"/>
-                <w:sz w:val="16"/>
+                <w:sz w:val="15"/>
               </w:rPr>
               <w:t>Scientific measurement</w:t>
             </w:r>
@@ -2021,19 +1843,19 @@
         </w:tc>
         <w:tc>
           <w:tcPr>
-            <w:tcW w:type="dxa" w:w="5429"/>
+            <w:tcW w:type="dxa" w:w="5112"/>
             <w:shd w:fill="EEF6F4"/>
             <w:tcMar>
-              <w:top w:w="55" w:type="dxa"/>
+              <w:top w:w="50" w:type="dxa"/>
               <w:start w:w="65" w:type="dxa"/>
-              <w:bottom w:w="55" w:type="dxa"/>
+              <w:bottom w:w="50" w:type="dxa"/>
               <w:end w:w="65" w:type="dxa"/>
             </w:tcMar>
             <w:tcBorders>
-              <w:top w:sz="2" w:val="single" w:color="D4E4E1"/>
-              <w:left w:sz="2" w:val="single" w:color="D4E4E1"/>
-              <w:bottom w:sz="2" w:val="single" w:color="D4E4E1"/>
-              <w:right w:sz="2" w:val="single" w:color="D4E4E1"/>
+              <w:top w:val="single" w:sz="2" w:color="D4E4E1"/>
+              <w:left w:val="single" w:sz="2" w:color="D4E4E1"/>
+              <w:bottom w:val="single" w:sz="2" w:color="D4E4E1"/>
+              <w:right w:val="single" w:sz="2" w:color="D4E4E1"/>
             </w:tcBorders>
           </w:tcPr>
           <w:p>
@@ -2042,11 +1864,11 @@
             </w:pPr>
             <w:r>
               <w:rPr>
-                <w:rFonts w:ascii="Aptos" w:hAnsi="Aptos" w:eastAsia="Aptos"/>
+                <w:rFonts w:ascii="Carlito" w:hAnsi="Carlito" w:eastAsia="Carlito"/>
                 <w:b w:val="0"/>
                 <w:i w:val="0"/>
                 <w:color w:val="14232A"/>
-                <w:sz w:val="16"/>
+                <w:sz w:val="15"/>
               </w:rPr>
               <w:t>University of Hawaii sea-urchin morphometric research, 2016-2017: processed physical measurements of gill structures to support visual species identification.</w:t>
             </w:r>
@@ -2056,19 +1878,19 @@
       <w:tr>
         <w:tc>
           <w:tcPr>
-            <w:tcW w:type="dxa" w:w="5429"/>
+            <w:tcW w:type="dxa" w:w="5112"/>
             <w:shd w:fill="F7FAF9"/>
             <w:tcMar>
-              <w:top w:w="55" w:type="dxa"/>
+              <w:top w:w="50" w:type="dxa"/>
               <w:start w:w="65" w:type="dxa"/>
-              <w:bottom w:w="55" w:type="dxa"/>
+              <w:bottom w:w="50" w:type="dxa"/>
               <w:end w:w="65" w:type="dxa"/>
             </w:tcMar>
             <w:tcBorders>
-              <w:top w:sz="2" w:val="single" w:color="D4E4E1"/>
-              <w:left w:sz="2" w:val="single" w:color="D4E4E1"/>
-              <w:bottom w:sz="2" w:val="single" w:color="D4E4E1"/>
-              <w:right w:sz="2" w:val="single" w:color="D4E4E1"/>
+              <w:top w:val="single" w:sz="2" w:color="D4E4E1"/>
+              <w:left w:val="single" w:sz="2" w:color="D4E4E1"/>
+              <w:bottom w:val="single" w:sz="2" w:color="D4E4E1"/>
+              <w:right w:val="single" w:sz="2" w:color="D4E4E1"/>
             </w:tcBorders>
           </w:tcPr>
           <w:p>
@@ -2077,11 +1899,11 @@
             </w:pPr>
             <w:r>
               <w:rPr>
-                <w:rFonts w:ascii="Aptos" w:hAnsi="Aptos" w:eastAsia="Aptos"/>
+                <w:rFonts w:ascii="Carlito" w:hAnsi="Carlito" w:eastAsia="Carlito"/>
                 <w:b/>
                 <w:i w:val="0"/>
                 <w:color w:val="087A73"/>
-                <w:sz w:val="16"/>
+                <w:sz w:val="15"/>
               </w:rPr>
               <w:t>Compressed-gas systems</w:t>
             </w:r>
@@ -2089,19 +1911,19 @@
         </w:tc>
         <w:tc>
           <w:tcPr>
-            <w:tcW w:type="dxa" w:w="5429"/>
+            <w:tcW w:type="dxa" w:w="5112"/>
             <w:shd w:fill="F7FAF9"/>
             <w:tcMar>
-              <w:top w:w="55" w:type="dxa"/>
+              <w:top w:w="50" w:type="dxa"/>
               <w:start w:w="65" w:type="dxa"/>
-              <w:bottom w:w="55" w:type="dxa"/>
+              <w:bottom w:w="50" w:type="dxa"/>
               <w:end w:w="65" w:type="dxa"/>
             </w:tcMar>
             <w:tcBorders>
-              <w:top w:sz="2" w:val="single" w:color="D4E4E1"/>
-              <w:left w:sz="2" w:val="single" w:color="D4E4E1"/>
-              <w:bottom w:sz="2" w:val="single" w:color="D4E4E1"/>
-              <w:right w:sz="2" w:val="single" w:color="D4E4E1"/>
+              <w:top w:val="single" w:sz="2" w:color="D4E4E1"/>
+              <w:left w:val="single" w:sz="2" w:color="D4E4E1"/>
+              <w:bottom w:val="single" w:sz="2" w:color="D4E4E1"/>
+              <w:right w:val="single" w:sz="2" w:color="D4E4E1"/>
             </w:tcBorders>
           </w:tcPr>
           <w:p>
@@ -2110,11 +1932,11 @@
             </w:pPr>
             <w:r>
               <w:rPr>
-                <w:rFonts w:ascii="Aptos" w:hAnsi="Aptos" w:eastAsia="Aptos"/>
+                <w:rFonts w:ascii="Carlito" w:hAnsi="Carlito" w:eastAsia="Carlito"/>
                 <w:b w:val="0"/>
                 <w:i w:val="0"/>
                 <w:color w:val="14232A"/>
-                <w:sz w:val="16"/>
+                <w:sz w:val="15"/>
               </w:rPr>
               <w:t>Scuba Tank Technician, Hawaiian Diving Adventures and UH Dive Office, 2016-2017: tank filling, transport, inspection and repair support, and gas mixing under safety-critical procedures.</w:t>
             </w:r>
@@ -2124,19 +1946,19 @@
       <w:tr>
         <w:tc>
           <w:tcPr>
-            <w:tcW w:type="dxa" w:w="5429"/>
+            <w:tcW w:type="dxa" w:w="5112"/>
             <w:shd w:fill="EEF6F4"/>
             <w:tcMar>
-              <w:top w:w="55" w:type="dxa"/>
+              <w:top w:w="50" w:type="dxa"/>
               <w:start w:w="65" w:type="dxa"/>
-              <w:bottom w:w="55" w:type="dxa"/>
+              <w:bottom w:w="50" w:type="dxa"/>
               <w:end w:w="65" w:type="dxa"/>
             </w:tcMar>
             <w:tcBorders>
-              <w:top w:sz="2" w:val="single" w:color="D4E4E1"/>
-              <w:left w:sz="2" w:val="single" w:color="D4E4E1"/>
-              <w:bottom w:sz="2" w:val="single" w:color="D4E4E1"/>
-              <w:right w:sz="2" w:val="single" w:color="D4E4E1"/>
+              <w:top w:val="single" w:sz="2" w:color="D4E4E1"/>
+              <w:left w:val="single" w:sz="2" w:color="D4E4E1"/>
+              <w:bottom w:val="single" w:sz="2" w:color="D4E4E1"/>
+              <w:right w:val="single" w:sz="2" w:color="D4E4E1"/>
             </w:tcBorders>
           </w:tcPr>
           <w:p>
@@ -2145,11 +1967,11 @@
             </w:pPr>
             <w:r>
               <w:rPr>
-                <w:rFonts w:ascii="Aptos" w:hAnsi="Aptos" w:eastAsia="Aptos"/>
+                <w:rFonts w:ascii="Carlito" w:hAnsi="Carlito" w:eastAsia="Carlito"/>
                 <w:b/>
                 <w:i w:val="0"/>
                 <w:color w:val="087A73"/>
-                <w:sz w:val="16"/>
+                <w:sz w:val="15"/>
               </w:rPr>
               <w:t>Field systems operations</w:t>
             </w:r>
@@ -2157,19 +1979,19 @@
         </w:tc>
         <w:tc>
           <w:tcPr>
-            <w:tcW w:type="dxa" w:w="5429"/>
+            <w:tcW w:type="dxa" w:w="5112"/>
             <w:shd w:fill="EEF6F4"/>
             <w:tcMar>
-              <w:top w:w="55" w:type="dxa"/>
+              <w:top w:w="50" w:type="dxa"/>
               <w:start w:w="65" w:type="dxa"/>
-              <w:bottom w:w="55" w:type="dxa"/>
+              <w:bottom w:w="50" w:type="dxa"/>
               <w:end w:w="65" w:type="dxa"/>
             </w:tcMar>
             <w:tcBorders>
-              <w:top w:sz="2" w:val="single" w:color="D4E4E1"/>
-              <w:left w:sz="2" w:val="single" w:color="D4E4E1"/>
-              <w:bottom w:sz="2" w:val="single" w:color="D4E4E1"/>
-              <w:right w:sz="2" w:val="single" w:color="D4E4E1"/>
+              <w:top w:val="single" w:sz="2" w:color="D4E4E1"/>
+              <w:left w:val="single" w:sz="2" w:color="D4E4E1"/>
+              <w:bottom w:val="single" w:sz="2" w:color="D4E4E1"/>
+              <w:right w:val="single" w:sz="2" w:color="D4E4E1"/>
             </w:tcBorders>
           </w:tcPr>
           <w:p>
@@ -2178,81 +2000,13 @@
             </w:pPr>
             <w:r>
               <w:rPr>
-                <w:rFonts w:ascii="Aptos" w:hAnsi="Aptos" w:eastAsia="Aptos"/>
+                <w:rFonts w:ascii="Carlito" w:hAnsi="Carlito" w:eastAsia="Carlito"/>
                 <w:b w:val="0"/>
                 <w:i w:val="0"/>
                 <w:color w:val="14232A"/>
-                <w:sz w:val="16"/>
+                <w:sz w:val="15"/>
               </w:rPr>
               <w:t>Residential inspection and repair work developed practical judgment around interacting systems, failure consequences, uncertainty, and clear client communication.</w:t>
-            </w:r>
-          </w:p>
-        </w:tc>
-      </w:tr>
-      <w:tr>
-        <w:tc>
-          <w:tcPr>
-            <w:tcW w:type="dxa" w:w="5429"/>
-            <w:shd w:fill="F7FAF9"/>
-            <w:tcMar>
-              <w:top w:w="55" w:type="dxa"/>
-              <w:start w:w="65" w:type="dxa"/>
-              <w:bottom w:w="55" w:type="dxa"/>
-              <w:end w:w="65" w:type="dxa"/>
-            </w:tcMar>
-            <w:tcBorders>
-              <w:top w:sz="2" w:val="single" w:color="D4E4E1"/>
-              <w:left w:sz="2" w:val="single" w:color="D4E4E1"/>
-              <w:bottom w:sz="2" w:val="single" w:color="D4E4E1"/>
-              <w:right w:sz="2" w:val="single" w:color="D4E4E1"/>
-            </w:tcBorders>
-          </w:tcPr>
-          <w:p>
-            <w:pPr>
-              <w:spacing w:before="0" w:after="0" w:line="240" w:lineRule="auto"/>
-            </w:pPr>
-            <w:r>
-              <w:rPr>
-                <w:rFonts w:ascii="Aptos" w:hAnsi="Aptos" w:eastAsia="Aptos"/>
-                <w:b/>
-                <w:i w:val="0"/>
-                <w:color w:val="087A73"/>
-                <w:sz w:val="16"/>
-              </w:rPr>
-              <w:t>Earlier leadership</w:t>
-            </w:r>
-          </w:p>
-        </w:tc>
-        <w:tc>
-          <w:tcPr>
-            <w:tcW w:type="dxa" w:w="5429"/>
-            <w:shd w:fill="F7FAF9"/>
-            <w:tcMar>
-              <w:top w:w="55" w:type="dxa"/>
-              <w:start w:w="65" w:type="dxa"/>
-              <w:bottom w:w="55" w:type="dxa"/>
-              <w:end w:w="65" w:type="dxa"/>
-            </w:tcMar>
-            <w:tcBorders>
-              <w:top w:sz="2" w:val="single" w:color="D4E4E1"/>
-              <w:left w:sz="2" w:val="single" w:color="D4E4E1"/>
-              <w:bottom w:sz="2" w:val="single" w:color="D4E4E1"/>
-              <w:right w:sz="2" w:val="single" w:color="D4E4E1"/>
-            </w:tcBorders>
-          </w:tcPr>
-          <w:p>
-            <w:pPr>
-              <w:spacing w:before="0" w:after="0" w:line="240" w:lineRule="auto"/>
-            </w:pPr>
-            <w:r>
-              <w:rPr>
-                <w:rFonts w:ascii="Aptos" w:hAnsi="Aptos" w:eastAsia="Aptos"/>
-                <w:b w:val="0"/>
-                <w:i w:val="0"/>
-                <w:color w:val="14232A"/>
-                <w:sz w:val="16"/>
-              </w:rPr>
-              <w:t>Civil Air Patrol Cadet Commander and Search-and-Rescue Ground Team Leader, 2007-2011; included as historical leadership context, not as formal professional management experience.</w:t>
             </w:r>
           </w:p>
         </w:tc>
@@ -2260,22 +2014,168 @@
     </w:tbl>
     <w:p>
       <w:pPr>
-        <w:spacing w:before="120" w:after="60" w:line="240" w:lineRule="auto"/>
-        <w:keepNext/>
-        <w:keepLines/>
+        <w:spacing w:before="140" w:after="20" w:line="240" w:lineRule="auto"/>
+      </w:pPr>
+      <w:r>
+        <w:rPr>
+          <w:rFonts w:ascii="Carlito" w:hAnsi="Carlito" w:eastAsia="Carlito"/>
+          <w:b/>
+          <w:i w:val="0"/>
+          <w:color w:val="087A73"/>
+          <w:sz w:val="14"/>
+        </w:rPr>
+        <w:t>TECHNICAL PROFILE</w:t>
+      </w:r>
+    </w:p>
+    <w:p>
+      <w:pPr>
+        <w:spacing w:before="0" w:after="80" w:line="240" w:lineRule="auto"/>
         <w:pBdr>
-          <w:bottom w:val="single" w:sz="10" w:space="2" w:color="087A73"/>
+          <w:bottom w:val="single" w:sz="8" w:space="2" w:color="087A73"/>
         </w:pBdr>
       </w:pPr>
       <w:r>
         <w:rPr>
-          <w:rFonts w:ascii="Aptos" w:hAnsi="Aptos" w:eastAsia="Aptos"/>
+          <w:rFonts w:ascii="Carlito" w:hAnsi="Carlito" w:eastAsia="Carlito"/>
+          <w:b/>
+          <w:i w:val="0"/>
+          <w:color w:val="14232A"/>
+          <w:sz w:val="26"/>
+        </w:rPr>
+        <w:t>Tools and architecture</w:t>
+      </w:r>
+    </w:p>
+    <w:p>
+      <w:pPr>
+        <w:spacing w:before="0" w:after="40" w:line="240" w:lineRule="auto"/>
+      </w:pPr>
+      <w:r>
+        <w:rPr>
+          <w:rFonts w:ascii="Carlito" w:hAnsi="Carlito" w:eastAsia="Carlito"/>
           <w:b/>
           <w:i w:val="0"/>
           <w:color w:val="087A73"/>
-          <w:sz w:val="24"/>
+          <w:sz w:val="16"/>
         </w:rPr>
-        <w:t>EDUCATION AND EARLIER TECHNICAL CREDENTIALS</w:t>
+        <w:t xml:space="preserve">Primary: </w:t>
+      </w:r>
+      <w:r>
+        <w:rPr>
+          <w:rFonts w:ascii="Carlito" w:hAnsi="Carlito" w:eastAsia="Carlito"/>
+          <w:b w:val="0"/>
+          <w:i w:val="0"/>
+          <w:color w:val="14232A"/>
+          <w:sz w:val="16"/>
+        </w:rPr>
+        <w:t>Python, TypeScript, JavaScript, SQL, Bash, Node.js, React, Next.js, FastAPI</w:t>
+      </w:r>
+    </w:p>
+    <w:p>
+      <w:pPr>
+        <w:spacing w:before="0" w:after="40" w:line="240" w:lineRule="auto"/>
+      </w:pPr>
+      <w:r>
+        <w:rPr>
+          <w:rFonts w:ascii="Carlito" w:hAnsi="Carlito" w:eastAsia="Carlito"/>
+          <w:b/>
+          <w:i w:val="0"/>
+          <w:color w:val="087A73"/>
+          <w:sz w:val="16"/>
+        </w:rPr>
+        <w:t xml:space="preserve">Architecture: </w:t>
+      </w:r>
+      <w:r>
+        <w:rPr>
+          <w:rFonts w:ascii="Carlito" w:hAnsi="Carlito" w:eastAsia="Carlito"/>
+          <w:b w:val="0"/>
+          <w:i w:val="0"/>
+          <w:color w:val="14232A"/>
+          <w:sz w:val="16"/>
+        </w:rPr>
+        <w:t>REST, JSON-RPC 2.0, MCP, JSON Schema, Protocol Buffers, events, state machines, idempotency, authority models, evidence models</w:t>
+      </w:r>
+    </w:p>
+    <w:p>
+      <w:pPr>
+        <w:spacing w:before="0" w:after="40" w:line="240" w:lineRule="auto"/>
+      </w:pPr>
+      <w:r>
+        <w:rPr>
+          <w:rFonts w:ascii="Carlito" w:hAnsi="Carlito" w:eastAsia="Carlito"/>
+          <w:b/>
+          <w:i w:val="0"/>
+          <w:color w:val="087A73"/>
+          <w:sz w:val="16"/>
+        </w:rPr>
+        <w:t xml:space="preserve">Delivery: </w:t>
+      </w:r>
+      <w:r>
+        <w:rPr>
+          <w:rFonts w:ascii="Carlito" w:hAnsi="Carlito" w:eastAsia="Carlito"/>
+          <w:b w:val="0"/>
+          <w:i w:val="0"/>
+          <w:color w:val="14232A"/>
+          <w:sz w:val="16"/>
+        </w:rPr>
+        <w:t>Git, GitHub Actions, Docker, Vercel, automated testing, static analysis, dependency auditing, deterministic release checks</w:t>
+      </w:r>
+    </w:p>
+    <w:p>
+      <w:pPr>
+        <w:spacing w:before="0" w:after="0" w:line="240" w:lineRule="auto"/>
+      </w:pPr>
+      <w:r>
+        <w:rPr>
+          <w:rFonts w:ascii="Carlito" w:hAnsi="Carlito" w:eastAsia="Carlito"/>
+          <w:b/>
+          <w:i w:val="0"/>
+          <w:color w:val="087A73"/>
+          <w:sz w:val="16"/>
+        </w:rPr>
+        <w:t xml:space="preserve">Additional evidence-bounded exposure: </w:t>
+      </w:r>
+      <w:r>
+        <w:rPr>
+          <w:rFonts w:ascii="Carlito" w:hAnsi="Carlito" w:eastAsia="Carlito"/>
+          <w:b w:val="0"/>
+          <w:i w:val="0"/>
+          <w:color w:val="14232A"/>
+          <w:sz w:val="16"/>
+        </w:rPr>
+        <w:t>Go, Rust, C, C++, CUDA, Swift/Metal, Julia, R, Verilog/SystemVerilog, WebAssembly</w:t>
+      </w:r>
+    </w:p>
+    <w:p>
+      <w:pPr>
+        <w:spacing w:before="140" w:after="20" w:line="240" w:lineRule="auto"/>
+      </w:pPr>
+      <w:r>
+        <w:rPr>
+          <w:rFonts w:ascii="Carlito" w:hAnsi="Carlito" w:eastAsia="Carlito"/>
+          <w:b/>
+          <w:i w:val="0"/>
+          <w:color w:val="087A73"/>
+          <w:sz w:val="14"/>
+        </w:rPr>
+        <w:t>EDUCATION</w:t>
+      </w:r>
+    </w:p>
+    <w:p>
+      <w:pPr>
+        <w:spacing w:before="0" w:after="80" w:line="240" w:lineRule="auto"/>
+        <w:pBdr>
+          <w:bottom w:val="single" w:sz="8" w:space="2" w:color="087A73"/>
+        </w:pBdr>
+      </w:pPr>
+      <w:r>
+        <w:rPr>
+          <w:rFonts w:ascii="Carlito" w:hAnsi="Carlito" w:eastAsia="Carlito"/>
+          <w:b/>
+          <w:i w:val="0"/>
+          <w:color w:val="14232A"/>
+          <w:sz w:val="26"/>
+        </w:rPr>
+        <w:t>Scientific foundation and current cloud training</w:t>
       </w:r>
     </w:p>
     <w:tbl>
@@ -2287,22 +2187,19 @@
         <w:tblCellSpacing w:w="0" w:type="dxa"/>
       </w:tblPr>
       <w:tblGrid>
-        <w:gridCol w:w="6912"/>
-        <w:gridCol w:w="3960"/>
+        <w:gridCol w:w="6336"/>
+        <w:gridCol w:w="3888"/>
       </w:tblGrid>
       <w:tr>
         <w:tc>
           <w:tcPr>
-            <w:tcW w:type="dxa" w:w="5429"/>
+            <w:tcW w:type="dxa" w:w="5112"/>
             <w:tcMar>
-              <w:top w:w="35" w:type="dxa"/>
+              <w:top w:w="30" w:type="dxa"/>
               <w:start w:w="20" w:type="dxa"/>
-              <w:bottom w:w="35" w:type="dxa"/>
+              <w:bottom w:w="30" w:type="dxa"/>
               <w:end w:w="20" w:type="dxa"/>
             </w:tcMar>
-            <w:tcBorders>
-              <w:bottom w:val="nil"/>
-            </w:tcBorders>
           </w:tcPr>
           <w:p>
             <w:pPr>
@@ -2310,11 +2207,11 @@
             </w:pPr>
             <w:r>
               <w:rPr>
-                <w:rFonts w:ascii="Aptos" w:hAnsi="Aptos" w:eastAsia="Aptos"/>
+                <w:rFonts w:ascii="Carlito" w:hAnsi="Carlito" w:eastAsia="Carlito"/>
                 <w:b/>
                 <w:i w:val="0"/>
                 <w:color w:val="14232A"/>
-                <w:sz w:val="18"/>
+                <w:sz w:val="17"/>
               </w:rPr>
               <w:t>University of Hawaii at Manoa</w:t>
             </w:r>
@@ -2322,16 +2219,13 @@
         </w:tc>
         <w:tc>
           <w:tcPr>
-            <w:tcW w:type="dxa" w:w="5429"/>
+            <w:tcW w:type="dxa" w:w="5112"/>
             <w:tcMar>
-              <w:top w:w="35" w:type="dxa"/>
+              <w:top w:w="30" w:type="dxa"/>
               <w:start w:w="20" w:type="dxa"/>
-              <w:bottom w:w="35" w:type="dxa"/>
+              <w:bottom w:w="30" w:type="dxa"/>
               <w:end w:w="20" w:type="dxa"/>
             </w:tcMar>
-            <w:tcBorders>
-              <w:bottom w:val="nil"/>
-            </w:tcBorders>
           </w:tcPr>
           <w:p>
             <w:pPr>
@@ -2340,11 +2234,11 @@
             </w:pPr>
             <w:r>
               <w:rPr>
-                <w:rFonts w:ascii="Aptos" w:hAnsi="Aptos" w:eastAsia="Aptos"/>
+                <w:rFonts w:ascii="Carlito" w:hAnsi="Carlito" w:eastAsia="Carlito"/>
                 <w:b w:val="0"/>
                 <w:i w:val="0"/>
                 <w:color w:val="5B6D75"/>
-                <w:sz w:val="17"/>
+                <w:sz w:val="16"/>
               </w:rPr>
               <w:t>B.S., Marine Biology - 2016</w:t>
             </w:r>
@@ -2354,15 +2248,85 @@
       <w:tr>
         <w:tc>
           <w:tcPr>
-            <w:tcW w:type="dxa" w:w="5429"/>
+            <w:tcW w:type="dxa" w:w="5112"/>
             <w:tcMar>
-              <w:top w:w="35" w:type="dxa"/>
+              <w:top w:w="30" w:type="dxa"/>
               <w:start w:w="20" w:type="dxa"/>
-              <w:bottom w:w="35" w:type="dxa"/>
+              <w:bottom w:w="30" w:type="dxa"/>
               <w:end w:w="20" w:type="dxa"/>
             </w:tcMar>
+          </w:tcPr>
+          <w:p>
+            <w:pPr>
+              <w:spacing w:before="0" w:after="0" w:line="240" w:lineRule="auto"/>
+            </w:pPr>
+            <w:r>
+              <w:rPr>
+                <w:rFonts w:ascii="Carlito" w:hAnsi="Carlito" w:eastAsia="Carlito"/>
+                <w:b/>
+                <w:i w:val="0"/>
+                <w:color w:val="14232A"/>
+                <w:sz w:val="17"/>
+              </w:rPr>
+              <w:t>AWS Cloud Institute</w:t>
+            </w:r>
+          </w:p>
+        </w:tc>
+        <w:tc>
+          <w:tcPr>
+            <w:tcW w:type="dxa" w:w="5112"/>
+            <w:tcMar>
+              <w:top w:w="30" w:type="dxa"/>
+              <w:start w:w="20" w:type="dxa"/>
+              <w:bottom w:w="30" w:type="dxa"/>
+              <w:end w:w="20" w:type="dxa"/>
+            </w:tcMar>
+          </w:tcPr>
+          <w:p>
+            <w:pPr>
+              <w:spacing w:before="0" w:after="0" w:line="240" w:lineRule="auto"/>
+              <w:jc w:val="right"/>
+            </w:pPr>
+            <w:r>
+              <w:rPr>
+                <w:rFonts w:ascii="Carlito" w:hAnsi="Carlito" w:eastAsia="Carlito"/>
+                <w:b w:val="0"/>
+                <w:i w:val="0"/>
+                <w:color w:val="5B6D75"/>
+                <w:sz w:val="16"/>
+              </w:rPr>
+              <w:t>Cloud Application Developer program - 2025-2026, in progress</w:t>
+            </w:r>
+          </w:p>
+        </w:tc>
+      </w:tr>
+    </w:tbl>
+    <w:tbl>
+      <w:tblPr>
+        <w:tblW w:type="auto" w:w="0"/>
+        <w:jc w:val="center"/>
+        <w:tblLook w:firstColumn="1" w:firstRow="1" w:lastColumn="0" w:lastRow="0" w:noHBand="0" w:noVBand="1" w:val="04A0"/>
+        <w:tblCellSpacing w:w="0" w:type="dxa"/>
+      </w:tblPr>
+      <w:tblGrid>
+        <w:gridCol w:w="10224"/>
+      </w:tblGrid>
+      <w:tr>
+        <w:tc>
+          <w:tcPr>
+            <w:tcW w:type="dxa" w:w="10224"/>
+            <w:shd w:fill="FFF5DE"/>
+            <w:tcMar>
+              <w:top w:w="65" w:type="dxa"/>
+              <w:start w:w="80" w:type="dxa"/>
+              <w:bottom w:w="65" w:type="dxa"/>
+              <w:end w:w="80" w:type="dxa"/>
+            </w:tcMar>
             <w:tcBorders>
-              <w:bottom w:val="nil"/>
+              <w:top w:val="single" w:sz="4" w:color="E5B34B"/>
+              <w:left w:val="single" w:sz="4" w:color="E5B34B"/>
+              <w:bottom w:val="single" w:sz="4" w:color="E5B34B"/>
+              <w:right w:val="single" w:sz="4" w:color="E5B34B"/>
             </w:tcBorders>
           </w:tcPr>
           <w:p>
@@ -2371,124 +2335,23 @@
             </w:pPr>
             <w:r>
               <w:rPr>
-                <w:rFonts w:ascii="Aptos" w:hAnsi="Aptos" w:eastAsia="Aptos"/>
-                <w:b/>
-                <w:i w:val="0"/>
-                <w:color w:val="14232A"/>
-                <w:sz w:val="18"/>
-              </w:rPr>
-              <w:t>AWS Cloud Institute</w:t>
-            </w:r>
-          </w:p>
-        </w:tc>
-        <w:tc>
-          <w:tcPr>
-            <w:tcW w:type="dxa" w:w="5429"/>
-            <w:tcMar>
-              <w:top w:w="35" w:type="dxa"/>
-              <w:start w:w="20" w:type="dxa"/>
-              <w:bottom w:w="35" w:type="dxa"/>
-              <w:end w:w="20" w:type="dxa"/>
-            </w:tcMar>
-            <w:tcBorders>
-              <w:bottom w:val="nil"/>
-            </w:tcBorders>
-          </w:tcPr>
-          <w:p>
-            <w:pPr>
-              <w:spacing w:before="0" w:after="0" w:line="240" w:lineRule="auto"/>
-              <w:jc w:val="right"/>
-            </w:pPr>
-            <w:r>
-              <w:rPr>
-                <w:rFonts w:ascii="Aptos" w:hAnsi="Aptos" w:eastAsia="Aptos"/>
-                <w:b w:val="0"/>
-                <w:i w:val="0"/>
-                <w:color w:val="5B6D75"/>
-                <w:sz w:val="17"/>
-              </w:rPr>
-              <w:t>Cloud Application Developer program - 2025-2026, in progress</w:t>
-            </w:r>
-          </w:p>
-        </w:tc>
-      </w:tr>
-    </w:tbl>
-    <w:p>
-      <w:pPr>
-        <w:spacing w:before="80" w:after="80" w:line="240" w:lineRule="auto"/>
-      </w:pPr>
-      <w:r>
-        <w:rPr>
-          <w:rFonts w:ascii="Aptos" w:hAnsi="Aptos" w:eastAsia="Aptos"/>
-          <w:b/>
-          <w:i w:val="0"/>
-          <w:color w:val="087A73"/>
-          <w:sz w:val="15"/>
-        </w:rPr>
-        <w:t xml:space="preserve">Earlier technical certifications recorded in prior resumes: </w:t>
-      </w:r>
-      <w:r>
-        <w:rPr>
-          <w:rFonts w:ascii="Aptos" w:hAnsi="Aptos" w:eastAsia="Aptos"/>
-          <w:b w:val="0"/>
-          <w:i w:val="0"/>
-          <w:color w:val="5B6D75"/>
-          <w:sz w:val="15"/>
-        </w:rPr>
-        <w:t>PSI Visual Cylinder Inspector, Eddy Current Technician, Valve Repair Technician, Oxygen Cleaning Cylinder Technician; NAUI Rescue and Master Diver; PADI Enriched Air Diver. Current status is not represented as active without updated documentation.</w:t>
-      </w:r>
-    </w:p>
-    <w:tbl>
-      <w:tblPr>
-        <w:tblW w:type="auto" w:w="0"/>
-        <w:jc w:val="center"/>
-        <w:tblLook w:firstColumn="1" w:firstRow="1" w:lastColumn="0" w:lastRow="0" w:noHBand="0" w:noVBand="1" w:val="04A0"/>
-        <w:tblCellSpacing w:w="0" w:type="dxa"/>
-      </w:tblPr>
-      <w:tblGrid>
-        <w:gridCol w:w="10858"/>
-      </w:tblGrid>
-      <w:tr>
-        <w:tc>
-          <w:tcPr>
-            <w:tcW w:type="dxa" w:w="10858"/>
-            <w:shd w:fill="FFF5DE"/>
-            <w:tcMar>
-              <w:top w:w="65" w:type="dxa"/>
-              <w:start w:w="75" w:type="dxa"/>
-              <w:bottom w:w="65" w:type="dxa"/>
-              <w:end w:w="75" w:type="dxa"/>
-            </w:tcMar>
-            <w:tcBorders>
-              <w:top w:sz="4" w:val="single" w:color="E5B34B"/>
-              <w:left w:sz="2" w:val="single" w:color="F2D99A"/>
-              <w:bottom w:sz="4" w:val="single" w:color="E5B34B"/>
-              <w:right w:sz="2" w:val="single" w:color="F2D99A"/>
-            </w:tcBorders>
-          </w:tcPr>
-          <w:p>
-            <w:pPr>
-              <w:spacing w:before="0" w:after="0" w:line="240" w:lineRule="auto"/>
-            </w:pPr>
-            <w:r>
-              <w:rPr>
-                <w:rFonts w:ascii="Aptos" w:hAnsi="Aptos" w:eastAsia="Aptos"/>
+                <w:rFonts w:ascii="Carlito" w:hAnsi="Carlito" w:eastAsia="Carlito"/>
                 <w:b/>
                 <w:i w:val="0"/>
                 <w:color w:val="A56600"/>
-                <w:sz w:val="16"/>
+                <w:sz w:val="15"/>
               </w:rPr>
               <w:t xml:space="preserve">EVIDENCE BOUNDARY  </w:t>
             </w:r>
             <w:r>
               <w:rPr>
-                <w:rFonts w:ascii="Aptos" w:hAnsi="Aptos" w:eastAsia="Aptos"/>
+                <w:rFonts w:ascii="Carlito" w:hAnsi="Carlito" w:eastAsia="Carlito"/>
                 <w:b w:val="0"/>
                 <w:i w:val="0"/>
                 <w:color w:val="14232A"/>
                 <w:sz w:val="15"/>
               </w:rPr>
-              <w:t>Independent GlacierEQ work and bounded technical exhibits. Test counts refer only to their stated repository and scope. No company affiliation, proprietary access, production use, customer impact, formal people-management experience, current certification status, or hardware validation is claimed without direct evidence.</w:t>
+              <w:t>Independent GlacierEQ work and bounded technical exhibits. Test counts refer only to their stated repository and scope. No company affiliation, proprietary access, production deployment, customer impact, formal people-management experience, current certification status, hardware validation, or measured business outcome is claimed without direct evidence.</w:t>
             </w:r>
           </w:p>
         </w:tc>
@@ -2497,7 +2360,7 @@
     <w:sectPr>
       <w:footerReference w:type="default" r:id="rId13"/>
       <w:pgSz w:w="12240" w:h="15840"/>
-      <w:pgMar w:top="605" w:right="691" w:bottom="648" w:left="691" w:header="216" w:footer="360" w:gutter="0"/>
+      <w:pgMar w:top="864" w:right="1008" w:bottom="864" w:left="1008" w:header="317" w:footer="403" w:gutter="0"/>
       <w:cols w:space="720"/>
       <w:docGrid w:linePitch="360"/>
     </w:sectPr>
@@ -2515,13 +2378,13 @@
     </w:pPr>
     <w:r>
       <w:rPr>
-        <w:rFonts w:ascii="Aptos" w:hAnsi="Aptos" w:eastAsia="Aptos"/>
+        <w:rFonts w:ascii="Carlito" w:hAnsi="Carlito" w:eastAsia="Carlito"/>
         <w:b/>
         <w:i w:val="0"/>
         <w:color w:val="5B6D75"/>
         <w:sz w:val="13"/>
       </w:rPr>
-      <w:t>CASEY BARTON  |  PSYSOC-X V17 RESUME INTELLIGENCE  |  HUMAN SIGNAL + MACHINE-VERIFIABLE FACTS</w:t>
+      <w:t>CASEY BARTON  |  EVIDENCE-BOUND AI SYSTEMS  |  HONOLULU, HAWAII</w:t>
     </w:r>
   </w:p>
 </w:ftr>
@@ -2894,7 +2757,7 @@
       <w:spacing w:after="0"/>
     </w:pPr>
     <w:rPr>
-      <w:rFonts w:ascii="Aptos" w:hAnsi="Aptos" w:eastAsia="Aptos"/>
+      <w:rFonts w:ascii="Carlito" w:hAnsi="Carlito" w:eastAsia="Carlito"/>
       <w:color w:val="14232A"/>
       <w:sz w:val="18"/>
     </w:rPr>
@@ -3428,7 +3291,9 @@
       <w:contextualSpacing/>
     </w:pPr>
     <w:rPr>
-      <w:rFonts w:ascii="Aptos" w:hAnsi="Aptos" w:eastAsia="Aptos"/>
+      <w:rFonts w:ascii="Carlito" w:hAnsi="Carlito" w:eastAsia="Carlito"/>
+      <w:color w:val="14232A"/>
+      <w:sz w:val="18"/>
     </w:rPr>
   </w:style>
   <w:style w:type="paragraph" w:styleId="ListBullet2">

</xml_diff>